<commit_message>
style: change code font to 9pt
</commit_message>
<xml_diff>
--- a/reports/lr2/Звіт_ЛР2_Коновалов_ПЗПІ-25-6.docx
+++ b/reports/lr2/Звіт_ЛР2_Коновалов_ПЗПІ-25-6.docx
@@ -627,8 +627,8 @@
       <w:r>
         <w:rPr>
           <w:rFonts w:ascii="Courier New" w:cs="Courier New" w:eastAsia="Courier New" w:hAnsi="Courier New"/>
-          <w:sz w:val="20"/>
-          <w:szCs w:val="20"/>
+          <w:sz w:val="18"/>
+          <w:szCs w:val="18"/>
           <w:shd w:fill="F2F2F2" w:color="auto" w:val="clear"/>
         </w:rPr>
         <w:t xml:space="preserve">export class ArrayStack {</w:t>
@@ -648,8 +648,8 @@
       <w:r>
         <w:rPr>
           <w:rFonts w:ascii="Courier New" w:cs="Courier New" w:eastAsia="Courier New" w:hAnsi="Courier New"/>
-          <w:sz w:val="20"/>
-          <w:szCs w:val="20"/>
+          <w:sz w:val="18"/>
+          <w:szCs w:val="18"/>
           <w:shd w:fill="F2F2F2" w:color="auto" w:val="clear"/>
         </w:rPr>
         <w:t xml:space="preserve">  private data: number[];</w:t>
@@ -669,8 +669,8 @@
       <w:r>
         <w:rPr>
           <w:rFonts w:ascii="Courier New" w:cs="Courier New" w:eastAsia="Courier New" w:hAnsi="Courier New"/>
-          <w:sz w:val="20"/>
-          <w:szCs w:val="20"/>
+          <w:sz w:val="18"/>
+          <w:szCs w:val="18"/>
           <w:shd w:fill="F2F2F2" w:color="auto" w:val="clear"/>
         </w:rPr>
         <w:t xml:space="preserve">  private top: number;</w:t>
@@ -690,8 +690,8 @@
       <w:r>
         <w:rPr>
           <w:rFonts w:ascii="Courier New" w:cs="Courier New" w:eastAsia="Courier New" w:hAnsi="Courier New"/>
-          <w:sz w:val="20"/>
-          <w:szCs w:val="20"/>
+          <w:sz w:val="18"/>
+          <w:szCs w:val="18"/>
           <w:shd w:fill="F2F2F2" w:color="auto" w:val="clear"/>
         </w:rPr>
         <w:t xml:space="preserve">  private capacity: number;</w:t>
@@ -711,8 +711,8 @@
       <w:r>
         <w:rPr>
           <w:rFonts w:ascii="Courier New" w:cs="Courier New" w:eastAsia="Courier New" w:hAnsi="Courier New"/>
-          <w:sz w:val="20"/>
-          <w:szCs w:val="20"/>
+          <w:sz w:val="18"/>
+          <w:szCs w:val="18"/>
           <w:shd w:fill="F2F2F2" w:color="auto" w:val="clear"/>
         </w:rPr>
         <w:t xml:space="preserve"> </w:t>
@@ -732,8 +732,8 @@
       <w:r>
         <w:rPr>
           <w:rFonts w:ascii="Courier New" w:cs="Courier New" w:eastAsia="Courier New" w:hAnsi="Courier New"/>
-          <w:sz w:val="20"/>
-          <w:szCs w:val="20"/>
+          <w:sz w:val="18"/>
+          <w:szCs w:val="18"/>
           <w:shd w:fill="F2F2F2" w:color="auto" w:val="clear"/>
         </w:rPr>
         <w:t xml:space="preserve">  constructor(capacity: number = 100) {</w:t>
@@ -753,8 +753,8 @@
       <w:r>
         <w:rPr>
           <w:rFonts w:ascii="Courier New" w:cs="Courier New" w:eastAsia="Courier New" w:hAnsi="Courier New"/>
-          <w:sz w:val="20"/>
-          <w:szCs w:val="20"/>
+          <w:sz w:val="18"/>
+          <w:szCs w:val="18"/>
           <w:shd w:fill="F2F2F2" w:color="auto" w:val="clear"/>
         </w:rPr>
         <w:t xml:space="preserve">    this.data = new Array(capacity);</w:t>
@@ -774,8 +774,8 @@
       <w:r>
         <w:rPr>
           <w:rFonts w:ascii="Courier New" w:cs="Courier New" w:eastAsia="Courier New" w:hAnsi="Courier New"/>
-          <w:sz w:val="20"/>
-          <w:szCs w:val="20"/>
+          <w:sz w:val="18"/>
+          <w:szCs w:val="18"/>
           <w:shd w:fill="F2F2F2" w:color="auto" w:val="clear"/>
         </w:rPr>
         <w:t xml:space="preserve">    this.top = -1;</w:t>
@@ -795,8 +795,8 @@
       <w:r>
         <w:rPr>
           <w:rFonts w:ascii="Courier New" w:cs="Courier New" w:eastAsia="Courier New" w:hAnsi="Courier New"/>
-          <w:sz w:val="20"/>
-          <w:szCs w:val="20"/>
+          <w:sz w:val="18"/>
+          <w:szCs w:val="18"/>
           <w:shd w:fill="F2F2F2" w:color="auto" w:val="clear"/>
         </w:rPr>
         <w:t xml:space="preserve">    this.capacity = capacity;</w:t>
@@ -816,8 +816,8 @@
       <w:r>
         <w:rPr>
           <w:rFonts w:ascii="Courier New" w:cs="Courier New" w:eastAsia="Courier New" w:hAnsi="Courier New"/>
-          <w:sz w:val="20"/>
-          <w:szCs w:val="20"/>
+          <w:sz w:val="18"/>
+          <w:szCs w:val="18"/>
           <w:shd w:fill="F2F2F2" w:color="auto" w:val="clear"/>
         </w:rPr>
         <w:t xml:space="preserve">  }</w:t>
@@ -837,8 +837,8 @@
       <w:r>
         <w:rPr>
           <w:rFonts w:ascii="Courier New" w:cs="Courier New" w:eastAsia="Courier New" w:hAnsi="Courier New"/>
-          <w:sz w:val="20"/>
-          <w:szCs w:val="20"/>
+          <w:sz w:val="18"/>
+          <w:szCs w:val="18"/>
           <w:shd w:fill="F2F2F2" w:color="auto" w:val="clear"/>
         </w:rPr>
         <w:t xml:space="preserve"> </w:t>
@@ -858,8 +858,8 @@
       <w:r>
         <w:rPr>
           <w:rFonts w:ascii="Courier New" w:cs="Courier New" w:eastAsia="Courier New" w:hAnsi="Courier New"/>
-          <w:sz w:val="20"/>
-          <w:szCs w:val="20"/>
+          <w:sz w:val="18"/>
+          <w:szCs w:val="18"/>
           <w:shd w:fill="F2F2F2" w:color="auto" w:val="clear"/>
         </w:rPr>
         <w:t xml:space="preserve">  push(value: number): void {</w:t>
@@ -879,8 +879,8 @@
       <w:r>
         <w:rPr>
           <w:rFonts w:ascii="Courier New" w:cs="Courier New" w:eastAsia="Courier New" w:hAnsi="Courier New"/>
-          <w:sz w:val="20"/>
-          <w:szCs w:val="20"/>
+          <w:sz w:val="18"/>
+          <w:szCs w:val="18"/>
           <w:shd w:fill="F2F2F2" w:color="auto" w:val="clear"/>
         </w:rPr>
         <w:t xml:space="preserve">    if (this.top &gt;= this.capacity - 1) throw new Error("Stack overflow");</w:t>
@@ -900,8 +900,8 @@
       <w:r>
         <w:rPr>
           <w:rFonts w:ascii="Courier New" w:cs="Courier New" w:eastAsia="Courier New" w:hAnsi="Courier New"/>
-          <w:sz w:val="20"/>
-          <w:szCs w:val="20"/>
+          <w:sz w:val="18"/>
+          <w:szCs w:val="18"/>
           <w:shd w:fill="F2F2F2" w:color="auto" w:val="clear"/>
         </w:rPr>
         <w:t xml:space="preserve">    this.data[++this.top] = value;</w:t>
@@ -921,8 +921,8 @@
       <w:r>
         <w:rPr>
           <w:rFonts w:ascii="Courier New" w:cs="Courier New" w:eastAsia="Courier New" w:hAnsi="Courier New"/>
-          <w:sz w:val="20"/>
-          <w:szCs w:val="20"/>
+          <w:sz w:val="18"/>
+          <w:szCs w:val="18"/>
           <w:shd w:fill="F2F2F2" w:color="auto" w:val="clear"/>
         </w:rPr>
         <w:t xml:space="preserve">  }</w:t>
@@ -942,8 +942,8 @@
       <w:r>
         <w:rPr>
           <w:rFonts w:ascii="Courier New" w:cs="Courier New" w:eastAsia="Courier New" w:hAnsi="Courier New"/>
-          <w:sz w:val="20"/>
-          <w:szCs w:val="20"/>
+          <w:sz w:val="18"/>
+          <w:szCs w:val="18"/>
           <w:shd w:fill="F2F2F2" w:color="auto" w:val="clear"/>
         </w:rPr>
         <w:t xml:space="preserve"> </w:t>
@@ -963,8 +963,8 @@
       <w:r>
         <w:rPr>
           <w:rFonts w:ascii="Courier New" w:cs="Courier New" w:eastAsia="Courier New" w:hAnsi="Courier New"/>
-          <w:sz w:val="20"/>
-          <w:szCs w:val="20"/>
+          <w:sz w:val="18"/>
+          <w:szCs w:val="18"/>
           <w:shd w:fill="F2F2F2" w:color="auto" w:val="clear"/>
         </w:rPr>
         <w:t xml:space="preserve">  pop(): number {</w:t>
@@ -984,8 +984,8 @@
       <w:r>
         <w:rPr>
           <w:rFonts w:ascii="Courier New" w:cs="Courier New" w:eastAsia="Courier New" w:hAnsi="Courier New"/>
-          <w:sz w:val="20"/>
-          <w:szCs w:val="20"/>
+          <w:sz w:val="18"/>
+          <w:szCs w:val="18"/>
           <w:shd w:fill="F2F2F2" w:color="auto" w:val="clear"/>
         </w:rPr>
         <w:t xml:space="preserve">    if (this.top &lt; 0) throw new Error("Stack underflow");</w:t>
@@ -1005,8 +1005,8 @@
       <w:r>
         <w:rPr>
           <w:rFonts w:ascii="Courier New" w:cs="Courier New" w:eastAsia="Courier New" w:hAnsi="Courier New"/>
-          <w:sz w:val="20"/>
-          <w:szCs w:val="20"/>
+          <w:sz w:val="18"/>
+          <w:szCs w:val="18"/>
           <w:shd w:fill="F2F2F2" w:color="auto" w:val="clear"/>
         </w:rPr>
         <w:t xml:space="preserve">    return this.data[this.top--];</w:t>
@@ -1026,8 +1026,8 @@
       <w:r>
         <w:rPr>
           <w:rFonts w:ascii="Courier New" w:cs="Courier New" w:eastAsia="Courier New" w:hAnsi="Courier New"/>
-          <w:sz w:val="20"/>
-          <w:szCs w:val="20"/>
+          <w:sz w:val="18"/>
+          <w:szCs w:val="18"/>
           <w:shd w:fill="F2F2F2" w:color="auto" w:val="clear"/>
         </w:rPr>
         <w:t xml:space="preserve">  }</w:t>
@@ -1062,8 +1062,8 @@
       <w:r>
         <w:rPr>
           <w:rFonts w:ascii="Courier New" w:cs="Courier New" w:eastAsia="Courier New" w:hAnsi="Courier New"/>
-          <w:sz w:val="20"/>
-          <w:szCs w:val="20"/>
+          <w:sz w:val="18"/>
+          <w:szCs w:val="18"/>
           <w:shd w:fill="F2F2F2" w:color="auto" w:val="clear"/>
         </w:rPr>
         <w:t xml:space="preserve"> </w:t>
@@ -1083,8 +1083,8 @@
       <w:r>
         <w:rPr>
           <w:rFonts w:ascii="Courier New" w:cs="Courier New" w:eastAsia="Courier New" w:hAnsi="Courier New"/>
-          <w:sz w:val="20"/>
-          <w:szCs w:val="20"/>
+          <w:sz w:val="18"/>
+          <w:szCs w:val="18"/>
           <w:shd w:fill="F2F2F2" w:color="auto" w:val="clear"/>
         </w:rPr>
         <w:t xml:space="preserve">  peek(): number {</w:t>
@@ -1104,8 +1104,8 @@
       <w:r>
         <w:rPr>
           <w:rFonts w:ascii="Courier New" w:cs="Courier New" w:eastAsia="Courier New" w:hAnsi="Courier New"/>
-          <w:sz w:val="20"/>
-          <w:szCs w:val="20"/>
+          <w:sz w:val="18"/>
+          <w:szCs w:val="18"/>
           <w:shd w:fill="F2F2F2" w:color="auto" w:val="clear"/>
         </w:rPr>
         <w:t xml:space="preserve">    if (this.top &lt; 0) throw new Error("Stack is empty");</w:t>
@@ -1125,8 +1125,8 @@
       <w:r>
         <w:rPr>
           <w:rFonts w:ascii="Courier New" w:cs="Courier New" w:eastAsia="Courier New" w:hAnsi="Courier New"/>
-          <w:sz w:val="20"/>
-          <w:szCs w:val="20"/>
+          <w:sz w:val="18"/>
+          <w:szCs w:val="18"/>
           <w:shd w:fill="F2F2F2" w:color="auto" w:val="clear"/>
         </w:rPr>
         <w:t xml:space="preserve">    return this.data[this.top];</w:t>
@@ -1146,8 +1146,8 @@
       <w:r>
         <w:rPr>
           <w:rFonts w:ascii="Courier New" w:cs="Courier New" w:eastAsia="Courier New" w:hAnsi="Courier New"/>
-          <w:sz w:val="20"/>
-          <w:szCs w:val="20"/>
+          <w:sz w:val="18"/>
+          <w:szCs w:val="18"/>
           <w:shd w:fill="F2F2F2" w:color="auto" w:val="clear"/>
         </w:rPr>
         <w:t xml:space="preserve">  }</w:t>
@@ -1167,8 +1167,8 @@
       <w:r>
         <w:rPr>
           <w:rFonts w:ascii="Courier New" w:cs="Courier New" w:eastAsia="Courier New" w:hAnsi="Courier New"/>
-          <w:sz w:val="20"/>
-          <w:szCs w:val="20"/>
+          <w:sz w:val="18"/>
+          <w:szCs w:val="18"/>
           <w:shd w:fill="F2F2F2" w:color="auto" w:val="clear"/>
         </w:rPr>
         <w:t xml:space="preserve"> </w:t>
@@ -1188,8 +1188,8 @@
       <w:r>
         <w:rPr>
           <w:rFonts w:ascii="Courier New" w:cs="Courier New" w:eastAsia="Courier New" w:hAnsi="Courier New"/>
-          <w:sz w:val="20"/>
-          <w:szCs w:val="20"/>
+          <w:sz w:val="18"/>
+          <w:szCs w:val="18"/>
           <w:shd w:fill="F2F2F2" w:color="auto" w:val="clear"/>
         </w:rPr>
         <w:t xml:space="preserve">  isEmpty(): boolean {</w:t>
@@ -1209,8 +1209,8 @@
       <w:r>
         <w:rPr>
           <w:rFonts w:ascii="Courier New" w:cs="Courier New" w:eastAsia="Courier New" w:hAnsi="Courier New"/>
-          <w:sz w:val="20"/>
-          <w:szCs w:val="20"/>
+          <w:sz w:val="18"/>
+          <w:szCs w:val="18"/>
           <w:shd w:fill="F2F2F2" w:color="auto" w:val="clear"/>
         </w:rPr>
         <w:t xml:space="preserve">    return this.top &lt; 0;</w:t>
@@ -1230,8 +1230,8 @@
       <w:r>
         <w:rPr>
           <w:rFonts w:ascii="Courier New" w:cs="Courier New" w:eastAsia="Courier New" w:hAnsi="Courier New"/>
-          <w:sz w:val="20"/>
-          <w:szCs w:val="20"/>
+          <w:sz w:val="18"/>
+          <w:szCs w:val="18"/>
           <w:shd w:fill="F2F2F2" w:color="auto" w:val="clear"/>
         </w:rPr>
         <w:t xml:space="preserve">  }</w:t>
@@ -1251,8 +1251,8 @@
       <w:r>
         <w:rPr>
           <w:rFonts w:ascii="Courier New" w:cs="Courier New" w:eastAsia="Courier New" w:hAnsi="Courier New"/>
-          <w:sz w:val="20"/>
-          <w:szCs w:val="20"/>
+          <w:sz w:val="18"/>
+          <w:szCs w:val="18"/>
           <w:shd w:fill="F2F2F2" w:color="auto" w:val="clear"/>
         </w:rPr>
         <w:t xml:space="preserve"> </w:t>
@@ -1272,8 +1272,8 @@
       <w:r>
         <w:rPr>
           <w:rFonts w:ascii="Courier New" w:cs="Courier New" w:eastAsia="Courier New" w:hAnsi="Courier New"/>
-          <w:sz w:val="20"/>
-          <w:szCs w:val="20"/>
+          <w:sz w:val="18"/>
+          <w:szCs w:val="18"/>
           <w:shd w:fill="F2F2F2" w:color="auto" w:val="clear"/>
         </w:rPr>
         <w:t xml:space="preserve">  print(): void {</w:t>
@@ -1293,8 +1293,8 @@
       <w:r>
         <w:rPr>
           <w:rFonts w:ascii="Courier New" w:cs="Courier New" w:eastAsia="Courier New" w:hAnsi="Courier New"/>
-          <w:sz w:val="20"/>
-          <w:szCs w:val="20"/>
+          <w:sz w:val="18"/>
+          <w:szCs w:val="18"/>
           <w:shd w:fill="F2F2F2" w:color="auto" w:val="clear"/>
         </w:rPr>
         <w:t xml:space="preserve">    const items: number[] = [];</w:t>
@@ -1314,8 +1314,8 @@
       <w:r>
         <w:rPr>
           <w:rFonts w:ascii="Courier New" w:cs="Courier New" w:eastAsia="Courier New" w:hAnsi="Courier New"/>
-          <w:sz w:val="20"/>
-          <w:szCs w:val="20"/>
+          <w:sz w:val="18"/>
+          <w:szCs w:val="18"/>
           <w:shd w:fill="F2F2F2" w:color="auto" w:val="clear"/>
         </w:rPr>
         <w:t xml:space="preserve">    for (let i = 0; i &lt;= this.top; i++) items.push(this.data[i]);</w:t>
@@ -1335,8 +1335,8 @@
       <w:r>
         <w:rPr>
           <w:rFonts w:ascii="Courier New" w:cs="Courier New" w:eastAsia="Courier New" w:hAnsi="Courier New"/>
-          <w:sz w:val="20"/>
-          <w:szCs w:val="20"/>
+          <w:sz w:val="18"/>
+          <w:szCs w:val="18"/>
           <w:shd w:fill="F2F2F2" w:color="auto" w:val="clear"/>
         </w:rPr>
         <w:t xml:space="preserve">    console.log(`Stack [bottom → top]: ${items.join(", ")}`);</w:t>
@@ -1356,8 +1356,8 @@
       <w:r>
         <w:rPr>
           <w:rFonts w:ascii="Courier New" w:cs="Courier New" w:eastAsia="Courier New" w:hAnsi="Courier New"/>
-          <w:sz w:val="20"/>
-          <w:szCs w:val="20"/>
+          <w:sz w:val="18"/>
+          <w:szCs w:val="18"/>
           <w:shd w:fill="F2F2F2" w:color="auto" w:val="clear"/>
         </w:rPr>
         <w:t xml:space="preserve">  }</w:t>
@@ -1377,8 +1377,8 @@
       <w:r>
         <w:rPr>
           <w:rFonts w:ascii="Courier New" w:cs="Courier New" w:eastAsia="Courier New" w:hAnsi="Courier New"/>
-          <w:sz w:val="20"/>
-          <w:szCs w:val="20"/>
+          <w:sz w:val="18"/>
+          <w:szCs w:val="18"/>
           <w:shd w:fill="F2F2F2" w:color="auto" w:val="clear"/>
         </w:rPr>
         <w:t xml:space="preserve">}</w:t>
@@ -1446,8 +1446,8 @@
       <w:r>
         <w:rPr>
           <w:rFonts w:ascii="Courier New" w:cs="Courier New" w:eastAsia="Courier New" w:hAnsi="Courier New"/>
-          <w:sz w:val="20"/>
-          <w:szCs w:val="20"/>
+          <w:sz w:val="18"/>
+          <w:szCs w:val="18"/>
           <w:shd w:fill="F2F2F2" w:color="auto" w:val="clear"/>
         </w:rPr>
         <w:t xml:space="preserve">export class ArrayQueue {</w:t>
@@ -1467,8 +1467,8 @@
       <w:r>
         <w:rPr>
           <w:rFonts w:ascii="Courier New" w:cs="Courier New" w:eastAsia="Courier New" w:hAnsi="Courier New"/>
-          <w:sz w:val="20"/>
-          <w:szCs w:val="20"/>
+          <w:sz w:val="18"/>
+          <w:szCs w:val="18"/>
           <w:shd w:fill="F2F2F2" w:color="auto" w:val="clear"/>
         </w:rPr>
         <w:t xml:space="preserve">  private data: number[];</w:t>
@@ -1488,8 +1488,8 @@
       <w:r>
         <w:rPr>
           <w:rFonts w:ascii="Courier New" w:cs="Courier New" w:eastAsia="Courier New" w:hAnsi="Courier New"/>
-          <w:sz w:val="20"/>
-          <w:szCs w:val="20"/>
+          <w:sz w:val="18"/>
+          <w:szCs w:val="18"/>
           <w:shd w:fill="F2F2F2" w:color="auto" w:val="clear"/>
         </w:rPr>
         <w:t xml:space="preserve">  private head: number;</w:t>
@@ -1509,8 +1509,8 @@
       <w:r>
         <w:rPr>
           <w:rFonts w:ascii="Courier New" w:cs="Courier New" w:eastAsia="Courier New" w:hAnsi="Courier New"/>
-          <w:sz w:val="20"/>
-          <w:szCs w:val="20"/>
+          <w:sz w:val="18"/>
+          <w:szCs w:val="18"/>
           <w:shd w:fill="F2F2F2" w:color="auto" w:val="clear"/>
         </w:rPr>
         <w:t xml:space="preserve">  private tail: number;</w:t>
@@ -1530,8 +1530,8 @@
       <w:r>
         <w:rPr>
           <w:rFonts w:ascii="Courier New" w:cs="Courier New" w:eastAsia="Courier New" w:hAnsi="Courier New"/>
-          <w:sz w:val="20"/>
-          <w:szCs w:val="20"/>
+          <w:sz w:val="18"/>
+          <w:szCs w:val="18"/>
           <w:shd w:fill="F2F2F2" w:color="auto" w:val="clear"/>
         </w:rPr>
         <w:t xml:space="preserve">  private size: number;</w:t>
@@ -1551,8 +1551,8 @@
       <w:r>
         <w:rPr>
           <w:rFonts w:ascii="Courier New" w:cs="Courier New" w:eastAsia="Courier New" w:hAnsi="Courier New"/>
-          <w:sz w:val="20"/>
-          <w:szCs w:val="20"/>
+          <w:sz w:val="18"/>
+          <w:szCs w:val="18"/>
           <w:shd w:fill="F2F2F2" w:color="auto" w:val="clear"/>
         </w:rPr>
         <w:t xml:space="preserve">  private capacity: number;</w:t>
@@ -1572,8 +1572,8 @@
       <w:r>
         <w:rPr>
           <w:rFonts w:ascii="Courier New" w:cs="Courier New" w:eastAsia="Courier New" w:hAnsi="Courier New"/>
-          <w:sz w:val="20"/>
-          <w:szCs w:val="20"/>
+          <w:sz w:val="18"/>
+          <w:szCs w:val="18"/>
           <w:shd w:fill="F2F2F2" w:color="auto" w:val="clear"/>
         </w:rPr>
         <w:t xml:space="preserve"> </w:t>
@@ -1593,8 +1593,8 @@
       <w:r>
         <w:rPr>
           <w:rFonts w:ascii="Courier New" w:cs="Courier New" w:eastAsia="Courier New" w:hAnsi="Courier New"/>
-          <w:sz w:val="20"/>
-          <w:szCs w:val="20"/>
+          <w:sz w:val="18"/>
+          <w:szCs w:val="18"/>
           <w:shd w:fill="F2F2F2" w:color="auto" w:val="clear"/>
         </w:rPr>
         <w:t xml:space="preserve">  constructor(capacity: number = 100) {</w:t>
@@ -1614,8 +1614,8 @@
       <w:r>
         <w:rPr>
           <w:rFonts w:ascii="Courier New" w:cs="Courier New" w:eastAsia="Courier New" w:hAnsi="Courier New"/>
-          <w:sz w:val="20"/>
-          <w:szCs w:val="20"/>
+          <w:sz w:val="18"/>
+          <w:szCs w:val="18"/>
           <w:shd w:fill="F2F2F2" w:color="auto" w:val="clear"/>
         </w:rPr>
         <w:t xml:space="preserve">    this.data = new Array(capacity);</w:t>
@@ -1635,8 +1635,8 @@
       <w:r>
         <w:rPr>
           <w:rFonts w:ascii="Courier New" w:cs="Courier New" w:eastAsia="Courier New" w:hAnsi="Courier New"/>
-          <w:sz w:val="20"/>
-          <w:szCs w:val="20"/>
+          <w:sz w:val="18"/>
+          <w:szCs w:val="18"/>
           <w:shd w:fill="F2F2F2" w:color="auto" w:val="clear"/>
         </w:rPr>
         <w:t xml:space="preserve">    this.head = 0;</w:t>
@@ -1656,8 +1656,8 @@
       <w:r>
         <w:rPr>
           <w:rFonts w:ascii="Courier New" w:cs="Courier New" w:eastAsia="Courier New" w:hAnsi="Courier New"/>
-          <w:sz w:val="20"/>
-          <w:szCs w:val="20"/>
+          <w:sz w:val="18"/>
+          <w:szCs w:val="18"/>
           <w:shd w:fill="F2F2F2" w:color="auto" w:val="clear"/>
         </w:rPr>
         <w:t xml:space="preserve">    this.tail = 0;</w:t>
@@ -1677,8 +1677,8 @@
       <w:r>
         <w:rPr>
           <w:rFonts w:ascii="Courier New" w:cs="Courier New" w:eastAsia="Courier New" w:hAnsi="Courier New"/>
-          <w:sz w:val="20"/>
-          <w:szCs w:val="20"/>
+          <w:sz w:val="18"/>
+          <w:szCs w:val="18"/>
           <w:shd w:fill="F2F2F2" w:color="auto" w:val="clear"/>
         </w:rPr>
         <w:t xml:space="preserve">    this.size = 0;</w:t>
@@ -1698,8 +1698,8 @@
       <w:r>
         <w:rPr>
           <w:rFonts w:ascii="Courier New" w:cs="Courier New" w:eastAsia="Courier New" w:hAnsi="Courier New"/>
-          <w:sz w:val="20"/>
-          <w:szCs w:val="20"/>
+          <w:sz w:val="18"/>
+          <w:szCs w:val="18"/>
           <w:shd w:fill="F2F2F2" w:color="auto" w:val="clear"/>
         </w:rPr>
         <w:t xml:space="preserve">    this.capacity = capacity;</w:t>
@@ -1719,8 +1719,8 @@
       <w:r>
         <w:rPr>
           <w:rFonts w:ascii="Courier New" w:cs="Courier New" w:eastAsia="Courier New" w:hAnsi="Courier New"/>
-          <w:sz w:val="20"/>
-          <w:szCs w:val="20"/>
+          <w:sz w:val="18"/>
+          <w:szCs w:val="18"/>
           <w:shd w:fill="F2F2F2" w:color="auto" w:val="clear"/>
         </w:rPr>
         <w:t xml:space="preserve">  }</w:t>
@@ -1740,8 +1740,8 @@
       <w:r>
         <w:rPr>
           <w:rFonts w:ascii="Courier New" w:cs="Courier New" w:eastAsia="Courier New" w:hAnsi="Courier New"/>
-          <w:sz w:val="20"/>
-          <w:szCs w:val="20"/>
+          <w:sz w:val="18"/>
+          <w:szCs w:val="18"/>
           <w:shd w:fill="F2F2F2" w:color="auto" w:val="clear"/>
         </w:rPr>
         <w:t xml:space="preserve"> </w:t>
@@ -1761,8 +1761,8 @@
       <w:r>
         <w:rPr>
           <w:rFonts w:ascii="Courier New" w:cs="Courier New" w:eastAsia="Courier New" w:hAnsi="Courier New"/>
-          <w:sz w:val="20"/>
-          <w:szCs w:val="20"/>
+          <w:sz w:val="18"/>
+          <w:szCs w:val="18"/>
           <w:shd w:fill="F2F2F2" w:color="auto" w:val="clear"/>
         </w:rPr>
         <w:t xml:space="preserve">  enqueue(value: number): void {</w:t>
@@ -1782,8 +1782,8 @@
       <w:r>
         <w:rPr>
           <w:rFonts w:ascii="Courier New" w:cs="Courier New" w:eastAsia="Courier New" w:hAnsi="Courier New"/>
-          <w:sz w:val="20"/>
-          <w:szCs w:val="20"/>
+          <w:sz w:val="18"/>
+          <w:szCs w:val="18"/>
           <w:shd w:fill="F2F2F2" w:color="auto" w:val="clear"/>
         </w:rPr>
         <w:t xml:space="preserve">    if (this.size &gt;= this.capacity) throw new Error("Queue overflow");</w:t>
@@ -1803,8 +1803,8 @@
       <w:r>
         <w:rPr>
           <w:rFonts w:ascii="Courier New" w:cs="Courier New" w:eastAsia="Courier New" w:hAnsi="Courier New"/>
-          <w:sz w:val="20"/>
-          <w:szCs w:val="20"/>
+          <w:sz w:val="18"/>
+          <w:szCs w:val="18"/>
           <w:shd w:fill="F2F2F2" w:color="auto" w:val="clear"/>
         </w:rPr>
         <w:t xml:space="preserve">    this.data[this.tail] = value;</w:t>
@@ -1824,8 +1824,8 @@
       <w:r>
         <w:rPr>
           <w:rFonts w:ascii="Courier New" w:cs="Courier New" w:eastAsia="Courier New" w:hAnsi="Courier New"/>
-          <w:sz w:val="20"/>
-          <w:szCs w:val="20"/>
+          <w:sz w:val="18"/>
+          <w:szCs w:val="18"/>
           <w:shd w:fill="F2F2F2" w:color="auto" w:val="clear"/>
         </w:rPr>
         <w:t xml:space="preserve">    this.tail = (this.tail + 1) % this.capacity;</w:t>
@@ -1845,8 +1845,8 @@
       <w:r>
         <w:rPr>
           <w:rFonts w:ascii="Courier New" w:cs="Courier New" w:eastAsia="Courier New" w:hAnsi="Courier New"/>
-          <w:sz w:val="20"/>
-          <w:szCs w:val="20"/>
+          <w:sz w:val="18"/>
+          <w:szCs w:val="18"/>
           <w:shd w:fill="F2F2F2" w:color="auto" w:val="clear"/>
         </w:rPr>
         <w:t xml:space="preserve">    this.size++;</w:t>
@@ -1881,8 +1881,8 @@
       <w:r>
         <w:rPr>
           <w:rFonts w:ascii="Courier New" w:cs="Courier New" w:eastAsia="Courier New" w:hAnsi="Courier New"/>
-          <w:sz w:val="20"/>
-          <w:szCs w:val="20"/>
+          <w:sz w:val="18"/>
+          <w:szCs w:val="18"/>
           <w:shd w:fill="F2F2F2" w:color="auto" w:val="clear"/>
         </w:rPr>
         <w:t xml:space="preserve">  }</w:t>
@@ -1902,8 +1902,8 @@
       <w:r>
         <w:rPr>
           <w:rFonts w:ascii="Courier New" w:cs="Courier New" w:eastAsia="Courier New" w:hAnsi="Courier New"/>
-          <w:sz w:val="20"/>
-          <w:szCs w:val="20"/>
+          <w:sz w:val="18"/>
+          <w:szCs w:val="18"/>
           <w:shd w:fill="F2F2F2" w:color="auto" w:val="clear"/>
         </w:rPr>
         <w:t xml:space="preserve"> </w:t>
@@ -1923,8 +1923,8 @@
       <w:r>
         <w:rPr>
           <w:rFonts w:ascii="Courier New" w:cs="Courier New" w:eastAsia="Courier New" w:hAnsi="Courier New"/>
-          <w:sz w:val="20"/>
-          <w:szCs w:val="20"/>
+          <w:sz w:val="18"/>
+          <w:szCs w:val="18"/>
           <w:shd w:fill="F2F2F2" w:color="auto" w:val="clear"/>
         </w:rPr>
         <w:t xml:space="preserve">  dequeue(): number {</w:t>
@@ -1944,8 +1944,8 @@
       <w:r>
         <w:rPr>
           <w:rFonts w:ascii="Courier New" w:cs="Courier New" w:eastAsia="Courier New" w:hAnsi="Courier New"/>
-          <w:sz w:val="20"/>
-          <w:szCs w:val="20"/>
+          <w:sz w:val="18"/>
+          <w:szCs w:val="18"/>
           <w:shd w:fill="F2F2F2" w:color="auto" w:val="clear"/>
         </w:rPr>
         <w:t xml:space="preserve">    if (this.size === 0) throw new Error("Queue is empty");</w:t>
@@ -1965,8 +1965,8 @@
       <w:r>
         <w:rPr>
           <w:rFonts w:ascii="Courier New" w:cs="Courier New" w:eastAsia="Courier New" w:hAnsi="Courier New"/>
-          <w:sz w:val="20"/>
-          <w:szCs w:val="20"/>
+          <w:sz w:val="18"/>
+          <w:szCs w:val="18"/>
           <w:shd w:fill="F2F2F2" w:color="auto" w:val="clear"/>
         </w:rPr>
         <w:t xml:space="preserve">    const value = this.data[this.head];</w:t>
@@ -1986,8 +1986,8 @@
       <w:r>
         <w:rPr>
           <w:rFonts w:ascii="Courier New" w:cs="Courier New" w:eastAsia="Courier New" w:hAnsi="Courier New"/>
-          <w:sz w:val="20"/>
-          <w:szCs w:val="20"/>
+          <w:sz w:val="18"/>
+          <w:szCs w:val="18"/>
           <w:shd w:fill="F2F2F2" w:color="auto" w:val="clear"/>
         </w:rPr>
         <w:t xml:space="preserve">    this.head = (this.head + 1) % this.capacity;</w:t>
@@ -2007,8 +2007,8 @@
       <w:r>
         <w:rPr>
           <w:rFonts w:ascii="Courier New" w:cs="Courier New" w:eastAsia="Courier New" w:hAnsi="Courier New"/>
-          <w:sz w:val="20"/>
-          <w:szCs w:val="20"/>
+          <w:sz w:val="18"/>
+          <w:szCs w:val="18"/>
           <w:shd w:fill="F2F2F2" w:color="auto" w:val="clear"/>
         </w:rPr>
         <w:t xml:space="preserve">    this.size--;</w:t>
@@ -2028,8 +2028,8 @@
       <w:r>
         <w:rPr>
           <w:rFonts w:ascii="Courier New" w:cs="Courier New" w:eastAsia="Courier New" w:hAnsi="Courier New"/>
-          <w:sz w:val="20"/>
-          <w:szCs w:val="20"/>
+          <w:sz w:val="18"/>
+          <w:szCs w:val="18"/>
           <w:shd w:fill="F2F2F2" w:color="auto" w:val="clear"/>
         </w:rPr>
         <w:t xml:space="preserve">    return value;</w:t>
@@ -2049,8 +2049,8 @@
       <w:r>
         <w:rPr>
           <w:rFonts w:ascii="Courier New" w:cs="Courier New" w:eastAsia="Courier New" w:hAnsi="Courier New"/>
-          <w:sz w:val="20"/>
-          <w:szCs w:val="20"/>
+          <w:sz w:val="18"/>
+          <w:szCs w:val="18"/>
           <w:shd w:fill="F2F2F2" w:color="auto" w:val="clear"/>
         </w:rPr>
         <w:t xml:space="preserve">  }</w:t>
@@ -2070,8 +2070,8 @@
       <w:r>
         <w:rPr>
           <w:rFonts w:ascii="Courier New" w:cs="Courier New" w:eastAsia="Courier New" w:hAnsi="Courier New"/>
-          <w:sz w:val="20"/>
-          <w:szCs w:val="20"/>
+          <w:sz w:val="18"/>
+          <w:szCs w:val="18"/>
           <w:shd w:fill="F2F2F2" w:color="auto" w:val="clear"/>
         </w:rPr>
         <w:t xml:space="preserve"> </w:t>
@@ -2091,8 +2091,8 @@
       <w:r>
         <w:rPr>
           <w:rFonts w:ascii="Courier New" w:cs="Courier New" w:eastAsia="Courier New" w:hAnsi="Courier New"/>
-          <w:sz w:val="20"/>
-          <w:szCs w:val="20"/>
+          <w:sz w:val="18"/>
+          <w:szCs w:val="18"/>
           <w:shd w:fill="F2F2F2" w:color="auto" w:val="clear"/>
         </w:rPr>
         <w:t xml:space="preserve">  isEmpty(): boolean {</w:t>
@@ -2112,8 +2112,8 @@
       <w:r>
         <w:rPr>
           <w:rFonts w:ascii="Courier New" w:cs="Courier New" w:eastAsia="Courier New" w:hAnsi="Courier New"/>
-          <w:sz w:val="20"/>
-          <w:szCs w:val="20"/>
+          <w:sz w:val="18"/>
+          <w:szCs w:val="18"/>
           <w:shd w:fill="F2F2F2" w:color="auto" w:val="clear"/>
         </w:rPr>
         <w:t xml:space="preserve">    return this.size === 0;</w:t>
@@ -2133,8 +2133,8 @@
       <w:r>
         <w:rPr>
           <w:rFonts w:ascii="Courier New" w:cs="Courier New" w:eastAsia="Courier New" w:hAnsi="Courier New"/>
-          <w:sz w:val="20"/>
-          <w:szCs w:val="20"/>
+          <w:sz w:val="18"/>
+          <w:szCs w:val="18"/>
           <w:shd w:fill="F2F2F2" w:color="auto" w:val="clear"/>
         </w:rPr>
         <w:t xml:space="preserve">  }</w:t>
@@ -2154,8 +2154,8 @@
       <w:r>
         <w:rPr>
           <w:rFonts w:ascii="Courier New" w:cs="Courier New" w:eastAsia="Courier New" w:hAnsi="Courier New"/>
-          <w:sz w:val="20"/>
-          <w:szCs w:val="20"/>
+          <w:sz w:val="18"/>
+          <w:szCs w:val="18"/>
           <w:shd w:fill="F2F2F2" w:color="auto" w:val="clear"/>
         </w:rPr>
         <w:t xml:space="preserve"> </w:t>
@@ -2175,8 +2175,8 @@
       <w:r>
         <w:rPr>
           <w:rFonts w:ascii="Courier New" w:cs="Courier New" w:eastAsia="Courier New" w:hAnsi="Courier New"/>
-          <w:sz w:val="20"/>
-          <w:szCs w:val="20"/>
+          <w:sz w:val="18"/>
+          <w:szCs w:val="18"/>
           <w:shd w:fill="F2F2F2" w:color="auto" w:val="clear"/>
         </w:rPr>
         <w:t xml:space="preserve">  print(): void {</w:t>
@@ -2196,8 +2196,8 @@
       <w:r>
         <w:rPr>
           <w:rFonts w:ascii="Courier New" w:cs="Courier New" w:eastAsia="Courier New" w:hAnsi="Courier New"/>
-          <w:sz w:val="20"/>
-          <w:szCs w:val="20"/>
+          <w:sz w:val="18"/>
+          <w:szCs w:val="18"/>
           <w:shd w:fill="F2F2F2" w:color="auto" w:val="clear"/>
         </w:rPr>
         <w:t xml:space="preserve">    const items: number[] = [];</w:t>
@@ -2217,8 +2217,8 @@
       <w:r>
         <w:rPr>
           <w:rFonts w:ascii="Courier New" w:cs="Courier New" w:eastAsia="Courier New" w:hAnsi="Courier New"/>
-          <w:sz w:val="20"/>
-          <w:szCs w:val="20"/>
+          <w:sz w:val="18"/>
+          <w:szCs w:val="18"/>
           <w:shd w:fill="F2F2F2" w:color="auto" w:val="clear"/>
         </w:rPr>
         <w:t xml:space="preserve">    for (let i = 0; i &lt; this.size; i++) {</w:t>
@@ -2238,8 +2238,8 @@
       <w:r>
         <w:rPr>
           <w:rFonts w:ascii="Courier New" w:cs="Courier New" w:eastAsia="Courier New" w:hAnsi="Courier New"/>
-          <w:sz w:val="20"/>
-          <w:szCs w:val="20"/>
+          <w:sz w:val="18"/>
+          <w:szCs w:val="18"/>
           <w:shd w:fill="F2F2F2" w:color="auto" w:val="clear"/>
         </w:rPr>
         <w:t xml:space="preserve">      items.push(this.data[(this.head + i) % this.capacity]);</w:t>
@@ -2259,8 +2259,8 @@
       <w:r>
         <w:rPr>
           <w:rFonts w:ascii="Courier New" w:cs="Courier New" w:eastAsia="Courier New" w:hAnsi="Courier New"/>
-          <w:sz w:val="20"/>
-          <w:szCs w:val="20"/>
+          <w:sz w:val="18"/>
+          <w:szCs w:val="18"/>
           <w:shd w:fill="F2F2F2" w:color="auto" w:val="clear"/>
         </w:rPr>
         <w:t xml:space="preserve">    }</w:t>
@@ -2280,8 +2280,8 @@
       <w:r>
         <w:rPr>
           <w:rFonts w:ascii="Courier New" w:cs="Courier New" w:eastAsia="Courier New" w:hAnsi="Courier New"/>
-          <w:sz w:val="20"/>
-          <w:szCs w:val="20"/>
+          <w:sz w:val="18"/>
+          <w:szCs w:val="18"/>
           <w:shd w:fill="F2F2F2" w:color="auto" w:val="clear"/>
         </w:rPr>
         <w:t xml:space="preserve">    console.log(`Queue [head → tail]: ${items.join(", ")}`);</w:t>
@@ -2316,8 +2316,8 @@
       <w:r>
         <w:rPr>
           <w:rFonts w:ascii="Courier New" w:cs="Courier New" w:eastAsia="Courier New" w:hAnsi="Courier New"/>
-          <w:sz w:val="20"/>
-          <w:szCs w:val="20"/>
+          <w:sz w:val="18"/>
+          <w:szCs w:val="18"/>
           <w:shd w:fill="F2F2F2" w:color="auto" w:val="clear"/>
         </w:rPr>
         <w:t xml:space="preserve">  }</w:t>
@@ -2337,8 +2337,8 @@
       <w:r>
         <w:rPr>
           <w:rFonts w:ascii="Courier New" w:cs="Courier New" w:eastAsia="Courier New" w:hAnsi="Courier New"/>
-          <w:sz w:val="20"/>
-          <w:szCs w:val="20"/>
+          <w:sz w:val="18"/>
+          <w:szCs w:val="18"/>
           <w:shd w:fill="F2F2F2" w:color="auto" w:val="clear"/>
         </w:rPr>
         <w:t xml:space="preserve">}</w:t>
@@ -2406,8 +2406,8 @@
       <w:r>
         <w:rPr>
           <w:rFonts w:ascii="Courier New" w:cs="Courier New" w:eastAsia="Courier New" w:hAnsi="Courier New"/>
-          <w:sz w:val="20"/>
-          <w:szCs w:val="20"/>
+          <w:sz w:val="18"/>
+          <w:szCs w:val="18"/>
           <w:shd w:fill="F2F2F2" w:color="auto" w:val="clear"/>
         </w:rPr>
         <w:t xml:space="preserve">class ListNode {</w:t>
@@ -2427,8 +2427,8 @@
       <w:r>
         <w:rPr>
           <w:rFonts w:ascii="Courier New" w:cs="Courier New" w:eastAsia="Courier New" w:hAnsi="Courier New"/>
-          <w:sz w:val="20"/>
-          <w:szCs w:val="20"/>
+          <w:sz w:val="18"/>
+          <w:szCs w:val="18"/>
           <w:shd w:fill="F2F2F2" w:color="auto" w:val="clear"/>
         </w:rPr>
         <w:t xml:space="preserve">  value: number;</w:t>
@@ -2448,8 +2448,8 @@
       <w:r>
         <w:rPr>
           <w:rFonts w:ascii="Courier New" w:cs="Courier New" w:eastAsia="Courier New" w:hAnsi="Courier New"/>
-          <w:sz w:val="20"/>
-          <w:szCs w:val="20"/>
+          <w:sz w:val="18"/>
+          <w:szCs w:val="18"/>
           <w:shd w:fill="F2F2F2" w:color="auto" w:val="clear"/>
         </w:rPr>
         <w:t xml:space="preserve">  next: ListNode | null;</w:t>
@@ -2469,8 +2469,8 @@
       <w:r>
         <w:rPr>
           <w:rFonts w:ascii="Courier New" w:cs="Courier New" w:eastAsia="Courier New" w:hAnsi="Courier New"/>
-          <w:sz w:val="20"/>
-          <w:szCs w:val="20"/>
+          <w:sz w:val="18"/>
+          <w:szCs w:val="18"/>
           <w:shd w:fill="F2F2F2" w:color="auto" w:val="clear"/>
         </w:rPr>
         <w:t xml:space="preserve">  constructor(value: number) {</w:t>
@@ -2490,8 +2490,8 @@
       <w:r>
         <w:rPr>
           <w:rFonts w:ascii="Courier New" w:cs="Courier New" w:eastAsia="Courier New" w:hAnsi="Courier New"/>
-          <w:sz w:val="20"/>
-          <w:szCs w:val="20"/>
+          <w:sz w:val="18"/>
+          <w:szCs w:val="18"/>
           <w:shd w:fill="F2F2F2" w:color="auto" w:val="clear"/>
         </w:rPr>
         <w:t xml:space="preserve">    this.value = value;</w:t>
@@ -2511,8 +2511,8 @@
       <w:r>
         <w:rPr>
           <w:rFonts w:ascii="Courier New" w:cs="Courier New" w:eastAsia="Courier New" w:hAnsi="Courier New"/>
-          <w:sz w:val="20"/>
-          <w:szCs w:val="20"/>
+          <w:sz w:val="18"/>
+          <w:szCs w:val="18"/>
           <w:shd w:fill="F2F2F2" w:color="auto" w:val="clear"/>
         </w:rPr>
         <w:t xml:space="preserve">    this.next = null;</w:t>
@@ -2532,8 +2532,8 @@
       <w:r>
         <w:rPr>
           <w:rFonts w:ascii="Courier New" w:cs="Courier New" w:eastAsia="Courier New" w:hAnsi="Courier New"/>
-          <w:sz w:val="20"/>
-          <w:szCs w:val="20"/>
+          <w:sz w:val="18"/>
+          <w:szCs w:val="18"/>
           <w:shd w:fill="F2F2F2" w:color="auto" w:val="clear"/>
         </w:rPr>
         <w:t xml:space="preserve">  }</w:t>
@@ -2553,8 +2553,8 @@
       <w:r>
         <w:rPr>
           <w:rFonts w:ascii="Courier New" w:cs="Courier New" w:eastAsia="Courier New" w:hAnsi="Courier New"/>
-          <w:sz w:val="20"/>
-          <w:szCs w:val="20"/>
+          <w:sz w:val="18"/>
+          <w:szCs w:val="18"/>
           <w:shd w:fill="F2F2F2" w:color="auto" w:val="clear"/>
         </w:rPr>
         <w:t xml:space="preserve">}</w:t>
@@ -2574,8 +2574,8 @@
       <w:r>
         <w:rPr>
           <w:rFonts w:ascii="Courier New" w:cs="Courier New" w:eastAsia="Courier New" w:hAnsi="Courier New"/>
-          <w:sz w:val="20"/>
-          <w:szCs w:val="20"/>
+          <w:sz w:val="18"/>
+          <w:szCs w:val="18"/>
           <w:shd w:fill="F2F2F2" w:color="auto" w:val="clear"/>
         </w:rPr>
         <w:t xml:space="preserve"> </w:t>
@@ -2595,8 +2595,8 @@
       <w:r>
         <w:rPr>
           <w:rFonts w:ascii="Courier New" w:cs="Courier New" w:eastAsia="Courier New" w:hAnsi="Courier New"/>
-          <w:sz w:val="20"/>
-          <w:szCs w:val="20"/>
+          <w:sz w:val="18"/>
+          <w:szCs w:val="18"/>
           <w:shd w:fill="F2F2F2" w:color="auto" w:val="clear"/>
         </w:rPr>
         <w:t xml:space="preserve">export class SinglyLinkedList {</w:t>
@@ -2616,8 +2616,8 @@
       <w:r>
         <w:rPr>
           <w:rFonts w:ascii="Courier New" w:cs="Courier New" w:eastAsia="Courier New" w:hAnsi="Courier New"/>
-          <w:sz w:val="20"/>
-          <w:szCs w:val="20"/>
+          <w:sz w:val="18"/>
+          <w:szCs w:val="18"/>
           <w:shd w:fill="F2F2F2" w:color="auto" w:val="clear"/>
         </w:rPr>
         <w:t xml:space="preserve">  private head: ListNode | null = null;</w:t>
@@ -2637,8 +2637,8 @@
       <w:r>
         <w:rPr>
           <w:rFonts w:ascii="Courier New" w:cs="Courier New" w:eastAsia="Courier New" w:hAnsi="Courier New"/>
-          <w:sz w:val="20"/>
-          <w:szCs w:val="20"/>
+          <w:sz w:val="18"/>
+          <w:szCs w:val="18"/>
           <w:shd w:fill="F2F2F2" w:color="auto" w:val="clear"/>
         </w:rPr>
         <w:t xml:space="preserve"> </w:t>
@@ -2658,8 +2658,8 @@
       <w:r>
         <w:rPr>
           <w:rFonts w:ascii="Courier New" w:cs="Courier New" w:eastAsia="Courier New" w:hAnsi="Courier New"/>
-          <w:sz w:val="20"/>
-          <w:szCs w:val="20"/>
+          <w:sz w:val="18"/>
+          <w:szCs w:val="18"/>
           <w:shd w:fill="F2F2F2" w:color="auto" w:val="clear"/>
         </w:rPr>
         <w:t xml:space="preserve">  append(value: number): void {</w:t>
@@ -2679,8 +2679,8 @@
       <w:r>
         <w:rPr>
           <w:rFonts w:ascii="Courier New" w:cs="Courier New" w:eastAsia="Courier New" w:hAnsi="Courier New"/>
-          <w:sz w:val="20"/>
-          <w:szCs w:val="20"/>
+          <w:sz w:val="18"/>
+          <w:szCs w:val="18"/>
           <w:shd w:fill="F2F2F2" w:color="auto" w:val="clear"/>
         </w:rPr>
         <w:t xml:space="preserve">    const node = new ListNode(value);</w:t>
@@ -2700,8 +2700,8 @@
       <w:r>
         <w:rPr>
           <w:rFonts w:ascii="Courier New" w:cs="Courier New" w:eastAsia="Courier New" w:hAnsi="Courier New"/>
-          <w:sz w:val="20"/>
-          <w:szCs w:val="20"/>
+          <w:sz w:val="18"/>
+          <w:szCs w:val="18"/>
           <w:shd w:fill="F2F2F2" w:color="auto" w:val="clear"/>
         </w:rPr>
         <w:t xml:space="preserve">    if (!this.head) {</w:t>
@@ -2721,8 +2721,8 @@
       <w:r>
         <w:rPr>
           <w:rFonts w:ascii="Courier New" w:cs="Courier New" w:eastAsia="Courier New" w:hAnsi="Courier New"/>
-          <w:sz w:val="20"/>
-          <w:szCs w:val="20"/>
+          <w:sz w:val="18"/>
+          <w:szCs w:val="18"/>
           <w:shd w:fill="F2F2F2" w:color="auto" w:val="clear"/>
         </w:rPr>
         <w:t xml:space="preserve">      this.head = node;</w:t>
@@ -2742,8 +2742,8 @@
       <w:r>
         <w:rPr>
           <w:rFonts w:ascii="Courier New" w:cs="Courier New" w:eastAsia="Courier New" w:hAnsi="Courier New"/>
-          <w:sz w:val="20"/>
-          <w:szCs w:val="20"/>
+          <w:sz w:val="18"/>
+          <w:szCs w:val="18"/>
           <w:shd w:fill="F2F2F2" w:color="auto" w:val="clear"/>
         </w:rPr>
         <w:t xml:space="preserve">      return;</w:t>
@@ -2763,8 +2763,8 @@
       <w:r>
         <w:rPr>
           <w:rFonts w:ascii="Courier New" w:cs="Courier New" w:eastAsia="Courier New" w:hAnsi="Courier New"/>
-          <w:sz w:val="20"/>
-          <w:szCs w:val="20"/>
+          <w:sz w:val="18"/>
+          <w:szCs w:val="18"/>
           <w:shd w:fill="F2F2F2" w:color="auto" w:val="clear"/>
         </w:rPr>
         <w:t xml:space="preserve">    }</w:t>
@@ -2784,8 +2784,8 @@
       <w:r>
         <w:rPr>
           <w:rFonts w:ascii="Courier New" w:cs="Courier New" w:eastAsia="Courier New" w:hAnsi="Courier New"/>
-          <w:sz w:val="20"/>
-          <w:szCs w:val="20"/>
+          <w:sz w:val="18"/>
+          <w:szCs w:val="18"/>
           <w:shd w:fill="F2F2F2" w:color="auto" w:val="clear"/>
         </w:rPr>
         <w:t xml:space="preserve">    let current = this.head;</w:t>
@@ -2805,8 +2805,8 @@
       <w:r>
         <w:rPr>
           <w:rFonts w:ascii="Courier New" w:cs="Courier New" w:eastAsia="Courier New" w:hAnsi="Courier New"/>
-          <w:sz w:val="20"/>
-          <w:szCs w:val="20"/>
+          <w:sz w:val="18"/>
+          <w:szCs w:val="18"/>
           <w:shd w:fill="F2F2F2" w:color="auto" w:val="clear"/>
         </w:rPr>
         <w:t xml:space="preserve">    while (current.next) current = current.next;</w:t>
@@ -2841,8 +2841,8 @@
       <w:r>
         <w:rPr>
           <w:rFonts w:ascii="Courier New" w:cs="Courier New" w:eastAsia="Courier New" w:hAnsi="Courier New"/>
-          <w:sz w:val="20"/>
-          <w:szCs w:val="20"/>
+          <w:sz w:val="18"/>
+          <w:szCs w:val="18"/>
           <w:shd w:fill="F2F2F2" w:color="auto" w:val="clear"/>
         </w:rPr>
         <w:t xml:space="preserve">    current.next = node;</w:t>
@@ -2862,8 +2862,8 @@
       <w:r>
         <w:rPr>
           <w:rFonts w:ascii="Courier New" w:cs="Courier New" w:eastAsia="Courier New" w:hAnsi="Courier New"/>
-          <w:sz w:val="20"/>
-          <w:szCs w:val="20"/>
+          <w:sz w:val="18"/>
+          <w:szCs w:val="18"/>
           <w:shd w:fill="F2F2F2" w:color="auto" w:val="clear"/>
         </w:rPr>
         <w:t xml:space="preserve">  }</w:t>
@@ -2883,8 +2883,8 @@
       <w:r>
         <w:rPr>
           <w:rFonts w:ascii="Courier New" w:cs="Courier New" w:eastAsia="Courier New" w:hAnsi="Courier New"/>
-          <w:sz w:val="20"/>
-          <w:szCs w:val="20"/>
+          <w:sz w:val="18"/>
+          <w:szCs w:val="18"/>
           <w:shd w:fill="F2F2F2" w:color="auto" w:val="clear"/>
         </w:rPr>
         <w:t xml:space="preserve"> </w:t>
@@ -2904,8 +2904,8 @@
       <w:r>
         <w:rPr>
           <w:rFonts w:ascii="Courier New" w:cs="Courier New" w:eastAsia="Courier New" w:hAnsi="Courier New"/>
-          <w:sz w:val="20"/>
-          <w:szCs w:val="20"/>
+          <w:sz w:val="18"/>
+          <w:szCs w:val="18"/>
           <w:shd w:fill="F2F2F2" w:color="auto" w:val="clear"/>
         </w:rPr>
         <w:t xml:space="preserve">  print(): void {</w:t>
@@ -2925,8 +2925,8 @@
       <w:r>
         <w:rPr>
           <w:rFonts w:ascii="Courier New" w:cs="Courier New" w:eastAsia="Courier New" w:hAnsi="Courier New"/>
-          <w:sz w:val="20"/>
-          <w:szCs w:val="20"/>
+          <w:sz w:val="18"/>
+          <w:szCs w:val="18"/>
           <w:shd w:fill="F2F2F2" w:color="auto" w:val="clear"/>
         </w:rPr>
         <w:t xml:space="preserve">    const items: number[] = [];</w:t>
@@ -2946,8 +2946,8 @@
       <w:r>
         <w:rPr>
           <w:rFonts w:ascii="Courier New" w:cs="Courier New" w:eastAsia="Courier New" w:hAnsi="Courier New"/>
-          <w:sz w:val="20"/>
-          <w:szCs w:val="20"/>
+          <w:sz w:val="18"/>
+          <w:szCs w:val="18"/>
           <w:shd w:fill="F2F2F2" w:color="auto" w:val="clear"/>
         </w:rPr>
         <w:t xml:space="preserve">    let current = this.head;</w:t>
@@ -2967,8 +2967,8 @@
       <w:r>
         <w:rPr>
           <w:rFonts w:ascii="Courier New" w:cs="Courier New" w:eastAsia="Courier New" w:hAnsi="Courier New"/>
-          <w:sz w:val="20"/>
-          <w:szCs w:val="20"/>
+          <w:sz w:val="18"/>
+          <w:szCs w:val="18"/>
           <w:shd w:fill="F2F2F2" w:color="auto" w:val="clear"/>
         </w:rPr>
         <w:t xml:space="preserve">    while (current) {</w:t>
@@ -2988,8 +2988,8 @@
       <w:r>
         <w:rPr>
           <w:rFonts w:ascii="Courier New" w:cs="Courier New" w:eastAsia="Courier New" w:hAnsi="Courier New"/>
-          <w:sz w:val="20"/>
-          <w:szCs w:val="20"/>
+          <w:sz w:val="18"/>
+          <w:szCs w:val="18"/>
           <w:shd w:fill="F2F2F2" w:color="auto" w:val="clear"/>
         </w:rPr>
         <w:t xml:space="preserve">      items.push(current.value);</w:t>
@@ -3009,8 +3009,8 @@
       <w:r>
         <w:rPr>
           <w:rFonts w:ascii="Courier New" w:cs="Courier New" w:eastAsia="Courier New" w:hAnsi="Courier New"/>
-          <w:sz w:val="20"/>
-          <w:szCs w:val="20"/>
+          <w:sz w:val="18"/>
+          <w:szCs w:val="18"/>
           <w:shd w:fill="F2F2F2" w:color="auto" w:val="clear"/>
         </w:rPr>
         <w:t xml:space="preserve">      current = current.next;</w:t>
@@ -3030,8 +3030,8 @@
       <w:r>
         <w:rPr>
           <w:rFonts w:ascii="Courier New" w:cs="Courier New" w:eastAsia="Courier New" w:hAnsi="Courier New"/>
-          <w:sz w:val="20"/>
-          <w:szCs w:val="20"/>
+          <w:sz w:val="18"/>
+          <w:szCs w:val="18"/>
           <w:shd w:fill="F2F2F2" w:color="auto" w:val="clear"/>
         </w:rPr>
         <w:t xml:space="preserve">    }</w:t>
@@ -3051,8 +3051,8 @@
       <w:r>
         <w:rPr>
           <w:rFonts w:ascii="Courier New" w:cs="Courier New" w:eastAsia="Courier New" w:hAnsi="Courier New"/>
-          <w:sz w:val="20"/>
-          <w:szCs w:val="20"/>
+          <w:sz w:val="18"/>
+          <w:szCs w:val="18"/>
           <w:shd w:fill="F2F2F2" w:color="auto" w:val="clear"/>
         </w:rPr>
         <w:t xml:space="preserve">    console.log(`List: ${items.join(" → ")} → null`);</w:t>
@@ -3072,8 +3072,8 @@
       <w:r>
         <w:rPr>
           <w:rFonts w:ascii="Courier New" w:cs="Courier New" w:eastAsia="Courier New" w:hAnsi="Courier New"/>
-          <w:sz w:val="20"/>
-          <w:szCs w:val="20"/>
+          <w:sz w:val="18"/>
+          <w:szCs w:val="18"/>
           <w:shd w:fill="F2F2F2" w:color="auto" w:val="clear"/>
         </w:rPr>
         <w:t xml:space="preserve">  }</w:t>
@@ -3093,8 +3093,8 @@
       <w:r>
         <w:rPr>
           <w:rFonts w:ascii="Courier New" w:cs="Courier New" w:eastAsia="Courier New" w:hAnsi="Courier New"/>
-          <w:sz w:val="20"/>
-          <w:szCs w:val="20"/>
+          <w:sz w:val="18"/>
+          <w:szCs w:val="18"/>
           <w:shd w:fill="F2F2F2" w:color="auto" w:val="clear"/>
         </w:rPr>
         <w:t xml:space="preserve">}</w:t>
@@ -3162,8 +3162,8 @@
       <w:r>
         <w:rPr>
           <w:rFonts w:ascii="Courier New" w:cs="Courier New" w:eastAsia="Courier New" w:hAnsi="Courier New"/>
-          <w:sz w:val="20"/>
-          <w:szCs w:val="20"/>
+          <w:sz w:val="18"/>
+          <w:szCs w:val="18"/>
           <w:shd w:fill="F2F2F2" w:color="auto" w:val="clear"/>
         </w:rPr>
         <w:t xml:space="preserve">Лабораторна робота №2 — Структури даних</w:t>
@@ -3183,8 +3183,8 @@
       <w:r>
         <w:rPr>
           <w:rFonts w:ascii="Courier New" w:cs="Courier New" w:eastAsia="Courier New" w:hAnsi="Courier New"/>
-          <w:sz w:val="20"/>
-          <w:szCs w:val="20"/>
+          <w:sz w:val="18"/>
+          <w:szCs w:val="18"/>
           <w:shd w:fill="F2F2F2" w:color="auto" w:val="clear"/>
         </w:rPr>
         <w:t xml:space="preserve">Варіант 9</w:t>
@@ -3204,8 +3204,8 @@
       <w:r>
         <w:rPr>
           <w:rFonts w:ascii="Courier New" w:cs="Courier New" w:eastAsia="Courier New" w:hAnsi="Courier New"/>
-          <w:sz w:val="20"/>
-          <w:szCs w:val="20"/>
+          <w:sz w:val="18"/>
+          <w:szCs w:val="18"/>
           <w:shd w:fill="F2F2F2" w:color="auto" w:val="clear"/>
         </w:rPr>
         <w:t xml:space="preserve"> </w:t>
@@ -3225,8 +3225,8 @@
       <w:r>
         <w:rPr>
           <w:rFonts w:ascii="Courier New" w:cs="Courier New" w:eastAsia="Courier New" w:hAnsi="Courier New"/>
-          <w:sz w:val="20"/>
-          <w:szCs w:val="20"/>
+          <w:sz w:val="18"/>
+          <w:szCs w:val="18"/>
           <w:shd w:fill="F2F2F2" w:color="auto" w:val="clear"/>
         </w:rPr>
         <w:t xml:space="preserve">=== Завдання 1: Стек на основі масиву ===</w:t>
@@ -3246,8 +3246,8 @@
       <w:r>
         <w:rPr>
           <w:rFonts w:ascii="Courier New" w:cs="Courier New" w:eastAsia="Courier New" w:hAnsi="Courier New"/>
-          <w:sz w:val="20"/>
-          <w:szCs w:val="20"/>
+          <w:sz w:val="18"/>
+          <w:szCs w:val="18"/>
           <w:shd w:fill="F2F2F2" w:color="auto" w:val="clear"/>
         </w:rPr>
         <w:t xml:space="preserve"> </w:t>
@@ -3267,8 +3267,8 @@
       <w:r>
         <w:rPr>
           <w:rFonts w:ascii="Courier New" w:cs="Courier New" w:eastAsia="Courier New" w:hAnsi="Courier New"/>
-          <w:sz w:val="20"/>
-          <w:szCs w:val="20"/>
+          <w:sz w:val="18"/>
+          <w:szCs w:val="18"/>
           <w:shd w:fill="F2F2F2" w:color="auto" w:val="clear"/>
         </w:rPr>
         <w:t xml:space="preserve">PUSH 5 елементів:</w:t>
@@ -3288,8 +3288,8 @@
       <w:r>
         <w:rPr>
           <w:rFonts w:ascii="Courier New" w:cs="Courier New" w:eastAsia="Courier New" w:hAnsi="Courier New"/>
-          <w:sz w:val="20"/>
-          <w:szCs w:val="20"/>
+          <w:sz w:val="18"/>
+          <w:szCs w:val="18"/>
           <w:shd w:fill="F2F2F2" w:color="auto" w:val="clear"/>
         </w:rPr>
         <w:t xml:space="preserve">  push(10)</w:t>
@@ -3309,8 +3309,8 @@
       <w:r>
         <w:rPr>
           <w:rFonts w:ascii="Courier New" w:cs="Courier New" w:eastAsia="Courier New" w:hAnsi="Courier New"/>
-          <w:sz w:val="20"/>
-          <w:szCs w:val="20"/>
+          <w:sz w:val="18"/>
+          <w:szCs w:val="18"/>
           <w:shd w:fill="F2F2F2" w:color="auto" w:val="clear"/>
         </w:rPr>
         <w:t xml:space="preserve">  push(20)</w:t>
@@ -3330,8 +3330,8 @@
       <w:r>
         <w:rPr>
           <w:rFonts w:ascii="Courier New" w:cs="Courier New" w:eastAsia="Courier New" w:hAnsi="Courier New"/>
-          <w:sz w:val="20"/>
-          <w:szCs w:val="20"/>
+          <w:sz w:val="18"/>
+          <w:szCs w:val="18"/>
           <w:shd w:fill="F2F2F2" w:color="auto" w:val="clear"/>
         </w:rPr>
         <w:t xml:space="preserve">  push(30)</w:t>
@@ -3351,8 +3351,8 @@
       <w:r>
         <w:rPr>
           <w:rFonts w:ascii="Courier New" w:cs="Courier New" w:eastAsia="Courier New" w:hAnsi="Courier New"/>
-          <w:sz w:val="20"/>
-          <w:szCs w:val="20"/>
+          <w:sz w:val="18"/>
+          <w:szCs w:val="18"/>
           <w:shd w:fill="F2F2F2" w:color="auto" w:val="clear"/>
         </w:rPr>
         <w:t xml:space="preserve">  push(40)</w:t>
@@ -3372,8 +3372,8 @@
       <w:r>
         <w:rPr>
           <w:rFonts w:ascii="Courier New" w:cs="Courier New" w:eastAsia="Courier New" w:hAnsi="Courier New"/>
-          <w:sz w:val="20"/>
-          <w:szCs w:val="20"/>
+          <w:sz w:val="18"/>
+          <w:szCs w:val="18"/>
           <w:shd w:fill="F2F2F2" w:color="auto" w:val="clear"/>
         </w:rPr>
         <w:t xml:space="preserve">  push(50)</w:t>
@@ -3393,8 +3393,8 @@
       <w:r>
         <w:rPr>
           <w:rFonts w:ascii="Courier New" w:cs="Courier New" w:eastAsia="Courier New" w:hAnsi="Courier New"/>
-          <w:sz w:val="20"/>
-          <w:szCs w:val="20"/>
+          <w:sz w:val="18"/>
+          <w:szCs w:val="18"/>
           <w:shd w:fill="F2F2F2" w:color="auto" w:val="clear"/>
         </w:rPr>
         <w:t xml:space="preserve">Stack [bottom → top]: 10, 20, 30, 40, 50</w:t>
@@ -3414,8 +3414,8 @@
       <w:r>
         <w:rPr>
           <w:rFonts w:ascii="Courier New" w:cs="Courier New" w:eastAsia="Courier New" w:hAnsi="Courier New"/>
-          <w:sz w:val="20"/>
-          <w:szCs w:val="20"/>
+          <w:sz w:val="18"/>
+          <w:szCs w:val="18"/>
           <w:shd w:fill="F2F2F2" w:color="auto" w:val="clear"/>
         </w:rPr>
         <w:t xml:space="preserve"> </w:t>
@@ -3435,8 +3435,8 @@
       <w:r>
         <w:rPr>
           <w:rFonts w:ascii="Courier New" w:cs="Courier New" w:eastAsia="Courier New" w:hAnsi="Courier New"/>
-          <w:sz w:val="20"/>
-          <w:szCs w:val="20"/>
+          <w:sz w:val="18"/>
+          <w:szCs w:val="18"/>
           <w:shd w:fill="F2F2F2" w:color="auto" w:val="clear"/>
         </w:rPr>
         <w:t xml:space="preserve">POP 2 елементи:</w:t>
@@ -3456,8 +3456,8 @@
       <w:r>
         <w:rPr>
           <w:rFonts w:ascii="Courier New" w:cs="Courier New" w:eastAsia="Courier New" w:hAnsi="Courier New"/>
-          <w:sz w:val="20"/>
-          <w:szCs w:val="20"/>
+          <w:sz w:val="18"/>
+          <w:szCs w:val="18"/>
           <w:shd w:fill="F2F2F2" w:color="auto" w:val="clear"/>
         </w:rPr>
         <w:t xml:space="preserve">  pop() → 50</w:t>
@@ -3477,8 +3477,8 @@
       <w:r>
         <w:rPr>
           <w:rFonts w:ascii="Courier New" w:cs="Courier New" w:eastAsia="Courier New" w:hAnsi="Courier New"/>
-          <w:sz w:val="20"/>
-          <w:szCs w:val="20"/>
+          <w:sz w:val="18"/>
+          <w:szCs w:val="18"/>
           <w:shd w:fill="F2F2F2" w:color="auto" w:val="clear"/>
         </w:rPr>
         <w:t xml:space="preserve">  pop() → 40</w:t>
@@ -3498,8 +3498,8 @@
       <w:r>
         <w:rPr>
           <w:rFonts w:ascii="Courier New" w:cs="Courier New" w:eastAsia="Courier New" w:hAnsi="Courier New"/>
-          <w:sz w:val="20"/>
-          <w:szCs w:val="20"/>
+          <w:sz w:val="18"/>
+          <w:szCs w:val="18"/>
           <w:shd w:fill="F2F2F2" w:color="auto" w:val="clear"/>
         </w:rPr>
         <w:t xml:space="preserve"> </w:t>
@@ -3519,8 +3519,8 @@
       <w:r>
         <w:rPr>
           <w:rFonts w:ascii="Courier New" w:cs="Courier New" w:eastAsia="Courier New" w:hAnsi="Courier New"/>
-          <w:sz w:val="20"/>
-          <w:szCs w:val="20"/>
+          <w:sz w:val="18"/>
+          <w:szCs w:val="18"/>
           <w:shd w:fill="F2F2F2" w:color="auto" w:val="clear"/>
         </w:rPr>
         <w:t xml:space="preserve">Залишок стеку:</w:t>
@@ -3540,8 +3540,8 @@
       <w:r>
         <w:rPr>
           <w:rFonts w:ascii="Courier New" w:cs="Courier New" w:eastAsia="Courier New" w:hAnsi="Courier New"/>
-          <w:sz w:val="20"/>
-          <w:szCs w:val="20"/>
+          <w:sz w:val="18"/>
+          <w:szCs w:val="18"/>
           <w:shd w:fill="F2F2F2" w:color="auto" w:val="clear"/>
         </w:rPr>
         <w:t xml:space="preserve">Stack [bottom → top]: 10, 20, 30</w:t>
@@ -3561,8 +3561,8 @@
       <w:r>
         <w:rPr>
           <w:rFonts w:ascii="Courier New" w:cs="Courier New" w:eastAsia="Courier New" w:hAnsi="Courier New"/>
-          <w:sz w:val="20"/>
-          <w:szCs w:val="20"/>
+          <w:sz w:val="18"/>
+          <w:szCs w:val="18"/>
           <w:shd w:fill="F2F2F2" w:color="auto" w:val="clear"/>
         </w:rPr>
         <w:t xml:space="preserve"> </w:t>
@@ -3597,8 +3597,8 @@
       <w:r>
         <w:rPr>
           <w:rFonts w:ascii="Courier New" w:cs="Courier New" w:eastAsia="Courier New" w:hAnsi="Courier New"/>
-          <w:sz w:val="20"/>
-          <w:szCs w:val="20"/>
+          <w:sz w:val="18"/>
+          <w:szCs w:val="18"/>
           <w:shd w:fill="F2F2F2" w:color="auto" w:val="clear"/>
         </w:rPr>
         <w:t xml:space="preserve">=== Завдання 2: Черга на основі масиву ===</w:t>
@@ -3618,8 +3618,8 @@
       <w:r>
         <w:rPr>
           <w:rFonts w:ascii="Courier New" w:cs="Courier New" w:eastAsia="Courier New" w:hAnsi="Courier New"/>
-          <w:sz w:val="20"/>
-          <w:szCs w:val="20"/>
+          <w:sz w:val="18"/>
+          <w:szCs w:val="18"/>
           <w:shd w:fill="F2F2F2" w:color="auto" w:val="clear"/>
         </w:rPr>
         <w:t xml:space="preserve"> </w:t>
@@ -3639,8 +3639,8 @@
       <w:r>
         <w:rPr>
           <w:rFonts w:ascii="Courier New" w:cs="Courier New" w:eastAsia="Courier New" w:hAnsi="Courier New"/>
-          <w:sz w:val="20"/>
-          <w:szCs w:val="20"/>
+          <w:sz w:val="18"/>
+          <w:szCs w:val="18"/>
           <w:shd w:fill="F2F2F2" w:color="auto" w:val="clear"/>
         </w:rPr>
         <w:t xml:space="preserve">ENQUEUE 5 елементів:</w:t>
@@ -3660,8 +3660,8 @@
       <w:r>
         <w:rPr>
           <w:rFonts w:ascii="Courier New" w:cs="Courier New" w:eastAsia="Courier New" w:hAnsi="Courier New"/>
-          <w:sz w:val="20"/>
-          <w:szCs w:val="20"/>
+          <w:sz w:val="18"/>
+          <w:szCs w:val="18"/>
           <w:shd w:fill="F2F2F2" w:color="auto" w:val="clear"/>
         </w:rPr>
         <w:t xml:space="preserve">  enqueue(10)</w:t>
@@ -3681,8 +3681,8 @@
       <w:r>
         <w:rPr>
           <w:rFonts w:ascii="Courier New" w:cs="Courier New" w:eastAsia="Courier New" w:hAnsi="Courier New"/>
-          <w:sz w:val="20"/>
-          <w:szCs w:val="20"/>
+          <w:sz w:val="18"/>
+          <w:szCs w:val="18"/>
           <w:shd w:fill="F2F2F2" w:color="auto" w:val="clear"/>
         </w:rPr>
         <w:t xml:space="preserve">  enqueue(20)</w:t>
@@ -3702,8 +3702,8 @@
       <w:r>
         <w:rPr>
           <w:rFonts w:ascii="Courier New" w:cs="Courier New" w:eastAsia="Courier New" w:hAnsi="Courier New"/>
-          <w:sz w:val="20"/>
-          <w:szCs w:val="20"/>
+          <w:sz w:val="18"/>
+          <w:szCs w:val="18"/>
           <w:shd w:fill="F2F2F2" w:color="auto" w:val="clear"/>
         </w:rPr>
         <w:t xml:space="preserve">  enqueue(30)</w:t>
@@ -3723,8 +3723,8 @@
       <w:r>
         <w:rPr>
           <w:rFonts w:ascii="Courier New" w:cs="Courier New" w:eastAsia="Courier New" w:hAnsi="Courier New"/>
-          <w:sz w:val="20"/>
-          <w:szCs w:val="20"/>
+          <w:sz w:val="18"/>
+          <w:szCs w:val="18"/>
           <w:shd w:fill="F2F2F2" w:color="auto" w:val="clear"/>
         </w:rPr>
         <w:t xml:space="preserve">  enqueue(40)</w:t>
@@ -3744,8 +3744,8 @@
       <w:r>
         <w:rPr>
           <w:rFonts w:ascii="Courier New" w:cs="Courier New" w:eastAsia="Courier New" w:hAnsi="Courier New"/>
-          <w:sz w:val="20"/>
-          <w:szCs w:val="20"/>
+          <w:sz w:val="18"/>
+          <w:szCs w:val="18"/>
           <w:shd w:fill="F2F2F2" w:color="auto" w:val="clear"/>
         </w:rPr>
         <w:t xml:space="preserve">  enqueue(50)</w:t>
@@ -3765,8 +3765,8 @@
       <w:r>
         <w:rPr>
           <w:rFonts w:ascii="Courier New" w:cs="Courier New" w:eastAsia="Courier New" w:hAnsi="Courier New"/>
-          <w:sz w:val="20"/>
-          <w:szCs w:val="20"/>
+          <w:sz w:val="18"/>
+          <w:szCs w:val="18"/>
           <w:shd w:fill="F2F2F2" w:color="auto" w:val="clear"/>
         </w:rPr>
         <w:t xml:space="preserve">Queue [head → tail]: 10, 20, 30, 40, 50</w:t>
@@ -3786,8 +3786,8 @@
       <w:r>
         <w:rPr>
           <w:rFonts w:ascii="Courier New" w:cs="Courier New" w:eastAsia="Courier New" w:hAnsi="Courier New"/>
-          <w:sz w:val="20"/>
-          <w:szCs w:val="20"/>
+          <w:sz w:val="18"/>
+          <w:szCs w:val="18"/>
           <w:shd w:fill="F2F2F2" w:color="auto" w:val="clear"/>
         </w:rPr>
         <w:t xml:space="preserve"> </w:t>
@@ -3807,8 +3807,8 @@
       <w:r>
         <w:rPr>
           <w:rFonts w:ascii="Courier New" w:cs="Courier New" w:eastAsia="Courier New" w:hAnsi="Courier New"/>
-          <w:sz w:val="20"/>
-          <w:szCs w:val="20"/>
+          <w:sz w:val="18"/>
+          <w:szCs w:val="18"/>
           <w:shd w:fill="F2F2F2" w:color="auto" w:val="clear"/>
         </w:rPr>
         <w:t xml:space="preserve">DEQUEUE 2 елементи:</w:t>
@@ -3828,8 +3828,8 @@
       <w:r>
         <w:rPr>
           <w:rFonts w:ascii="Courier New" w:cs="Courier New" w:eastAsia="Courier New" w:hAnsi="Courier New"/>
-          <w:sz w:val="20"/>
-          <w:szCs w:val="20"/>
+          <w:sz w:val="18"/>
+          <w:szCs w:val="18"/>
           <w:shd w:fill="F2F2F2" w:color="auto" w:val="clear"/>
         </w:rPr>
         <w:t xml:space="preserve">  dequeue() → 10</w:t>
@@ -3849,8 +3849,8 @@
       <w:r>
         <w:rPr>
           <w:rFonts w:ascii="Courier New" w:cs="Courier New" w:eastAsia="Courier New" w:hAnsi="Courier New"/>
-          <w:sz w:val="20"/>
-          <w:szCs w:val="20"/>
+          <w:sz w:val="18"/>
+          <w:szCs w:val="18"/>
           <w:shd w:fill="F2F2F2" w:color="auto" w:val="clear"/>
         </w:rPr>
         <w:t xml:space="preserve">  dequeue() → 20</w:t>
@@ -3870,8 +3870,8 @@
       <w:r>
         <w:rPr>
           <w:rFonts w:ascii="Courier New" w:cs="Courier New" w:eastAsia="Courier New" w:hAnsi="Courier New"/>
-          <w:sz w:val="20"/>
-          <w:szCs w:val="20"/>
+          <w:sz w:val="18"/>
+          <w:szCs w:val="18"/>
           <w:shd w:fill="F2F2F2" w:color="auto" w:val="clear"/>
         </w:rPr>
         <w:t xml:space="preserve"> </w:t>
@@ -3891,8 +3891,8 @@
       <w:r>
         <w:rPr>
           <w:rFonts w:ascii="Courier New" w:cs="Courier New" w:eastAsia="Courier New" w:hAnsi="Courier New"/>
-          <w:sz w:val="20"/>
-          <w:szCs w:val="20"/>
+          <w:sz w:val="18"/>
+          <w:szCs w:val="18"/>
           <w:shd w:fill="F2F2F2" w:color="auto" w:val="clear"/>
         </w:rPr>
         <w:t xml:space="preserve">Залишок черги:</w:t>
@@ -3912,8 +3912,8 @@
       <w:r>
         <w:rPr>
           <w:rFonts w:ascii="Courier New" w:cs="Courier New" w:eastAsia="Courier New" w:hAnsi="Courier New"/>
-          <w:sz w:val="20"/>
-          <w:szCs w:val="20"/>
+          <w:sz w:val="18"/>
+          <w:szCs w:val="18"/>
           <w:shd w:fill="F2F2F2" w:color="auto" w:val="clear"/>
         </w:rPr>
         <w:t xml:space="preserve">Queue [head → tail]: 30, 40, 50</w:t>
@@ -3933,8 +3933,8 @@
       <w:r>
         <w:rPr>
           <w:rFonts w:ascii="Courier New" w:cs="Courier New" w:eastAsia="Courier New" w:hAnsi="Courier New"/>
-          <w:sz w:val="20"/>
-          <w:szCs w:val="20"/>
+          <w:sz w:val="18"/>
+          <w:szCs w:val="18"/>
           <w:shd w:fill="F2F2F2" w:color="auto" w:val="clear"/>
         </w:rPr>
         <w:t xml:space="preserve"> </w:t>
@@ -3954,8 +3954,8 @@
       <w:r>
         <w:rPr>
           <w:rFonts w:ascii="Courier New" w:cs="Courier New" w:eastAsia="Courier New" w:hAnsi="Courier New"/>
-          <w:sz w:val="20"/>
-          <w:szCs w:val="20"/>
+          <w:sz w:val="18"/>
+          <w:szCs w:val="18"/>
           <w:shd w:fill="F2F2F2" w:color="auto" w:val="clear"/>
         </w:rPr>
         <w:t xml:space="preserve">=== Завдання 3: Зв'язковий список ===</w:t>
@@ -3975,8 +3975,8 @@
       <w:r>
         <w:rPr>
           <w:rFonts w:ascii="Courier New" w:cs="Courier New" w:eastAsia="Courier New" w:hAnsi="Courier New"/>
-          <w:sz w:val="20"/>
-          <w:szCs w:val="20"/>
+          <w:sz w:val="18"/>
+          <w:szCs w:val="18"/>
           <w:shd w:fill="F2F2F2" w:color="auto" w:val="clear"/>
         </w:rPr>
         <w:t xml:space="preserve"> </w:t>
@@ -3996,8 +3996,8 @@
       <w:r>
         <w:rPr>
           <w:rFonts w:ascii="Courier New" w:cs="Courier New" w:eastAsia="Courier New" w:hAnsi="Courier New"/>
-          <w:sz w:val="20"/>
-          <w:szCs w:val="20"/>
+          <w:sz w:val="18"/>
+          <w:szCs w:val="18"/>
           <w:shd w:fill="F2F2F2" w:color="auto" w:val="clear"/>
         </w:rPr>
         <w:t xml:space="preserve">Створення списку з 5 елементів:</w:t>
@@ -4032,8 +4032,8 @@
       <w:r>
         <w:rPr>
           <w:rFonts w:ascii="Courier New" w:cs="Courier New" w:eastAsia="Courier New" w:hAnsi="Courier New"/>
-          <w:sz w:val="20"/>
-          <w:szCs w:val="20"/>
+          <w:sz w:val="18"/>
+          <w:szCs w:val="18"/>
           <w:shd w:fill="F2F2F2" w:color="auto" w:val="clear"/>
         </w:rPr>
         <w:t xml:space="preserve">  append(10)</w:t>
@@ -4053,8 +4053,8 @@
       <w:r>
         <w:rPr>
           <w:rFonts w:ascii="Courier New" w:cs="Courier New" w:eastAsia="Courier New" w:hAnsi="Courier New"/>
-          <w:sz w:val="20"/>
-          <w:szCs w:val="20"/>
+          <w:sz w:val="18"/>
+          <w:szCs w:val="18"/>
           <w:shd w:fill="F2F2F2" w:color="auto" w:val="clear"/>
         </w:rPr>
         <w:t xml:space="preserve">  append(20)</w:t>
@@ -4074,8 +4074,8 @@
       <w:r>
         <w:rPr>
           <w:rFonts w:ascii="Courier New" w:cs="Courier New" w:eastAsia="Courier New" w:hAnsi="Courier New"/>
-          <w:sz w:val="20"/>
-          <w:szCs w:val="20"/>
+          <w:sz w:val="18"/>
+          <w:szCs w:val="18"/>
           <w:shd w:fill="F2F2F2" w:color="auto" w:val="clear"/>
         </w:rPr>
         <w:t xml:space="preserve">  append(30)</w:t>
@@ -4095,8 +4095,8 @@
       <w:r>
         <w:rPr>
           <w:rFonts w:ascii="Courier New" w:cs="Courier New" w:eastAsia="Courier New" w:hAnsi="Courier New"/>
-          <w:sz w:val="20"/>
-          <w:szCs w:val="20"/>
+          <w:sz w:val="18"/>
+          <w:szCs w:val="18"/>
           <w:shd w:fill="F2F2F2" w:color="auto" w:val="clear"/>
         </w:rPr>
         <w:t xml:space="preserve">  append(40)</w:t>
@@ -4116,8 +4116,8 @@
       <w:r>
         <w:rPr>
           <w:rFonts w:ascii="Courier New" w:cs="Courier New" w:eastAsia="Courier New" w:hAnsi="Courier New"/>
-          <w:sz w:val="20"/>
-          <w:szCs w:val="20"/>
+          <w:sz w:val="18"/>
+          <w:szCs w:val="18"/>
           <w:shd w:fill="F2F2F2" w:color="auto" w:val="clear"/>
         </w:rPr>
         <w:t xml:space="preserve">  append(50)</w:t>
@@ -4137,8 +4137,8 @@
       <w:r>
         <w:rPr>
           <w:rFonts w:ascii="Courier New" w:cs="Courier New" w:eastAsia="Courier New" w:hAnsi="Courier New"/>
-          <w:sz w:val="20"/>
-          <w:szCs w:val="20"/>
+          <w:sz w:val="18"/>
+          <w:szCs w:val="18"/>
           <w:shd w:fill="F2F2F2" w:color="auto" w:val="clear"/>
         </w:rPr>
         <w:t xml:space="preserve"> </w:t>
@@ -4158,8 +4158,8 @@
       <w:r>
         <w:rPr>
           <w:rFonts w:ascii="Courier New" w:cs="Courier New" w:eastAsia="Courier New" w:hAnsi="Courier New"/>
-          <w:sz w:val="20"/>
-          <w:szCs w:val="20"/>
+          <w:sz w:val="18"/>
+          <w:szCs w:val="18"/>
           <w:shd w:fill="F2F2F2" w:color="auto" w:val="clear"/>
         </w:rPr>
         <w:t xml:space="preserve">Список:</w:t>
@@ -4179,8 +4179,8 @@
       <w:r>
         <w:rPr>
           <w:rFonts w:ascii="Courier New" w:cs="Courier New" w:eastAsia="Courier New" w:hAnsi="Courier New"/>
-          <w:sz w:val="20"/>
-          <w:szCs w:val="20"/>
+          <w:sz w:val="18"/>
+          <w:szCs w:val="18"/>
           <w:shd w:fill="F2F2F2" w:color="auto" w:val="clear"/>
         </w:rPr>
         <w:t xml:space="preserve">List: 10 → 20 → 30 → 40 → 50 → null</w:t>
@@ -4298,8 +4298,8 @@
       <w:r>
         <w:rPr>
           <w:rFonts w:ascii="Courier New" w:cs="Courier New" w:eastAsia="Courier New" w:hAnsi="Courier New"/>
-          <w:sz w:val="20"/>
-          <w:szCs w:val="20"/>
+          <w:sz w:val="18"/>
+          <w:szCs w:val="18"/>
           <w:shd w:fill="F2F2F2" w:color="auto" w:val="clear"/>
         </w:rPr>
         <w:t xml:space="preserve">import { SinglyLinkedList } from "./structures/linked-list.ts";</w:t>
@@ -4319,8 +4319,8 @@
       <w:r>
         <w:rPr>
           <w:rFonts w:ascii="Courier New" w:cs="Courier New" w:eastAsia="Courier New" w:hAnsi="Courier New"/>
-          <w:sz w:val="20"/>
-          <w:szCs w:val="20"/>
+          <w:sz w:val="18"/>
+          <w:szCs w:val="18"/>
           <w:shd w:fill="F2F2F2" w:color="auto" w:val="clear"/>
         </w:rPr>
         <w:t xml:space="preserve"> </w:t>
@@ -4340,8 +4340,8 @@
       <w:r>
         <w:rPr>
           <w:rFonts w:ascii="Courier New" w:cs="Courier New" w:eastAsia="Courier New" w:hAnsi="Courier New"/>
-          <w:sz w:val="20"/>
-          <w:szCs w:val="20"/>
+          <w:sz w:val="18"/>
+          <w:szCs w:val="18"/>
           <w:shd w:fill="F2F2F2" w:color="auto" w:val="clear"/>
         </w:rPr>
         <w:t xml:space="preserve">export function demoList(): void {</w:t>
@@ -4361,8 +4361,8 @@
       <w:r>
         <w:rPr>
           <w:rFonts w:ascii="Courier New" w:cs="Courier New" w:eastAsia="Courier New" w:hAnsi="Courier New"/>
-          <w:sz w:val="20"/>
-          <w:szCs w:val="20"/>
+          <w:sz w:val="18"/>
+          <w:szCs w:val="18"/>
           <w:shd w:fill="F2F2F2" w:color="auto" w:val="clear"/>
         </w:rPr>
         <w:t xml:space="preserve">  console.log("=== Завдання 3: Зв'язковий список ===\n");</w:t>
@@ -4382,8 +4382,8 @@
       <w:r>
         <w:rPr>
           <w:rFonts w:ascii="Courier New" w:cs="Courier New" w:eastAsia="Courier New" w:hAnsi="Courier New"/>
-          <w:sz w:val="20"/>
-          <w:szCs w:val="20"/>
+          <w:sz w:val="18"/>
+          <w:szCs w:val="18"/>
           <w:shd w:fill="F2F2F2" w:color="auto" w:val="clear"/>
         </w:rPr>
         <w:t xml:space="preserve">  const list = new SinglyLinkedList();</w:t>
@@ -4403,8 +4403,8 @@
       <w:r>
         <w:rPr>
           <w:rFonts w:ascii="Courier New" w:cs="Courier New" w:eastAsia="Courier New" w:hAnsi="Courier New"/>
-          <w:sz w:val="20"/>
-          <w:szCs w:val="20"/>
+          <w:sz w:val="18"/>
+          <w:szCs w:val="18"/>
           <w:shd w:fill="F2F2F2" w:color="auto" w:val="clear"/>
         </w:rPr>
         <w:t xml:space="preserve"> </w:t>
@@ -4424,8 +4424,8 @@
       <w:r>
         <w:rPr>
           <w:rFonts w:ascii="Courier New" w:cs="Courier New" w:eastAsia="Courier New" w:hAnsi="Courier New"/>
-          <w:sz w:val="20"/>
-          <w:szCs w:val="20"/>
+          <w:sz w:val="18"/>
+          <w:szCs w:val="18"/>
           <w:shd w:fill="F2F2F2" w:color="auto" w:val="clear"/>
         </w:rPr>
         <w:t xml:space="preserve">  console.log("Створення списку з 5 елементів:");</w:t>
@@ -4445,8 +4445,8 @@
       <w:r>
         <w:rPr>
           <w:rFonts w:ascii="Courier New" w:cs="Courier New" w:eastAsia="Courier New" w:hAnsi="Courier New"/>
-          <w:sz w:val="20"/>
-          <w:szCs w:val="20"/>
+          <w:sz w:val="18"/>
+          <w:szCs w:val="18"/>
           <w:shd w:fill="F2F2F2" w:color="auto" w:val="clear"/>
         </w:rPr>
         <w:t xml:space="preserve">  for (const v of [10, 20, 30, 40, 50]) {</w:t>
@@ -4466,8 +4466,8 @@
       <w:r>
         <w:rPr>
           <w:rFonts w:ascii="Courier New" w:cs="Courier New" w:eastAsia="Courier New" w:hAnsi="Courier New"/>
-          <w:sz w:val="20"/>
-          <w:szCs w:val="20"/>
+          <w:sz w:val="18"/>
+          <w:szCs w:val="18"/>
           <w:shd w:fill="F2F2F2" w:color="auto" w:val="clear"/>
         </w:rPr>
         <w:t xml:space="preserve">    list.append(v);</w:t>
@@ -4487,8 +4487,8 @@
       <w:r>
         <w:rPr>
           <w:rFonts w:ascii="Courier New" w:cs="Courier New" w:eastAsia="Courier New" w:hAnsi="Courier New"/>
-          <w:sz w:val="20"/>
-          <w:szCs w:val="20"/>
+          <w:sz w:val="18"/>
+          <w:szCs w:val="18"/>
           <w:shd w:fill="F2F2F2" w:color="auto" w:val="clear"/>
         </w:rPr>
         <w:t xml:space="preserve">    console.log(`  append(${v})`);</w:t>
@@ -4508,8 +4508,8 @@
       <w:r>
         <w:rPr>
           <w:rFonts w:ascii="Courier New" w:cs="Courier New" w:eastAsia="Courier New" w:hAnsi="Courier New"/>
-          <w:sz w:val="20"/>
-          <w:szCs w:val="20"/>
+          <w:sz w:val="18"/>
+          <w:szCs w:val="18"/>
           <w:shd w:fill="F2F2F2" w:color="auto" w:val="clear"/>
         </w:rPr>
         <w:t xml:space="preserve">  }</w:t>
@@ -4529,8 +4529,8 @@
       <w:r>
         <w:rPr>
           <w:rFonts w:ascii="Courier New" w:cs="Courier New" w:eastAsia="Courier New" w:hAnsi="Courier New"/>
-          <w:sz w:val="20"/>
-          <w:szCs w:val="20"/>
+          <w:sz w:val="18"/>
+          <w:szCs w:val="18"/>
           <w:shd w:fill="F2F2F2" w:color="auto" w:val="clear"/>
         </w:rPr>
         <w:t xml:space="preserve"> </w:t>
@@ -4550,8 +4550,8 @@
       <w:r>
         <w:rPr>
           <w:rFonts w:ascii="Courier New" w:cs="Courier New" w:eastAsia="Courier New" w:hAnsi="Courier New"/>
-          <w:sz w:val="20"/>
-          <w:szCs w:val="20"/>
+          <w:sz w:val="18"/>
+          <w:szCs w:val="18"/>
           <w:shd w:fill="F2F2F2" w:color="auto" w:val="clear"/>
         </w:rPr>
         <w:t xml:space="preserve">  console.log("\nСписок:");</w:t>
@@ -4571,8 +4571,8 @@
       <w:r>
         <w:rPr>
           <w:rFonts w:ascii="Courier New" w:cs="Courier New" w:eastAsia="Courier New" w:hAnsi="Courier New"/>
-          <w:sz w:val="20"/>
-          <w:szCs w:val="20"/>
+          <w:sz w:val="18"/>
+          <w:szCs w:val="18"/>
           <w:shd w:fill="F2F2F2" w:color="auto" w:val="clear"/>
         </w:rPr>
         <w:t xml:space="preserve">  list.print();</w:t>
@@ -4592,8 +4592,8 @@
       <w:r>
         <w:rPr>
           <w:rFonts w:ascii="Courier New" w:cs="Courier New" w:eastAsia="Courier New" w:hAnsi="Courier New"/>
-          <w:sz w:val="20"/>
-          <w:szCs w:val="20"/>
+          <w:sz w:val="18"/>
+          <w:szCs w:val="18"/>
           <w:shd w:fill="F2F2F2" w:color="auto" w:val="clear"/>
         </w:rPr>
         <w:t xml:space="preserve">}</w:t>
@@ -4644,8 +4644,8 @@
       <w:r>
         <w:rPr>
           <w:rFonts w:ascii="Courier New" w:cs="Courier New" w:eastAsia="Courier New" w:hAnsi="Courier New"/>
-          <w:sz w:val="20"/>
-          <w:szCs w:val="20"/>
+          <w:sz w:val="18"/>
+          <w:szCs w:val="18"/>
           <w:shd w:fill="F2F2F2" w:color="auto" w:val="clear"/>
         </w:rPr>
         <w:t xml:space="preserve">import { ArrayQueue } from "./structures/queue.ts";</w:t>
@@ -4665,8 +4665,8 @@
       <w:r>
         <w:rPr>
           <w:rFonts w:ascii="Courier New" w:cs="Courier New" w:eastAsia="Courier New" w:hAnsi="Courier New"/>
-          <w:sz w:val="20"/>
-          <w:szCs w:val="20"/>
+          <w:sz w:val="18"/>
+          <w:szCs w:val="18"/>
           <w:shd w:fill="F2F2F2" w:color="auto" w:val="clear"/>
         </w:rPr>
         <w:t xml:space="preserve"> </w:t>
@@ -4686,8 +4686,8 @@
       <w:r>
         <w:rPr>
           <w:rFonts w:ascii="Courier New" w:cs="Courier New" w:eastAsia="Courier New" w:hAnsi="Courier New"/>
-          <w:sz w:val="20"/>
-          <w:szCs w:val="20"/>
+          <w:sz w:val="18"/>
+          <w:szCs w:val="18"/>
           <w:shd w:fill="F2F2F2" w:color="auto" w:val="clear"/>
         </w:rPr>
         <w:t xml:space="preserve">export function demoQueue(): void {</w:t>
@@ -4707,8 +4707,8 @@
       <w:r>
         <w:rPr>
           <w:rFonts w:ascii="Courier New" w:cs="Courier New" w:eastAsia="Courier New" w:hAnsi="Courier New"/>
-          <w:sz w:val="20"/>
-          <w:szCs w:val="20"/>
+          <w:sz w:val="18"/>
+          <w:szCs w:val="18"/>
           <w:shd w:fill="F2F2F2" w:color="auto" w:val="clear"/>
         </w:rPr>
         <w:t xml:space="preserve">  console.log("=== Завдання 2: Черга на основі масиву ===\n");</w:t>
@@ -4728,8 +4728,8 @@
       <w:r>
         <w:rPr>
           <w:rFonts w:ascii="Courier New" w:cs="Courier New" w:eastAsia="Courier New" w:hAnsi="Courier New"/>
-          <w:sz w:val="20"/>
-          <w:szCs w:val="20"/>
+          <w:sz w:val="18"/>
+          <w:szCs w:val="18"/>
           <w:shd w:fill="F2F2F2" w:color="auto" w:val="clear"/>
         </w:rPr>
         <w:t xml:space="preserve">  const queue = new ArrayQueue();</w:t>
@@ -4749,8 +4749,8 @@
       <w:r>
         <w:rPr>
           <w:rFonts w:ascii="Courier New" w:cs="Courier New" w:eastAsia="Courier New" w:hAnsi="Courier New"/>
-          <w:sz w:val="20"/>
-          <w:szCs w:val="20"/>
+          <w:sz w:val="18"/>
+          <w:szCs w:val="18"/>
           <w:shd w:fill="F2F2F2" w:color="auto" w:val="clear"/>
         </w:rPr>
         <w:t xml:space="preserve">  const values = [10, 20, 30, 40, 50];</w:t>
@@ -4770,8 +4770,8 @@
       <w:r>
         <w:rPr>
           <w:rFonts w:ascii="Courier New" w:cs="Courier New" w:eastAsia="Courier New" w:hAnsi="Courier New"/>
-          <w:sz w:val="20"/>
-          <w:szCs w:val="20"/>
+          <w:sz w:val="18"/>
+          <w:szCs w:val="18"/>
           <w:shd w:fill="F2F2F2" w:color="auto" w:val="clear"/>
         </w:rPr>
         <w:t xml:space="preserve"> </w:t>
@@ -4791,8 +4791,8 @@
       <w:r>
         <w:rPr>
           <w:rFonts w:ascii="Courier New" w:cs="Courier New" w:eastAsia="Courier New" w:hAnsi="Courier New"/>
-          <w:sz w:val="20"/>
-          <w:szCs w:val="20"/>
+          <w:sz w:val="18"/>
+          <w:szCs w:val="18"/>
           <w:shd w:fill="F2F2F2" w:color="auto" w:val="clear"/>
         </w:rPr>
         <w:t xml:space="preserve">  console.log("ENQUEUE 5 елементів:");</w:t>
@@ -4812,8 +4812,8 @@
       <w:r>
         <w:rPr>
           <w:rFonts w:ascii="Courier New" w:cs="Courier New" w:eastAsia="Courier New" w:hAnsi="Courier New"/>
-          <w:sz w:val="20"/>
-          <w:szCs w:val="20"/>
+          <w:sz w:val="18"/>
+          <w:szCs w:val="18"/>
           <w:shd w:fill="F2F2F2" w:color="auto" w:val="clear"/>
         </w:rPr>
         <w:t xml:space="preserve">  for (const v of values) {</w:t>
@@ -4833,8 +4833,8 @@
       <w:r>
         <w:rPr>
           <w:rFonts w:ascii="Courier New" w:cs="Courier New" w:eastAsia="Courier New" w:hAnsi="Courier New"/>
-          <w:sz w:val="20"/>
-          <w:szCs w:val="20"/>
+          <w:sz w:val="18"/>
+          <w:szCs w:val="18"/>
           <w:shd w:fill="F2F2F2" w:color="auto" w:val="clear"/>
         </w:rPr>
         <w:t xml:space="preserve">    queue.enqueue(v);</w:t>
@@ -4854,8 +4854,8 @@
       <w:r>
         <w:rPr>
           <w:rFonts w:ascii="Courier New" w:cs="Courier New" w:eastAsia="Courier New" w:hAnsi="Courier New"/>
-          <w:sz w:val="20"/>
-          <w:szCs w:val="20"/>
+          <w:sz w:val="18"/>
+          <w:szCs w:val="18"/>
           <w:shd w:fill="F2F2F2" w:color="auto" w:val="clear"/>
         </w:rPr>
         <w:t xml:space="preserve">    console.log(`  enqueue(${v})`);</w:t>
@@ -4875,8 +4875,8 @@
       <w:r>
         <w:rPr>
           <w:rFonts w:ascii="Courier New" w:cs="Courier New" w:eastAsia="Courier New" w:hAnsi="Courier New"/>
-          <w:sz w:val="20"/>
-          <w:szCs w:val="20"/>
+          <w:sz w:val="18"/>
+          <w:szCs w:val="18"/>
           <w:shd w:fill="F2F2F2" w:color="auto" w:val="clear"/>
         </w:rPr>
         <w:t xml:space="preserve">  }</w:t>
@@ -4896,8 +4896,8 @@
       <w:r>
         <w:rPr>
           <w:rFonts w:ascii="Courier New" w:cs="Courier New" w:eastAsia="Courier New" w:hAnsi="Courier New"/>
-          <w:sz w:val="20"/>
-          <w:szCs w:val="20"/>
+          <w:sz w:val="18"/>
+          <w:szCs w:val="18"/>
           <w:shd w:fill="F2F2F2" w:color="auto" w:val="clear"/>
         </w:rPr>
         <w:t xml:space="preserve">  queue.print();</w:t>
@@ -4917,8 +4917,8 @@
       <w:r>
         <w:rPr>
           <w:rFonts w:ascii="Courier New" w:cs="Courier New" w:eastAsia="Courier New" w:hAnsi="Courier New"/>
-          <w:sz w:val="20"/>
-          <w:szCs w:val="20"/>
+          <w:sz w:val="18"/>
+          <w:szCs w:val="18"/>
           <w:shd w:fill="F2F2F2" w:color="auto" w:val="clear"/>
         </w:rPr>
         <w:t xml:space="preserve"> </w:t>
@@ -4938,8 +4938,8 @@
       <w:r>
         <w:rPr>
           <w:rFonts w:ascii="Courier New" w:cs="Courier New" w:eastAsia="Courier New" w:hAnsi="Courier New"/>
-          <w:sz w:val="20"/>
-          <w:szCs w:val="20"/>
+          <w:sz w:val="18"/>
+          <w:szCs w:val="18"/>
           <w:shd w:fill="F2F2F2" w:color="auto" w:val="clear"/>
         </w:rPr>
         <w:t xml:space="preserve">  console.log("\nDEQUEUE 2 елементи:");</w:t>
@@ -4959,8 +4959,8 @@
       <w:r>
         <w:rPr>
           <w:rFonts w:ascii="Courier New" w:cs="Courier New" w:eastAsia="Courier New" w:hAnsi="Courier New"/>
-          <w:sz w:val="20"/>
-          <w:szCs w:val="20"/>
+          <w:sz w:val="18"/>
+          <w:szCs w:val="18"/>
           <w:shd w:fill="F2F2F2" w:color="auto" w:val="clear"/>
         </w:rPr>
         <w:t xml:space="preserve">  console.log(`  dequeue() → ${queue.dequeue()}`);</w:t>
@@ -4980,8 +4980,8 @@
       <w:r>
         <w:rPr>
           <w:rFonts w:ascii="Courier New" w:cs="Courier New" w:eastAsia="Courier New" w:hAnsi="Courier New"/>
-          <w:sz w:val="20"/>
-          <w:szCs w:val="20"/>
+          <w:sz w:val="18"/>
+          <w:szCs w:val="18"/>
           <w:shd w:fill="F2F2F2" w:color="auto" w:val="clear"/>
         </w:rPr>
         <w:t xml:space="preserve">  console.log(`  dequeue() → ${queue.dequeue()}`);</w:t>
@@ -5001,8 +5001,8 @@
       <w:r>
         <w:rPr>
           <w:rFonts w:ascii="Courier New" w:cs="Courier New" w:eastAsia="Courier New" w:hAnsi="Courier New"/>
-          <w:sz w:val="20"/>
-          <w:szCs w:val="20"/>
+          <w:sz w:val="18"/>
+          <w:szCs w:val="18"/>
           <w:shd w:fill="F2F2F2" w:color="auto" w:val="clear"/>
         </w:rPr>
         <w:t xml:space="preserve"> </w:t>
@@ -5022,8 +5022,8 @@
       <w:r>
         <w:rPr>
           <w:rFonts w:ascii="Courier New" w:cs="Courier New" w:eastAsia="Courier New" w:hAnsi="Courier New"/>
-          <w:sz w:val="20"/>
-          <w:szCs w:val="20"/>
+          <w:sz w:val="18"/>
+          <w:szCs w:val="18"/>
           <w:shd w:fill="F2F2F2" w:color="auto" w:val="clear"/>
         </w:rPr>
         <w:t xml:space="preserve">  console.log("\nЗалишок черги:");</w:t>
@@ -5043,8 +5043,8 @@
       <w:r>
         <w:rPr>
           <w:rFonts w:ascii="Courier New" w:cs="Courier New" w:eastAsia="Courier New" w:hAnsi="Courier New"/>
-          <w:sz w:val="20"/>
-          <w:szCs w:val="20"/>
+          <w:sz w:val="18"/>
+          <w:szCs w:val="18"/>
           <w:shd w:fill="F2F2F2" w:color="auto" w:val="clear"/>
         </w:rPr>
         <w:t xml:space="preserve">  queue.print();</w:t>
@@ -5079,8 +5079,8 @@
       <w:r>
         <w:rPr>
           <w:rFonts w:ascii="Courier New" w:cs="Courier New" w:eastAsia="Courier New" w:hAnsi="Courier New"/>
-          <w:sz w:val="20"/>
-          <w:szCs w:val="20"/>
+          <w:sz w:val="18"/>
+          <w:szCs w:val="18"/>
           <w:shd w:fill="F2F2F2" w:color="auto" w:val="clear"/>
         </w:rPr>
         <w:t xml:space="preserve">}</w:t>
@@ -5131,8 +5131,8 @@
       <w:r>
         <w:rPr>
           <w:rFonts w:ascii="Courier New" w:cs="Courier New" w:eastAsia="Courier New" w:hAnsi="Courier New"/>
-          <w:sz w:val="20"/>
-          <w:szCs w:val="20"/>
+          <w:sz w:val="18"/>
+          <w:szCs w:val="18"/>
           <w:shd w:fill="F2F2F2" w:color="auto" w:val="clear"/>
         </w:rPr>
         <w:t xml:space="preserve">import { ArrayStack } from "./structures/stack.ts";</w:t>
@@ -5152,8 +5152,8 @@
       <w:r>
         <w:rPr>
           <w:rFonts w:ascii="Courier New" w:cs="Courier New" w:eastAsia="Courier New" w:hAnsi="Courier New"/>
-          <w:sz w:val="20"/>
-          <w:szCs w:val="20"/>
+          <w:sz w:val="18"/>
+          <w:szCs w:val="18"/>
           <w:shd w:fill="F2F2F2" w:color="auto" w:val="clear"/>
         </w:rPr>
         <w:t xml:space="preserve"> </w:t>
@@ -5173,8 +5173,8 @@
       <w:r>
         <w:rPr>
           <w:rFonts w:ascii="Courier New" w:cs="Courier New" w:eastAsia="Courier New" w:hAnsi="Courier New"/>
-          <w:sz w:val="20"/>
-          <w:szCs w:val="20"/>
+          <w:sz w:val="18"/>
+          <w:szCs w:val="18"/>
           <w:shd w:fill="F2F2F2" w:color="auto" w:val="clear"/>
         </w:rPr>
         <w:t xml:space="preserve">export function demoStack(): void {</w:t>
@@ -5194,8 +5194,8 @@
       <w:r>
         <w:rPr>
           <w:rFonts w:ascii="Courier New" w:cs="Courier New" w:eastAsia="Courier New" w:hAnsi="Courier New"/>
-          <w:sz w:val="20"/>
-          <w:szCs w:val="20"/>
+          <w:sz w:val="18"/>
+          <w:szCs w:val="18"/>
           <w:shd w:fill="F2F2F2" w:color="auto" w:val="clear"/>
         </w:rPr>
         <w:t xml:space="preserve">  console.log("=== Завдання 1: Стек на основі масиву ===\n");</w:t>
@@ -5215,8 +5215,8 @@
       <w:r>
         <w:rPr>
           <w:rFonts w:ascii="Courier New" w:cs="Courier New" w:eastAsia="Courier New" w:hAnsi="Courier New"/>
-          <w:sz w:val="20"/>
-          <w:szCs w:val="20"/>
+          <w:sz w:val="18"/>
+          <w:szCs w:val="18"/>
           <w:shd w:fill="F2F2F2" w:color="auto" w:val="clear"/>
         </w:rPr>
         <w:t xml:space="preserve">  const stack = new ArrayStack();</w:t>
@@ -5236,8 +5236,8 @@
       <w:r>
         <w:rPr>
           <w:rFonts w:ascii="Courier New" w:cs="Courier New" w:eastAsia="Courier New" w:hAnsi="Courier New"/>
-          <w:sz w:val="20"/>
-          <w:szCs w:val="20"/>
+          <w:sz w:val="18"/>
+          <w:szCs w:val="18"/>
           <w:shd w:fill="F2F2F2" w:color="auto" w:val="clear"/>
         </w:rPr>
         <w:t xml:space="preserve">  const values = [10, 20, 30, 40, 50];</w:t>
@@ -5257,8 +5257,8 @@
       <w:r>
         <w:rPr>
           <w:rFonts w:ascii="Courier New" w:cs="Courier New" w:eastAsia="Courier New" w:hAnsi="Courier New"/>
-          <w:sz w:val="20"/>
-          <w:szCs w:val="20"/>
+          <w:sz w:val="18"/>
+          <w:szCs w:val="18"/>
           <w:shd w:fill="F2F2F2" w:color="auto" w:val="clear"/>
         </w:rPr>
         <w:t xml:space="preserve"> </w:t>
@@ -5278,8 +5278,8 @@
       <w:r>
         <w:rPr>
           <w:rFonts w:ascii="Courier New" w:cs="Courier New" w:eastAsia="Courier New" w:hAnsi="Courier New"/>
-          <w:sz w:val="20"/>
-          <w:szCs w:val="20"/>
+          <w:sz w:val="18"/>
+          <w:szCs w:val="18"/>
           <w:shd w:fill="F2F2F2" w:color="auto" w:val="clear"/>
         </w:rPr>
         <w:t xml:space="preserve">  console.log("PUSH 5 елементів:");</w:t>
@@ -5299,8 +5299,8 @@
       <w:r>
         <w:rPr>
           <w:rFonts w:ascii="Courier New" w:cs="Courier New" w:eastAsia="Courier New" w:hAnsi="Courier New"/>
-          <w:sz w:val="20"/>
-          <w:szCs w:val="20"/>
+          <w:sz w:val="18"/>
+          <w:szCs w:val="18"/>
           <w:shd w:fill="F2F2F2" w:color="auto" w:val="clear"/>
         </w:rPr>
         <w:t xml:space="preserve">  for (const v of values) {</w:t>
@@ -5320,8 +5320,8 @@
       <w:r>
         <w:rPr>
           <w:rFonts w:ascii="Courier New" w:cs="Courier New" w:eastAsia="Courier New" w:hAnsi="Courier New"/>
-          <w:sz w:val="20"/>
-          <w:szCs w:val="20"/>
+          <w:sz w:val="18"/>
+          <w:szCs w:val="18"/>
           <w:shd w:fill="F2F2F2" w:color="auto" w:val="clear"/>
         </w:rPr>
         <w:t xml:space="preserve">    stack.push(v);</w:t>
@@ -5341,8 +5341,8 @@
       <w:r>
         <w:rPr>
           <w:rFonts w:ascii="Courier New" w:cs="Courier New" w:eastAsia="Courier New" w:hAnsi="Courier New"/>
-          <w:sz w:val="20"/>
-          <w:szCs w:val="20"/>
+          <w:sz w:val="18"/>
+          <w:szCs w:val="18"/>
           <w:shd w:fill="F2F2F2" w:color="auto" w:val="clear"/>
         </w:rPr>
         <w:t xml:space="preserve">    console.log(`  push(${v})`);</w:t>
@@ -5362,8 +5362,8 @@
       <w:r>
         <w:rPr>
           <w:rFonts w:ascii="Courier New" w:cs="Courier New" w:eastAsia="Courier New" w:hAnsi="Courier New"/>
-          <w:sz w:val="20"/>
-          <w:szCs w:val="20"/>
+          <w:sz w:val="18"/>
+          <w:szCs w:val="18"/>
           <w:shd w:fill="F2F2F2" w:color="auto" w:val="clear"/>
         </w:rPr>
         <w:t xml:space="preserve">  }</w:t>
@@ -5383,8 +5383,8 @@
       <w:r>
         <w:rPr>
           <w:rFonts w:ascii="Courier New" w:cs="Courier New" w:eastAsia="Courier New" w:hAnsi="Courier New"/>
-          <w:sz w:val="20"/>
-          <w:szCs w:val="20"/>
+          <w:sz w:val="18"/>
+          <w:szCs w:val="18"/>
           <w:shd w:fill="F2F2F2" w:color="auto" w:val="clear"/>
         </w:rPr>
         <w:t xml:space="preserve">  stack.print();</w:t>
@@ -5404,8 +5404,8 @@
       <w:r>
         <w:rPr>
           <w:rFonts w:ascii="Courier New" w:cs="Courier New" w:eastAsia="Courier New" w:hAnsi="Courier New"/>
-          <w:sz w:val="20"/>
-          <w:szCs w:val="20"/>
+          <w:sz w:val="18"/>
+          <w:szCs w:val="18"/>
           <w:shd w:fill="F2F2F2" w:color="auto" w:val="clear"/>
         </w:rPr>
         <w:t xml:space="preserve"> </w:t>
@@ -5425,8 +5425,8 @@
       <w:r>
         <w:rPr>
           <w:rFonts w:ascii="Courier New" w:cs="Courier New" w:eastAsia="Courier New" w:hAnsi="Courier New"/>
-          <w:sz w:val="20"/>
-          <w:szCs w:val="20"/>
+          <w:sz w:val="18"/>
+          <w:szCs w:val="18"/>
           <w:shd w:fill="F2F2F2" w:color="auto" w:val="clear"/>
         </w:rPr>
         <w:t xml:space="preserve">  console.log("\nPOP 2 елементи:");</w:t>
@@ -5446,8 +5446,8 @@
       <w:r>
         <w:rPr>
           <w:rFonts w:ascii="Courier New" w:cs="Courier New" w:eastAsia="Courier New" w:hAnsi="Courier New"/>
-          <w:sz w:val="20"/>
-          <w:szCs w:val="20"/>
+          <w:sz w:val="18"/>
+          <w:szCs w:val="18"/>
           <w:shd w:fill="F2F2F2" w:color="auto" w:val="clear"/>
         </w:rPr>
         <w:t xml:space="preserve">  console.log(`  pop() → ${stack.pop()}`);</w:t>
@@ -5467,8 +5467,8 @@
       <w:r>
         <w:rPr>
           <w:rFonts w:ascii="Courier New" w:cs="Courier New" w:eastAsia="Courier New" w:hAnsi="Courier New"/>
-          <w:sz w:val="20"/>
-          <w:szCs w:val="20"/>
+          <w:sz w:val="18"/>
+          <w:szCs w:val="18"/>
           <w:shd w:fill="F2F2F2" w:color="auto" w:val="clear"/>
         </w:rPr>
         <w:t xml:space="preserve">  console.log(`  pop() → ${stack.pop()}`);</w:t>
@@ -5488,8 +5488,8 @@
       <w:r>
         <w:rPr>
           <w:rFonts w:ascii="Courier New" w:cs="Courier New" w:eastAsia="Courier New" w:hAnsi="Courier New"/>
-          <w:sz w:val="20"/>
-          <w:szCs w:val="20"/>
+          <w:sz w:val="18"/>
+          <w:szCs w:val="18"/>
           <w:shd w:fill="F2F2F2" w:color="auto" w:val="clear"/>
         </w:rPr>
         <w:t xml:space="preserve"> </w:t>
@@ -5509,8 +5509,8 @@
       <w:r>
         <w:rPr>
           <w:rFonts w:ascii="Courier New" w:cs="Courier New" w:eastAsia="Courier New" w:hAnsi="Courier New"/>
-          <w:sz w:val="20"/>
-          <w:szCs w:val="20"/>
+          <w:sz w:val="18"/>
+          <w:szCs w:val="18"/>
           <w:shd w:fill="F2F2F2" w:color="auto" w:val="clear"/>
         </w:rPr>
         <w:t xml:space="preserve">  console.log("\nЗалишок стеку:");</w:t>
@@ -5530,8 +5530,8 @@
       <w:r>
         <w:rPr>
           <w:rFonts w:ascii="Courier New" w:cs="Courier New" w:eastAsia="Courier New" w:hAnsi="Courier New"/>
-          <w:sz w:val="20"/>
-          <w:szCs w:val="20"/>
+          <w:sz w:val="18"/>
+          <w:szCs w:val="18"/>
           <w:shd w:fill="F2F2F2" w:color="auto" w:val="clear"/>
         </w:rPr>
         <w:t xml:space="preserve">  stack.print();</w:t>
@@ -5566,8 +5566,8 @@
       <w:r>
         <w:rPr>
           <w:rFonts w:ascii="Courier New" w:cs="Courier New" w:eastAsia="Courier New" w:hAnsi="Courier New"/>
-          <w:sz w:val="20"/>
-          <w:szCs w:val="20"/>
+          <w:sz w:val="18"/>
+          <w:szCs w:val="18"/>
           <w:shd w:fill="F2F2F2" w:color="auto" w:val="clear"/>
         </w:rPr>
         <w:t xml:space="preserve">}</w:t>
@@ -5618,8 +5618,8 @@
       <w:r>
         <w:rPr>
           <w:rFonts w:ascii="Courier New" w:cs="Courier New" w:eastAsia="Courier New" w:hAnsi="Courier New"/>
-          <w:sz w:val="20"/>
-          <w:szCs w:val="20"/>
+          <w:sz w:val="18"/>
+          <w:szCs w:val="18"/>
           <w:shd w:fill="F2F2F2" w:color="auto" w:val="clear"/>
         </w:rPr>
         <w:t xml:space="preserve">import { demoStack } from "./demo-stack.ts";</w:t>
@@ -5639,8 +5639,8 @@
       <w:r>
         <w:rPr>
           <w:rFonts w:ascii="Courier New" w:cs="Courier New" w:eastAsia="Courier New" w:hAnsi="Courier New"/>
-          <w:sz w:val="20"/>
-          <w:szCs w:val="20"/>
+          <w:sz w:val="18"/>
+          <w:szCs w:val="18"/>
           <w:shd w:fill="F2F2F2" w:color="auto" w:val="clear"/>
         </w:rPr>
         <w:t xml:space="preserve">import { demoQueue } from "./demo-queue.ts";</w:t>
@@ -5660,8 +5660,8 @@
       <w:r>
         <w:rPr>
           <w:rFonts w:ascii="Courier New" w:cs="Courier New" w:eastAsia="Courier New" w:hAnsi="Courier New"/>
-          <w:sz w:val="20"/>
-          <w:szCs w:val="20"/>
+          <w:sz w:val="18"/>
+          <w:szCs w:val="18"/>
           <w:shd w:fill="F2F2F2" w:color="auto" w:val="clear"/>
         </w:rPr>
         <w:t xml:space="preserve">import { demoList } from "./demo-list.ts";</w:t>
@@ -5681,8 +5681,8 @@
       <w:r>
         <w:rPr>
           <w:rFonts w:ascii="Courier New" w:cs="Courier New" w:eastAsia="Courier New" w:hAnsi="Courier New"/>
-          <w:sz w:val="20"/>
-          <w:szCs w:val="20"/>
+          <w:sz w:val="18"/>
+          <w:szCs w:val="18"/>
           <w:shd w:fill="F2F2F2" w:color="auto" w:val="clear"/>
         </w:rPr>
         <w:t xml:space="preserve"> </w:t>
@@ -5702,8 +5702,8 @@
       <w:r>
         <w:rPr>
           <w:rFonts w:ascii="Courier New" w:cs="Courier New" w:eastAsia="Courier New" w:hAnsi="Courier New"/>
-          <w:sz w:val="20"/>
-          <w:szCs w:val="20"/>
+          <w:sz w:val="18"/>
+          <w:szCs w:val="18"/>
           <w:shd w:fill="F2F2F2" w:color="auto" w:val="clear"/>
         </w:rPr>
         <w:t xml:space="preserve">console.log("Лабораторна робота №2 — Структури даних");</w:t>
@@ -5723,8 +5723,8 @@
       <w:r>
         <w:rPr>
           <w:rFonts w:ascii="Courier New" w:cs="Courier New" w:eastAsia="Courier New" w:hAnsi="Courier New"/>
-          <w:sz w:val="20"/>
-          <w:szCs w:val="20"/>
+          <w:sz w:val="18"/>
+          <w:szCs w:val="18"/>
           <w:shd w:fill="F2F2F2" w:color="auto" w:val="clear"/>
         </w:rPr>
         <w:t xml:space="preserve">console.log("Варіант 9\n");</w:t>
@@ -5744,8 +5744,8 @@
       <w:r>
         <w:rPr>
           <w:rFonts w:ascii="Courier New" w:cs="Courier New" w:eastAsia="Courier New" w:hAnsi="Courier New"/>
-          <w:sz w:val="20"/>
-          <w:szCs w:val="20"/>
+          <w:sz w:val="18"/>
+          <w:szCs w:val="18"/>
           <w:shd w:fill="F2F2F2" w:color="auto" w:val="clear"/>
         </w:rPr>
         <w:t xml:space="preserve"> </w:t>
@@ -5765,8 +5765,8 @@
       <w:r>
         <w:rPr>
           <w:rFonts w:ascii="Courier New" w:cs="Courier New" w:eastAsia="Courier New" w:hAnsi="Courier New"/>
-          <w:sz w:val="20"/>
-          <w:szCs w:val="20"/>
+          <w:sz w:val="18"/>
+          <w:szCs w:val="18"/>
           <w:shd w:fill="F2F2F2" w:color="auto" w:val="clear"/>
         </w:rPr>
         <w:t xml:space="preserve">demoStack();</w:t>
@@ -5786,8 +5786,8 @@
       <w:r>
         <w:rPr>
           <w:rFonts w:ascii="Courier New" w:cs="Courier New" w:eastAsia="Courier New" w:hAnsi="Courier New"/>
-          <w:sz w:val="20"/>
-          <w:szCs w:val="20"/>
+          <w:sz w:val="18"/>
+          <w:szCs w:val="18"/>
           <w:shd w:fill="F2F2F2" w:color="auto" w:val="clear"/>
         </w:rPr>
         <w:t xml:space="preserve">console.log();</w:t>
@@ -5807,8 +5807,8 @@
       <w:r>
         <w:rPr>
           <w:rFonts w:ascii="Courier New" w:cs="Courier New" w:eastAsia="Courier New" w:hAnsi="Courier New"/>
-          <w:sz w:val="20"/>
-          <w:szCs w:val="20"/>
+          <w:sz w:val="18"/>
+          <w:szCs w:val="18"/>
           <w:shd w:fill="F2F2F2" w:color="auto" w:val="clear"/>
         </w:rPr>
         <w:t xml:space="preserve">demoQueue();</w:t>
@@ -5828,8 +5828,8 @@
       <w:r>
         <w:rPr>
           <w:rFonts w:ascii="Courier New" w:cs="Courier New" w:eastAsia="Courier New" w:hAnsi="Courier New"/>
-          <w:sz w:val="20"/>
-          <w:szCs w:val="20"/>
+          <w:sz w:val="18"/>
+          <w:szCs w:val="18"/>
           <w:shd w:fill="F2F2F2" w:color="auto" w:val="clear"/>
         </w:rPr>
         <w:t xml:space="preserve">console.log();</w:t>
@@ -5849,8 +5849,8 @@
       <w:r>
         <w:rPr>
           <w:rFonts w:ascii="Courier New" w:cs="Courier New" w:eastAsia="Courier New" w:hAnsi="Courier New"/>
-          <w:sz w:val="20"/>
-          <w:szCs w:val="20"/>
+          <w:sz w:val="18"/>
+          <w:szCs w:val="18"/>
           <w:shd w:fill="F2F2F2" w:color="auto" w:val="clear"/>
         </w:rPr>
         <w:t xml:space="preserve">demoList();</w:t>
@@ -5901,8 +5901,8 @@
       <w:r>
         <w:rPr>
           <w:rFonts w:ascii="Courier New" w:cs="Courier New" w:eastAsia="Courier New" w:hAnsi="Courier New"/>
-          <w:sz w:val="20"/>
-          <w:szCs w:val="20"/>
+          <w:sz w:val="18"/>
+          <w:szCs w:val="18"/>
           <w:shd w:fill="F2F2F2" w:color="auto" w:val="clear"/>
         </w:rPr>
         <w:t xml:space="preserve">class ListNode {</w:t>
@@ -5922,8 +5922,8 @@
       <w:r>
         <w:rPr>
           <w:rFonts w:ascii="Courier New" w:cs="Courier New" w:eastAsia="Courier New" w:hAnsi="Courier New"/>
-          <w:sz w:val="20"/>
-          <w:szCs w:val="20"/>
+          <w:sz w:val="18"/>
+          <w:szCs w:val="18"/>
           <w:shd w:fill="F2F2F2" w:color="auto" w:val="clear"/>
         </w:rPr>
         <w:t xml:space="preserve">  value: number;</w:t>
@@ -5943,8 +5943,8 @@
       <w:r>
         <w:rPr>
           <w:rFonts w:ascii="Courier New" w:cs="Courier New" w:eastAsia="Courier New" w:hAnsi="Courier New"/>
-          <w:sz w:val="20"/>
-          <w:szCs w:val="20"/>
+          <w:sz w:val="18"/>
+          <w:szCs w:val="18"/>
           <w:shd w:fill="F2F2F2" w:color="auto" w:val="clear"/>
         </w:rPr>
         <w:t xml:space="preserve">  next: ListNode | null;</w:t>
@@ -5964,8 +5964,8 @@
       <w:r>
         <w:rPr>
           <w:rFonts w:ascii="Courier New" w:cs="Courier New" w:eastAsia="Courier New" w:hAnsi="Courier New"/>
-          <w:sz w:val="20"/>
-          <w:szCs w:val="20"/>
+          <w:sz w:val="18"/>
+          <w:szCs w:val="18"/>
           <w:shd w:fill="F2F2F2" w:color="auto" w:val="clear"/>
         </w:rPr>
         <w:t xml:space="preserve">  constructor(value: number) {</w:t>
@@ -5985,8 +5985,8 @@
       <w:r>
         <w:rPr>
           <w:rFonts w:ascii="Courier New" w:cs="Courier New" w:eastAsia="Courier New" w:hAnsi="Courier New"/>
-          <w:sz w:val="20"/>
-          <w:szCs w:val="20"/>
+          <w:sz w:val="18"/>
+          <w:szCs w:val="18"/>
           <w:shd w:fill="F2F2F2" w:color="auto" w:val="clear"/>
         </w:rPr>
         <w:t xml:space="preserve">    this.value = value;</w:t>
@@ -6006,8 +6006,8 @@
       <w:r>
         <w:rPr>
           <w:rFonts w:ascii="Courier New" w:cs="Courier New" w:eastAsia="Courier New" w:hAnsi="Courier New"/>
-          <w:sz w:val="20"/>
-          <w:szCs w:val="20"/>
+          <w:sz w:val="18"/>
+          <w:szCs w:val="18"/>
           <w:shd w:fill="F2F2F2" w:color="auto" w:val="clear"/>
         </w:rPr>
         <w:t xml:space="preserve">    this.next = null;</w:t>
@@ -6027,8 +6027,8 @@
       <w:r>
         <w:rPr>
           <w:rFonts w:ascii="Courier New" w:cs="Courier New" w:eastAsia="Courier New" w:hAnsi="Courier New"/>
-          <w:sz w:val="20"/>
-          <w:szCs w:val="20"/>
+          <w:sz w:val="18"/>
+          <w:szCs w:val="18"/>
           <w:shd w:fill="F2F2F2" w:color="auto" w:val="clear"/>
         </w:rPr>
         <w:t xml:space="preserve">  }</w:t>
@@ -6048,8 +6048,8 @@
       <w:r>
         <w:rPr>
           <w:rFonts w:ascii="Courier New" w:cs="Courier New" w:eastAsia="Courier New" w:hAnsi="Courier New"/>
-          <w:sz w:val="20"/>
-          <w:szCs w:val="20"/>
+          <w:sz w:val="18"/>
+          <w:szCs w:val="18"/>
           <w:shd w:fill="F2F2F2" w:color="auto" w:val="clear"/>
         </w:rPr>
         <w:t xml:space="preserve">}</w:t>
@@ -6069,8 +6069,8 @@
       <w:r>
         <w:rPr>
           <w:rFonts w:ascii="Courier New" w:cs="Courier New" w:eastAsia="Courier New" w:hAnsi="Courier New"/>
-          <w:sz w:val="20"/>
-          <w:szCs w:val="20"/>
+          <w:sz w:val="18"/>
+          <w:szCs w:val="18"/>
           <w:shd w:fill="F2F2F2" w:color="auto" w:val="clear"/>
         </w:rPr>
         <w:t xml:space="preserve"> </w:t>
@@ -6090,8 +6090,8 @@
       <w:r>
         <w:rPr>
           <w:rFonts w:ascii="Courier New" w:cs="Courier New" w:eastAsia="Courier New" w:hAnsi="Courier New"/>
-          <w:sz w:val="20"/>
-          <w:szCs w:val="20"/>
+          <w:sz w:val="18"/>
+          <w:szCs w:val="18"/>
           <w:shd w:fill="F2F2F2" w:color="auto" w:val="clear"/>
         </w:rPr>
         <w:t xml:space="preserve">export class SinglyLinkedList {</w:t>
@@ -6111,8 +6111,8 @@
       <w:r>
         <w:rPr>
           <w:rFonts w:ascii="Courier New" w:cs="Courier New" w:eastAsia="Courier New" w:hAnsi="Courier New"/>
-          <w:sz w:val="20"/>
-          <w:szCs w:val="20"/>
+          <w:sz w:val="18"/>
+          <w:szCs w:val="18"/>
           <w:shd w:fill="F2F2F2" w:color="auto" w:val="clear"/>
         </w:rPr>
         <w:t xml:space="preserve">  private head: ListNode | null = null;</w:t>
@@ -6132,8 +6132,8 @@
       <w:r>
         <w:rPr>
           <w:rFonts w:ascii="Courier New" w:cs="Courier New" w:eastAsia="Courier New" w:hAnsi="Courier New"/>
-          <w:sz w:val="20"/>
-          <w:szCs w:val="20"/>
+          <w:sz w:val="18"/>
+          <w:szCs w:val="18"/>
           <w:shd w:fill="F2F2F2" w:color="auto" w:val="clear"/>
         </w:rPr>
         <w:t xml:space="preserve"> </w:t>
@@ -6153,8 +6153,8 @@
       <w:r>
         <w:rPr>
           <w:rFonts w:ascii="Courier New" w:cs="Courier New" w:eastAsia="Courier New" w:hAnsi="Courier New"/>
-          <w:sz w:val="20"/>
-          <w:szCs w:val="20"/>
+          <w:sz w:val="18"/>
+          <w:szCs w:val="18"/>
           <w:shd w:fill="F2F2F2" w:color="auto" w:val="clear"/>
         </w:rPr>
         <w:t xml:space="preserve">  append(value: number): void {</w:t>
@@ -6174,8 +6174,8 @@
       <w:r>
         <w:rPr>
           <w:rFonts w:ascii="Courier New" w:cs="Courier New" w:eastAsia="Courier New" w:hAnsi="Courier New"/>
-          <w:sz w:val="20"/>
-          <w:szCs w:val="20"/>
+          <w:sz w:val="18"/>
+          <w:szCs w:val="18"/>
           <w:shd w:fill="F2F2F2" w:color="auto" w:val="clear"/>
         </w:rPr>
         <w:t xml:space="preserve">    const node = new ListNode(value);</w:t>
@@ -6195,8 +6195,8 @@
       <w:r>
         <w:rPr>
           <w:rFonts w:ascii="Courier New" w:cs="Courier New" w:eastAsia="Courier New" w:hAnsi="Courier New"/>
-          <w:sz w:val="20"/>
-          <w:szCs w:val="20"/>
+          <w:sz w:val="18"/>
+          <w:szCs w:val="18"/>
           <w:shd w:fill="F2F2F2" w:color="auto" w:val="clear"/>
         </w:rPr>
         <w:t xml:space="preserve">    if (!this.head) {</w:t>
@@ -6216,8 +6216,8 @@
       <w:r>
         <w:rPr>
           <w:rFonts w:ascii="Courier New" w:cs="Courier New" w:eastAsia="Courier New" w:hAnsi="Courier New"/>
-          <w:sz w:val="20"/>
-          <w:szCs w:val="20"/>
+          <w:sz w:val="18"/>
+          <w:szCs w:val="18"/>
           <w:shd w:fill="F2F2F2" w:color="auto" w:val="clear"/>
         </w:rPr>
         <w:t xml:space="preserve">      this.head = node;</w:t>
@@ -6237,8 +6237,8 @@
       <w:r>
         <w:rPr>
           <w:rFonts w:ascii="Courier New" w:cs="Courier New" w:eastAsia="Courier New" w:hAnsi="Courier New"/>
-          <w:sz w:val="20"/>
-          <w:szCs w:val="20"/>
+          <w:sz w:val="18"/>
+          <w:szCs w:val="18"/>
           <w:shd w:fill="F2F2F2" w:color="auto" w:val="clear"/>
         </w:rPr>
         <w:t xml:space="preserve">      return;</w:t>
@@ -6258,8 +6258,8 @@
       <w:r>
         <w:rPr>
           <w:rFonts w:ascii="Courier New" w:cs="Courier New" w:eastAsia="Courier New" w:hAnsi="Courier New"/>
-          <w:sz w:val="20"/>
-          <w:szCs w:val="20"/>
+          <w:sz w:val="18"/>
+          <w:szCs w:val="18"/>
           <w:shd w:fill="F2F2F2" w:color="auto" w:val="clear"/>
         </w:rPr>
         <w:t xml:space="preserve">    }</w:t>
@@ -6279,8 +6279,8 @@
       <w:r>
         <w:rPr>
           <w:rFonts w:ascii="Courier New" w:cs="Courier New" w:eastAsia="Courier New" w:hAnsi="Courier New"/>
-          <w:sz w:val="20"/>
-          <w:szCs w:val="20"/>
+          <w:sz w:val="18"/>
+          <w:szCs w:val="18"/>
           <w:shd w:fill="F2F2F2" w:color="auto" w:val="clear"/>
         </w:rPr>
         <w:t xml:space="preserve">    let current = this.head;</w:t>
@@ -6300,8 +6300,8 @@
       <w:r>
         <w:rPr>
           <w:rFonts w:ascii="Courier New" w:cs="Courier New" w:eastAsia="Courier New" w:hAnsi="Courier New"/>
-          <w:sz w:val="20"/>
-          <w:szCs w:val="20"/>
+          <w:sz w:val="18"/>
+          <w:szCs w:val="18"/>
           <w:shd w:fill="F2F2F2" w:color="auto" w:val="clear"/>
         </w:rPr>
         <w:t xml:space="preserve">    while (current.next) current = current.next;</w:t>
@@ -6336,8 +6336,8 @@
       <w:r>
         <w:rPr>
           <w:rFonts w:ascii="Courier New" w:cs="Courier New" w:eastAsia="Courier New" w:hAnsi="Courier New"/>
-          <w:sz w:val="20"/>
-          <w:szCs w:val="20"/>
+          <w:sz w:val="18"/>
+          <w:szCs w:val="18"/>
           <w:shd w:fill="F2F2F2" w:color="auto" w:val="clear"/>
         </w:rPr>
         <w:t xml:space="preserve">    current.next = node;</w:t>
@@ -6357,8 +6357,8 @@
       <w:r>
         <w:rPr>
           <w:rFonts w:ascii="Courier New" w:cs="Courier New" w:eastAsia="Courier New" w:hAnsi="Courier New"/>
-          <w:sz w:val="20"/>
-          <w:szCs w:val="20"/>
+          <w:sz w:val="18"/>
+          <w:szCs w:val="18"/>
           <w:shd w:fill="F2F2F2" w:color="auto" w:val="clear"/>
         </w:rPr>
         <w:t xml:space="preserve">  }</w:t>
@@ -6378,8 +6378,8 @@
       <w:r>
         <w:rPr>
           <w:rFonts w:ascii="Courier New" w:cs="Courier New" w:eastAsia="Courier New" w:hAnsi="Courier New"/>
-          <w:sz w:val="20"/>
-          <w:szCs w:val="20"/>
+          <w:sz w:val="18"/>
+          <w:szCs w:val="18"/>
           <w:shd w:fill="F2F2F2" w:color="auto" w:val="clear"/>
         </w:rPr>
         <w:t xml:space="preserve"> </w:t>
@@ -6399,8 +6399,8 @@
       <w:r>
         <w:rPr>
           <w:rFonts w:ascii="Courier New" w:cs="Courier New" w:eastAsia="Courier New" w:hAnsi="Courier New"/>
-          <w:sz w:val="20"/>
-          <w:szCs w:val="20"/>
+          <w:sz w:val="18"/>
+          <w:szCs w:val="18"/>
           <w:shd w:fill="F2F2F2" w:color="auto" w:val="clear"/>
         </w:rPr>
         <w:t xml:space="preserve">  print(): void {</w:t>
@@ -6420,8 +6420,8 @@
       <w:r>
         <w:rPr>
           <w:rFonts w:ascii="Courier New" w:cs="Courier New" w:eastAsia="Courier New" w:hAnsi="Courier New"/>
-          <w:sz w:val="20"/>
-          <w:szCs w:val="20"/>
+          <w:sz w:val="18"/>
+          <w:szCs w:val="18"/>
           <w:shd w:fill="F2F2F2" w:color="auto" w:val="clear"/>
         </w:rPr>
         <w:t xml:space="preserve">    const items: number[] = [];</w:t>
@@ -6441,8 +6441,8 @@
       <w:r>
         <w:rPr>
           <w:rFonts w:ascii="Courier New" w:cs="Courier New" w:eastAsia="Courier New" w:hAnsi="Courier New"/>
-          <w:sz w:val="20"/>
-          <w:szCs w:val="20"/>
+          <w:sz w:val="18"/>
+          <w:szCs w:val="18"/>
           <w:shd w:fill="F2F2F2" w:color="auto" w:val="clear"/>
         </w:rPr>
         <w:t xml:space="preserve">    let current = this.head;</w:t>
@@ -6462,8 +6462,8 @@
       <w:r>
         <w:rPr>
           <w:rFonts w:ascii="Courier New" w:cs="Courier New" w:eastAsia="Courier New" w:hAnsi="Courier New"/>
-          <w:sz w:val="20"/>
-          <w:szCs w:val="20"/>
+          <w:sz w:val="18"/>
+          <w:szCs w:val="18"/>
           <w:shd w:fill="F2F2F2" w:color="auto" w:val="clear"/>
         </w:rPr>
         <w:t xml:space="preserve">    while (current) {</w:t>
@@ -6483,8 +6483,8 @@
       <w:r>
         <w:rPr>
           <w:rFonts w:ascii="Courier New" w:cs="Courier New" w:eastAsia="Courier New" w:hAnsi="Courier New"/>
-          <w:sz w:val="20"/>
-          <w:szCs w:val="20"/>
+          <w:sz w:val="18"/>
+          <w:szCs w:val="18"/>
           <w:shd w:fill="F2F2F2" w:color="auto" w:val="clear"/>
         </w:rPr>
         <w:t xml:space="preserve">      items.push(current.value);</w:t>
@@ -6504,8 +6504,8 @@
       <w:r>
         <w:rPr>
           <w:rFonts w:ascii="Courier New" w:cs="Courier New" w:eastAsia="Courier New" w:hAnsi="Courier New"/>
-          <w:sz w:val="20"/>
-          <w:szCs w:val="20"/>
+          <w:sz w:val="18"/>
+          <w:szCs w:val="18"/>
           <w:shd w:fill="F2F2F2" w:color="auto" w:val="clear"/>
         </w:rPr>
         <w:t xml:space="preserve">      current = current.next;</w:t>
@@ -6525,8 +6525,8 @@
       <w:r>
         <w:rPr>
           <w:rFonts w:ascii="Courier New" w:cs="Courier New" w:eastAsia="Courier New" w:hAnsi="Courier New"/>
-          <w:sz w:val="20"/>
-          <w:szCs w:val="20"/>
+          <w:sz w:val="18"/>
+          <w:szCs w:val="18"/>
           <w:shd w:fill="F2F2F2" w:color="auto" w:val="clear"/>
         </w:rPr>
         <w:t xml:space="preserve">    }</w:t>
@@ -6546,8 +6546,8 @@
       <w:r>
         <w:rPr>
           <w:rFonts w:ascii="Courier New" w:cs="Courier New" w:eastAsia="Courier New" w:hAnsi="Courier New"/>
-          <w:sz w:val="20"/>
-          <w:szCs w:val="20"/>
+          <w:sz w:val="18"/>
+          <w:szCs w:val="18"/>
           <w:shd w:fill="F2F2F2" w:color="auto" w:val="clear"/>
         </w:rPr>
         <w:t xml:space="preserve">    console.log(`List: ${items.join(" → ")} → null`);</w:t>
@@ -6567,8 +6567,8 @@
       <w:r>
         <w:rPr>
           <w:rFonts w:ascii="Courier New" w:cs="Courier New" w:eastAsia="Courier New" w:hAnsi="Courier New"/>
-          <w:sz w:val="20"/>
-          <w:szCs w:val="20"/>
+          <w:sz w:val="18"/>
+          <w:szCs w:val="18"/>
           <w:shd w:fill="F2F2F2" w:color="auto" w:val="clear"/>
         </w:rPr>
         <w:t xml:space="preserve">  }</w:t>
@@ -6588,8 +6588,8 @@
       <w:r>
         <w:rPr>
           <w:rFonts w:ascii="Courier New" w:cs="Courier New" w:eastAsia="Courier New" w:hAnsi="Courier New"/>
-          <w:sz w:val="20"/>
-          <w:szCs w:val="20"/>
+          <w:sz w:val="18"/>
+          <w:szCs w:val="18"/>
           <w:shd w:fill="F2F2F2" w:color="auto" w:val="clear"/>
         </w:rPr>
         <w:t xml:space="preserve">}</w:t>
@@ -6640,8 +6640,8 @@
       <w:r>
         <w:rPr>
           <w:rFonts w:ascii="Courier New" w:cs="Courier New" w:eastAsia="Courier New" w:hAnsi="Courier New"/>
-          <w:sz w:val="20"/>
-          <w:szCs w:val="20"/>
+          <w:sz w:val="18"/>
+          <w:szCs w:val="18"/>
           <w:shd w:fill="F2F2F2" w:color="auto" w:val="clear"/>
         </w:rPr>
         <w:t xml:space="preserve">export class ArrayQueue {</w:t>
@@ -6661,8 +6661,8 @@
       <w:r>
         <w:rPr>
           <w:rFonts w:ascii="Courier New" w:cs="Courier New" w:eastAsia="Courier New" w:hAnsi="Courier New"/>
-          <w:sz w:val="20"/>
-          <w:szCs w:val="20"/>
+          <w:sz w:val="18"/>
+          <w:szCs w:val="18"/>
           <w:shd w:fill="F2F2F2" w:color="auto" w:val="clear"/>
         </w:rPr>
         <w:t xml:space="preserve">  private data: number[];</w:t>
@@ -6682,8 +6682,8 @@
       <w:r>
         <w:rPr>
           <w:rFonts w:ascii="Courier New" w:cs="Courier New" w:eastAsia="Courier New" w:hAnsi="Courier New"/>
-          <w:sz w:val="20"/>
-          <w:szCs w:val="20"/>
+          <w:sz w:val="18"/>
+          <w:szCs w:val="18"/>
           <w:shd w:fill="F2F2F2" w:color="auto" w:val="clear"/>
         </w:rPr>
         <w:t xml:space="preserve">  private head: number;</w:t>
@@ -6703,8 +6703,8 @@
       <w:r>
         <w:rPr>
           <w:rFonts w:ascii="Courier New" w:cs="Courier New" w:eastAsia="Courier New" w:hAnsi="Courier New"/>
-          <w:sz w:val="20"/>
-          <w:szCs w:val="20"/>
+          <w:sz w:val="18"/>
+          <w:szCs w:val="18"/>
           <w:shd w:fill="F2F2F2" w:color="auto" w:val="clear"/>
         </w:rPr>
         <w:t xml:space="preserve">  private tail: number;</w:t>
@@ -6724,8 +6724,8 @@
       <w:r>
         <w:rPr>
           <w:rFonts w:ascii="Courier New" w:cs="Courier New" w:eastAsia="Courier New" w:hAnsi="Courier New"/>
-          <w:sz w:val="20"/>
-          <w:szCs w:val="20"/>
+          <w:sz w:val="18"/>
+          <w:szCs w:val="18"/>
           <w:shd w:fill="F2F2F2" w:color="auto" w:val="clear"/>
         </w:rPr>
         <w:t xml:space="preserve">  private size: number;</w:t>
@@ -6745,8 +6745,8 @@
       <w:r>
         <w:rPr>
           <w:rFonts w:ascii="Courier New" w:cs="Courier New" w:eastAsia="Courier New" w:hAnsi="Courier New"/>
-          <w:sz w:val="20"/>
-          <w:szCs w:val="20"/>
+          <w:sz w:val="18"/>
+          <w:szCs w:val="18"/>
           <w:shd w:fill="F2F2F2" w:color="auto" w:val="clear"/>
         </w:rPr>
         <w:t xml:space="preserve">  private capacity: number;</w:t>
@@ -6766,8 +6766,8 @@
       <w:r>
         <w:rPr>
           <w:rFonts w:ascii="Courier New" w:cs="Courier New" w:eastAsia="Courier New" w:hAnsi="Courier New"/>
-          <w:sz w:val="20"/>
-          <w:szCs w:val="20"/>
+          <w:sz w:val="18"/>
+          <w:szCs w:val="18"/>
           <w:shd w:fill="F2F2F2" w:color="auto" w:val="clear"/>
         </w:rPr>
         <w:t xml:space="preserve"> </w:t>
@@ -6787,8 +6787,8 @@
       <w:r>
         <w:rPr>
           <w:rFonts w:ascii="Courier New" w:cs="Courier New" w:eastAsia="Courier New" w:hAnsi="Courier New"/>
-          <w:sz w:val="20"/>
-          <w:szCs w:val="20"/>
+          <w:sz w:val="18"/>
+          <w:szCs w:val="18"/>
           <w:shd w:fill="F2F2F2" w:color="auto" w:val="clear"/>
         </w:rPr>
         <w:t xml:space="preserve">  constructor(capacity: number = 100) {</w:t>
@@ -6808,8 +6808,8 @@
       <w:r>
         <w:rPr>
           <w:rFonts w:ascii="Courier New" w:cs="Courier New" w:eastAsia="Courier New" w:hAnsi="Courier New"/>
-          <w:sz w:val="20"/>
-          <w:szCs w:val="20"/>
+          <w:sz w:val="18"/>
+          <w:szCs w:val="18"/>
           <w:shd w:fill="F2F2F2" w:color="auto" w:val="clear"/>
         </w:rPr>
         <w:t xml:space="preserve">    this.data = new Array(capacity);</w:t>
@@ -6829,8 +6829,8 @@
       <w:r>
         <w:rPr>
           <w:rFonts w:ascii="Courier New" w:cs="Courier New" w:eastAsia="Courier New" w:hAnsi="Courier New"/>
-          <w:sz w:val="20"/>
-          <w:szCs w:val="20"/>
+          <w:sz w:val="18"/>
+          <w:szCs w:val="18"/>
           <w:shd w:fill="F2F2F2" w:color="auto" w:val="clear"/>
         </w:rPr>
         <w:t xml:space="preserve">    this.head = 0;</w:t>
@@ -6850,8 +6850,8 @@
       <w:r>
         <w:rPr>
           <w:rFonts w:ascii="Courier New" w:cs="Courier New" w:eastAsia="Courier New" w:hAnsi="Courier New"/>
-          <w:sz w:val="20"/>
-          <w:szCs w:val="20"/>
+          <w:sz w:val="18"/>
+          <w:szCs w:val="18"/>
           <w:shd w:fill="F2F2F2" w:color="auto" w:val="clear"/>
         </w:rPr>
         <w:t xml:space="preserve">    this.tail = 0;</w:t>
@@ -6871,8 +6871,8 @@
       <w:r>
         <w:rPr>
           <w:rFonts w:ascii="Courier New" w:cs="Courier New" w:eastAsia="Courier New" w:hAnsi="Courier New"/>
-          <w:sz w:val="20"/>
-          <w:szCs w:val="20"/>
+          <w:sz w:val="18"/>
+          <w:szCs w:val="18"/>
           <w:shd w:fill="F2F2F2" w:color="auto" w:val="clear"/>
         </w:rPr>
         <w:t xml:space="preserve">    this.size = 0;</w:t>
@@ -6892,8 +6892,8 @@
       <w:r>
         <w:rPr>
           <w:rFonts w:ascii="Courier New" w:cs="Courier New" w:eastAsia="Courier New" w:hAnsi="Courier New"/>
-          <w:sz w:val="20"/>
-          <w:szCs w:val="20"/>
+          <w:sz w:val="18"/>
+          <w:szCs w:val="18"/>
           <w:shd w:fill="F2F2F2" w:color="auto" w:val="clear"/>
         </w:rPr>
         <w:t xml:space="preserve">    this.capacity = capacity;</w:t>
@@ -6913,8 +6913,8 @@
       <w:r>
         <w:rPr>
           <w:rFonts w:ascii="Courier New" w:cs="Courier New" w:eastAsia="Courier New" w:hAnsi="Courier New"/>
-          <w:sz w:val="20"/>
-          <w:szCs w:val="20"/>
+          <w:sz w:val="18"/>
+          <w:szCs w:val="18"/>
           <w:shd w:fill="F2F2F2" w:color="auto" w:val="clear"/>
         </w:rPr>
         <w:t xml:space="preserve">  }</w:t>
@@ -6934,8 +6934,8 @@
       <w:r>
         <w:rPr>
           <w:rFonts w:ascii="Courier New" w:cs="Courier New" w:eastAsia="Courier New" w:hAnsi="Courier New"/>
-          <w:sz w:val="20"/>
-          <w:szCs w:val="20"/>
+          <w:sz w:val="18"/>
+          <w:szCs w:val="18"/>
           <w:shd w:fill="F2F2F2" w:color="auto" w:val="clear"/>
         </w:rPr>
         <w:t xml:space="preserve"> </w:t>
@@ -6955,8 +6955,8 @@
       <w:r>
         <w:rPr>
           <w:rFonts w:ascii="Courier New" w:cs="Courier New" w:eastAsia="Courier New" w:hAnsi="Courier New"/>
-          <w:sz w:val="20"/>
-          <w:szCs w:val="20"/>
+          <w:sz w:val="18"/>
+          <w:szCs w:val="18"/>
           <w:shd w:fill="F2F2F2" w:color="auto" w:val="clear"/>
         </w:rPr>
         <w:t xml:space="preserve">  enqueue(value: number): void {</w:t>
@@ -6976,8 +6976,8 @@
       <w:r>
         <w:rPr>
           <w:rFonts w:ascii="Courier New" w:cs="Courier New" w:eastAsia="Courier New" w:hAnsi="Courier New"/>
-          <w:sz w:val="20"/>
-          <w:szCs w:val="20"/>
+          <w:sz w:val="18"/>
+          <w:szCs w:val="18"/>
           <w:shd w:fill="F2F2F2" w:color="auto" w:val="clear"/>
         </w:rPr>
         <w:t xml:space="preserve">    if (this.size &gt;= this.capacity) throw new Error("Queue overflow");</w:t>
@@ -6997,8 +6997,8 @@
       <w:r>
         <w:rPr>
           <w:rFonts w:ascii="Courier New" w:cs="Courier New" w:eastAsia="Courier New" w:hAnsi="Courier New"/>
-          <w:sz w:val="20"/>
-          <w:szCs w:val="20"/>
+          <w:sz w:val="18"/>
+          <w:szCs w:val="18"/>
           <w:shd w:fill="F2F2F2" w:color="auto" w:val="clear"/>
         </w:rPr>
         <w:t xml:space="preserve">    this.data[this.tail] = value;</w:t>
@@ -7018,8 +7018,8 @@
       <w:r>
         <w:rPr>
           <w:rFonts w:ascii="Courier New" w:cs="Courier New" w:eastAsia="Courier New" w:hAnsi="Courier New"/>
-          <w:sz w:val="20"/>
-          <w:szCs w:val="20"/>
+          <w:sz w:val="18"/>
+          <w:szCs w:val="18"/>
           <w:shd w:fill="F2F2F2" w:color="auto" w:val="clear"/>
         </w:rPr>
         <w:t xml:space="preserve">    this.tail = (this.tail + 1) % this.capacity;</w:t>
@@ -7039,8 +7039,8 @@
       <w:r>
         <w:rPr>
           <w:rFonts w:ascii="Courier New" w:cs="Courier New" w:eastAsia="Courier New" w:hAnsi="Courier New"/>
-          <w:sz w:val="20"/>
-          <w:szCs w:val="20"/>
+          <w:sz w:val="18"/>
+          <w:szCs w:val="18"/>
           <w:shd w:fill="F2F2F2" w:color="auto" w:val="clear"/>
         </w:rPr>
         <w:t xml:space="preserve">    this.size++;</w:t>
@@ -7075,8 +7075,8 @@
       <w:r>
         <w:rPr>
           <w:rFonts w:ascii="Courier New" w:cs="Courier New" w:eastAsia="Courier New" w:hAnsi="Courier New"/>
-          <w:sz w:val="20"/>
-          <w:szCs w:val="20"/>
+          <w:sz w:val="18"/>
+          <w:szCs w:val="18"/>
           <w:shd w:fill="F2F2F2" w:color="auto" w:val="clear"/>
         </w:rPr>
         <w:t xml:space="preserve">  }</w:t>
@@ -7096,8 +7096,8 @@
       <w:r>
         <w:rPr>
           <w:rFonts w:ascii="Courier New" w:cs="Courier New" w:eastAsia="Courier New" w:hAnsi="Courier New"/>
-          <w:sz w:val="20"/>
-          <w:szCs w:val="20"/>
+          <w:sz w:val="18"/>
+          <w:szCs w:val="18"/>
           <w:shd w:fill="F2F2F2" w:color="auto" w:val="clear"/>
         </w:rPr>
         <w:t xml:space="preserve"> </w:t>
@@ -7117,8 +7117,8 @@
       <w:r>
         <w:rPr>
           <w:rFonts w:ascii="Courier New" w:cs="Courier New" w:eastAsia="Courier New" w:hAnsi="Courier New"/>
-          <w:sz w:val="20"/>
-          <w:szCs w:val="20"/>
+          <w:sz w:val="18"/>
+          <w:szCs w:val="18"/>
           <w:shd w:fill="F2F2F2" w:color="auto" w:val="clear"/>
         </w:rPr>
         <w:t xml:space="preserve">  dequeue(): number {</w:t>
@@ -7138,8 +7138,8 @@
       <w:r>
         <w:rPr>
           <w:rFonts w:ascii="Courier New" w:cs="Courier New" w:eastAsia="Courier New" w:hAnsi="Courier New"/>
-          <w:sz w:val="20"/>
-          <w:szCs w:val="20"/>
+          <w:sz w:val="18"/>
+          <w:szCs w:val="18"/>
           <w:shd w:fill="F2F2F2" w:color="auto" w:val="clear"/>
         </w:rPr>
         <w:t xml:space="preserve">    if (this.size === 0) throw new Error("Queue is empty");</w:t>
@@ -7159,8 +7159,8 @@
       <w:r>
         <w:rPr>
           <w:rFonts w:ascii="Courier New" w:cs="Courier New" w:eastAsia="Courier New" w:hAnsi="Courier New"/>
-          <w:sz w:val="20"/>
-          <w:szCs w:val="20"/>
+          <w:sz w:val="18"/>
+          <w:szCs w:val="18"/>
           <w:shd w:fill="F2F2F2" w:color="auto" w:val="clear"/>
         </w:rPr>
         <w:t xml:space="preserve">    const value = this.data[this.head];</w:t>
@@ -7180,8 +7180,8 @@
       <w:r>
         <w:rPr>
           <w:rFonts w:ascii="Courier New" w:cs="Courier New" w:eastAsia="Courier New" w:hAnsi="Courier New"/>
-          <w:sz w:val="20"/>
-          <w:szCs w:val="20"/>
+          <w:sz w:val="18"/>
+          <w:szCs w:val="18"/>
           <w:shd w:fill="F2F2F2" w:color="auto" w:val="clear"/>
         </w:rPr>
         <w:t xml:space="preserve">    this.head = (this.head + 1) % this.capacity;</w:t>
@@ -7201,8 +7201,8 @@
       <w:r>
         <w:rPr>
           <w:rFonts w:ascii="Courier New" w:cs="Courier New" w:eastAsia="Courier New" w:hAnsi="Courier New"/>
-          <w:sz w:val="20"/>
-          <w:szCs w:val="20"/>
+          <w:sz w:val="18"/>
+          <w:szCs w:val="18"/>
           <w:shd w:fill="F2F2F2" w:color="auto" w:val="clear"/>
         </w:rPr>
         <w:t xml:space="preserve">    this.size--;</w:t>
@@ -7222,8 +7222,8 @@
       <w:r>
         <w:rPr>
           <w:rFonts w:ascii="Courier New" w:cs="Courier New" w:eastAsia="Courier New" w:hAnsi="Courier New"/>
-          <w:sz w:val="20"/>
-          <w:szCs w:val="20"/>
+          <w:sz w:val="18"/>
+          <w:szCs w:val="18"/>
           <w:shd w:fill="F2F2F2" w:color="auto" w:val="clear"/>
         </w:rPr>
         <w:t xml:space="preserve">    return value;</w:t>
@@ -7243,8 +7243,8 @@
       <w:r>
         <w:rPr>
           <w:rFonts w:ascii="Courier New" w:cs="Courier New" w:eastAsia="Courier New" w:hAnsi="Courier New"/>
-          <w:sz w:val="20"/>
-          <w:szCs w:val="20"/>
+          <w:sz w:val="18"/>
+          <w:szCs w:val="18"/>
           <w:shd w:fill="F2F2F2" w:color="auto" w:val="clear"/>
         </w:rPr>
         <w:t xml:space="preserve">  }</w:t>
@@ -7264,8 +7264,8 @@
       <w:r>
         <w:rPr>
           <w:rFonts w:ascii="Courier New" w:cs="Courier New" w:eastAsia="Courier New" w:hAnsi="Courier New"/>
-          <w:sz w:val="20"/>
-          <w:szCs w:val="20"/>
+          <w:sz w:val="18"/>
+          <w:szCs w:val="18"/>
           <w:shd w:fill="F2F2F2" w:color="auto" w:val="clear"/>
         </w:rPr>
         <w:t xml:space="preserve"> </w:t>
@@ -7285,8 +7285,8 @@
       <w:r>
         <w:rPr>
           <w:rFonts w:ascii="Courier New" w:cs="Courier New" w:eastAsia="Courier New" w:hAnsi="Courier New"/>
-          <w:sz w:val="20"/>
-          <w:szCs w:val="20"/>
+          <w:sz w:val="18"/>
+          <w:szCs w:val="18"/>
           <w:shd w:fill="F2F2F2" w:color="auto" w:val="clear"/>
         </w:rPr>
         <w:t xml:space="preserve">  isEmpty(): boolean {</w:t>
@@ -7306,8 +7306,8 @@
       <w:r>
         <w:rPr>
           <w:rFonts w:ascii="Courier New" w:cs="Courier New" w:eastAsia="Courier New" w:hAnsi="Courier New"/>
-          <w:sz w:val="20"/>
-          <w:szCs w:val="20"/>
+          <w:sz w:val="18"/>
+          <w:szCs w:val="18"/>
           <w:shd w:fill="F2F2F2" w:color="auto" w:val="clear"/>
         </w:rPr>
         <w:t xml:space="preserve">    return this.size === 0;</w:t>
@@ -7327,8 +7327,8 @@
       <w:r>
         <w:rPr>
           <w:rFonts w:ascii="Courier New" w:cs="Courier New" w:eastAsia="Courier New" w:hAnsi="Courier New"/>
-          <w:sz w:val="20"/>
-          <w:szCs w:val="20"/>
+          <w:sz w:val="18"/>
+          <w:szCs w:val="18"/>
           <w:shd w:fill="F2F2F2" w:color="auto" w:val="clear"/>
         </w:rPr>
         <w:t xml:space="preserve">  }</w:t>
@@ -7348,8 +7348,8 @@
       <w:r>
         <w:rPr>
           <w:rFonts w:ascii="Courier New" w:cs="Courier New" w:eastAsia="Courier New" w:hAnsi="Courier New"/>
-          <w:sz w:val="20"/>
-          <w:szCs w:val="20"/>
+          <w:sz w:val="18"/>
+          <w:szCs w:val="18"/>
           <w:shd w:fill="F2F2F2" w:color="auto" w:val="clear"/>
         </w:rPr>
         <w:t xml:space="preserve"> </w:t>
@@ -7369,8 +7369,8 @@
       <w:r>
         <w:rPr>
           <w:rFonts w:ascii="Courier New" w:cs="Courier New" w:eastAsia="Courier New" w:hAnsi="Courier New"/>
-          <w:sz w:val="20"/>
-          <w:szCs w:val="20"/>
+          <w:sz w:val="18"/>
+          <w:szCs w:val="18"/>
           <w:shd w:fill="F2F2F2" w:color="auto" w:val="clear"/>
         </w:rPr>
         <w:t xml:space="preserve">  print(): void {</w:t>
@@ -7390,8 +7390,8 @@
       <w:r>
         <w:rPr>
           <w:rFonts w:ascii="Courier New" w:cs="Courier New" w:eastAsia="Courier New" w:hAnsi="Courier New"/>
-          <w:sz w:val="20"/>
-          <w:szCs w:val="20"/>
+          <w:sz w:val="18"/>
+          <w:szCs w:val="18"/>
           <w:shd w:fill="F2F2F2" w:color="auto" w:val="clear"/>
         </w:rPr>
         <w:t xml:space="preserve">    const items: number[] = [];</w:t>
@@ -7411,8 +7411,8 @@
       <w:r>
         <w:rPr>
           <w:rFonts w:ascii="Courier New" w:cs="Courier New" w:eastAsia="Courier New" w:hAnsi="Courier New"/>
-          <w:sz w:val="20"/>
-          <w:szCs w:val="20"/>
+          <w:sz w:val="18"/>
+          <w:szCs w:val="18"/>
           <w:shd w:fill="F2F2F2" w:color="auto" w:val="clear"/>
         </w:rPr>
         <w:t xml:space="preserve">    for (let i = 0; i &lt; this.size; i++) {</w:t>
@@ -7432,8 +7432,8 @@
       <w:r>
         <w:rPr>
           <w:rFonts w:ascii="Courier New" w:cs="Courier New" w:eastAsia="Courier New" w:hAnsi="Courier New"/>
-          <w:sz w:val="20"/>
-          <w:szCs w:val="20"/>
+          <w:sz w:val="18"/>
+          <w:szCs w:val="18"/>
           <w:shd w:fill="F2F2F2" w:color="auto" w:val="clear"/>
         </w:rPr>
         <w:t xml:space="preserve">      items.push(this.data[(this.head + i) % this.capacity]);</w:t>
@@ -7453,8 +7453,8 @@
       <w:r>
         <w:rPr>
           <w:rFonts w:ascii="Courier New" w:cs="Courier New" w:eastAsia="Courier New" w:hAnsi="Courier New"/>
-          <w:sz w:val="20"/>
-          <w:szCs w:val="20"/>
+          <w:sz w:val="18"/>
+          <w:szCs w:val="18"/>
           <w:shd w:fill="F2F2F2" w:color="auto" w:val="clear"/>
         </w:rPr>
         <w:t xml:space="preserve">    }</w:t>
@@ -7474,8 +7474,8 @@
       <w:r>
         <w:rPr>
           <w:rFonts w:ascii="Courier New" w:cs="Courier New" w:eastAsia="Courier New" w:hAnsi="Courier New"/>
-          <w:sz w:val="20"/>
-          <w:szCs w:val="20"/>
+          <w:sz w:val="18"/>
+          <w:szCs w:val="18"/>
           <w:shd w:fill="F2F2F2" w:color="auto" w:val="clear"/>
         </w:rPr>
         <w:t xml:space="preserve">    console.log(`Queue [head → tail]: ${items.join(", ")}`);</w:t>
@@ -7510,8 +7510,8 @@
       <w:r>
         <w:rPr>
           <w:rFonts w:ascii="Courier New" w:cs="Courier New" w:eastAsia="Courier New" w:hAnsi="Courier New"/>
-          <w:sz w:val="20"/>
-          <w:szCs w:val="20"/>
+          <w:sz w:val="18"/>
+          <w:szCs w:val="18"/>
           <w:shd w:fill="F2F2F2" w:color="auto" w:val="clear"/>
         </w:rPr>
         <w:t xml:space="preserve">  }</w:t>
@@ -7531,8 +7531,8 @@
       <w:r>
         <w:rPr>
           <w:rFonts w:ascii="Courier New" w:cs="Courier New" w:eastAsia="Courier New" w:hAnsi="Courier New"/>
-          <w:sz w:val="20"/>
-          <w:szCs w:val="20"/>
+          <w:sz w:val="18"/>
+          <w:szCs w:val="18"/>
           <w:shd w:fill="F2F2F2" w:color="auto" w:val="clear"/>
         </w:rPr>
         <w:t xml:space="preserve">}</w:t>
@@ -7583,8 +7583,8 @@
       <w:r>
         <w:rPr>
           <w:rFonts w:ascii="Courier New" w:cs="Courier New" w:eastAsia="Courier New" w:hAnsi="Courier New"/>
-          <w:sz w:val="20"/>
-          <w:szCs w:val="20"/>
+          <w:sz w:val="18"/>
+          <w:szCs w:val="18"/>
           <w:shd w:fill="F2F2F2" w:color="auto" w:val="clear"/>
         </w:rPr>
         <w:t xml:space="preserve">export class ArrayStack {</w:t>
@@ -7604,8 +7604,8 @@
       <w:r>
         <w:rPr>
           <w:rFonts w:ascii="Courier New" w:cs="Courier New" w:eastAsia="Courier New" w:hAnsi="Courier New"/>
-          <w:sz w:val="20"/>
-          <w:szCs w:val="20"/>
+          <w:sz w:val="18"/>
+          <w:szCs w:val="18"/>
           <w:shd w:fill="F2F2F2" w:color="auto" w:val="clear"/>
         </w:rPr>
         <w:t xml:space="preserve">  private data: number[];</w:t>
@@ -7625,8 +7625,8 @@
       <w:r>
         <w:rPr>
           <w:rFonts w:ascii="Courier New" w:cs="Courier New" w:eastAsia="Courier New" w:hAnsi="Courier New"/>
-          <w:sz w:val="20"/>
-          <w:szCs w:val="20"/>
+          <w:sz w:val="18"/>
+          <w:szCs w:val="18"/>
           <w:shd w:fill="F2F2F2" w:color="auto" w:val="clear"/>
         </w:rPr>
         <w:t xml:space="preserve">  private top: number;</w:t>
@@ -7646,8 +7646,8 @@
       <w:r>
         <w:rPr>
           <w:rFonts w:ascii="Courier New" w:cs="Courier New" w:eastAsia="Courier New" w:hAnsi="Courier New"/>
-          <w:sz w:val="20"/>
-          <w:szCs w:val="20"/>
+          <w:sz w:val="18"/>
+          <w:szCs w:val="18"/>
           <w:shd w:fill="F2F2F2" w:color="auto" w:val="clear"/>
         </w:rPr>
         <w:t xml:space="preserve">  private capacity: number;</w:t>
@@ -7667,8 +7667,8 @@
       <w:r>
         <w:rPr>
           <w:rFonts w:ascii="Courier New" w:cs="Courier New" w:eastAsia="Courier New" w:hAnsi="Courier New"/>
-          <w:sz w:val="20"/>
-          <w:szCs w:val="20"/>
+          <w:sz w:val="18"/>
+          <w:szCs w:val="18"/>
           <w:shd w:fill="F2F2F2" w:color="auto" w:val="clear"/>
         </w:rPr>
         <w:t xml:space="preserve"> </w:t>
@@ -7688,8 +7688,8 @@
       <w:r>
         <w:rPr>
           <w:rFonts w:ascii="Courier New" w:cs="Courier New" w:eastAsia="Courier New" w:hAnsi="Courier New"/>
-          <w:sz w:val="20"/>
-          <w:szCs w:val="20"/>
+          <w:sz w:val="18"/>
+          <w:szCs w:val="18"/>
           <w:shd w:fill="F2F2F2" w:color="auto" w:val="clear"/>
         </w:rPr>
         <w:t xml:space="preserve">  constructor(capacity: number = 100) {</w:t>
@@ -7709,8 +7709,8 @@
       <w:r>
         <w:rPr>
           <w:rFonts w:ascii="Courier New" w:cs="Courier New" w:eastAsia="Courier New" w:hAnsi="Courier New"/>
-          <w:sz w:val="20"/>
-          <w:szCs w:val="20"/>
+          <w:sz w:val="18"/>
+          <w:szCs w:val="18"/>
           <w:shd w:fill="F2F2F2" w:color="auto" w:val="clear"/>
         </w:rPr>
         <w:t xml:space="preserve">    this.data = new Array(capacity);</w:t>
@@ -7730,8 +7730,8 @@
       <w:r>
         <w:rPr>
           <w:rFonts w:ascii="Courier New" w:cs="Courier New" w:eastAsia="Courier New" w:hAnsi="Courier New"/>
-          <w:sz w:val="20"/>
-          <w:szCs w:val="20"/>
+          <w:sz w:val="18"/>
+          <w:szCs w:val="18"/>
           <w:shd w:fill="F2F2F2" w:color="auto" w:val="clear"/>
         </w:rPr>
         <w:t xml:space="preserve">    this.top = -1;</w:t>
@@ -7751,8 +7751,8 @@
       <w:r>
         <w:rPr>
           <w:rFonts w:ascii="Courier New" w:cs="Courier New" w:eastAsia="Courier New" w:hAnsi="Courier New"/>
-          <w:sz w:val="20"/>
-          <w:szCs w:val="20"/>
+          <w:sz w:val="18"/>
+          <w:szCs w:val="18"/>
           <w:shd w:fill="F2F2F2" w:color="auto" w:val="clear"/>
         </w:rPr>
         <w:t xml:space="preserve">    this.capacity = capacity;</w:t>
@@ -7772,8 +7772,8 @@
       <w:r>
         <w:rPr>
           <w:rFonts w:ascii="Courier New" w:cs="Courier New" w:eastAsia="Courier New" w:hAnsi="Courier New"/>
-          <w:sz w:val="20"/>
-          <w:szCs w:val="20"/>
+          <w:sz w:val="18"/>
+          <w:szCs w:val="18"/>
           <w:shd w:fill="F2F2F2" w:color="auto" w:val="clear"/>
         </w:rPr>
         <w:t xml:space="preserve">  }</w:t>
@@ -7793,8 +7793,8 @@
       <w:r>
         <w:rPr>
           <w:rFonts w:ascii="Courier New" w:cs="Courier New" w:eastAsia="Courier New" w:hAnsi="Courier New"/>
-          <w:sz w:val="20"/>
-          <w:szCs w:val="20"/>
+          <w:sz w:val="18"/>
+          <w:szCs w:val="18"/>
           <w:shd w:fill="F2F2F2" w:color="auto" w:val="clear"/>
         </w:rPr>
         <w:t xml:space="preserve"> </w:t>
@@ -7814,8 +7814,8 @@
       <w:r>
         <w:rPr>
           <w:rFonts w:ascii="Courier New" w:cs="Courier New" w:eastAsia="Courier New" w:hAnsi="Courier New"/>
-          <w:sz w:val="20"/>
-          <w:szCs w:val="20"/>
+          <w:sz w:val="18"/>
+          <w:szCs w:val="18"/>
           <w:shd w:fill="F2F2F2" w:color="auto" w:val="clear"/>
         </w:rPr>
         <w:t xml:space="preserve">  push(value: number): void {</w:t>
@@ -7835,8 +7835,8 @@
       <w:r>
         <w:rPr>
           <w:rFonts w:ascii="Courier New" w:cs="Courier New" w:eastAsia="Courier New" w:hAnsi="Courier New"/>
-          <w:sz w:val="20"/>
-          <w:szCs w:val="20"/>
+          <w:sz w:val="18"/>
+          <w:szCs w:val="18"/>
           <w:shd w:fill="F2F2F2" w:color="auto" w:val="clear"/>
         </w:rPr>
         <w:t xml:space="preserve">    if (this.top &gt;= this.capacity - 1) throw new Error("Stack overflow");</w:t>
@@ -7856,8 +7856,8 @@
       <w:r>
         <w:rPr>
           <w:rFonts w:ascii="Courier New" w:cs="Courier New" w:eastAsia="Courier New" w:hAnsi="Courier New"/>
-          <w:sz w:val="20"/>
-          <w:szCs w:val="20"/>
+          <w:sz w:val="18"/>
+          <w:szCs w:val="18"/>
           <w:shd w:fill="F2F2F2" w:color="auto" w:val="clear"/>
         </w:rPr>
         <w:t xml:space="preserve">    this.data[++this.top] = value;</w:t>
@@ -7877,8 +7877,8 @@
       <w:r>
         <w:rPr>
           <w:rFonts w:ascii="Courier New" w:cs="Courier New" w:eastAsia="Courier New" w:hAnsi="Courier New"/>
-          <w:sz w:val="20"/>
-          <w:szCs w:val="20"/>
+          <w:sz w:val="18"/>
+          <w:szCs w:val="18"/>
           <w:shd w:fill="F2F2F2" w:color="auto" w:val="clear"/>
         </w:rPr>
         <w:t xml:space="preserve">  }</w:t>
@@ -7898,8 +7898,8 @@
       <w:r>
         <w:rPr>
           <w:rFonts w:ascii="Courier New" w:cs="Courier New" w:eastAsia="Courier New" w:hAnsi="Courier New"/>
-          <w:sz w:val="20"/>
-          <w:szCs w:val="20"/>
+          <w:sz w:val="18"/>
+          <w:szCs w:val="18"/>
           <w:shd w:fill="F2F2F2" w:color="auto" w:val="clear"/>
         </w:rPr>
         <w:t xml:space="preserve"> </w:t>
@@ -7919,8 +7919,8 @@
       <w:r>
         <w:rPr>
           <w:rFonts w:ascii="Courier New" w:cs="Courier New" w:eastAsia="Courier New" w:hAnsi="Courier New"/>
-          <w:sz w:val="20"/>
-          <w:szCs w:val="20"/>
+          <w:sz w:val="18"/>
+          <w:szCs w:val="18"/>
           <w:shd w:fill="F2F2F2" w:color="auto" w:val="clear"/>
         </w:rPr>
         <w:t xml:space="preserve">  pop(): number {</w:t>
@@ -7940,8 +7940,8 @@
       <w:r>
         <w:rPr>
           <w:rFonts w:ascii="Courier New" w:cs="Courier New" w:eastAsia="Courier New" w:hAnsi="Courier New"/>
-          <w:sz w:val="20"/>
-          <w:szCs w:val="20"/>
+          <w:sz w:val="18"/>
+          <w:szCs w:val="18"/>
           <w:shd w:fill="F2F2F2" w:color="auto" w:val="clear"/>
         </w:rPr>
         <w:t xml:space="preserve">    if (this.top &lt; 0) throw new Error("Stack underflow");</w:t>
@@ -7961,8 +7961,8 @@
       <w:r>
         <w:rPr>
           <w:rFonts w:ascii="Courier New" w:cs="Courier New" w:eastAsia="Courier New" w:hAnsi="Courier New"/>
-          <w:sz w:val="20"/>
-          <w:szCs w:val="20"/>
+          <w:sz w:val="18"/>
+          <w:szCs w:val="18"/>
           <w:shd w:fill="F2F2F2" w:color="auto" w:val="clear"/>
         </w:rPr>
         <w:t xml:space="preserve">    return this.data[this.top--];</w:t>
@@ -7982,8 +7982,8 @@
       <w:r>
         <w:rPr>
           <w:rFonts w:ascii="Courier New" w:cs="Courier New" w:eastAsia="Courier New" w:hAnsi="Courier New"/>
-          <w:sz w:val="20"/>
-          <w:szCs w:val="20"/>
+          <w:sz w:val="18"/>
+          <w:szCs w:val="18"/>
           <w:shd w:fill="F2F2F2" w:color="auto" w:val="clear"/>
         </w:rPr>
         <w:t xml:space="preserve">  }</w:t>
@@ -8018,8 +8018,8 @@
       <w:r>
         <w:rPr>
           <w:rFonts w:ascii="Courier New" w:cs="Courier New" w:eastAsia="Courier New" w:hAnsi="Courier New"/>
-          <w:sz w:val="20"/>
-          <w:szCs w:val="20"/>
+          <w:sz w:val="18"/>
+          <w:szCs w:val="18"/>
           <w:shd w:fill="F2F2F2" w:color="auto" w:val="clear"/>
         </w:rPr>
         <w:t xml:space="preserve"> </w:t>
@@ -8039,8 +8039,8 @@
       <w:r>
         <w:rPr>
           <w:rFonts w:ascii="Courier New" w:cs="Courier New" w:eastAsia="Courier New" w:hAnsi="Courier New"/>
-          <w:sz w:val="20"/>
-          <w:szCs w:val="20"/>
+          <w:sz w:val="18"/>
+          <w:szCs w:val="18"/>
           <w:shd w:fill="F2F2F2" w:color="auto" w:val="clear"/>
         </w:rPr>
         <w:t xml:space="preserve">  peek(): number {</w:t>
@@ -8060,8 +8060,8 @@
       <w:r>
         <w:rPr>
           <w:rFonts w:ascii="Courier New" w:cs="Courier New" w:eastAsia="Courier New" w:hAnsi="Courier New"/>
-          <w:sz w:val="20"/>
-          <w:szCs w:val="20"/>
+          <w:sz w:val="18"/>
+          <w:szCs w:val="18"/>
           <w:shd w:fill="F2F2F2" w:color="auto" w:val="clear"/>
         </w:rPr>
         <w:t xml:space="preserve">    if (this.top &lt; 0) throw new Error("Stack is empty");</w:t>
@@ -8081,8 +8081,8 @@
       <w:r>
         <w:rPr>
           <w:rFonts w:ascii="Courier New" w:cs="Courier New" w:eastAsia="Courier New" w:hAnsi="Courier New"/>
-          <w:sz w:val="20"/>
-          <w:szCs w:val="20"/>
+          <w:sz w:val="18"/>
+          <w:szCs w:val="18"/>
           <w:shd w:fill="F2F2F2" w:color="auto" w:val="clear"/>
         </w:rPr>
         <w:t xml:space="preserve">    return this.data[this.top];</w:t>
@@ -8102,8 +8102,8 @@
       <w:r>
         <w:rPr>
           <w:rFonts w:ascii="Courier New" w:cs="Courier New" w:eastAsia="Courier New" w:hAnsi="Courier New"/>
-          <w:sz w:val="20"/>
-          <w:szCs w:val="20"/>
+          <w:sz w:val="18"/>
+          <w:szCs w:val="18"/>
           <w:shd w:fill="F2F2F2" w:color="auto" w:val="clear"/>
         </w:rPr>
         <w:t xml:space="preserve">  }</w:t>
@@ -8123,8 +8123,8 @@
       <w:r>
         <w:rPr>
           <w:rFonts w:ascii="Courier New" w:cs="Courier New" w:eastAsia="Courier New" w:hAnsi="Courier New"/>
-          <w:sz w:val="20"/>
-          <w:szCs w:val="20"/>
+          <w:sz w:val="18"/>
+          <w:szCs w:val="18"/>
           <w:shd w:fill="F2F2F2" w:color="auto" w:val="clear"/>
         </w:rPr>
         <w:t xml:space="preserve"> </w:t>
@@ -8144,8 +8144,8 @@
       <w:r>
         <w:rPr>
           <w:rFonts w:ascii="Courier New" w:cs="Courier New" w:eastAsia="Courier New" w:hAnsi="Courier New"/>
-          <w:sz w:val="20"/>
-          <w:szCs w:val="20"/>
+          <w:sz w:val="18"/>
+          <w:szCs w:val="18"/>
           <w:shd w:fill="F2F2F2" w:color="auto" w:val="clear"/>
         </w:rPr>
         <w:t xml:space="preserve">  isEmpty(): boolean {</w:t>
@@ -8165,8 +8165,8 @@
       <w:r>
         <w:rPr>
           <w:rFonts w:ascii="Courier New" w:cs="Courier New" w:eastAsia="Courier New" w:hAnsi="Courier New"/>
-          <w:sz w:val="20"/>
-          <w:szCs w:val="20"/>
+          <w:sz w:val="18"/>
+          <w:szCs w:val="18"/>
           <w:shd w:fill="F2F2F2" w:color="auto" w:val="clear"/>
         </w:rPr>
         <w:t xml:space="preserve">    return this.top &lt; 0;</w:t>
@@ -8186,8 +8186,8 @@
       <w:r>
         <w:rPr>
           <w:rFonts w:ascii="Courier New" w:cs="Courier New" w:eastAsia="Courier New" w:hAnsi="Courier New"/>
-          <w:sz w:val="20"/>
-          <w:szCs w:val="20"/>
+          <w:sz w:val="18"/>
+          <w:szCs w:val="18"/>
           <w:shd w:fill="F2F2F2" w:color="auto" w:val="clear"/>
         </w:rPr>
         <w:t xml:space="preserve">  }</w:t>
@@ -8207,8 +8207,8 @@
       <w:r>
         <w:rPr>
           <w:rFonts w:ascii="Courier New" w:cs="Courier New" w:eastAsia="Courier New" w:hAnsi="Courier New"/>
-          <w:sz w:val="20"/>
-          <w:szCs w:val="20"/>
+          <w:sz w:val="18"/>
+          <w:szCs w:val="18"/>
           <w:shd w:fill="F2F2F2" w:color="auto" w:val="clear"/>
         </w:rPr>
         <w:t xml:space="preserve"> </w:t>
@@ -8228,8 +8228,8 @@
       <w:r>
         <w:rPr>
           <w:rFonts w:ascii="Courier New" w:cs="Courier New" w:eastAsia="Courier New" w:hAnsi="Courier New"/>
-          <w:sz w:val="20"/>
-          <w:szCs w:val="20"/>
+          <w:sz w:val="18"/>
+          <w:szCs w:val="18"/>
           <w:shd w:fill="F2F2F2" w:color="auto" w:val="clear"/>
         </w:rPr>
         <w:t xml:space="preserve">  print(): void {</w:t>
@@ -8249,8 +8249,8 @@
       <w:r>
         <w:rPr>
           <w:rFonts w:ascii="Courier New" w:cs="Courier New" w:eastAsia="Courier New" w:hAnsi="Courier New"/>
-          <w:sz w:val="20"/>
-          <w:szCs w:val="20"/>
+          <w:sz w:val="18"/>
+          <w:szCs w:val="18"/>
           <w:shd w:fill="F2F2F2" w:color="auto" w:val="clear"/>
         </w:rPr>
         <w:t xml:space="preserve">    const items: number[] = [];</w:t>
@@ -8270,8 +8270,8 @@
       <w:r>
         <w:rPr>
           <w:rFonts w:ascii="Courier New" w:cs="Courier New" w:eastAsia="Courier New" w:hAnsi="Courier New"/>
-          <w:sz w:val="20"/>
-          <w:szCs w:val="20"/>
+          <w:sz w:val="18"/>
+          <w:szCs w:val="18"/>
           <w:shd w:fill="F2F2F2" w:color="auto" w:val="clear"/>
         </w:rPr>
         <w:t xml:space="preserve">    for (let i = 0; i &lt;= this.top; i++) items.push(this.data[i]);</w:t>
@@ -8291,8 +8291,8 @@
       <w:r>
         <w:rPr>
           <w:rFonts w:ascii="Courier New" w:cs="Courier New" w:eastAsia="Courier New" w:hAnsi="Courier New"/>
-          <w:sz w:val="20"/>
-          <w:szCs w:val="20"/>
+          <w:sz w:val="18"/>
+          <w:szCs w:val="18"/>
           <w:shd w:fill="F2F2F2" w:color="auto" w:val="clear"/>
         </w:rPr>
         <w:t xml:space="preserve">    console.log(`Stack [bottom → top]: ${items.join(", ")}`);</w:t>
@@ -8312,8 +8312,8 @@
       <w:r>
         <w:rPr>
           <w:rFonts w:ascii="Courier New" w:cs="Courier New" w:eastAsia="Courier New" w:hAnsi="Courier New"/>
-          <w:sz w:val="20"/>
-          <w:szCs w:val="20"/>
+          <w:sz w:val="18"/>
+          <w:szCs w:val="18"/>
           <w:shd w:fill="F2F2F2" w:color="auto" w:val="clear"/>
         </w:rPr>
         <w:t xml:space="preserve">  }</w:t>
@@ -8333,8 +8333,8 @@
       <w:r>
         <w:rPr>
           <w:rFonts w:ascii="Courier New" w:cs="Courier New" w:eastAsia="Courier New" w:hAnsi="Courier New"/>
-          <w:sz w:val="20"/>
-          <w:szCs w:val="20"/>
+          <w:sz w:val="18"/>
+          <w:szCs w:val="18"/>
           <w:shd w:fill="F2F2F2" w:color="auto" w:val="clear"/>
         </w:rPr>
         <w:t xml:space="preserve">}</w:t>

</xml_diff>

<commit_message>
fix: remove code chunking, simplify codeBlock
</commit_message>
<xml_diff>
--- a/reports/lr2/Звіт_ЛР2_Коновалов_ПЗПІ-25-6.docx
+++ b/reports/lr2/Звіт_ЛР2_Коновалов_ПЗПІ-25-6.docx
@@ -615,8 +615,8 @@
     </w:p>
     <w:p>
       <w:pPr>
-        <w:keepNext/>
-        <w:keepLines/>
+        <w:keepNext w:val="false"/>
+        <w:keepLines w:val="false"/>
         <w:pBdr>
           <w:left w:val="single" w:color="4472C4" w:sz="12" w:space="4"/>
         </w:pBdr>
@@ -636,8 +636,8 @@
     </w:p>
     <w:p>
       <w:pPr>
-        <w:keepNext/>
-        <w:keepLines/>
+        <w:keepNext w:val="false"/>
+        <w:keepLines w:val="false"/>
         <w:pBdr>
           <w:left w:val="single" w:color="4472C4" w:sz="12" w:space="4"/>
         </w:pBdr>
@@ -657,8 +657,8 @@
     </w:p>
     <w:p>
       <w:pPr>
-        <w:keepNext/>
-        <w:keepLines/>
+        <w:keepNext w:val="false"/>
+        <w:keepLines w:val="false"/>
         <w:pBdr>
           <w:left w:val="single" w:color="4472C4" w:sz="12" w:space="4"/>
         </w:pBdr>
@@ -678,8 +678,8 @@
     </w:p>
     <w:p>
       <w:pPr>
-        <w:keepNext/>
-        <w:keepLines/>
+        <w:keepNext w:val="false"/>
+        <w:keepLines w:val="false"/>
         <w:pBdr>
           <w:left w:val="single" w:color="4472C4" w:sz="12" w:space="4"/>
         </w:pBdr>
@@ -699,8 +699,8 @@
     </w:p>
     <w:p>
       <w:pPr>
-        <w:keepNext/>
-        <w:keepLines/>
+        <w:keepNext w:val="false"/>
+        <w:keepLines w:val="false"/>
         <w:pBdr>
           <w:left w:val="single" w:color="4472C4" w:sz="12" w:space="4"/>
         </w:pBdr>
@@ -720,8 +720,8 @@
     </w:p>
     <w:p>
       <w:pPr>
-        <w:keepNext/>
-        <w:keepLines/>
+        <w:keepNext w:val="false"/>
+        <w:keepLines w:val="false"/>
         <w:pBdr>
           <w:left w:val="single" w:color="4472C4" w:sz="12" w:space="4"/>
         </w:pBdr>
@@ -741,8 +741,8 @@
     </w:p>
     <w:p>
       <w:pPr>
-        <w:keepNext/>
-        <w:keepLines/>
+        <w:keepNext w:val="false"/>
+        <w:keepLines w:val="false"/>
         <w:pBdr>
           <w:left w:val="single" w:color="4472C4" w:sz="12" w:space="4"/>
         </w:pBdr>
@@ -762,8 +762,8 @@
     </w:p>
     <w:p>
       <w:pPr>
-        <w:keepNext/>
-        <w:keepLines/>
+        <w:keepNext w:val="false"/>
+        <w:keepLines w:val="false"/>
         <w:pBdr>
           <w:left w:val="single" w:color="4472C4" w:sz="12" w:space="4"/>
         </w:pBdr>
@@ -783,8 +783,8 @@
     </w:p>
     <w:p>
       <w:pPr>
-        <w:keepNext/>
-        <w:keepLines/>
+        <w:keepNext w:val="false"/>
+        <w:keepLines w:val="false"/>
         <w:pBdr>
           <w:left w:val="single" w:color="4472C4" w:sz="12" w:space="4"/>
         </w:pBdr>
@@ -804,8 +804,8 @@
     </w:p>
     <w:p>
       <w:pPr>
-        <w:keepNext/>
-        <w:keepLines/>
+        <w:keepNext w:val="false"/>
+        <w:keepLines w:val="false"/>
         <w:pBdr>
           <w:left w:val="single" w:color="4472C4" w:sz="12" w:space="4"/>
         </w:pBdr>
@@ -825,8 +825,8 @@
     </w:p>
     <w:p>
       <w:pPr>
-        <w:keepNext/>
-        <w:keepLines/>
+        <w:keepNext w:val="false"/>
+        <w:keepLines w:val="false"/>
         <w:pBdr>
           <w:left w:val="single" w:color="4472C4" w:sz="12" w:space="4"/>
         </w:pBdr>
@@ -846,8 +846,8 @@
     </w:p>
     <w:p>
       <w:pPr>
-        <w:keepNext/>
-        <w:keepLines/>
+        <w:keepNext w:val="false"/>
+        <w:keepLines w:val="false"/>
         <w:pBdr>
           <w:left w:val="single" w:color="4472C4" w:sz="12" w:space="4"/>
         </w:pBdr>
@@ -867,8 +867,8 @@
     </w:p>
     <w:p>
       <w:pPr>
-        <w:keepNext/>
-        <w:keepLines/>
+        <w:keepNext w:val="false"/>
+        <w:keepLines w:val="false"/>
         <w:pBdr>
           <w:left w:val="single" w:color="4472C4" w:sz="12" w:space="4"/>
         </w:pBdr>
@@ -888,8 +888,8 @@
     </w:p>
     <w:p>
       <w:pPr>
-        <w:keepNext/>
-        <w:keepLines/>
+        <w:keepNext w:val="false"/>
+        <w:keepLines w:val="false"/>
         <w:pBdr>
           <w:left w:val="single" w:color="4472C4" w:sz="12" w:space="4"/>
         </w:pBdr>
@@ -909,8 +909,8 @@
     </w:p>
     <w:p>
       <w:pPr>
-        <w:keepNext/>
-        <w:keepLines/>
+        <w:keepNext w:val="false"/>
+        <w:keepLines w:val="false"/>
         <w:pBdr>
           <w:left w:val="single" w:color="4472C4" w:sz="12" w:space="4"/>
         </w:pBdr>
@@ -930,8 +930,8 @@
     </w:p>
     <w:p>
       <w:pPr>
-        <w:keepNext/>
-        <w:keepLines/>
+        <w:keepNext w:val="false"/>
+        <w:keepLines w:val="false"/>
         <w:pBdr>
           <w:left w:val="single" w:color="4472C4" w:sz="12" w:space="4"/>
         </w:pBdr>
@@ -951,8 +951,8 @@
     </w:p>
     <w:p>
       <w:pPr>
-        <w:keepNext/>
-        <w:keepLines/>
+        <w:keepNext w:val="false"/>
+        <w:keepLines w:val="false"/>
         <w:pBdr>
           <w:left w:val="single" w:color="4472C4" w:sz="12" w:space="4"/>
         </w:pBdr>
@@ -972,8 +972,8 @@
     </w:p>
     <w:p>
       <w:pPr>
-        <w:keepNext/>
-        <w:keepLines/>
+        <w:keepNext w:val="false"/>
+        <w:keepLines w:val="false"/>
         <w:pBdr>
           <w:left w:val="single" w:color="4472C4" w:sz="12" w:space="4"/>
         </w:pBdr>
@@ -993,8 +993,8 @@
     </w:p>
     <w:p>
       <w:pPr>
-        <w:keepNext/>
-        <w:keepLines/>
+        <w:keepNext w:val="false"/>
+        <w:keepLines w:val="false"/>
         <w:pBdr>
           <w:left w:val="single" w:color="4472C4" w:sz="12" w:space="4"/>
         </w:pBdr>
@@ -1015,7 +1015,7 @@
     <w:p>
       <w:pPr>
         <w:keepNext w:val="false"/>
-        <w:keepLines/>
+        <w:keepLines w:val="false"/>
         <w:pBdr>
           <w:left w:val="single" w:color="4472C4" w:sz="12" w:space="4"/>
         </w:pBdr>
@@ -1035,23 +1035,8 @@
     </w:p>
     <w:p>
       <w:pPr>
-        <w:keepNext/>
-        <w:spacing w:after="60" w:before="60" w:line="360" w:lineRule="auto"/>
-        <w:ind w:firstLine="709"/>
-      </w:pPr>
-      <w:r>
-        <w:rPr>
-          <w:rFonts w:ascii="Times New Roman" w:cs="Times New Roman" w:eastAsia="Times New Roman" w:hAnsi="Times New Roman"/>
-          <w:sz w:val="28"/>
-          <w:szCs w:val="28"/>
-        </w:rPr>
-        <w:t xml:space="preserve">Продовження лістингу 3.1</w:t>
-      </w:r>
-    </w:p>
-    <w:p>
-      <w:pPr>
-        <w:keepNext/>
-        <w:keepLines/>
+        <w:keepNext w:val="false"/>
+        <w:keepLines w:val="false"/>
         <w:pBdr>
           <w:left w:val="single" w:color="4472C4" w:sz="12" w:space="4"/>
         </w:pBdr>
@@ -1071,8 +1056,8 @@
     </w:p>
     <w:p>
       <w:pPr>
-        <w:keepNext/>
-        <w:keepLines/>
+        <w:keepNext w:val="false"/>
+        <w:keepLines w:val="false"/>
         <w:pBdr>
           <w:left w:val="single" w:color="4472C4" w:sz="12" w:space="4"/>
         </w:pBdr>
@@ -1092,8 +1077,8 @@
     </w:p>
     <w:p>
       <w:pPr>
-        <w:keepNext/>
-        <w:keepLines/>
+        <w:keepNext w:val="false"/>
+        <w:keepLines w:val="false"/>
         <w:pBdr>
           <w:left w:val="single" w:color="4472C4" w:sz="12" w:space="4"/>
         </w:pBdr>
@@ -1113,8 +1098,8 @@
     </w:p>
     <w:p>
       <w:pPr>
-        <w:keepNext/>
-        <w:keepLines/>
+        <w:keepNext w:val="false"/>
+        <w:keepLines w:val="false"/>
         <w:pBdr>
           <w:left w:val="single" w:color="4472C4" w:sz="12" w:space="4"/>
         </w:pBdr>
@@ -1134,8 +1119,8 @@
     </w:p>
     <w:p>
       <w:pPr>
-        <w:keepNext/>
-        <w:keepLines/>
+        <w:keepNext w:val="false"/>
+        <w:keepLines w:val="false"/>
         <w:pBdr>
           <w:left w:val="single" w:color="4472C4" w:sz="12" w:space="4"/>
         </w:pBdr>
@@ -1155,8 +1140,8 @@
     </w:p>
     <w:p>
       <w:pPr>
-        <w:keepNext/>
-        <w:keepLines/>
+        <w:keepNext w:val="false"/>
+        <w:keepLines w:val="false"/>
         <w:pBdr>
           <w:left w:val="single" w:color="4472C4" w:sz="12" w:space="4"/>
         </w:pBdr>
@@ -1176,8 +1161,8 @@
     </w:p>
     <w:p>
       <w:pPr>
-        <w:keepNext/>
-        <w:keepLines/>
+        <w:keepNext w:val="false"/>
+        <w:keepLines w:val="false"/>
         <w:pBdr>
           <w:left w:val="single" w:color="4472C4" w:sz="12" w:space="4"/>
         </w:pBdr>
@@ -1197,8 +1182,8 @@
     </w:p>
     <w:p>
       <w:pPr>
-        <w:keepNext/>
-        <w:keepLines/>
+        <w:keepNext w:val="false"/>
+        <w:keepLines w:val="false"/>
         <w:pBdr>
           <w:left w:val="single" w:color="4472C4" w:sz="12" w:space="4"/>
         </w:pBdr>
@@ -1218,8 +1203,8 @@
     </w:p>
     <w:p>
       <w:pPr>
-        <w:keepNext/>
-        <w:keepLines/>
+        <w:keepNext w:val="false"/>
+        <w:keepLines w:val="false"/>
         <w:pBdr>
           <w:left w:val="single" w:color="4472C4" w:sz="12" w:space="4"/>
         </w:pBdr>
@@ -1239,8 +1224,8 @@
     </w:p>
     <w:p>
       <w:pPr>
-        <w:keepNext/>
-        <w:keepLines/>
+        <w:keepNext w:val="false"/>
+        <w:keepLines w:val="false"/>
         <w:pBdr>
           <w:left w:val="single" w:color="4472C4" w:sz="12" w:space="4"/>
         </w:pBdr>
@@ -1260,8 +1245,8 @@
     </w:p>
     <w:p>
       <w:pPr>
-        <w:keepNext/>
-        <w:keepLines/>
+        <w:keepNext w:val="false"/>
+        <w:keepLines w:val="false"/>
         <w:pBdr>
           <w:left w:val="single" w:color="4472C4" w:sz="12" w:space="4"/>
         </w:pBdr>
@@ -1281,8 +1266,8 @@
     </w:p>
     <w:p>
       <w:pPr>
-        <w:keepNext/>
-        <w:keepLines/>
+        <w:keepNext w:val="false"/>
+        <w:keepLines w:val="false"/>
         <w:pBdr>
           <w:left w:val="single" w:color="4472C4" w:sz="12" w:space="4"/>
         </w:pBdr>
@@ -1302,8 +1287,8 @@
     </w:p>
     <w:p>
       <w:pPr>
-        <w:keepNext/>
-        <w:keepLines/>
+        <w:keepNext w:val="false"/>
+        <w:keepLines w:val="false"/>
         <w:pBdr>
           <w:left w:val="single" w:color="4472C4" w:sz="12" w:space="4"/>
         </w:pBdr>
@@ -1323,8 +1308,8 @@
     </w:p>
     <w:p>
       <w:pPr>
-        <w:keepNext/>
-        <w:keepLines/>
+        <w:keepNext w:val="false"/>
+        <w:keepLines w:val="false"/>
         <w:pBdr>
           <w:left w:val="single" w:color="4472C4" w:sz="12" w:space="4"/>
         </w:pBdr>
@@ -1344,8 +1329,8 @@
     </w:p>
     <w:p>
       <w:pPr>
-        <w:keepNext/>
-        <w:keepLines/>
+        <w:keepNext w:val="false"/>
+        <w:keepLines w:val="false"/>
         <w:pBdr>
           <w:left w:val="single" w:color="4472C4" w:sz="12" w:space="4"/>
         </w:pBdr>
@@ -1366,7 +1351,7 @@
     <w:p>
       <w:pPr>
         <w:keepNext w:val="false"/>
-        <w:keepLines/>
+        <w:keepLines w:val="false"/>
         <w:pBdr>
           <w:left w:val="single" w:color="4472C4" w:sz="12" w:space="4"/>
         </w:pBdr>
@@ -1434,8 +1419,8 @@
     </w:p>
     <w:p>
       <w:pPr>
-        <w:keepNext/>
-        <w:keepLines/>
+        <w:keepNext w:val="false"/>
+        <w:keepLines w:val="false"/>
         <w:pBdr>
           <w:left w:val="single" w:color="4472C4" w:sz="12" w:space="4"/>
         </w:pBdr>
@@ -1455,8 +1440,8 @@
     </w:p>
     <w:p>
       <w:pPr>
-        <w:keepNext/>
-        <w:keepLines/>
+        <w:keepNext w:val="false"/>
+        <w:keepLines w:val="false"/>
         <w:pBdr>
           <w:left w:val="single" w:color="4472C4" w:sz="12" w:space="4"/>
         </w:pBdr>
@@ -1476,8 +1461,8 @@
     </w:p>
     <w:p>
       <w:pPr>
-        <w:keepNext/>
-        <w:keepLines/>
+        <w:keepNext w:val="false"/>
+        <w:keepLines w:val="false"/>
         <w:pBdr>
           <w:left w:val="single" w:color="4472C4" w:sz="12" w:space="4"/>
         </w:pBdr>
@@ -1497,8 +1482,8 @@
     </w:p>
     <w:p>
       <w:pPr>
-        <w:keepNext/>
-        <w:keepLines/>
+        <w:keepNext w:val="false"/>
+        <w:keepLines w:val="false"/>
         <w:pBdr>
           <w:left w:val="single" w:color="4472C4" w:sz="12" w:space="4"/>
         </w:pBdr>
@@ -1518,8 +1503,8 @@
     </w:p>
     <w:p>
       <w:pPr>
-        <w:keepNext/>
-        <w:keepLines/>
+        <w:keepNext w:val="false"/>
+        <w:keepLines w:val="false"/>
         <w:pBdr>
           <w:left w:val="single" w:color="4472C4" w:sz="12" w:space="4"/>
         </w:pBdr>
@@ -1539,8 +1524,8 @@
     </w:p>
     <w:p>
       <w:pPr>
-        <w:keepNext/>
-        <w:keepLines/>
+        <w:keepNext w:val="false"/>
+        <w:keepLines w:val="false"/>
         <w:pBdr>
           <w:left w:val="single" w:color="4472C4" w:sz="12" w:space="4"/>
         </w:pBdr>
@@ -1560,8 +1545,8 @@
     </w:p>
     <w:p>
       <w:pPr>
-        <w:keepNext/>
-        <w:keepLines/>
+        <w:keepNext w:val="false"/>
+        <w:keepLines w:val="false"/>
         <w:pBdr>
           <w:left w:val="single" w:color="4472C4" w:sz="12" w:space="4"/>
         </w:pBdr>
@@ -1581,8 +1566,8 @@
     </w:p>
     <w:p>
       <w:pPr>
-        <w:keepNext/>
-        <w:keepLines/>
+        <w:keepNext w:val="false"/>
+        <w:keepLines w:val="false"/>
         <w:pBdr>
           <w:left w:val="single" w:color="4472C4" w:sz="12" w:space="4"/>
         </w:pBdr>
@@ -1602,8 +1587,8 @@
     </w:p>
     <w:p>
       <w:pPr>
-        <w:keepNext/>
-        <w:keepLines/>
+        <w:keepNext w:val="false"/>
+        <w:keepLines w:val="false"/>
         <w:pBdr>
           <w:left w:val="single" w:color="4472C4" w:sz="12" w:space="4"/>
         </w:pBdr>
@@ -1623,8 +1608,8 @@
     </w:p>
     <w:p>
       <w:pPr>
-        <w:keepNext/>
-        <w:keepLines/>
+        <w:keepNext w:val="false"/>
+        <w:keepLines w:val="false"/>
         <w:pBdr>
           <w:left w:val="single" w:color="4472C4" w:sz="12" w:space="4"/>
         </w:pBdr>
@@ -1644,8 +1629,8 @@
     </w:p>
     <w:p>
       <w:pPr>
-        <w:keepNext/>
-        <w:keepLines/>
+        <w:keepNext w:val="false"/>
+        <w:keepLines w:val="false"/>
         <w:pBdr>
           <w:left w:val="single" w:color="4472C4" w:sz="12" w:space="4"/>
         </w:pBdr>
@@ -1665,8 +1650,8 @@
     </w:p>
     <w:p>
       <w:pPr>
-        <w:keepNext/>
-        <w:keepLines/>
+        <w:keepNext w:val="false"/>
+        <w:keepLines w:val="false"/>
         <w:pBdr>
           <w:left w:val="single" w:color="4472C4" w:sz="12" w:space="4"/>
         </w:pBdr>
@@ -1686,8 +1671,8 @@
     </w:p>
     <w:p>
       <w:pPr>
-        <w:keepNext/>
-        <w:keepLines/>
+        <w:keepNext w:val="false"/>
+        <w:keepLines w:val="false"/>
         <w:pBdr>
           <w:left w:val="single" w:color="4472C4" w:sz="12" w:space="4"/>
         </w:pBdr>
@@ -1707,8 +1692,8 @@
     </w:p>
     <w:p>
       <w:pPr>
-        <w:keepNext/>
-        <w:keepLines/>
+        <w:keepNext w:val="false"/>
+        <w:keepLines w:val="false"/>
         <w:pBdr>
           <w:left w:val="single" w:color="4472C4" w:sz="12" w:space="4"/>
         </w:pBdr>
@@ -1728,8 +1713,8 @@
     </w:p>
     <w:p>
       <w:pPr>
-        <w:keepNext/>
-        <w:keepLines/>
+        <w:keepNext w:val="false"/>
+        <w:keepLines w:val="false"/>
         <w:pBdr>
           <w:left w:val="single" w:color="4472C4" w:sz="12" w:space="4"/>
         </w:pBdr>
@@ -1749,8 +1734,8 @@
     </w:p>
     <w:p>
       <w:pPr>
-        <w:keepNext/>
-        <w:keepLines/>
+        <w:keepNext w:val="false"/>
+        <w:keepLines w:val="false"/>
         <w:pBdr>
           <w:left w:val="single" w:color="4472C4" w:sz="12" w:space="4"/>
         </w:pBdr>
@@ -1770,8 +1755,8 @@
     </w:p>
     <w:p>
       <w:pPr>
-        <w:keepNext/>
-        <w:keepLines/>
+        <w:keepNext w:val="false"/>
+        <w:keepLines w:val="false"/>
         <w:pBdr>
           <w:left w:val="single" w:color="4472C4" w:sz="12" w:space="4"/>
         </w:pBdr>
@@ -1791,8 +1776,8 @@
     </w:p>
     <w:p>
       <w:pPr>
-        <w:keepNext/>
-        <w:keepLines/>
+        <w:keepNext w:val="false"/>
+        <w:keepLines w:val="false"/>
         <w:pBdr>
           <w:left w:val="single" w:color="4472C4" w:sz="12" w:space="4"/>
         </w:pBdr>
@@ -1812,8 +1797,8 @@
     </w:p>
     <w:p>
       <w:pPr>
-        <w:keepNext/>
-        <w:keepLines/>
+        <w:keepNext w:val="false"/>
+        <w:keepLines w:val="false"/>
         <w:pBdr>
           <w:left w:val="single" w:color="4472C4" w:sz="12" w:space="4"/>
         </w:pBdr>
@@ -1834,7 +1819,7 @@
     <w:p>
       <w:pPr>
         <w:keepNext w:val="false"/>
-        <w:keepLines/>
+        <w:keepLines w:val="false"/>
         <w:pBdr>
           <w:left w:val="single" w:color="4472C4" w:sz="12" w:space="4"/>
         </w:pBdr>
@@ -1854,23 +1839,8 @@
     </w:p>
     <w:p>
       <w:pPr>
-        <w:keepNext/>
-        <w:spacing w:after="60" w:before="60" w:line="360" w:lineRule="auto"/>
-        <w:ind w:firstLine="709"/>
-      </w:pPr>
-      <w:r>
-        <w:rPr>
-          <w:rFonts w:ascii="Times New Roman" w:cs="Times New Roman" w:eastAsia="Times New Roman" w:hAnsi="Times New Roman"/>
-          <w:sz w:val="28"/>
-          <w:szCs w:val="28"/>
-        </w:rPr>
-        <w:t xml:space="preserve">Продовження лістингу 3.2</w:t>
-      </w:r>
-    </w:p>
-    <w:p>
-      <w:pPr>
-        <w:keepNext/>
-        <w:keepLines/>
+        <w:keepNext w:val="false"/>
+        <w:keepLines w:val="false"/>
         <w:pBdr>
           <w:left w:val="single" w:color="4472C4" w:sz="12" w:space="4"/>
         </w:pBdr>
@@ -1890,8 +1860,8 @@
     </w:p>
     <w:p>
       <w:pPr>
-        <w:keepNext/>
-        <w:keepLines/>
+        <w:keepNext w:val="false"/>
+        <w:keepLines w:val="false"/>
         <w:pBdr>
           <w:left w:val="single" w:color="4472C4" w:sz="12" w:space="4"/>
         </w:pBdr>
@@ -1911,8 +1881,8 @@
     </w:p>
     <w:p>
       <w:pPr>
-        <w:keepNext/>
-        <w:keepLines/>
+        <w:keepNext w:val="false"/>
+        <w:keepLines w:val="false"/>
         <w:pBdr>
           <w:left w:val="single" w:color="4472C4" w:sz="12" w:space="4"/>
         </w:pBdr>
@@ -1932,8 +1902,8 @@
     </w:p>
     <w:p>
       <w:pPr>
-        <w:keepNext/>
-        <w:keepLines/>
+        <w:keepNext w:val="false"/>
+        <w:keepLines w:val="false"/>
         <w:pBdr>
           <w:left w:val="single" w:color="4472C4" w:sz="12" w:space="4"/>
         </w:pBdr>
@@ -1953,8 +1923,8 @@
     </w:p>
     <w:p>
       <w:pPr>
-        <w:keepNext/>
-        <w:keepLines/>
+        <w:keepNext w:val="false"/>
+        <w:keepLines w:val="false"/>
         <w:pBdr>
           <w:left w:val="single" w:color="4472C4" w:sz="12" w:space="4"/>
         </w:pBdr>
@@ -1974,8 +1944,8 @@
     </w:p>
     <w:p>
       <w:pPr>
-        <w:keepNext/>
-        <w:keepLines/>
+        <w:keepNext w:val="false"/>
+        <w:keepLines w:val="false"/>
         <w:pBdr>
           <w:left w:val="single" w:color="4472C4" w:sz="12" w:space="4"/>
         </w:pBdr>
@@ -1995,8 +1965,8 @@
     </w:p>
     <w:p>
       <w:pPr>
-        <w:keepNext/>
-        <w:keepLines/>
+        <w:keepNext w:val="false"/>
+        <w:keepLines w:val="false"/>
         <w:pBdr>
           <w:left w:val="single" w:color="4472C4" w:sz="12" w:space="4"/>
         </w:pBdr>
@@ -2016,8 +1986,8 @@
     </w:p>
     <w:p>
       <w:pPr>
-        <w:keepNext/>
-        <w:keepLines/>
+        <w:keepNext w:val="false"/>
+        <w:keepLines w:val="false"/>
         <w:pBdr>
           <w:left w:val="single" w:color="4472C4" w:sz="12" w:space="4"/>
         </w:pBdr>
@@ -2037,8 +2007,8 @@
     </w:p>
     <w:p>
       <w:pPr>
-        <w:keepNext/>
-        <w:keepLines/>
+        <w:keepNext w:val="false"/>
+        <w:keepLines w:val="false"/>
         <w:pBdr>
           <w:left w:val="single" w:color="4472C4" w:sz="12" w:space="4"/>
         </w:pBdr>
@@ -2058,8 +2028,8 @@
     </w:p>
     <w:p>
       <w:pPr>
-        <w:keepNext/>
-        <w:keepLines/>
+        <w:keepNext w:val="false"/>
+        <w:keepLines w:val="false"/>
         <w:pBdr>
           <w:left w:val="single" w:color="4472C4" w:sz="12" w:space="4"/>
         </w:pBdr>
@@ -2079,8 +2049,8 @@
     </w:p>
     <w:p>
       <w:pPr>
-        <w:keepNext/>
-        <w:keepLines/>
+        <w:keepNext w:val="false"/>
+        <w:keepLines w:val="false"/>
         <w:pBdr>
           <w:left w:val="single" w:color="4472C4" w:sz="12" w:space="4"/>
         </w:pBdr>
@@ -2100,8 +2070,8 @@
     </w:p>
     <w:p>
       <w:pPr>
-        <w:keepNext/>
-        <w:keepLines/>
+        <w:keepNext w:val="false"/>
+        <w:keepLines w:val="false"/>
         <w:pBdr>
           <w:left w:val="single" w:color="4472C4" w:sz="12" w:space="4"/>
         </w:pBdr>
@@ -2121,8 +2091,8 @@
     </w:p>
     <w:p>
       <w:pPr>
-        <w:keepNext/>
-        <w:keepLines/>
+        <w:keepNext w:val="false"/>
+        <w:keepLines w:val="false"/>
         <w:pBdr>
           <w:left w:val="single" w:color="4472C4" w:sz="12" w:space="4"/>
         </w:pBdr>
@@ -2142,8 +2112,8 @@
     </w:p>
     <w:p>
       <w:pPr>
-        <w:keepNext/>
-        <w:keepLines/>
+        <w:keepNext w:val="false"/>
+        <w:keepLines w:val="false"/>
         <w:pBdr>
           <w:left w:val="single" w:color="4472C4" w:sz="12" w:space="4"/>
         </w:pBdr>
@@ -2163,8 +2133,8 @@
     </w:p>
     <w:p>
       <w:pPr>
-        <w:keepNext/>
-        <w:keepLines/>
+        <w:keepNext w:val="false"/>
+        <w:keepLines w:val="false"/>
         <w:pBdr>
           <w:left w:val="single" w:color="4472C4" w:sz="12" w:space="4"/>
         </w:pBdr>
@@ -2184,8 +2154,8 @@
     </w:p>
     <w:p>
       <w:pPr>
-        <w:keepNext/>
-        <w:keepLines/>
+        <w:keepNext w:val="false"/>
+        <w:keepLines w:val="false"/>
         <w:pBdr>
           <w:left w:val="single" w:color="4472C4" w:sz="12" w:space="4"/>
         </w:pBdr>
@@ -2205,8 +2175,8 @@
     </w:p>
     <w:p>
       <w:pPr>
-        <w:keepNext/>
-        <w:keepLines/>
+        <w:keepNext w:val="false"/>
+        <w:keepLines w:val="false"/>
         <w:pBdr>
           <w:left w:val="single" w:color="4472C4" w:sz="12" w:space="4"/>
         </w:pBdr>
@@ -2226,8 +2196,8 @@
     </w:p>
     <w:p>
       <w:pPr>
-        <w:keepNext/>
-        <w:keepLines/>
+        <w:keepNext w:val="false"/>
+        <w:keepLines w:val="false"/>
         <w:pBdr>
           <w:left w:val="single" w:color="4472C4" w:sz="12" w:space="4"/>
         </w:pBdr>
@@ -2247,8 +2217,8 @@
     </w:p>
     <w:p>
       <w:pPr>
-        <w:keepNext/>
-        <w:keepLines/>
+        <w:keepNext w:val="false"/>
+        <w:keepLines w:val="false"/>
         <w:pBdr>
           <w:left w:val="single" w:color="4472C4" w:sz="12" w:space="4"/>
         </w:pBdr>
@@ -2269,7 +2239,7 @@
     <w:p>
       <w:pPr>
         <w:keepNext w:val="false"/>
-        <w:keepLines/>
+        <w:keepLines w:val="false"/>
         <w:pBdr>
           <w:left w:val="single" w:color="4472C4" w:sz="12" w:space="4"/>
         </w:pBdr>
@@ -2289,23 +2259,8 @@
     </w:p>
     <w:p>
       <w:pPr>
-        <w:keepNext/>
-        <w:spacing w:after="60" w:before="60" w:line="360" w:lineRule="auto"/>
-        <w:ind w:firstLine="709"/>
-      </w:pPr>
-      <w:r>
-        <w:rPr>
-          <w:rFonts w:ascii="Times New Roman" w:cs="Times New Roman" w:eastAsia="Times New Roman" w:hAnsi="Times New Roman"/>
-          <w:sz w:val="28"/>
-          <w:szCs w:val="28"/>
-        </w:rPr>
-        <w:t xml:space="preserve">Продовження лістингу 3.2</w:t>
-      </w:r>
-    </w:p>
-    <w:p>
-      <w:pPr>
-        <w:keepNext/>
-        <w:keepLines/>
+        <w:keepNext w:val="false"/>
+        <w:keepLines w:val="false"/>
         <w:pBdr>
           <w:left w:val="single" w:color="4472C4" w:sz="12" w:space="4"/>
         </w:pBdr>
@@ -2326,7 +2281,7 @@
     <w:p>
       <w:pPr>
         <w:keepNext w:val="false"/>
-        <w:keepLines/>
+        <w:keepLines w:val="false"/>
         <w:pBdr>
           <w:left w:val="single" w:color="4472C4" w:sz="12" w:space="4"/>
         </w:pBdr>
@@ -2394,8 +2349,8 @@
     </w:p>
     <w:p>
       <w:pPr>
-        <w:keepNext/>
-        <w:keepLines/>
+        <w:keepNext w:val="false"/>
+        <w:keepLines w:val="false"/>
         <w:pBdr>
           <w:left w:val="single" w:color="4472C4" w:sz="12" w:space="4"/>
         </w:pBdr>
@@ -2415,8 +2370,8 @@
     </w:p>
     <w:p>
       <w:pPr>
-        <w:keepNext/>
-        <w:keepLines/>
+        <w:keepNext w:val="false"/>
+        <w:keepLines w:val="false"/>
         <w:pBdr>
           <w:left w:val="single" w:color="4472C4" w:sz="12" w:space="4"/>
         </w:pBdr>
@@ -2436,8 +2391,8 @@
     </w:p>
     <w:p>
       <w:pPr>
-        <w:keepNext/>
-        <w:keepLines/>
+        <w:keepNext w:val="false"/>
+        <w:keepLines w:val="false"/>
         <w:pBdr>
           <w:left w:val="single" w:color="4472C4" w:sz="12" w:space="4"/>
         </w:pBdr>
@@ -2457,8 +2412,8 @@
     </w:p>
     <w:p>
       <w:pPr>
-        <w:keepNext/>
-        <w:keepLines/>
+        <w:keepNext w:val="false"/>
+        <w:keepLines w:val="false"/>
         <w:pBdr>
           <w:left w:val="single" w:color="4472C4" w:sz="12" w:space="4"/>
         </w:pBdr>
@@ -2478,8 +2433,8 @@
     </w:p>
     <w:p>
       <w:pPr>
-        <w:keepNext/>
-        <w:keepLines/>
+        <w:keepNext w:val="false"/>
+        <w:keepLines w:val="false"/>
         <w:pBdr>
           <w:left w:val="single" w:color="4472C4" w:sz="12" w:space="4"/>
         </w:pBdr>
@@ -2499,8 +2454,8 @@
     </w:p>
     <w:p>
       <w:pPr>
-        <w:keepNext/>
-        <w:keepLines/>
+        <w:keepNext w:val="false"/>
+        <w:keepLines w:val="false"/>
         <w:pBdr>
           <w:left w:val="single" w:color="4472C4" w:sz="12" w:space="4"/>
         </w:pBdr>
@@ -2520,8 +2475,8 @@
     </w:p>
     <w:p>
       <w:pPr>
-        <w:keepNext/>
-        <w:keepLines/>
+        <w:keepNext w:val="false"/>
+        <w:keepLines w:val="false"/>
         <w:pBdr>
           <w:left w:val="single" w:color="4472C4" w:sz="12" w:space="4"/>
         </w:pBdr>
@@ -2541,8 +2496,8 @@
     </w:p>
     <w:p>
       <w:pPr>
-        <w:keepNext/>
-        <w:keepLines/>
+        <w:keepNext w:val="false"/>
+        <w:keepLines w:val="false"/>
         <w:pBdr>
           <w:left w:val="single" w:color="4472C4" w:sz="12" w:space="4"/>
         </w:pBdr>
@@ -2562,8 +2517,8 @@
     </w:p>
     <w:p>
       <w:pPr>
-        <w:keepNext/>
-        <w:keepLines/>
+        <w:keepNext w:val="false"/>
+        <w:keepLines w:val="false"/>
         <w:pBdr>
           <w:left w:val="single" w:color="4472C4" w:sz="12" w:space="4"/>
         </w:pBdr>
@@ -2583,8 +2538,8 @@
     </w:p>
     <w:p>
       <w:pPr>
-        <w:keepNext/>
-        <w:keepLines/>
+        <w:keepNext w:val="false"/>
+        <w:keepLines w:val="false"/>
         <w:pBdr>
           <w:left w:val="single" w:color="4472C4" w:sz="12" w:space="4"/>
         </w:pBdr>
@@ -2604,8 +2559,8 @@
     </w:p>
     <w:p>
       <w:pPr>
-        <w:keepNext/>
-        <w:keepLines/>
+        <w:keepNext w:val="false"/>
+        <w:keepLines w:val="false"/>
         <w:pBdr>
           <w:left w:val="single" w:color="4472C4" w:sz="12" w:space="4"/>
         </w:pBdr>
@@ -2625,8 +2580,8 @@
     </w:p>
     <w:p>
       <w:pPr>
-        <w:keepNext/>
-        <w:keepLines/>
+        <w:keepNext w:val="false"/>
+        <w:keepLines w:val="false"/>
         <w:pBdr>
           <w:left w:val="single" w:color="4472C4" w:sz="12" w:space="4"/>
         </w:pBdr>
@@ -2646,8 +2601,8 @@
     </w:p>
     <w:p>
       <w:pPr>
-        <w:keepNext/>
-        <w:keepLines/>
+        <w:keepNext w:val="false"/>
+        <w:keepLines w:val="false"/>
         <w:pBdr>
           <w:left w:val="single" w:color="4472C4" w:sz="12" w:space="4"/>
         </w:pBdr>
@@ -2667,8 +2622,8 @@
     </w:p>
     <w:p>
       <w:pPr>
-        <w:keepNext/>
-        <w:keepLines/>
+        <w:keepNext w:val="false"/>
+        <w:keepLines w:val="false"/>
         <w:pBdr>
           <w:left w:val="single" w:color="4472C4" w:sz="12" w:space="4"/>
         </w:pBdr>
@@ -2688,8 +2643,8 @@
     </w:p>
     <w:p>
       <w:pPr>
-        <w:keepNext/>
-        <w:keepLines/>
+        <w:keepNext w:val="false"/>
+        <w:keepLines w:val="false"/>
         <w:pBdr>
           <w:left w:val="single" w:color="4472C4" w:sz="12" w:space="4"/>
         </w:pBdr>
@@ -2709,8 +2664,8 @@
     </w:p>
     <w:p>
       <w:pPr>
-        <w:keepNext/>
-        <w:keepLines/>
+        <w:keepNext w:val="false"/>
+        <w:keepLines w:val="false"/>
         <w:pBdr>
           <w:left w:val="single" w:color="4472C4" w:sz="12" w:space="4"/>
         </w:pBdr>
@@ -2730,8 +2685,8 @@
     </w:p>
     <w:p>
       <w:pPr>
-        <w:keepNext/>
-        <w:keepLines/>
+        <w:keepNext w:val="false"/>
+        <w:keepLines w:val="false"/>
         <w:pBdr>
           <w:left w:val="single" w:color="4472C4" w:sz="12" w:space="4"/>
         </w:pBdr>
@@ -2751,8 +2706,8 @@
     </w:p>
     <w:p>
       <w:pPr>
-        <w:keepNext/>
-        <w:keepLines/>
+        <w:keepNext w:val="false"/>
+        <w:keepLines w:val="false"/>
         <w:pBdr>
           <w:left w:val="single" w:color="4472C4" w:sz="12" w:space="4"/>
         </w:pBdr>
@@ -2772,8 +2727,8 @@
     </w:p>
     <w:p>
       <w:pPr>
-        <w:keepNext/>
-        <w:keepLines/>
+        <w:keepNext w:val="false"/>
+        <w:keepLines w:val="false"/>
         <w:pBdr>
           <w:left w:val="single" w:color="4472C4" w:sz="12" w:space="4"/>
         </w:pBdr>
@@ -2794,7 +2749,7 @@
     <w:p>
       <w:pPr>
         <w:keepNext w:val="false"/>
-        <w:keepLines/>
+        <w:keepLines w:val="false"/>
         <w:pBdr>
           <w:left w:val="single" w:color="4472C4" w:sz="12" w:space="4"/>
         </w:pBdr>
@@ -2814,23 +2769,8 @@
     </w:p>
     <w:p>
       <w:pPr>
-        <w:keepNext/>
-        <w:spacing w:after="60" w:before="60" w:line="360" w:lineRule="auto"/>
-        <w:ind w:firstLine="709"/>
-      </w:pPr>
-      <w:r>
-        <w:rPr>
-          <w:rFonts w:ascii="Times New Roman" w:cs="Times New Roman" w:eastAsia="Times New Roman" w:hAnsi="Times New Roman"/>
-          <w:sz w:val="28"/>
-          <w:szCs w:val="28"/>
-        </w:rPr>
-        <w:t xml:space="preserve">Продовження лістингу 3.3</w:t>
-      </w:r>
-    </w:p>
-    <w:p>
-      <w:pPr>
-        <w:keepNext/>
-        <w:keepLines/>
+        <w:keepNext w:val="false"/>
+        <w:keepLines w:val="false"/>
         <w:pBdr>
           <w:left w:val="single" w:color="4472C4" w:sz="12" w:space="4"/>
         </w:pBdr>
@@ -2850,8 +2790,8 @@
     </w:p>
     <w:p>
       <w:pPr>
-        <w:keepNext/>
-        <w:keepLines/>
+        <w:keepNext w:val="false"/>
+        <w:keepLines w:val="false"/>
         <w:pBdr>
           <w:left w:val="single" w:color="4472C4" w:sz="12" w:space="4"/>
         </w:pBdr>
@@ -2871,8 +2811,8 @@
     </w:p>
     <w:p>
       <w:pPr>
-        <w:keepNext/>
-        <w:keepLines/>
+        <w:keepNext w:val="false"/>
+        <w:keepLines w:val="false"/>
         <w:pBdr>
           <w:left w:val="single" w:color="4472C4" w:sz="12" w:space="4"/>
         </w:pBdr>
@@ -2892,8 +2832,8 @@
     </w:p>
     <w:p>
       <w:pPr>
-        <w:keepNext/>
-        <w:keepLines/>
+        <w:keepNext w:val="false"/>
+        <w:keepLines w:val="false"/>
         <w:pBdr>
           <w:left w:val="single" w:color="4472C4" w:sz="12" w:space="4"/>
         </w:pBdr>
@@ -2913,8 +2853,8 @@
     </w:p>
     <w:p>
       <w:pPr>
-        <w:keepNext/>
-        <w:keepLines/>
+        <w:keepNext w:val="false"/>
+        <w:keepLines w:val="false"/>
         <w:pBdr>
           <w:left w:val="single" w:color="4472C4" w:sz="12" w:space="4"/>
         </w:pBdr>
@@ -2934,8 +2874,8 @@
     </w:p>
     <w:p>
       <w:pPr>
-        <w:keepNext/>
-        <w:keepLines/>
+        <w:keepNext w:val="false"/>
+        <w:keepLines w:val="false"/>
         <w:pBdr>
           <w:left w:val="single" w:color="4472C4" w:sz="12" w:space="4"/>
         </w:pBdr>
@@ -2955,8 +2895,8 @@
     </w:p>
     <w:p>
       <w:pPr>
-        <w:keepNext/>
-        <w:keepLines/>
+        <w:keepNext w:val="false"/>
+        <w:keepLines w:val="false"/>
         <w:pBdr>
           <w:left w:val="single" w:color="4472C4" w:sz="12" w:space="4"/>
         </w:pBdr>
@@ -2976,8 +2916,8 @@
     </w:p>
     <w:p>
       <w:pPr>
-        <w:keepNext/>
-        <w:keepLines/>
+        <w:keepNext w:val="false"/>
+        <w:keepLines w:val="false"/>
         <w:pBdr>
           <w:left w:val="single" w:color="4472C4" w:sz="12" w:space="4"/>
         </w:pBdr>
@@ -2997,8 +2937,8 @@
     </w:p>
     <w:p>
       <w:pPr>
-        <w:keepNext/>
-        <w:keepLines/>
+        <w:keepNext w:val="false"/>
+        <w:keepLines w:val="false"/>
         <w:pBdr>
           <w:left w:val="single" w:color="4472C4" w:sz="12" w:space="4"/>
         </w:pBdr>
@@ -3018,8 +2958,8 @@
     </w:p>
     <w:p>
       <w:pPr>
-        <w:keepNext/>
-        <w:keepLines/>
+        <w:keepNext w:val="false"/>
+        <w:keepLines w:val="false"/>
         <w:pBdr>
           <w:left w:val="single" w:color="4472C4" w:sz="12" w:space="4"/>
         </w:pBdr>
@@ -3039,8 +2979,8 @@
     </w:p>
     <w:p>
       <w:pPr>
-        <w:keepNext/>
-        <w:keepLines/>
+        <w:keepNext w:val="false"/>
+        <w:keepLines w:val="false"/>
         <w:pBdr>
           <w:left w:val="single" w:color="4472C4" w:sz="12" w:space="4"/>
         </w:pBdr>
@@ -3060,8 +3000,8 @@
     </w:p>
     <w:p>
       <w:pPr>
-        <w:keepNext/>
-        <w:keepLines/>
+        <w:keepNext w:val="false"/>
+        <w:keepLines w:val="false"/>
         <w:pBdr>
           <w:left w:val="single" w:color="4472C4" w:sz="12" w:space="4"/>
         </w:pBdr>
@@ -3082,7 +3022,7 @@
     <w:p>
       <w:pPr>
         <w:keepNext w:val="false"/>
-        <w:keepLines/>
+        <w:keepLines w:val="false"/>
         <w:pBdr>
           <w:left w:val="single" w:color="4472C4" w:sz="12" w:space="4"/>
         </w:pBdr>
@@ -3150,8 +3090,8 @@
     </w:p>
     <w:p>
       <w:pPr>
-        <w:keepNext/>
-        <w:keepLines/>
+        <w:keepNext w:val="false"/>
+        <w:keepLines w:val="false"/>
         <w:pBdr>
           <w:left w:val="single" w:color="4472C4" w:sz="12" w:space="4"/>
         </w:pBdr>
@@ -3171,8 +3111,8 @@
     </w:p>
     <w:p>
       <w:pPr>
-        <w:keepNext/>
-        <w:keepLines/>
+        <w:keepNext w:val="false"/>
+        <w:keepLines w:val="false"/>
         <w:pBdr>
           <w:left w:val="single" w:color="4472C4" w:sz="12" w:space="4"/>
         </w:pBdr>
@@ -3192,8 +3132,8 @@
     </w:p>
     <w:p>
       <w:pPr>
-        <w:keepNext/>
-        <w:keepLines/>
+        <w:keepNext w:val="false"/>
+        <w:keepLines w:val="false"/>
         <w:pBdr>
           <w:left w:val="single" w:color="4472C4" w:sz="12" w:space="4"/>
         </w:pBdr>
@@ -3213,8 +3153,8 @@
     </w:p>
     <w:p>
       <w:pPr>
-        <w:keepNext/>
-        <w:keepLines/>
+        <w:keepNext w:val="false"/>
+        <w:keepLines w:val="false"/>
         <w:pBdr>
           <w:left w:val="single" w:color="4472C4" w:sz="12" w:space="4"/>
         </w:pBdr>
@@ -3234,8 +3174,8 @@
     </w:p>
     <w:p>
       <w:pPr>
-        <w:keepNext/>
-        <w:keepLines/>
+        <w:keepNext w:val="false"/>
+        <w:keepLines w:val="false"/>
         <w:pBdr>
           <w:left w:val="single" w:color="4472C4" w:sz="12" w:space="4"/>
         </w:pBdr>
@@ -3255,8 +3195,8 @@
     </w:p>
     <w:p>
       <w:pPr>
-        <w:keepNext/>
-        <w:keepLines/>
+        <w:keepNext w:val="false"/>
+        <w:keepLines w:val="false"/>
         <w:pBdr>
           <w:left w:val="single" w:color="4472C4" w:sz="12" w:space="4"/>
         </w:pBdr>
@@ -3276,8 +3216,8 @@
     </w:p>
     <w:p>
       <w:pPr>
-        <w:keepNext/>
-        <w:keepLines/>
+        <w:keepNext w:val="false"/>
+        <w:keepLines w:val="false"/>
         <w:pBdr>
           <w:left w:val="single" w:color="4472C4" w:sz="12" w:space="4"/>
         </w:pBdr>
@@ -3297,8 +3237,8 @@
     </w:p>
     <w:p>
       <w:pPr>
-        <w:keepNext/>
-        <w:keepLines/>
+        <w:keepNext w:val="false"/>
+        <w:keepLines w:val="false"/>
         <w:pBdr>
           <w:left w:val="single" w:color="4472C4" w:sz="12" w:space="4"/>
         </w:pBdr>
@@ -3318,8 +3258,8 @@
     </w:p>
     <w:p>
       <w:pPr>
-        <w:keepNext/>
-        <w:keepLines/>
+        <w:keepNext w:val="false"/>
+        <w:keepLines w:val="false"/>
         <w:pBdr>
           <w:left w:val="single" w:color="4472C4" w:sz="12" w:space="4"/>
         </w:pBdr>
@@ -3339,8 +3279,8 @@
     </w:p>
     <w:p>
       <w:pPr>
-        <w:keepNext/>
-        <w:keepLines/>
+        <w:keepNext w:val="false"/>
+        <w:keepLines w:val="false"/>
         <w:pBdr>
           <w:left w:val="single" w:color="4472C4" w:sz="12" w:space="4"/>
         </w:pBdr>
@@ -3360,8 +3300,8 @@
     </w:p>
     <w:p>
       <w:pPr>
-        <w:keepNext/>
-        <w:keepLines/>
+        <w:keepNext w:val="false"/>
+        <w:keepLines w:val="false"/>
         <w:pBdr>
           <w:left w:val="single" w:color="4472C4" w:sz="12" w:space="4"/>
         </w:pBdr>
@@ -3381,8 +3321,8 @@
     </w:p>
     <w:p>
       <w:pPr>
-        <w:keepNext/>
-        <w:keepLines/>
+        <w:keepNext w:val="false"/>
+        <w:keepLines w:val="false"/>
         <w:pBdr>
           <w:left w:val="single" w:color="4472C4" w:sz="12" w:space="4"/>
         </w:pBdr>
@@ -3402,8 +3342,8 @@
     </w:p>
     <w:p>
       <w:pPr>
-        <w:keepNext/>
-        <w:keepLines/>
+        <w:keepNext w:val="false"/>
+        <w:keepLines w:val="false"/>
         <w:pBdr>
           <w:left w:val="single" w:color="4472C4" w:sz="12" w:space="4"/>
         </w:pBdr>
@@ -3423,8 +3363,8 @@
     </w:p>
     <w:p>
       <w:pPr>
-        <w:keepNext/>
-        <w:keepLines/>
+        <w:keepNext w:val="false"/>
+        <w:keepLines w:val="false"/>
         <w:pBdr>
           <w:left w:val="single" w:color="4472C4" w:sz="12" w:space="4"/>
         </w:pBdr>
@@ -3444,8 +3384,8 @@
     </w:p>
     <w:p>
       <w:pPr>
-        <w:keepNext/>
-        <w:keepLines/>
+        <w:keepNext w:val="false"/>
+        <w:keepLines w:val="false"/>
         <w:pBdr>
           <w:left w:val="single" w:color="4472C4" w:sz="12" w:space="4"/>
         </w:pBdr>
@@ -3465,8 +3405,8 @@
     </w:p>
     <w:p>
       <w:pPr>
-        <w:keepNext/>
-        <w:keepLines/>
+        <w:keepNext w:val="false"/>
+        <w:keepLines w:val="false"/>
         <w:pBdr>
           <w:left w:val="single" w:color="4472C4" w:sz="12" w:space="4"/>
         </w:pBdr>
@@ -3486,8 +3426,8 @@
     </w:p>
     <w:p>
       <w:pPr>
-        <w:keepNext/>
-        <w:keepLines/>
+        <w:keepNext w:val="false"/>
+        <w:keepLines w:val="false"/>
         <w:pBdr>
           <w:left w:val="single" w:color="4472C4" w:sz="12" w:space="4"/>
         </w:pBdr>
@@ -3507,8 +3447,8 @@
     </w:p>
     <w:p>
       <w:pPr>
-        <w:keepNext/>
-        <w:keepLines/>
+        <w:keepNext w:val="false"/>
+        <w:keepLines w:val="false"/>
         <w:pBdr>
           <w:left w:val="single" w:color="4472C4" w:sz="12" w:space="4"/>
         </w:pBdr>
@@ -3528,8 +3468,8 @@
     </w:p>
     <w:p>
       <w:pPr>
-        <w:keepNext/>
-        <w:keepLines/>
+        <w:keepNext w:val="false"/>
+        <w:keepLines w:val="false"/>
         <w:pBdr>
           <w:left w:val="single" w:color="4472C4" w:sz="12" w:space="4"/>
         </w:pBdr>
@@ -3550,7 +3490,7 @@
     <w:p>
       <w:pPr>
         <w:keepNext w:val="false"/>
-        <w:keepLines/>
+        <w:keepLines w:val="false"/>
         <w:pBdr>
           <w:left w:val="single" w:color="4472C4" w:sz="12" w:space="4"/>
         </w:pBdr>
@@ -3570,23 +3510,8 @@
     </w:p>
     <w:p>
       <w:pPr>
-        <w:keepNext/>
-        <w:spacing w:after="60" w:before="60" w:line="360" w:lineRule="auto"/>
-        <w:ind w:firstLine="709"/>
-      </w:pPr>
-      <w:r>
-        <w:rPr>
-          <w:rFonts w:ascii="Times New Roman" w:cs="Times New Roman" w:eastAsia="Times New Roman" w:hAnsi="Times New Roman"/>
-          <w:sz w:val="28"/>
-          <w:szCs w:val="28"/>
-        </w:rPr>
-        <w:t xml:space="preserve">Продовження лістингу 4.1</w:t>
-      </w:r>
-    </w:p>
-    <w:p>
-      <w:pPr>
-        <w:keepNext/>
-        <w:keepLines/>
+        <w:keepNext w:val="false"/>
+        <w:keepLines w:val="false"/>
         <w:pBdr>
           <w:left w:val="single" w:color="4472C4" w:sz="12" w:space="4"/>
         </w:pBdr>
@@ -3606,8 +3531,8 @@
     </w:p>
     <w:p>
       <w:pPr>
-        <w:keepNext/>
-        <w:keepLines/>
+        <w:keepNext w:val="false"/>
+        <w:keepLines w:val="false"/>
         <w:pBdr>
           <w:left w:val="single" w:color="4472C4" w:sz="12" w:space="4"/>
         </w:pBdr>
@@ -3627,8 +3552,8 @@
     </w:p>
     <w:p>
       <w:pPr>
-        <w:keepNext/>
-        <w:keepLines/>
+        <w:keepNext w:val="false"/>
+        <w:keepLines w:val="false"/>
         <w:pBdr>
           <w:left w:val="single" w:color="4472C4" w:sz="12" w:space="4"/>
         </w:pBdr>
@@ -3648,8 +3573,8 @@
     </w:p>
     <w:p>
       <w:pPr>
-        <w:keepNext/>
-        <w:keepLines/>
+        <w:keepNext w:val="false"/>
+        <w:keepLines w:val="false"/>
         <w:pBdr>
           <w:left w:val="single" w:color="4472C4" w:sz="12" w:space="4"/>
         </w:pBdr>
@@ -3669,8 +3594,8 @@
     </w:p>
     <w:p>
       <w:pPr>
-        <w:keepNext/>
-        <w:keepLines/>
+        <w:keepNext w:val="false"/>
+        <w:keepLines w:val="false"/>
         <w:pBdr>
           <w:left w:val="single" w:color="4472C4" w:sz="12" w:space="4"/>
         </w:pBdr>
@@ -3690,8 +3615,8 @@
     </w:p>
     <w:p>
       <w:pPr>
-        <w:keepNext/>
-        <w:keepLines/>
+        <w:keepNext w:val="false"/>
+        <w:keepLines w:val="false"/>
         <w:pBdr>
           <w:left w:val="single" w:color="4472C4" w:sz="12" w:space="4"/>
         </w:pBdr>
@@ -3711,8 +3636,8 @@
     </w:p>
     <w:p>
       <w:pPr>
-        <w:keepNext/>
-        <w:keepLines/>
+        <w:keepNext w:val="false"/>
+        <w:keepLines w:val="false"/>
         <w:pBdr>
           <w:left w:val="single" w:color="4472C4" w:sz="12" w:space="4"/>
         </w:pBdr>
@@ -3732,8 +3657,8 @@
     </w:p>
     <w:p>
       <w:pPr>
-        <w:keepNext/>
-        <w:keepLines/>
+        <w:keepNext w:val="false"/>
+        <w:keepLines w:val="false"/>
         <w:pBdr>
           <w:left w:val="single" w:color="4472C4" w:sz="12" w:space="4"/>
         </w:pBdr>
@@ -3753,8 +3678,8 @@
     </w:p>
     <w:p>
       <w:pPr>
-        <w:keepNext/>
-        <w:keepLines/>
+        <w:keepNext w:val="false"/>
+        <w:keepLines w:val="false"/>
         <w:pBdr>
           <w:left w:val="single" w:color="4472C4" w:sz="12" w:space="4"/>
         </w:pBdr>
@@ -3774,8 +3699,8 @@
     </w:p>
     <w:p>
       <w:pPr>
-        <w:keepNext/>
-        <w:keepLines/>
+        <w:keepNext w:val="false"/>
+        <w:keepLines w:val="false"/>
         <w:pBdr>
           <w:left w:val="single" w:color="4472C4" w:sz="12" w:space="4"/>
         </w:pBdr>
@@ -3795,8 +3720,8 @@
     </w:p>
     <w:p>
       <w:pPr>
-        <w:keepNext/>
-        <w:keepLines/>
+        <w:keepNext w:val="false"/>
+        <w:keepLines w:val="false"/>
         <w:pBdr>
           <w:left w:val="single" w:color="4472C4" w:sz="12" w:space="4"/>
         </w:pBdr>
@@ -3816,8 +3741,8 @@
     </w:p>
     <w:p>
       <w:pPr>
-        <w:keepNext/>
-        <w:keepLines/>
+        <w:keepNext w:val="false"/>
+        <w:keepLines w:val="false"/>
         <w:pBdr>
           <w:left w:val="single" w:color="4472C4" w:sz="12" w:space="4"/>
         </w:pBdr>
@@ -3837,8 +3762,8 @@
     </w:p>
     <w:p>
       <w:pPr>
-        <w:keepNext/>
-        <w:keepLines/>
+        <w:keepNext w:val="false"/>
+        <w:keepLines w:val="false"/>
         <w:pBdr>
           <w:left w:val="single" w:color="4472C4" w:sz="12" w:space="4"/>
         </w:pBdr>
@@ -3858,8 +3783,8 @@
     </w:p>
     <w:p>
       <w:pPr>
-        <w:keepNext/>
-        <w:keepLines/>
+        <w:keepNext w:val="false"/>
+        <w:keepLines w:val="false"/>
         <w:pBdr>
           <w:left w:val="single" w:color="4472C4" w:sz="12" w:space="4"/>
         </w:pBdr>
@@ -3879,8 +3804,8 @@
     </w:p>
     <w:p>
       <w:pPr>
-        <w:keepNext/>
-        <w:keepLines/>
+        <w:keepNext w:val="false"/>
+        <w:keepLines w:val="false"/>
         <w:pBdr>
           <w:left w:val="single" w:color="4472C4" w:sz="12" w:space="4"/>
         </w:pBdr>
@@ -3900,8 +3825,8 @@
     </w:p>
     <w:p>
       <w:pPr>
-        <w:keepNext/>
-        <w:keepLines/>
+        <w:keepNext w:val="false"/>
+        <w:keepLines w:val="false"/>
         <w:pBdr>
           <w:left w:val="single" w:color="4472C4" w:sz="12" w:space="4"/>
         </w:pBdr>
@@ -3921,8 +3846,8 @@
     </w:p>
     <w:p>
       <w:pPr>
-        <w:keepNext/>
-        <w:keepLines/>
+        <w:keepNext w:val="false"/>
+        <w:keepLines w:val="false"/>
         <w:pBdr>
           <w:left w:val="single" w:color="4472C4" w:sz="12" w:space="4"/>
         </w:pBdr>
@@ -3942,8 +3867,8 @@
     </w:p>
     <w:p>
       <w:pPr>
-        <w:keepNext/>
-        <w:keepLines/>
+        <w:keepNext w:val="false"/>
+        <w:keepLines w:val="false"/>
         <w:pBdr>
           <w:left w:val="single" w:color="4472C4" w:sz="12" w:space="4"/>
         </w:pBdr>
@@ -3963,8 +3888,8 @@
     </w:p>
     <w:p>
       <w:pPr>
-        <w:keepNext/>
-        <w:keepLines/>
+        <w:keepNext w:val="false"/>
+        <w:keepLines w:val="false"/>
         <w:pBdr>
           <w:left w:val="single" w:color="4472C4" w:sz="12" w:space="4"/>
         </w:pBdr>
@@ -3985,7 +3910,7 @@
     <w:p>
       <w:pPr>
         <w:keepNext w:val="false"/>
-        <w:keepLines/>
+        <w:keepLines w:val="false"/>
         <w:pBdr>
           <w:left w:val="single" w:color="4472C4" w:sz="12" w:space="4"/>
         </w:pBdr>
@@ -4005,23 +3930,8 @@
     </w:p>
     <w:p>
       <w:pPr>
-        <w:keepNext/>
-        <w:spacing w:after="60" w:before="60" w:line="360" w:lineRule="auto"/>
-        <w:ind w:firstLine="709"/>
-      </w:pPr>
-      <w:r>
-        <w:rPr>
-          <w:rFonts w:ascii="Times New Roman" w:cs="Times New Roman" w:eastAsia="Times New Roman" w:hAnsi="Times New Roman"/>
-          <w:sz w:val="28"/>
-          <w:szCs w:val="28"/>
-        </w:rPr>
-        <w:t xml:space="preserve">Продовження лістингу 4.1</w:t>
-      </w:r>
-    </w:p>
-    <w:p>
-      <w:pPr>
-        <w:keepNext/>
-        <w:keepLines/>
+        <w:keepNext w:val="false"/>
+        <w:keepLines w:val="false"/>
         <w:pBdr>
           <w:left w:val="single" w:color="4472C4" w:sz="12" w:space="4"/>
         </w:pBdr>
@@ -4041,8 +3951,8 @@
     </w:p>
     <w:p>
       <w:pPr>
-        <w:keepNext/>
-        <w:keepLines/>
+        <w:keepNext w:val="false"/>
+        <w:keepLines w:val="false"/>
         <w:pBdr>
           <w:left w:val="single" w:color="4472C4" w:sz="12" w:space="4"/>
         </w:pBdr>
@@ -4062,8 +3972,8 @@
     </w:p>
     <w:p>
       <w:pPr>
-        <w:keepNext/>
-        <w:keepLines/>
+        <w:keepNext w:val="false"/>
+        <w:keepLines w:val="false"/>
         <w:pBdr>
           <w:left w:val="single" w:color="4472C4" w:sz="12" w:space="4"/>
         </w:pBdr>
@@ -4083,8 +3993,8 @@
     </w:p>
     <w:p>
       <w:pPr>
-        <w:keepNext/>
-        <w:keepLines/>
+        <w:keepNext w:val="false"/>
+        <w:keepLines w:val="false"/>
         <w:pBdr>
           <w:left w:val="single" w:color="4472C4" w:sz="12" w:space="4"/>
         </w:pBdr>
@@ -4104,8 +4014,8 @@
     </w:p>
     <w:p>
       <w:pPr>
-        <w:keepNext/>
-        <w:keepLines/>
+        <w:keepNext w:val="false"/>
+        <w:keepLines w:val="false"/>
         <w:pBdr>
           <w:left w:val="single" w:color="4472C4" w:sz="12" w:space="4"/>
         </w:pBdr>
@@ -4125,8 +4035,8 @@
     </w:p>
     <w:p>
       <w:pPr>
-        <w:keepNext/>
-        <w:keepLines/>
+        <w:keepNext w:val="false"/>
+        <w:keepLines w:val="false"/>
         <w:pBdr>
           <w:left w:val="single" w:color="4472C4" w:sz="12" w:space="4"/>
         </w:pBdr>
@@ -4146,8 +4056,8 @@
     </w:p>
     <w:p>
       <w:pPr>
-        <w:keepNext/>
-        <w:keepLines/>
+        <w:keepNext w:val="false"/>
+        <w:keepLines w:val="false"/>
         <w:pBdr>
           <w:left w:val="single" w:color="4472C4" w:sz="12" w:space="4"/>
         </w:pBdr>
@@ -4168,7 +4078,7 @@
     <w:p>
       <w:pPr>
         <w:keepNext w:val="false"/>
-        <w:keepLines/>
+        <w:keepLines w:val="false"/>
         <w:pBdr>
           <w:left w:val="single" w:color="4472C4" w:sz="12" w:space="4"/>
         </w:pBdr>
@@ -5031,7 +4941,7 @@
     </w:p>
     <w:p>
       <w:pPr>
-        <w:keepNext w:val="false"/>
+        <w:keepNext/>
         <w:keepLines/>
         <w:pBdr>
           <w:left w:val="single" w:color="4472C4" w:sz="12" w:space="4"/>
@@ -5048,21 +4958,6 @@
           <w:shd w:fill="F2F2F2" w:color="auto" w:val="clear"/>
         </w:rPr>
         <w:t xml:space="preserve">  queue.print();</w:t>
-      </w:r>
-    </w:p>
-    <w:p>
-      <w:pPr>
-        <w:keepNext/>
-        <w:spacing w:after="60" w:before="60" w:line="360" w:lineRule="auto"/>
-        <w:ind w:firstLine="709"/>
-      </w:pPr>
-      <w:r>
-        <w:rPr>
-          <w:rFonts w:ascii="Times New Roman" w:cs="Times New Roman" w:eastAsia="Times New Roman" w:hAnsi="Times New Roman"/>
-          <w:sz w:val="28"/>
-          <w:szCs w:val="28"/>
-        </w:rPr>
-        <w:t xml:space="preserve">Продовження лістингу А.2</w:t>
       </w:r>
     </w:p>
     <w:p>
@@ -5518,7 +5413,7 @@
     </w:p>
     <w:p>
       <w:pPr>
-        <w:keepNext w:val="false"/>
+        <w:keepNext/>
         <w:keepLines/>
         <w:pBdr>
           <w:left w:val="single" w:color="4472C4" w:sz="12" w:space="4"/>
@@ -5535,21 +5430,6 @@
           <w:shd w:fill="F2F2F2" w:color="auto" w:val="clear"/>
         </w:rPr>
         <w:t xml:space="preserve">  stack.print();</w:t>
-      </w:r>
-    </w:p>
-    <w:p>
-      <w:pPr>
-        <w:keepNext/>
-        <w:spacing w:after="60" w:before="60" w:line="360" w:lineRule="auto"/>
-        <w:ind w:firstLine="709"/>
-      </w:pPr>
-      <w:r>
-        <w:rPr>
-          <w:rFonts w:ascii="Times New Roman" w:cs="Times New Roman" w:eastAsia="Times New Roman" w:hAnsi="Times New Roman"/>
-          <w:sz w:val="28"/>
-          <w:szCs w:val="28"/>
-        </w:rPr>
-        <w:t xml:space="preserve">Продовження лістингу А.3</w:t>
       </w:r>
     </w:p>
     <w:p>
@@ -5889,8 +5769,8 @@
     </w:p>
     <w:p>
       <w:pPr>
-        <w:keepNext/>
-        <w:keepLines/>
+        <w:keepNext w:val="false"/>
+        <w:keepLines w:val="false"/>
         <w:pBdr>
           <w:left w:val="single" w:color="4472C4" w:sz="12" w:space="4"/>
         </w:pBdr>
@@ -5910,8 +5790,8 @@
     </w:p>
     <w:p>
       <w:pPr>
-        <w:keepNext/>
-        <w:keepLines/>
+        <w:keepNext w:val="false"/>
+        <w:keepLines w:val="false"/>
         <w:pBdr>
           <w:left w:val="single" w:color="4472C4" w:sz="12" w:space="4"/>
         </w:pBdr>
@@ -5931,8 +5811,8 @@
     </w:p>
     <w:p>
       <w:pPr>
-        <w:keepNext/>
-        <w:keepLines/>
+        <w:keepNext w:val="false"/>
+        <w:keepLines w:val="false"/>
         <w:pBdr>
           <w:left w:val="single" w:color="4472C4" w:sz="12" w:space="4"/>
         </w:pBdr>
@@ -5952,8 +5832,8 @@
     </w:p>
     <w:p>
       <w:pPr>
-        <w:keepNext/>
-        <w:keepLines/>
+        <w:keepNext w:val="false"/>
+        <w:keepLines w:val="false"/>
         <w:pBdr>
           <w:left w:val="single" w:color="4472C4" w:sz="12" w:space="4"/>
         </w:pBdr>
@@ -5973,8 +5853,8 @@
     </w:p>
     <w:p>
       <w:pPr>
-        <w:keepNext/>
-        <w:keepLines/>
+        <w:keepNext w:val="false"/>
+        <w:keepLines w:val="false"/>
         <w:pBdr>
           <w:left w:val="single" w:color="4472C4" w:sz="12" w:space="4"/>
         </w:pBdr>
@@ -5994,8 +5874,8 @@
     </w:p>
     <w:p>
       <w:pPr>
-        <w:keepNext/>
-        <w:keepLines/>
+        <w:keepNext w:val="false"/>
+        <w:keepLines w:val="false"/>
         <w:pBdr>
           <w:left w:val="single" w:color="4472C4" w:sz="12" w:space="4"/>
         </w:pBdr>
@@ -6015,8 +5895,8 @@
     </w:p>
     <w:p>
       <w:pPr>
-        <w:keepNext/>
-        <w:keepLines/>
+        <w:keepNext w:val="false"/>
+        <w:keepLines w:val="false"/>
         <w:pBdr>
           <w:left w:val="single" w:color="4472C4" w:sz="12" w:space="4"/>
         </w:pBdr>
@@ -6036,8 +5916,8 @@
     </w:p>
     <w:p>
       <w:pPr>
-        <w:keepNext/>
-        <w:keepLines/>
+        <w:keepNext w:val="false"/>
+        <w:keepLines w:val="false"/>
         <w:pBdr>
           <w:left w:val="single" w:color="4472C4" w:sz="12" w:space="4"/>
         </w:pBdr>
@@ -6057,8 +5937,8 @@
     </w:p>
     <w:p>
       <w:pPr>
-        <w:keepNext/>
-        <w:keepLines/>
+        <w:keepNext w:val="false"/>
+        <w:keepLines w:val="false"/>
         <w:pBdr>
           <w:left w:val="single" w:color="4472C4" w:sz="12" w:space="4"/>
         </w:pBdr>
@@ -6078,8 +5958,8 @@
     </w:p>
     <w:p>
       <w:pPr>
-        <w:keepNext/>
-        <w:keepLines/>
+        <w:keepNext w:val="false"/>
+        <w:keepLines w:val="false"/>
         <w:pBdr>
           <w:left w:val="single" w:color="4472C4" w:sz="12" w:space="4"/>
         </w:pBdr>
@@ -6099,8 +5979,8 @@
     </w:p>
     <w:p>
       <w:pPr>
-        <w:keepNext/>
-        <w:keepLines/>
+        <w:keepNext w:val="false"/>
+        <w:keepLines w:val="false"/>
         <w:pBdr>
           <w:left w:val="single" w:color="4472C4" w:sz="12" w:space="4"/>
         </w:pBdr>
@@ -6120,8 +6000,8 @@
     </w:p>
     <w:p>
       <w:pPr>
-        <w:keepNext/>
-        <w:keepLines/>
+        <w:keepNext w:val="false"/>
+        <w:keepLines w:val="false"/>
         <w:pBdr>
           <w:left w:val="single" w:color="4472C4" w:sz="12" w:space="4"/>
         </w:pBdr>
@@ -6141,8 +6021,8 @@
     </w:p>
     <w:p>
       <w:pPr>
-        <w:keepNext/>
-        <w:keepLines/>
+        <w:keepNext w:val="false"/>
+        <w:keepLines w:val="false"/>
         <w:pBdr>
           <w:left w:val="single" w:color="4472C4" w:sz="12" w:space="4"/>
         </w:pBdr>
@@ -6162,8 +6042,8 @@
     </w:p>
     <w:p>
       <w:pPr>
-        <w:keepNext/>
-        <w:keepLines/>
+        <w:keepNext w:val="false"/>
+        <w:keepLines w:val="false"/>
         <w:pBdr>
           <w:left w:val="single" w:color="4472C4" w:sz="12" w:space="4"/>
         </w:pBdr>
@@ -6183,8 +6063,8 @@
     </w:p>
     <w:p>
       <w:pPr>
-        <w:keepNext/>
-        <w:keepLines/>
+        <w:keepNext w:val="false"/>
+        <w:keepLines w:val="false"/>
         <w:pBdr>
           <w:left w:val="single" w:color="4472C4" w:sz="12" w:space="4"/>
         </w:pBdr>
@@ -6204,8 +6084,8 @@
     </w:p>
     <w:p>
       <w:pPr>
-        <w:keepNext/>
-        <w:keepLines/>
+        <w:keepNext w:val="false"/>
+        <w:keepLines w:val="false"/>
         <w:pBdr>
           <w:left w:val="single" w:color="4472C4" w:sz="12" w:space="4"/>
         </w:pBdr>
@@ -6225,8 +6105,8 @@
     </w:p>
     <w:p>
       <w:pPr>
-        <w:keepNext/>
-        <w:keepLines/>
+        <w:keepNext w:val="false"/>
+        <w:keepLines w:val="false"/>
         <w:pBdr>
           <w:left w:val="single" w:color="4472C4" w:sz="12" w:space="4"/>
         </w:pBdr>
@@ -6246,8 +6126,8 @@
     </w:p>
     <w:p>
       <w:pPr>
-        <w:keepNext/>
-        <w:keepLines/>
+        <w:keepNext w:val="false"/>
+        <w:keepLines w:val="false"/>
         <w:pBdr>
           <w:left w:val="single" w:color="4472C4" w:sz="12" w:space="4"/>
         </w:pBdr>
@@ -6267,8 +6147,8 @@
     </w:p>
     <w:p>
       <w:pPr>
-        <w:keepNext/>
-        <w:keepLines/>
+        <w:keepNext w:val="false"/>
+        <w:keepLines w:val="false"/>
         <w:pBdr>
           <w:left w:val="single" w:color="4472C4" w:sz="12" w:space="4"/>
         </w:pBdr>
@@ -6289,7 +6169,7 @@
     <w:p>
       <w:pPr>
         <w:keepNext w:val="false"/>
-        <w:keepLines/>
+        <w:keepLines w:val="false"/>
         <w:pBdr>
           <w:left w:val="single" w:color="4472C4" w:sz="12" w:space="4"/>
         </w:pBdr>
@@ -6309,23 +6189,8 @@
     </w:p>
     <w:p>
       <w:pPr>
-        <w:keepNext/>
-        <w:spacing w:after="60" w:before="60" w:line="360" w:lineRule="auto"/>
-        <w:ind w:firstLine="709"/>
-      </w:pPr>
-      <w:r>
-        <w:rPr>
-          <w:rFonts w:ascii="Times New Roman" w:cs="Times New Roman" w:eastAsia="Times New Roman" w:hAnsi="Times New Roman"/>
-          <w:sz w:val="28"/>
-          <w:szCs w:val="28"/>
-        </w:rPr>
-        <w:t xml:space="preserve">Продовження лістингу А.5</w:t>
-      </w:r>
-    </w:p>
-    <w:p>
-      <w:pPr>
-        <w:keepNext/>
-        <w:keepLines/>
+        <w:keepNext w:val="false"/>
+        <w:keepLines w:val="false"/>
         <w:pBdr>
           <w:left w:val="single" w:color="4472C4" w:sz="12" w:space="4"/>
         </w:pBdr>
@@ -6345,8 +6210,8 @@
     </w:p>
     <w:p>
       <w:pPr>
-        <w:keepNext/>
-        <w:keepLines/>
+        <w:keepNext w:val="false"/>
+        <w:keepLines w:val="false"/>
         <w:pBdr>
           <w:left w:val="single" w:color="4472C4" w:sz="12" w:space="4"/>
         </w:pBdr>
@@ -6366,8 +6231,8 @@
     </w:p>
     <w:p>
       <w:pPr>
-        <w:keepNext/>
-        <w:keepLines/>
+        <w:keepNext w:val="false"/>
+        <w:keepLines w:val="false"/>
         <w:pBdr>
           <w:left w:val="single" w:color="4472C4" w:sz="12" w:space="4"/>
         </w:pBdr>
@@ -6387,8 +6252,8 @@
     </w:p>
     <w:p>
       <w:pPr>
-        <w:keepNext/>
-        <w:keepLines/>
+        <w:keepNext w:val="false"/>
+        <w:keepLines w:val="false"/>
         <w:pBdr>
           <w:left w:val="single" w:color="4472C4" w:sz="12" w:space="4"/>
         </w:pBdr>
@@ -6408,8 +6273,8 @@
     </w:p>
     <w:p>
       <w:pPr>
-        <w:keepNext/>
-        <w:keepLines/>
+        <w:keepNext w:val="false"/>
+        <w:keepLines w:val="false"/>
         <w:pBdr>
           <w:left w:val="single" w:color="4472C4" w:sz="12" w:space="4"/>
         </w:pBdr>
@@ -6429,8 +6294,8 @@
     </w:p>
     <w:p>
       <w:pPr>
-        <w:keepNext/>
-        <w:keepLines/>
+        <w:keepNext w:val="false"/>
+        <w:keepLines w:val="false"/>
         <w:pBdr>
           <w:left w:val="single" w:color="4472C4" w:sz="12" w:space="4"/>
         </w:pBdr>
@@ -6450,8 +6315,8 @@
     </w:p>
     <w:p>
       <w:pPr>
-        <w:keepNext/>
-        <w:keepLines/>
+        <w:keepNext w:val="false"/>
+        <w:keepLines w:val="false"/>
         <w:pBdr>
           <w:left w:val="single" w:color="4472C4" w:sz="12" w:space="4"/>
         </w:pBdr>
@@ -6471,8 +6336,8 @@
     </w:p>
     <w:p>
       <w:pPr>
-        <w:keepNext/>
-        <w:keepLines/>
+        <w:keepNext w:val="false"/>
+        <w:keepLines w:val="false"/>
         <w:pBdr>
           <w:left w:val="single" w:color="4472C4" w:sz="12" w:space="4"/>
         </w:pBdr>
@@ -6492,8 +6357,8 @@
     </w:p>
     <w:p>
       <w:pPr>
-        <w:keepNext/>
-        <w:keepLines/>
+        <w:keepNext w:val="false"/>
+        <w:keepLines w:val="false"/>
         <w:pBdr>
           <w:left w:val="single" w:color="4472C4" w:sz="12" w:space="4"/>
         </w:pBdr>
@@ -6513,8 +6378,8 @@
     </w:p>
     <w:p>
       <w:pPr>
-        <w:keepNext/>
-        <w:keepLines/>
+        <w:keepNext w:val="false"/>
+        <w:keepLines w:val="false"/>
         <w:pBdr>
           <w:left w:val="single" w:color="4472C4" w:sz="12" w:space="4"/>
         </w:pBdr>
@@ -6534,8 +6399,8 @@
     </w:p>
     <w:p>
       <w:pPr>
-        <w:keepNext/>
-        <w:keepLines/>
+        <w:keepNext w:val="false"/>
+        <w:keepLines w:val="false"/>
         <w:pBdr>
           <w:left w:val="single" w:color="4472C4" w:sz="12" w:space="4"/>
         </w:pBdr>
@@ -6555,8 +6420,8 @@
     </w:p>
     <w:p>
       <w:pPr>
-        <w:keepNext/>
-        <w:keepLines/>
+        <w:keepNext w:val="false"/>
+        <w:keepLines w:val="false"/>
         <w:pBdr>
           <w:left w:val="single" w:color="4472C4" w:sz="12" w:space="4"/>
         </w:pBdr>
@@ -6577,7 +6442,7 @@
     <w:p>
       <w:pPr>
         <w:keepNext w:val="false"/>
-        <w:keepLines/>
+        <w:keepLines w:val="false"/>
         <w:pBdr>
           <w:left w:val="single" w:color="4472C4" w:sz="12" w:space="4"/>
         </w:pBdr>
@@ -6628,8 +6493,8 @@
     </w:p>
     <w:p>
       <w:pPr>
-        <w:keepNext/>
-        <w:keepLines/>
+        <w:keepNext w:val="false"/>
+        <w:keepLines w:val="false"/>
         <w:pBdr>
           <w:left w:val="single" w:color="4472C4" w:sz="12" w:space="4"/>
         </w:pBdr>
@@ -6649,8 +6514,8 @@
     </w:p>
     <w:p>
       <w:pPr>
-        <w:keepNext/>
-        <w:keepLines/>
+        <w:keepNext w:val="false"/>
+        <w:keepLines w:val="false"/>
         <w:pBdr>
           <w:left w:val="single" w:color="4472C4" w:sz="12" w:space="4"/>
         </w:pBdr>
@@ -6670,8 +6535,8 @@
     </w:p>
     <w:p>
       <w:pPr>
-        <w:keepNext/>
-        <w:keepLines/>
+        <w:keepNext w:val="false"/>
+        <w:keepLines w:val="false"/>
         <w:pBdr>
           <w:left w:val="single" w:color="4472C4" w:sz="12" w:space="4"/>
         </w:pBdr>
@@ -6691,8 +6556,8 @@
     </w:p>
     <w:p>
       <w:pPr>
-        <w:keepNext/>
-        <w:keepLines/>
+        <w:keepNext w:val="false"/>
+        <w:keepLines w:val="false"/>
         <w:pBdr>
           <w:left w:val="single" w:color="4472C4" w:sz="12" w:space="4"/>
         </w:pBdr>
@@ -6712,8 +6577,8 @@
     </w:p>
     <w:p>
       <w:pPr>
-        <w:keepNext/>
-        <w:keepLines/>
+        <w:keepNext w:val="false"/>
+        <w:keepLines w:val="false"/>
         <w:pBdr>
           <w:left w:val="single" w:color="4472C4" w:sz="12" w:space="4"/>
         </w:pBdr>
@@ -6733,8 +6598,8 @@
     </w:p>
     <w:p>
       <w:pPr>
-        <w:keepNext/>
-        <w:keepLines/>
+        <w:keepNext w:val="false"/>
+        <w:keepLines w:val="false"/>
         <w:pBdr>
           <w:left w:val="single" w:color="4472C4" w:sz="12" w:space="4"/>
         </w:pBdr>
@@ -6754,8 +6619,8 @@
     </w:p>
     <w:p>
       <w:pPr>
-        <w:keepNext/>
-        <w:keepLines/>
+        <w:keepNext w:val="false"/>
+        <w:keepLines w:val="false"/>
         <w:pBdr>
           <w:left w:val="single" w:color="4472C4" w:sz="12" w:space="4"/>
         </w:pBdr>
@@ -6775,8 +6640,8 @@
     </w:p>
     <w:p>
       <w:pPr>
-        <w:keepNext/>
-        <w:keepLines/>
+        <w:keepNext w:val="false"/>
+        <w:keepLines w:val="false"/>
         <w:pBdr>
           <w:left w:val="single" w:color="4472C4" w:sz="12" w:space="4"/>
         </w:pBdr>
@@ -6796,8 +6661,8 @@
     </w:p>
     <w:p>
       <w:pPr>
-        <w:keepNext/>
-        <w:keepLines/>
+        <w:keepNext w:val="false"/>
+        <w:keepLines w:val="false"/>
         <w:pBdr>
           <w:left w:val="single" w:color="4472C4" w:sz="12" w:space="4"/>
         </w:pBdr>
@@ -6817,8 +6682,8 @@
     </w:p>
     <w:p>
       <w:pPr>
-        <w:keepNext/>
-        <w:keepLines/>
+        <w:keepNext w:val="false"/>
+        <w:keepLines w:val="false"/>
         <w:pBdr>
           <w:left w:val="single" w:color="4472C4" w:sz="12" w:space="4"/>
         </w:pBdr>
@@ -6838,8 +6703,8 @@
     </w:p>
     <w:p>
       <w:pPr>
-        <w:keepNext/>
-        <w:keepLines/>
+        <w:keepNext w:val="false"/>
+        <w:keepLines w:val="false"/>
         <w:pBdr>
           <w:left w:val="single" w:color="4472C4" w:sz="12" w:space="4"/>
         </w:pBdr>
@@ -6859,8 +6724,8 @@
     </w:p>
     <w:p>
       <w:pPr>
-        <w:keepNext/>
-        <w:keepLines/>
+        <w:keepNext w:val="false"/>
+        <w:keepLines w:val="false"/>
         <w:pBdr>
           <w:left w:val="single" w:color="4472C4" w:sz="12" w:space="4"/>
         </w:pBdr>
@@ -6880,8 +6745,8 @@
     </w:p>
     <w:p>
       <w:pPr>
-        <w:keepNext/>
-        <w:keepLines/>
+        <w:keepNext w:val="false"/>
+        <w:keepLines w:val="false"/>
         <w:pBdr>
           <w:left w:val="single" w:color="4472C4" w:sz="12" w:space="4"/>
         </w:pBdr>
@@ -6901,8 +6766,8 @@
     </w:p>
     <w:p>
       <w:pPr>
-        <w:keepNext/>
-        <w:keepLines/>
+        <w:keepNext w:val="false"/>
+        <w:keepLines w:val="false"/>
         <w:pBdr>
           <w:left w:val="single" w:color="4472C4" w:sz="12" w:space="4"/>
         </w:pBdr>
@@ -6922,8 +6787,8 @@
     </w:p>
     <w:p>
       <w:pPr>
-        <w:keepNext/>
-        <w:keepLines/>
+        <w:keepNext w:val="false"/>
+        <w:keepLines w:val="false"/>
         <w:pBdr>
           <w:left w:val="single" w:color="4472C4" w:sz="12" w:space="4"/>
         </w:pBdr>
@@ -6943,8 +6808,8 @@
     </w:p>
     <w:p>
       <w:pPr>
-        <w:keepNext/>
-        <w:keepLines/>
+        <w:keepNext w:val="false"/>
+        <w:keepLines w:val="false"/>
         <w:pBdr>
           <w:left w:val="single" w:color="4472C4" w:sz="12" w:space="4"/>
         </w:pBdr>
@@ -6964,8 +6829,8 @@
     </w:p>
     <w:p>
       <w:pPr>
-        <w:keepNext/>
-        <w:keepLines/>
+        <w:keepNext w:val="false"/>
+        <w:keepLines w:val="false"/>
         <w:pBdr>
           <w:left w:val="single" w:color="4472C4" w:sz="12" w:space="4"/>
         </w:pBdr>
@@ -6985,8 +6850,8 @@
     </w:p>
     <w:p>
       <w:pPr>
-        <w:keepNext/>
-        <w:keepLines/>
+        <w:keepNext w:val="false"/>
+        <w:keepLines w:val="false"/>
         <w:pBdr>
           <w:left w:val="single" w:color="4472C4" w:sz="12" w:space="4"/>
         </w:pBdr>
@@ -7006,8 +6871,8 @@
     </w:p>
     <w:p>
       <w:pPr>
-        <w:keepNext/>
-        <w:keepLines/>
+        <w:keepNext w:val="false"/>
+        <w:keepLines w:val="false"/>
         <w:pBdr>
           <w:left w:val="single" w:color="4472C4" w:sz="12" w:space="4"/>
         </w:pBdr>
@@ -7028,7 +6893,7 @@
     <w:p>
       <w:pPr>
         <w:keepNext w:val="false"/>
-        <w:keepLines/>
+        <w:keepLines w:val="false"/>
         <w:pBdr>
           <w:left w:val="single" w:color="4472C4" w:sz="12" w:space="4"/>
         </w:pBdr>
@@ -7048,23 +6913,8 @@
     </w:p>
     <w:p>
       <w:pPr>
-        <w:keepNext/>
-        <w:spacing w:after="60" w:before="60" w:line="360" w:lineRule="auto"/>
-        <w:ind w:firstLine="709"/>
-      </w:pPr>
-      <w:r>
-        <w:rPr>
-          <w:rFonts w:ascii="Times New Roman" w:cs="Times New Roman" w:eastAsia="Times New Roman" w:hAnsi="Times New Roman"/>
-          <w:sz w:val="28"/>
-          <w:szCs w:val="28"/>
-        </w:rPr>
-        <w:t xml:space="preserve">Продовження лістингу А.6</w:t>
-      </w:r>
-    </w:p>
-    <w:p>
-      <w:pPr>
-        <w:keepNext/>
-        <w:keepLines/>
+        <w:keepNext w:val="false"/>
+        <w:keepLines w:val="false"/>
         <w:pBdr>
           <w:left w:val="single" w:color="4472C4" w:sz="12" w:space="4"/>
         </w:pBdr>
@@ -7084,8 +6934,8 @@
     </w:p>
     <w:p>
       <w:pPr>
-        <w:keepNext/>
-        <w:keepLines/>
+        <w:keepNext w:val="false"/>
+        <w:keepLines w:val="false"/>
         <w:pBdr>
           <w:left w:val="single" w:color="4472C4" w:sz="12" w:space="4"/>
         </w:pBdr>
@@ -7105,8 +6955,8 @@
     </w:p>
     <w:p>
       <w:pPr>
-        <w:keepNext/>
-        <w:keepLines/>
+        <w:keepNext w:val="false"/>
+        <w:keepLines w:val="false"/>
         <w:pBdr>
           <w:left w:val="single" w:color="4472C4" w:sz="12" w:space="4"/>
         </w:pBdr>
@@ -7126,8 +6976,8 @@
     </w:p>
     <w:p>
       <w:pPr>
-        <w:keepNext/>
-        <w:keepLines/>
+        <w:keepNext w:val="false"/>
+        <w:keepLines w:val="false"/>
         <w:pBdr>
           <w:left w:val="single" w:color="4472C4" w:sz="12" w:space="4"/>
         </w:pBdr>
@@ -7147,8 +6997,8 @@
     </w:p>
     <w:p>
       <w:pPr>
-        <w:keepNext/>
-        <w:keepLines/>
+        <w:keepNext w:val="false"/>
+        <w:keepLines w:val="false"/>
         <w:pBdr>
           <w:left w:val="single" w:color="4472C4" w:sz="12" w:space="4"/>
         </w:pBdr>
@@ -7168,8 +7018,8 @@
     </w:p>
     <w:p>
       <w:pPr>
-        <w:keepNext/>
-        <w:keepLines/>
+        <w:keepNext w:val="false"/>
+        <w:keepLines w:val="false"/>
         <w:pBdr>
           <w:left w:val="single" w:color="4472C4" w:sz="12" w:space="4"/>
         </w:pBdr>
@@ -7189,8 +7039,8 @@
     </w:p>
     <w:p>
       <w:pPr>
-        <w:keepNext/>
-        <w:keepLines/>
+        <w:keepNext w:val="false"/>
+        <w:keepLines w:val="false"/>
         <w:pBdr>
           <w:left w:val="single" w:color="4472C4" w:sz="12" w:space="4"/>
         </w:pBdr>
@@ -7210,8 +7060,8 @@
     </w:p>
     <w:p>
       <w:pPr>
-        <w:keepNext/>
-        <w:keepLines/>
+        <w:keepNext w:val="false"/>
+        <w:keepLines w:val="false"/>
         <w:pBdr>
           <w:left w:val="single" w:color="4472C4" w:sz="12" w:space="4"/>
         </w:pBdr>
@@ -7231,8 +7081,8 @@
     </w:p>
     <w:p>
       <w:pPr>
-        <w:keepNext/>
-        <w:keepLines/>
+        <w:keepNext w:val="false"/>
+        <w:keepLines w:val="false"/>
         <w:pBdr>
           <w:left w:val="single" w:color="4472C4" w:sz="12" w:space="4"/>
         </w:pBdr>
@@ -7252,8 +7102,8 @@
     </w:p>
     <w:p>
       <w:pPr>
-        <w:keepNext/>
-        <w:keepLines/>
+        <w:keepNext w:val="false"/>
+        <w:keepLines w:val="false"/>
         <w:pBdr>
           <w:left w:val="single" w:color="4472C4" w:sz="12" w:space="4"/>
         </w:pBdr>
@@ -7273,8 +7123,8 @@
     </w:p>
     <w:p>
       <w:pPr>
-        <w:keepNext/>
-        <w:keepLines/>
+        <w:keepNext w:val="false"/>
+        <w:keepLines w:val="false"/>
         <w:pBdr>
           <w:left w:val="single" w:color="4472C4" w:sz="12" w:space="4"/>
         </w:pBdr>
@@ -7294,8 +7144,8 @@
     </w:p>
     <w:p>
       <w:pPr>
-        <w:keepNext/>
-        <w:keepLines/>
+        <w:keepNext w:val="false"/>
+        <w:keepLines w:val="false"/>
         <w:pBdr>
           <w:left w:val="single" w:color="4472C4" w:sz="12" w:space="4"/>
         </w:pBdr>
@@ -7315,8 +7165,8 @@
     </w:p>
     <w:p>
       <w:pPr>
-        <w:keepNext/>
-        <w:keepLines/>
+        <w:keepNext w:val="false"/>
+        <w:keepLines w:val="false"/>
         <w:pBdr>
           <w:left w:val="single" w:color="4472C4" w:sz="12" w:space="4"/>
         </w:pBdr>
@@ -7336,8 +7186,8 @@
     </w:p>
     <w:p>
       <w:pPr>
-        <w:keepNext/>
-        <w:keepLines/>
+        <w:keepNext w:val="false"/>
+        <w:keepLines w:val="false"/>
         <w:pBdr>
           <w:left w:val="single" w:color="4472C4" w:sz="12" w:space="4"/>
         </w:pBdr>
@@ -7357,8 +7207,8 @@
     </w:p>
     <w:p>
       <w:pPr>
-        <w:keepNext/>
-        <w:keepLines/>
+        <w:keepNext w:val="false"/>
+        <w:keepLines w:val="false"/>
         <w:pBdr>
           <w:left w:val="single" w:color="4472C4" w:sz="12" w:space="4"/>
         </w:pBdr>
@@ -7378,8 +7228,8 @@
     </w:p>
     <w:p>
       <w:pPr>
-        <w:keepNext/>
-        <w:keepLines/>
+        <w:keepNext w:val="false"/>
+        <w:keepLines w:val="false"/>
         <w:pBdr>
           <w:left w:val="single" w:color="4472C4" w:sz="12" w:space="4"/>
         </w:pBdr>
@@ -7399,8 +7249,8 @@
     </w:p>
     <w:p>
       <w:pPr>
-        <w:keepNext/>
-        <w:keepLines/>
+        <w:keepNext w:val="false"/>
+        <w:keepLines w:val="false"/>
         <w:pBdr>
           <w:left w:val="single" w:color="4472C4" w:sz="12" w:space="4"/>
         </w:pBdr>
@@ -7420,8 +7270,8 @@
     </w:p>
     <w:p>
       <w:pPr>
-        <w:keepNext/>
-        <w:keepLines/>
+        <w:keepNext w:val="false"/>
+        <w:keepLines w:val="false"/>
         <w:pBdr>
           <w:left w:val="single" w:color="4472C4" w:sz="12" w:space="4"/>
         </w:pBdr>
@@ -7441,8 +7291,8 @@
     </w:p>
     <w:p>
       <w:pPr>
-        <w:keepNext/>
-        <w:keepLines/>
+        <w:keepNext w:val="false"/>
+        <w:keepLines w:val="false"/>
         <w:pBdr>
           <w:left w:val="single" w:color="4472C4" w:sz="12" w:space="4"/>
         </w:pBdr>
@@ -7463,7 +7313,7 @@
     <w:p>
       <w:pPr>
         <w:keepNext w:val="false"/>
-        <w:keepLines/>
+        <w:keepLines w:val="false"/>
         <w:pBdr>
           <w:left w:val="single" w:color="4472C4" w:sz="12" w:space="4"/>
         </w:pBdr>
@@ -7483,23 +7333,8 @@
     </w:p>
     <w:p>
       <w:pPr>
-        <w:keepNext/>
-        <w:spacing w:after="60" w:before="60" w:line="360" w:lineRule="auto"/>
-        <w:ind w:firstLine="709"/>
-      </w:pPr>
-      <w:r>
-        <w:rPr>
-          <w:rFonts w:ascii="Times New Roman" w:cs="Times New Roman" w:eastAsia="Times New Roman" w:hAnsi="Times New Roman"/>
-          <w:sz w:val="28"/>
-          <w:szCs w:val="28"/>
-        </w:rPr>
-        <w:t xml:space="preserve">Продовження лістингу А.6</w:t>
-      </w:r>
-    </w:p>
-    <w:p>
-      <w:pPr>
-        <w:keepNext/>
-        <w:keepLines/>
+        <w:keepNext w:val="false"/>
+        <w:keepLines w:val="false"/>
         <w:pBdr>
           <w:left w:val="single" w:color="4472C4" w:sz="12" w:space="4"/>
         </w:pBdr>
@@ -7520,7 +7355,7 @@
     <w:p>
       <w:pPr>
         <w:keepNext w:val="false"/>
-        <w:keepLines/>
+        <w:keepLines w:val="false"/>
         <w:pBdr>
           <w:left w:val="single" w:color="4472C4" w:sz="12" w:space="4"/>
         </w:pBdr>
@@ -7571,8 +7406,8 @@
     </w:p>
     <w:p>
       <w:pPr>
-        <w:keepNext/>
-        <w:keepLines/>
+        <w:keepNext w:val="false"/>
+        <w:keepLines w:val="false"/>
         <w:pBdr>
           <w:left w:val="single" w:color="4472C4" w:sz="12" w:space="4"/>
         </w:pBdr>
@@ -7592,8 +7427,8 @@
     </w:p>
     <w:p>
       <w:pPr>
-        <w:keepNext/>
-        <w:keepLines/>
+        <w:keepNext w:val="false"/>
+        <w:keepLines w:val="false"/>
         <w:pBdr>
           <w:left w:val="single" w:color="4472C4" w:sz="12" w:space="4"/>
         </w:pBdr>
@@ -7613,8 +7448,8 @@
     </w:p>
     <w:p>
       <w:pPr>
-        <w:keepNext/>
-        <w:keepLines/>
+        <w:keepNext w:val="false"/>
+        <w:keepLines w:val="false"/>
         <w:pBdr>
           <w:left w:val="single" w:color="4472C4" w:sz="12" w:space="4"/>
         </w:pBdr>
@@ -7634,8 +7469,8 @@
     </w:p>
     <w:p>
       <w:pPr>
-        <w:keepNext/>
-        <w:keepLines/>
+        <w:keepNext w:val="false"/>
+        <w:keepLines w:val="false"/>
         <w:pBdr>
           <w:left w:val="single" w:color="4472C4" w:sz="12" w:space="4"/>
         </w:pBdr>
@@ -7655,8 +7490,8 @@
     </w:p>
     <w:p>
       <w:pPr>
-        <w:keepNext/>
-        <w:keepLines/>
+        <w:keepNext w:val="false"/>
+        <w:keepLines w:val="false"/>
         <w:pBdr>
           <w:left w:val="single" w:color="4472C4" w:sz="12" w:space="4"/>
         </w:pBdr>
@@ -7676,8 +7511,8 @@
     </w:p>
     <w:p>
       <w:pPr>
-        <w:keepNext/>
-        <w:keepLines/>
+        <w:keepNext w:val="false"/>
+        <w:keepLines w:val="false"/>
         <w:pBdr>
           <w:left w:val="single" w:color="4472C4" w:sz="12" w:space="4"/>
         </w:pBdr>
@@ -7697,8 +7532,8 @@
     </w:p>
     <w:p>
       <w:pPr>
-        <w:keepNext/>
-        <w:keepLines/>
+        <w:keepNext w:val="false"/>
+        <w:keepLines w:val="false"/>
         <w:pBdr>
           <w:left w:val="single" w:color="4472C4" w:sz="12" w:space="4"/>
         </w:pBdr>
@@ -7718,8 +7553,8 @@
     </w:p>
     <w:p>
       <w:pPr>
-        <w:keepNext/>
-        <w:keepLines/>
+        <w:keepNext w:val="false"/>
+        <w:keepLines w:val="false"/>
         <w:pBdr>
           <w:left w:val="single" w:color="4472C4" w:sz="12" w:space="4"/>
         </w:pBdr>
@@ -7739,8 +7574,8 @@
     </w:p>
     <w:p>
       <w:pPr>
-        <w:keepNext/>
-        <w:keepLines/>
+        <w:keepNext w:val="false"/>
+        <w:keepLines w:val="false"/>
         <w:pBdr>
           <w:left w:val="single" w:color="4472C4" w:sz="12" w:space="4"/>
         </w:pBdr>
@@ -7760,8 +7595,8 @@
     </w:p>
     <w:p>
       <w:pPr>
-        <w:keepNext/>
-        <w:keepLines/>
+        <w:keepNext w:val="false"/>
+        <w:keepLines w:val="false"/>
         <w:pBdr>
           <w:left w:val="single" w:color="4472C4" w:sz="12" w:space="4"/>
         </w:pBdr>
@@ -7781,8 +7616,8 @@
     </w:p>
     <w:p>
       <w:pPr>
-        <w:keepNext/>
-        <w:keepLines/>
+        <w:keepNext w:val="false"/>
+        <w:keepLines w:val="false"/>
         <w:pBdr>
           <w:left w:val="single" w:color="4472C4" w:sz="12" w:space="4"/>
         </w:pBdr>
@@ -7802,8 +7637,8 @@
     </w:p>
     <w:p>
       <w:pPr>
-        <w:keepNext/>
-        <w:keepLines/>
+        <w:keepNext w:val="false"/>
+        <w:keepLines w:val="false"/>
         <w:pBdr>
           <w:left w:val="single" w:color="4472C4" w:sz="12" w:space="4"/>
         </w:pBdr>
@@ -7823,8 +7658,8 @@
     </w:p>
     <w:p>
       <w:pPr>
-        <w:keepNext/>
-        <w:keepLines/>
+        <w:keepNext w:val="false"/>
+        <w:keepLines w:val="false"/>
         <w:pBdr>
           <w:left w:val="single" w:color="4472C4" w:sz="12" w:space="4"/>
         </w:pBdr>
@@ -7844,8 +7679,8 @@
     </w:p>
     <w:p>
       <w:pPr>
-        <w:keepNext/>
-        <w:keepLines/>
+        <w:keepNext w:val="false"/>
+        <w:keepLines w:val="false"/>
         <w:pBdr>
           <w:left w:val="single" w:color="4472C4" w:sz="12" w:space="4"/>
         </w:pBdr>
@@ -7865,8 +7700,8 @@
     </w:p>
     <w:p>
       <w:pPr>
-        <w:keepNext/>
-        <w:keepLines/>
+        <w:keepNext w:val="false"/>
+        <w:keepLines w:val="false"/>
         <w:pBdr>
           <w:left w:val="single" w:color="4472C4" w:sz="12" w:space="4"/>
         </w:pBdr>
@@ -7886,8 +7721,8 @@
     </w:p>
     <w:p>
       <w:pPr>
-        <w:keepNext/>
-        <w:keepLines/>
+        <w:keepNext w:val="false"/>
+        <w:keepLines w:val="false"/>
         <w:pBdr>
           <w:left w:val="single" w:color="4472C4" w:sz="12" w:space="4"/>
         </w:pBdr>
@@ -7907,8 +7742,8 @@
     </w:p>
     <w:p>
       <w:pPr>
-        <w:keepNext/>
-        <w:keepLines/>
+        <w:keepNext w:val="false"/>
+        <w:keepLines w:val="false"/>
         <w:pBdr>
           <w:left w:val="single" w:color="4472C4" w:sz="12" w:space="4"/>
         </w:pBdr>
@@ -7928,8 +7763,8 @@
     </w:p>
     <w:p>
       <w:pPr>
-        <w:keepNext/>
-        <w:keepLines/>
+        <w:keepNext w:val="false"/>
+        <w:keepLines w:val="false"/>
         <w:pBdr>
           <w:left w:val="single" w:color="4472C4" w:sz="12" w:space="4"/>
         </w:pBdr>
@@ -7949,8 +7784,8 @@
     </w:p>
     <w:p>
       <w:pPr>
-        <w:keepNext/>
-        <w:keepLines/>
+        <w:keepNext w:val="false"/>
+        <w:keepLines w:val="false"/>
         <w:pBdr>
           <w:left w:val="single" w:color="4472C4" w:sz="12" w:space="4"/>
         </w:pBdr>
@@ -7971,7 +7806,7 @@
     <w:p>
       <w:pPr>
         <w:keepNext w:val="false"/>
-        <w:keepLines/>
+        <w:keepLines w:val="false"/>
         <w:pBdr>
           <w:left w:val="single" w:color="4472C4" w:sz="12" w:space="4"/>
         </w:pBdr>
@@ -7991,23 +7826,8 @@
     </w:p>
     <w:p>
       <w:pPr>
-        <w:keepNext/>
-        <w:spacing w:after="60" w:before="60" w:line="360" w:lineRule="auto"/>
-        <w:ind w:firstLine="709"/>
-      </w:pPr>
-      <w:r>
-        <w:rPr>
-          <w:rFonts w:ascii="Times New Roman" w:cs="Times New Roman" w:eastAsia="Times New Roman" w:hAnsi="Times New Roman"/>
-          <w:sz w:val="28"/>
-          <w:szCs w:val="28"/>
-        </w:rPr>
-        <w:t xml:space="preserve">Продовження лістингу А.7</w:t>
-      </w:r>
-    </w:p>
-    <w:p>
-      <w:pPr>
-        <w:keepNext/>
-        <w:keepLines/>
+        <w:keepNext w:val="false"/>
+        <w:keepLines w:val="false"/>
         <w:pBdr>
           <w:left w:val="single" w:color="4472C4" w:sz="12" w:space="4"/>
         </w:pBdr>
@@ -8027,8 +7847,8 @@
     </w:p>
     <w:p>
       <w:pPr>
-        <w:keepNext/>
-        <w:keepLines/>
+        <w:keepNext w:val="false"/>
+        <w:keepLines w:val="false"/>
         <w:pBdr>
           <w:left w:val="single" w:color="4472C4" w:sz="12" w:space="4"/>
         </w:pBdr>
@@ -8048,8 +7868,8 @@
     </w:p>
     <w:p>
       <w:pPr>
-        <w:keepNext/>
-        <w:keepLines/>
+        <w:keepNext w:val="false"/>
+        <w:keepLines w:val="false"/>
         <w:pBdr>
           <w:left w:val="single" w:color="4472C4" w:sz="12" w:space="4"/>
         </w:pBdr>
@@ -8069,8 +7889,8 @@
     </w:p>
     <w:p>
       <w:pPr>
-        <w:keepNext/>
-        <w:keepLines/>
+        <w:keepNext w:val="false"/>
+        <w:keepLines w:val="false"/>
         <w:pBdr>
           <w:left w:val="single" w:color="4472C4" w:sz="12" w:space="4"/>
         </w:pBdr>
@@ -8090,8 +7910,8 @@
     </w:p>
     <w:p>
       <w:pPr>
-        <w:keepNext/>
-        <w:keepLines/>
+        <w:keepNext w:val="false"/>
+        <w:keepLines w:val="false"/>
         <w:pBdr>
           <w:left w:val="single" w:color="4472C4" w:sz="12" w:space="4"/>
         </w:pBdr>
@@ -8111,8 +7931,8 @@
     </w:p>
     <w:p>
       <w:pPr>
-        <w:keepNext/>
-        <w:keepLines/>
+        <w:keepNext w:val="false"/>
+        <w:keepLines w:val="false"/>
         <w:pBdr>
           <w:left w:val="single" w:color="4472C4" w:sz="12" w:space="4"/>
         </w:pBdr>
@@ -8132,8 +7952,8 @@
     </w:p>
     <w:p>
       <w:pPr>
-        <w:keepNext/>
-        <w:keepLines/>
+        <w:keepNext w:val="false"/>
+        <w:keepLines w:val="false"/>
         <w:pBdr>
           <w:left w:val="single" w:color="4472C4" w:sz="12" w:space="4"/>
         </w:pBdr>
@@ -8153,8 +7973,8 @@
     </w:p>
     <w:p>
       <w:pPr>
-        <w:keepNext/>
-        <w:keepLines/>
+        <w:keepNext w:val="false"/>
+        <w:keepLines w:val="false"/>
         <w:pBdr>
           <w:left w:val="single" w:color="4472C4" w:sz="12" w:space="4"/>
         </w:pBdr>
@@ -8174,8 +7994,8 @@
     </w:p>
     <w:p>
       <w:pPr>
-        <w:keepNext/>
-        <w:keepLines/>
+        <w:keepNext w:val="false"/>
+        <w:keepLines w:val="false"/>
         <w:pBdr>
           <w:left w:val="single" w:color="4472C4" w:sz="12" w:space="4"/>
         </w:pBdr>
@@ -8195,8 +8015,8 @@
     </w:p>
     <w:p>
       <w:pPr>
-        <w:keepNext/>
-        <w:keepLines/>
+        <w:keepNext w:val="false"/>
+        <w:keepLines w:val="false"/>
         <w:pBdr>
           <w:left w:val="single" w:color="4472C4" w:sz="12" w:space="4"/>
         </w:pBdr>
@@ -8216,8 +8036,8 @@
     </w:p>
     <w:p>
       <w:pPr>
-        <w:keepNext/>
-        <w:keepLines/>
+        <w:keepNext w:val="false"/>
+        <w:keepLines w:val="false"/>
         <w:pBdr>
           <w:left w:val="single" w:color="4472C4" w:sz="12" w:space="4"/>
         </w:pBdr>
@@ -8237,8 +8057,8 @@
     </w:p>
     <w:p>
       <w:pPr>
-        <w:keepNext/>
-        <w:keepLines/>
+        <w:keepNext w:val="false"/>
+        <w:keepLines w:val="false"/>
         <w:pBdr>
           <w:left w:val="single" w:color="4472C4" w:sz="12" w:space="4"/>
         </w:pBdr>
@@ -8258,8 +8078,8 @@
     </w:p>
     <w:p>
       <w:pPr>
-        <w:keepNext/>
-        <w:keepLines/>
+        <w:keepNext w:val="false"/>
+        <w:keepLines w:val="false"/>
         <w:pBdr>
           <w:left w:val="single" w:color="4472C4" w:sz="12" w:space="4"/>
         </w:pBdr>
@@ -8279,8 +8099,8 @@
     </w:p>
     <w:p>
       <w:pPr>
-        <w:keepNext/>
-        <w:keepLines/>
+        <w:keepNext w:val="false"/>
+        <w:keepLines w:val="false"/>
         <w:pBdr>
           <w:left w:val="single" w:color="4472C4" w:sz="12" w:space="4"/>
         </w:pBdr>
@@ -8300,8 +8120,8 @@
     </w:p>
     <w:p>
       <w:pPr>
-        <w:keepNext/>
-        <w:keepLines/>
+        <w:keepNext w:val="false"/>
+        <w:keepLines w:val="false"/>
         <w:pBdr>
           <w:left w:val="single" w:color="4472C4" w:sz="12" w:space="4"/>
         </w:pBdr>
@@ -8322,7 +8142,7 @@
     <w:p>
       <w:pPr>
         <w:keepNext w:val="false"/>
-        <w:keepLines/>
+        <w:keepLines w:val="false"/>
         <w:pBdr>
           <w:left w:val="single" w:color="4472C4" w:sz="12" w:space="4"/>
         </w:pBdr>

</xml_diff>

<commit_message>
style: rewrite report — key fragments in body, full code in appendix, real output
</commit_message>
<xml_diff>
--- a/reports/lr2/Звіт_ЛР2_Коновалов_ПЗПІ-25-6.docx
+++ b/reports/lr2/Звіт_ЛР2_Коновалов_ПЗПІ-25-6.docx
@@ -610,97 +610,97 @@
           <w:sz w:val="28"/>
           <w:szCs w:val="28"/>
         </w:rPr>
-        <w:t xml:space="preserve">Лістинг 3.1 — Реалізація стеку</w:t>
-      </w:r>
-    </w:p>
-    <w:p>
-      <w:pPr>
-        <w:keepNext w:val="false"/>
-        <w:keepLines w:val="false"/>
-        <w:pBdr>
-          <w:left w:val="single" w:color="4472C4" w:sz="12" w:space="4"/>
-        </w:pBdr>
-        <w:shd w:fill="F2F2F2" w:color="auto" w:val="clear"/>
-        <w:spacing w:after="0" w:line="240" w:lineRule="auto"/>
-        <w:ind w:left="283"/>
-      </w:pPr>
-      <w:r>
-        <w:rPr>
-          <w:rFonts w:ascii="Courier New" w:cs="Courier New" w:eastAsia="Courier New" w:hAnsi="Courier New"/>
-          <w:sz w:val="18"/>
-          <w:szCs w:val="18"/>
-          <w:shd w:fill="F2F2F2" w:color="auto" w:val="clear"/>
-        </w:rPr>
-        <w:t xml:space="preserve">export class ArrayStack {</w:t>
-      </w:r>
-    </w:p>
-    <w:p>
-      <w:pPr>
-        <w:keepNext w:val="false"/>
-        <w:keepLines w:val="false"/>
-        <w:pBdr>
-          <w:left w:val="single" w:color="4472C4" w:sz="12" w:space="4"/>
-        </w:pBdr>
-        <w:shd w:fill="F2F2F2" w:color="auto" w:val="clear"/>
-        <w:spacing w:after="0" w:line="240" w:lineRule="auto"/>
-        <w:ind w:left="283"/>
-      </w:pPr>
-      <w:r>
-        <w:rPr>
-          <w:rFonts w:ascii="Courier New" w:cs="Courier New" w:eastAsia="Courier New" w:hAnsi="Courier New"/>
-          <w:sz w:val="18"/>
-          <w:szCs w:val="18"/>
-          <w:shd w:fill="F2F2F2" w:color="auto" w:val="clear"/>
-        </w:rPr>
-        <w:t xml:space="preserve">  private data: number[];</w:t>
-      </w:r>
-    </w:p>
-    <w:p>
-      <w:pPr>
-        <w:keepNext w:val="false"/>
-        <w:keepLines w:val="false"/>
-        <w:pBdr>
-          <w:left w:val="single" w:color="4472C4" w:sz="12" w:space="4"/>
-        </w:pBdr>
-        <w:shd w:fill="F2F2F2" w:color="auto" w:val="clear"/>
-        <w:spacing w:after="0" w:line="240" w:lineRule="auto"/>
-        <w:ind w:left="283"/>
-      </w:pPr>
-      <w:r>
-        <w:rPr>
-          <w:rFonts w:ascii="Courier New" w:cs="Courier New" w:eastAsia="Courier New" w:hAnsi="Courier New"/>
-          <w:sz w:val="18"/>
-          <w:szCs w:val="18"/>
-          <w:shd w:fill="F2F2F2" w:color="auto" w:val="clear"/>
-        </w:rPr>
-        <w:t xml:space="preserve">  private top: number;</w:t>
-      </w:r>
-    </w:p>
-    <w:p>
-      <w:pPr>
-        <w:keepNext w:val="false"/>
-        <w:keepLines w:val="false"/>
-        <w:pBdr>
-          <w:left w:val="single" w:color="4472C4" w:sz="12" w:space="4"/>
-        </w:pBdr>
-        <w:shd w:fill="F2F2F2" w:color="auto" w:val="clear"/>
-        <w:spacing w:after="0" w:line="240" w:lineRule="auto"/>
-        <w:ind w:left="283"/>
-      </w:pPr>
-      <w:r>
-        <w:rPr>
-          <w:rFonts w:ascii="Courier New" w:cs="Courier New" w:eastAsia="Courier New" w:hAnsi="Courier New"/>
-          <w:sz w:val="18"/>
-          <w:szCs w:val="18"/>
-          <w:shd w:fill="F2F2F2" w:color="auto" w:val="clear"/>
-        </w:rPr>
-        <w:t xml:space="preserve">  private capacity: number;</w:t>
-      </w:r>
-    </w:p>
-    <w:p>
-      <w:pPr>
-        <w:keepNext w:val="false"/>
-        <w:keepLines w:val="false"/>
+        <w:t xml:space="preserve">Лістинг 3.1 — Ключові операції push та pop</w:t>
+      </w:r>
+    </w:p>
+    <w:p>
+      <w:pPr>
+        <w:keepNext/>
+        <w:keepLines/>
+        <w:pBdr>
+          <w:left w:val="single" w:color="4472C4" w:sz="12" w:space="4"/>
+        </w:pBdr>
+        <w:shd w:fill="F2F2F2" w:color="auto" w:val="clear"/>
+        <w:spacing w:after="0" w:line="240" w:lineRule="auto"/>
+        <w:ind w:left="283"/>
+      </w:pPr>
+      <w:r>
+        <w:rPr>
+          <w:rFonts w:ascii="Courier New" w:cs="Courier New" w:eastAsia="Courier New" w:hAnsi="Courier New"/>
+          <w:sz w:val="18"/>
+          <w:szCs w:val="18"/>
+          <w:shd w:fill="F2F2F2" w:color="auto" w:val="clear"/>
+        </w:rPr>
+        <w:t xml:space="preserve">  push(value: number): void {</w:t>
+      </w:r>
+    </w:p>
+    <w:p>
+      <w:pPr>
+        <w:keepNext/>
+        <w:keepLines/>
+        <w:pBdr>
+          <w:left w:val="single" w:color="4472C4" w:sz="12" w:space="4"/>
+        </w:pBdr>
+        <w:shd w:fill="F2F2F2" w:color="auto" w:val="clear"/>
+        <w:spacing w:after="0" w:line="240" w:lineRule="auto"/>
+        <w:ind w:left="283"/>
+      </w:pPr>
+      <w:r>
+        <w:rPr>
+          <w:rFonts w:ascii="Courier New" w:cs="Courier New" w:eastAsia="Courier New" w:hAnsi="Courier New"/>
+          <w:sz w:val="18"/>
+          <w:szCs w:val="18"/>
+          <w:shd w:fill="F2F2F2" w:color="auto" w:val="clear"/>
+        </w:rPr>
+        <w:t xml:space="preserve">    if (this.top &gt;= this.capacity - 1) throw new Error("Stack overflow");</w:t>
+      </w:r>
+    </w:p>
+    <w:p>
+      <w:pPr>
+        <w:keepNext/>
+        <w:keepLines/>
+        <w:pBdr>
+          <w:left w:val="single" w:color="4472C4" w:sz="12" w:space="4"/>
+        </w:pBdr>
+        <w:shd w:fill="F2F2F2" w:color="auto" w:val="clear"/>
+        <w:spacing w:after="0" w:line="240" w:lineRule="auto"/>
+        <w:ind w:left="283"/>
+      </w:pPr>
+      <w:r>
+        <w:rPr>
+          <w:rFonts w:ascii="Courier New" w:cs="Courier New" w:eastAsia="Courier New" w:hAnsi="Courier New"/>
+          <w:sz w:val="18"/>
+          <w:szCs w:val="18"/>
+          <w:shd w:fill="F2F2F2" w:color="auto" w:val="clear"/>
+        </w:rPr>
+        <w:t xml:space="preserve">    this.data[++this.top] = value;</w:t>
+      </w:r>
+    </w:p>
+    <w:p>
+      <w:pPr>
+        <w:keepNext/>
+        <w:keepLines/>
+        <w:pBdr>
+          <w:left w:val="single" w:color="4472C4" w:sz="12" w:space="4"/>
+        </w:pBdr>
+        <w:shd w:fill="F2F2F2" w:color="auto" w:val="clear"/>
+        <w:spacing w:after="0" w:line="240" w:lineRule="auto"/>
+        <w:ind w:left="283"/>
+      </w:pPr>
+      <w:r>
+        <w:rPr>
+          <w:rFonts w:ascii="Courier New" w:cs="Courier New" w:eastAsia="Courier New" w:hAnsi="Courier New"/>
+          <w:sz w:val="18"/>
+          <w:szCs w:val="18"/>
+          <w:shd w:fill="F2F2F2" w:color="auto" w:val="clear"/>
+        </w:rPr>
+        <w:t xml:space="preserve">  }</w:t>
+      </w:r>
+    </w:p>
+    <w:p>
+      <w:pPr>
+        <w:keepNext/>
+        <w:keepLines/>
         <w:pBdr>
           <w:left w:val="single" w:color="4472C4" w:sz="12" w:space="4"/>
         </w:pBdr>
@@ -720,92 +720,71 @@
     </w:p>
     <w:p>
       <w:pPr>
-        <w:keepNext w:val="false"/>
-        <w:keepLines w:val="false"/>
-        <w:pBdr>
-          <w:left w:val="single" w:color="4472C4" w:sz="12" w:space="4"/>
-        </w:pBdr>
-        <w:shd w:fill="F2F2F2" w:color="auto" w:val="clear"/>
-        <w:spacing w:after="0" w:line="240" w:lineRule="auto"/>
-        <w:ind w:left="283"/>
-      </w:pPr>
-      <w:r>
-        <w:rPr>
-          <w:rFonts w:ascii="Courier New" w:cs="Courier New" w:eastAsia="Courier New" w:hAnsi="Courier New"/>
-          <w:sz w:val="18"/>
-          <w:szCs w:val="18"/>
-          <w:shd w:fill="F2F2F2" w:color="auto" w:val="clear"/>
-        </w:rPr>
-        <w:t xml:space="preserve">  constructor(capacity: number = 100) {</w:t>
-      </w:r>
-    </w:p>
-    <w:p>
-      <w:pPr>
-        <w:keepNext w:val="false"/>
-        <w:keepLines w:val="false"/>
-        <w:pBdr>
-          <w:left w:val="single" w:color="4472C4" w:sz="12" w:space="4"/>
-        </w:pBdr>
-        <w:shd w:fill="F2F2F2" w:color="auto" w:val="clear"/>
-        <w:spacing w:after="0" w:line="240" w:lineRule="auto"/>
-        <w:ind w:left="283"/>
-      </w:pPr>
-      <w:r>
-        <w:rPr>
-          <w:rFonts w:ascii="Courier New" w:cs="Courier New" w:eastAsia="Courier New" w:hAnsi="Courier New"/>
-          <w:sz w:val="18"/>
-          <w:szCs w:val="18"/>
-          <w:shd w:fill="F2F2F2" w:color="auto" w:val="clear"/>
-        </w:rPr>
-        <w:t xml:space="preserve">    this.data = new Array(capacity);</w:t>
-      </w:r>
-    </w:p>
-    <w:p>
-      <w:pPr>
-        <w:keepNext w:val="false"/>
-        <w:keepLines w:val="false"/>
-        <w:pBdr>
-          <w:left w:val="single" w:color="4472C4" w:sz="12" w:space="4"/>
-        </w:pBdr>
-        <w:shd w:fill="F2F2F2" w:color="auto" w:val="clear"/>
-        <w:spacing w:after="0" w:line="240" w:lineRule="auto"/>
-        <w:ind w:left="283"/>
-      </w:pPr>
-      <w:r>
-        <w:rPr>
-          <w:rFonts w:ascii="Courier New" w:cs="Courier New" w:eastAsia="Courier New" w:hAnsi="Courier New"/>
-          <w:sz w:val="18"/>
-          <w:szCs w:val="18"/>
-          <w:shd w:fill="F2F2F2" w:color="auto" w:val="clear"/>
-        </w:rPr>
-        <w:t xml:space="preserve">    this.top = -1;</w:t>
-      </w:r>
-    </w:p>
-    <w:p>
-      <w:pPr>
-        <w:keepNext w:val="false"/>
-        <w:keepLines w:val="false"/>
-        <w:pBdr>
-          <w:left w:val="single" w:color="4472C4" w:sz="12" w:space="4"/>
-        </w:pBdr>
-        <w:shd w:fill="F2F2F2" w:color="auto" w:val="clear"/>
-        <w:spacing w:after="0" w:line="240" w:lineRule="auto"/>
-        <w:ind w:left="283"/>
-      </w:pPr>
-      <w:r>
-        <w:rPr>
-          <w:rFonts w:ascii="Courier New" w:cs="Courier New" w:eastAsia="Courier New" w:hAnsi="Courier New"/>
-          <w:sz w:val="18"/>
-          <w:szCs w:val="18"/>
-          <w:shd w:fill="F2F2F2" w:color="auto" w:val="clear"/>
-        </w:rPr>
-        <w:t xml:space="preserve">    this.capacity = capacity;</w:t>
-      </w:r>
-    </w:p>
-    <w:p>
-      <w:pPr>
-        <w:keepNext w:val="false"/>
-        <w:keepLines w:val="false"/>
+        <w:keepNext/>
+        <w:keepLines/>
+        <w:pBdr>
+          <w:left w:val="single" w:color="4472C4" w:sz="12" w:space="4"/>
+        </w:pBdr>
+        <w:shd w:fill="F2F2F2" w:color="auto" w:val="clear"/>
+        <w:spacing w:after="0" w:line="240" w:lineRule="auto"/>
+        <w:ind w:left="283"/>
+      </w:pPr>
+      <w:r>
+        <w:rPr>
+          <w:rFonts w:ascii="Courier New" w:cs="Courier New" w:eastAsia="Courier New" w:hAnsi="Courier New"/>
+          <w:sz w:val="18"/>
+          <w:szCs w:val="18"/>
+          <w:shd w:fill="F2F2F2" w:color="auto" w:val="clear"/>
+        </w:rPr>
+        <w:t xml:space="preserve">  pop(): number {</w:t>
+      </w:r>
+    </w:p>
+    <w:p>
+      <w:pPr>
+        <w:keepNext/>
+        <w:keepLines/>
+        <w:pBdr>
+          <w:left w:val="single" w:color="4472C4" w:sz="12" w:space="4"/>
+        </w:pBdr>
+        <w:shd w:fill="F2F2F2" w:color="auto" w:val="clear"/>
+        <w:spacing w:after="0" w:line="240" w:lineRule="auto"/>
+        <w:ind w:left="283"/>
+      </w:pPr>
+      <w:r>
+        <w:rPr>
+          <w:rFonts w:ascii="Courier New" w:cs="Courier New" w:eastAsia="Courier New" w:hAnsi="Courier New"/>
+          <w:sz w:val="18"/>
+          <w:szCs w:val="18"/>
+          <w:shd w:fill="F2F2F2" w:color="auto" w:val="clear"/>
+        </w:rPr>
+        <w:t xml:space="preserve">    if (this.top &lt; 0) throw new Error("Stack underflow");</w:t>
+      </w:r>
+    </w:p>
+    <w:p>
+      <w:pPr>
+        <w:keepNext/>
+        <w:keepLines/>
+        <w:pBdr>
+          <w:left w:val="single" w:color="4472C4" w:sz="12" w:space="4"/>
+        </w:pBdr>
+        <w:shd w:fill="F2F2F2" w:color="auto" w:val="clear"/>
+        <w:spacing w:after="0" w:line="240" w:lineRule="auto"/>
+        <w:ind w:left="283"/>
+      </w:pPr>
+      <w:r>
+        <w:rPr>
+          <w:rFonts w:ascii="Courier New" w:cs="Courier New" w:eastAsia="Courier New" w:hAnsi="Courier New"/>
+          <w:sz w:val="18"/>
+          <w:szCs w:val="18"/>
+          <w:shd w:fill="F2F2F2" w:color="auto" w:val="clear"/>
+        </w:rPr>
+        <w:t xml:space="preserve">    return this.data[this.top--];</w:t>
+      </w:r>
+    </w:p>
+    <w:p>
+      <w:pPr>
+        <w:keepNext w:val="false"/>
+        <w:keepLines/>
         <w:pBdr>
           <w:left w:val="single" w:color="4472C4" w:sz="12" w:space="4"/>
         </w:pBdr>
@@ -821,552 +800,6 @@
           <w:shd w:fill="F2F2F2" w:color="auto" w:val="clear"/>
         </w:rPr>
         <w:t xml:space="preserve">  }</w:t>
-      </w:r>
-    </w:p>
-    <w:p>
-      <w:pPr>
-        <w:keepNext w:val="false"/>
-        <w:keepLines w:val="false"/>
-        <w:pBdr>
-          <w:left w:val="single" w:color="4472C4" w:sz="12" w:space="4"/>
-        </w:pBdr>
-        <w:shd w:fill="F2F2F2" w:color="auto" w:val="clear"/>
-        <w:spacing w:after="0" w:line="240" w:lineRule="auto"/>
-        <w:ind w:left="283"/>
-      </w:pPr>
-      <w:r>
-        <w:rPr>
-          <w:rFonts w:ascii="Courier New" w:cs="Courier New" w:eastAsia="Courier New" w:hAnsi="Courier New"/>
-          <w:sz w:val="18"/>
-          <w:szCs w:val="18"/>
-          <w:shd w:fill="F2F2F2" w:color="auto" w:val="clear"/>
-        </w:rPr>
-        <w:t xml:space="preserve"> </w:t>
-      </w:r>
-    </w:p>
-    <w:p>
-      <w:pPr>
-        <w:keepNext w:val="false"/>
-        <w:keepLines w:val="false"/>
-        <w:pBdr>
-          <w:left w:val="single" w:color="4472C4" w:sz="12" w:space="4"/>
-        </w:pBdr>
-        <w:shd w:fill="F2F2F2" w:color="auto" w:val="clear"/>
-        <w:spacing w:after="0" w:line="240" w:lineRule="auto"/>
-        <w:ind w:left="283"/>
-      </w:pPr>
-      <w:r>
-        <w:rPr>
-          <w:rFonts w:ascii="Courier New" w:cs="Courier New" w:eastAsia="Courier New" w:hAnsi="Courier New"/>
-          <w:sz w:val="18"/>
-          <w:szCs w:val="18"/>
-          <w:shd w:fill="F2F2F2" w:color="auto" w:val="clear"/>
-        </w:rPr>
-        <w:t xml:space="preserve">  push(value: number): void {</w:t>
-      </w:r>
-    </w:p>
-    <w:p>
-      <w:pPr>
-        <w:keepNext w:val="false"/>
-        <w:keepLines w:val="false"/>
-        <w:pBdr>
-          <w:left w:val="single" w:color="4472C4" w:sz="12" w:space="4"/>
-        </w:pBdr>
-        <w:shd w:fill="F2F2F2" w:color="auto" w:val="clear"/>
-        <w:spacing w:after="0" w:line="240" w:lineRule="auto"/>
-        <w:ind w:left="283"/>
-      </w:pPr>
-      <w:r>
-        <w:rPr>
-          <w:rFonts w:ascii="Courier New" w:cs="Courier New" w:eastAsia="Courier New" w:hAnsi="Courier New"/>
-          <w:sz w:val="18"/>
-          <w:szCs w:val="18"/>
-          <w:shd w:fill="F2F2F2" w:color="auto" w:val="clear"/>
-        </w:rPr>
-        <w:t xml:space="preserve">    if (this.top &gt;= this.capacity - 1) throw new Error("Stack overflow");</w:t>
-      </w:r>
-    </w:p>
-    <w:p>
-      <w:pPr>
-        <w:keepNext w:val="false"/>
-        <w:keepLines w:val="false"/>
-        <w:pBdr>
-          <w:left w:val="single" w:color="4472C4" w:sz="12" w:space="4"/>
-        </w:pBdr>
-        <w:shd w:fill="F2F2F2" w:color="auto" w:val="clear"/>
-        <w:spacing w:after="0" w:line="240" w:lineRule="auto"/>
-        <w:ind w:left="283"/>
-      </w:pPr>
-      <w:r>
-        <w:rPr>
-          <w:rFonts w:ascii="Courier New" w:cs="Courier New" w:eastAsia="Courier New" w:hAnsi="Courier New"/>
-          <w:sz w:val="18"/>
-          <w:szCs w:val="18"/>
-          <w:shd w:fill="F2F2F2" w:color="auto" w:val="clear"/>
-        </w:rPr>
-        <w:t xml:space="preserve">    this.data[++this.top] = value;</w:t>
-      </w:r>
-    </w:p>
-    <w:p>
-      <w:pPr>
-        <w:keepNext w:val="false"/>
-        <w:keepLines w:val="false"/>
-        <w:pBdr>
-          <w:left w:val="single" w:color="4472C4" w:sz="12" w:space="4"/>
-        </w:pBdr>
-        <w:shd w:fill="F2F2F2" w:color="auto" w:val="clear"/>
-        <w:spacing w:after="0" w:line="240" w:lineRule="auto"/>
-        <w:ind w:left="283"/>
-      </w:pPr>
-      <w:r>
-        <w:rPr>
-          <w:rFonts w:ascii="Courier New" w:cs="Courier New" w:eastAsia="Courier New" w:hAnsi="Courier New"/>
-          <w:sz w:val="18"/>
-          <w:szCs w:val="18"/>
-          <w:shd w:fill="F2F2F2" w:color="auto" w:val="clear"/>
-        </w:rPr>
-        <w:t xml:space="preserve">  }</w:t>
-      </w:r>
-    </w:p>
-    <w:p>
-      <w:pPr>
-        <w:keepNext w:val="false"/>
-        <w:keepLines w:val="false"/>
-        <w:pBdr>
-          <w:left w:val="single" w:color="4472C4" w:sz="12" w:space="4"/>
-        </w:pBdr>
-        <w:shd w:fill="F2F2F2" w:color="auto" w:val="clear"/>
-        <w:spacing w:after="0" w:line="240" w:lineRule="auto"/>
-        <w:ind w:left="283"/>
-      </w:pPr>
-      <w:r>
-        <w:rPr>
-          <w:rFonts w:ascii="Courier New" w:cs="Courier New" w:eastAsia="Courier New" w:hAnsi="Courier New"/>
-          <w:sz w:val="18"/>
-          <w:szCs w:val="18"/>
-          <w:shd w:fill="F2F2F2" w:color="auto" w:val="clear"/>
-        </w:rPr>
-        <w:t xml:space="preserve"> </w:t>
-      </w:r>
-    </w:p>
-    <w:p>
-      <w:pPr>
-        <w:keepNext w:val="false"/>
-        <w:keepLines w:val="false"/>
-        <w:pBdr>
-          <w:left w:val="single" w:color="4472C4" w:sz="12" w:space="4"/>
-        </w:pBdr>
-        <w:shd w:fill="F2F2F2" w:color="auto" w:val="clear"/>
-        <w:spacing w:after="0" w:line="240" w:lineRule="auto"/>
-        <w:ind w:left="283"/>
-      </w:pPr>
-      <w:r>
-        <w:rPr>
-          <w:rFonts w:ascii="Courier New" w:cs="Courier New" w:eastAsia="Courier New" w:hAnsi="Courier New"/>
-          <w:sz w:val="18"/>
-          <w:szCs w:val="18"/>
-          <w:shd w:fill="F2F2F2" w:color="auto" w:val="clear"/>
-        </w:rPr>
-        <w:t xml:space="preserve">  pop(): number {</w:t>
-      </w:r>
-    </w:p>
-    <w:p>
-      <w:pPr>
-        <w:keepNext w:val="false"/>
-        <w:keepLines w:val="false"/>
-        <w:pBdr>
-          <w:left w:val="single" w:color="4472C4" w:sz="12" w:space="4"/>
-        </w:pBdr>
-        <w:shd w:fill="F2F2F2" w:color="auto" w:val="clear"/>
-        <w:spacing w:after="0" w:line="240" w:lineRule="auto"/>
-        <w:ind w:left="283"/>
-      </w:pPr>
-      <w:r>
-        <w:rPr>
-          <w:rFonts w:ascii="Courier New" w:cs="Courier New" w:eastAsia="Courier New" w:hAnsi="Courier New"/>
-          <w:sz w:val="18"/>
-          <w:szCs w:val="18"/>
-          <w:shd w:fill="F2F2F2" w:color="auto" w:val="clear"/>
-        </w:rPr>
-        <w:t xml:space="preserve">    if (this.top &lt; 0) throw new Error("Stack underflow");</w:t>
-      </w:r>
-    </w:p>
-    <w:p>
-      <w:pPr>
-        <w:keepNext w:val="false"/>
-        <w:keepLines w:val="false"/>
-        <w:pBdr>
-          <w:left w:val="single" w:color="4472C4" w:sz="12" w:space="4"/>
-        </w:pBdr>
-        <w:shd w:fill="F2F2F2" w:color="auto" w:val="clear"/>
-        <w:spacing w:after="0" w:line="240" w:lineRule="auto"/>
-        <w:ind w:left="283"/>
-      </w:pPr>
-      <w:r>
-        <w:rPr>
-          <w:rFonts w:ascii="Courier New" w:cs="Courier New" w:eastAsia="Courier New" w:hAnsi="Courier New"/>
-          <w:sz w:val="18"/>
-          <w:szCs w:val="18"/>
-          <w:shd w:fill="F2F2F2" w:color="auto" w:val="clear"/>
-        </w:rPr>
-        <w:t xml:space="preserve">    return this.data[this.top--];</w:t>
-      </w:r>
-    </w:p>
-    <w:p>
-      <w:pPr>
-        <w:keepNext w:val="false"/>
-        <w:keepLines w:val="false"/>
-        <w:pBdr>
-          <w:left w:val="single" w:color="4472C4" w:sz="12" w:space="4"/>
-        </w:pBdr>
-        <w:shd w:fill="F2F2F2" w:color="auto" w:val="clear"/>
-        <w:spacing w:after="0" w:line="240" w:lineRule="auto"/>
-        <w:ind w:left="283"/>
-      </w:pPr>
-      <w:r>
-        <w:rPr>
-          <w:rFonts w:ascii="Courier New" w:cs="Courier New" w:eastAsia="Courier New" w:hAnsi="Courier New"/>
-          <w:sz w:val="18"/>
-          <w:szCs w:val="18"/>
-          <w:shd w:fill="F2F2F2" w:color="auto" w:val="clear"/>
-        </w:rPr>
-        <w:t xml:space="preserve">  }</w:t>
-      </w:r>
-    </w:p>
-    <w:p>
-      <w:pPr>
-        <w:keepNext w:val="false"/>
-        <w:keepLines w:val="false"/>
-        <w:pBdr>
-          <w:left w:val="single" w:color="4472C4" w:sz="12" w:space="4"/>
-        </w:pBdr>
-        <w:shd w:fill="F2F2F2" w:color="auto" w:val="clear"/>
-        <w:spacing w:after="0" w:line="240" w:lineRule="auto"/>
-        <w:ind w:left="283"/>
-      </w:pPr>
-      <w:r>
-        <w:rPr>
-          <w:rFonts w:ascii="Courier New" w:cs="Courier New" w:eastAsia="Courier New" w:hAnsi="Courier New"/>
-          <w:sz w:val="18"/>
-          <w:szCs w:val="18"/>
-          <w:shd w:fill="F2F2F2" w:color="auto" w:val="clear"/>
-        </w:rPr>
-        <w:t xml:space="preserve"> </w:t>
-      </w:r>
-    </w:p>
-    <w:p>
-      <w:pPr>
-        <w:keepNext w:val="false"/>
-        <w:keepLines w:val="false"/>
-        <w:pBdr>
-          <w:left w:val="single" w:color="4472C4" w:sz="12" w:space="4"/>
-        </w:pBdr>
-        <w:shd w:fill="F2F2F2" w:color="auto" w:val="clear"/>
-        <w:spacing w:after="0" w:line="240" w:lineRule="auto"/>
-        <w:ind w:left="283"/>
-      </w:pPr>
-      <w:r>
-        <w:rPr>
-          <w:rFonts w:ascii="Courier New" w:cs="Courier New" w:eastAsia="Courier New" w:hAnsi="Courier New"/>
-          <w:sz w:val="18"/>
-          <w:szCs w:val="18"/>
-          <w:shd w:fill="F2F2F2" w:color="auto" w:val="clear"/>
-        </w:rPr>
-        <w:t xml:space="preserve">  peek(): number {</w:t>
-      </w:r>
-    </w:p>
-    <w:p>
-      <w:pPr>
-        <w:keepNext w:val="false"/>
-        <w:keepLines w:val="false"/>
-        <w:pBdr>
-          <w:left w:val="single" w:color="4472C4" w:sz="12" w:space="4"/>
-        </w:pBdr>
-        <w:shd w:fill="F2F2F2" w:color="auto" w:val="clear"/>
-        <w:spacing w:after="0" w:line="240" w:lineRule="auto"/>
-        <w:ind w:left="283"/>
-      </w:pPr>
-      <w:r>
-        <w:rPr>
-          <w:rFonts w:ascii="Courier New" w:cs="Courier New" w:eastAsia="Courier New" w:hAnsi="Courier New"/>
-          <w:sz w:val="18"/>
-          <w:szCs w:val="18"/>
-          <w:shd w:fill="F2F2F2" w:color="auto" w:val="clear"/>
-        </w:rPr>
-        <w:t xml:space="preserve">    if (this.top &lt; 0) throw new Error("Stack is empty");</w:t>
-      </w:r>
-    </w:p>
-    <w:p>
-      <w:pPr>
-        <w:keepNext w:val="false"/>
-        <w:keepLines w:val="false"/>
-        <w:pBdr>
-          <w:left w:val="single" w:color="4472C4" w:sz="12" w:space="4"/>
-        </w:pBdr>
-        <w:shd w:fill="F2F2F2" w:color="auto" w:val="clear"/>
-        <w:spacing w:after="0" w:line="240" w:lineRule="auto"/>
-        <w:ind w:left="283"/>
-      </w:pPr>
-      <w:r>
-        <w:rPr>
-          <w:rFonts w:ascii="Courier New" w:cs="Courier New" w:eastAsia="Courier New" w:hAnsi="Courier New"/>
-          <w:sz w:val="18"/>
-          <w:szCs w:val="18"/>
-          <w:shd w:fill="F2F2F2" w:color="auto" w:val="clear"/>
-        </w:rPr>
-        <w:t xml:space="preserve">    return this.data[this.top];</w:t>
-      </w:r>
-    </w:p>
-    <w:p>
-      <w:pPr>
-        <w:keepNext w:val="false"/>
-        <w:keepLines w:val="false"/>
-        <w:pBdr>
-          <w:left w:val="single" w:color="4472C4" w:sz="12" w:space="4"/>
-        </w:pBdr>
-        <w:shd w:fill="F2F2F2" w:color="auto" w:val="clear"/>
-        <w:spacing w:after="0" w:line="240" w:lineRule="auto"/>
-        <w:ind w:left="283"/>
-      </w:pPr>
-      <w:r>
-        <w:rPr>
-          <w:rFonts w:ascii="Courier New" w:cs="Courier New" w:eastAsia="Courier New" w:hAnsi="Courier New"/>
-          <w:sz w:val="18"/>
-          <w:szCs w:val="18"/>
-          <w:shd w:fill="F2F2F2" w:color="auto" w:val="clear"/>
-        </w:rPr>
-        <w:t xml:space="preserve">  }</w:t>
-      </w:r>
-    </w:p>
-    <w:p>
-      <w:pPr>
-        <w:keepNext w:val="false"/>
-        <w:keepLines w:val="false"/>
-        <w:pBdr>
-          <w:left w:val="single" w:color="4472C4" w:sz="12" w:space="4"/>
-        </w:pBdr>
-        <w:shd w:fill="F2F2F2" w:color="auto" w:val="clear"/>
-        <w:spacing w:after="0" w:line="240" w:lineRule="auto"/>
-        <w:ind w:left="283"/>
-      </w:pPr>
-      <w:r>
-        <w:rPr>
-          <w:rFonts w:ascii="Courier New" w:cs="Courier New" w:eastAsia="Courier New" w:hAnsi="Courier New"/>
-          <w:sz w:val="18"/>
-          <w:szCs w:val="18"/>
-          <w:shd w:fill="F2F2F2" w:color="auto" w:val="clear"/>
-        </w:rPr>
-        <w:t xml:space="preserve"> </w:t>
-      </w:r>
-    </w:p>
-    <w:p>
-      <w:pPr>
-        <w:keepNext w:val="false"/>
-        <w:keepLines w:val="false"/>
-        <w:pBdr>
-          <w:left w:val="single" w:color="4472C4" w:sz="12" w:space="4"/>
-        </w:pBdr>
-        <w:shd w:fill="F2F2F2" w:color="auto" w:val="clear"/>
-        <w:spacing w:after="0" w:line="240" w:lineRule="auto"/>
-        <w:ind w:left="283"/>
-      </w:pPr>
-      <w:r>
-        <w:rPr>
-          <w:rFonts w:ascii="Courier New" w:cs="Courier New" w:eastAsia="Courier New" w:hAnsi="Courier New"/>
-          <w:sz w:val="18"/>
-          <w:szCs w:val="18"/>
-          <w:shd w:fill="F2F2F2" w:color="auto" w:val="clear"/>
-        </w:rPr>
-        <w:t xml:space="preserve">  isEmpty(): boolean {</w:t>
-      </w:r>
-    </w:p>
-    <w:p>
-      <w:pPr>
-        <w:keepNext w:val="false"/>
-        <w:keepLines w:val="false"/>
-        <w:pBdr>
-          <w:left w:val="single" w:color="4472C4" w:sz="12" w:space="4"/>
-        </w:pBdr>
-        <w:shd w:fill="F2F2F2" w:color="auto" w:val="clear"/>
-        <w:spacing w:after="0" w:line="240" w:lineRule="auto"/>
-        <w:ind w:left="283"/>
-      </w:pPr>
-      <w:r>
-        <w:rPr>
-          <w:rFonts w:ascii="Courier New" w:cs="Courier New" w:eastAsia="Courier New" w:hAnsi="Courier New"/>
-          <w:sz w:val="18"/>
-          <w:szCs w:val="18"/>
-          <w:shd w:fill="F2F2F2" w:color="auto" w:val="clear"/>
-        </w:rPr>
-        <w:t xml:space="preserve">    return this.top &lt; 0;</w:t>
-      </w:r>
-    </w:p>
-    <w:p>
-      <w:pPr>
-        <w:keepNext w:val="false"/>
-        <w:keepLines w:val="false"/>
-        <w:pBdr>
-          <w:left w:val="single" w:color="4472C4" w:sz="12" w:space="4"/>
-        </w:pBdr>
-        <w:shd w:fill="F2F2F2" w:color="auto" w:val="clear"/>
-        <w:spacing w:after="0" w:line="240" w:lineRule="auto"/>
-        <w:ind w:left="283"/>
-      </w:pPr>
-      <w:r>
-        <w:rPr>
-          <w:rFonts w:ascii="Courier New" w:cs="Courier New" w:eastAsia="Courier New" w:hAnsi="Courier New"/>
-          <w:sz w:val="18"/>
-          <w:szCs w:val="18"/>
-          <w:shd w:fill="F2F2F2" w:color="auto" w:val="clear"/>
-        </w:rPr>
-        <w:t xml:space="preserve">  }</w:t>
-      </w:r>
-    </w:p>
-    <w:p>
-      <w:pPr>
-        <w:keepNext w:val="false"/>
-        <w:keepLines w:val="false"/>
-        <w:pBdr>
-          <w:left w:val="single" w:color="4472C4" w:sz="12" w:space="4"/>
-        </w:pBdr>
-        <w:shd w:fill="F2F2F2" w:color="auto" w:val="clear"/>
-        <w:spacing w:after="0" w:line="240" w:lineRule="auto"/>
-        <w:ind w:left="283"/>
-      </w:pPr>
-      <w:r>
-        <w:rPr>
-          <w:rFonts w:ascii="Courier New" w:cs="Courier New" w:eastAsia="Courier New" w:hAnsi="Courier New"/>
-          <w:sz w:val="18"/>
-          <w:szCs w:val="18"/>
-          <w:shd w:fill="F2F2F2" w:color="auto" w:val="clear"/>
-        </w:rPr>
-        <w:t xml:space="preserve"> </w:t>
-      </w:r>
-    </w:p>
-    <w:p>
-      <w:pPr>
-        <w:keepNext w:val="false"/>
-        <w:keepLines w:val="false"/>
-        <w:pBdr>
-          <w:left w:val="single" w:color="4472C4" w:sz="12" w:space="4"/>
-        </w:pBdr>
-        <w:shd w:fill="F2F2F2" w:color="auto" w:val="clear"/>
-        <w:spacing w:after="0" w:line="240" w:lineRule="auto"/>
-        <w:ind w:left="283"/>
-      </w:pPr>
-      <w:r>
-        <w:rPr>
-          <w:rFonts w:ascii="Courier New" w:cs="Courier New" w:eastAsia="Courier New" w:hAnsi="Courier New"/>
-          <w:sz w:val="18"/>
-          <w:szCs w:val="18"/>
-          <w:shd w:fill="F2F2F2" w:color="auto" w:val="clear"/>
-        </w:rPr>
-        <w:t xml:space="preserve">  print(): void {</w:t>
-      </w:r>
-    </w:p>
-    <w:p>
-      <w:pPr>
-        <w:keepNext w:val="false"/>
-        <w:keepLines w:val="false"/>
-        <w:pBdr>
-          <w:left w:val="single" w:color="4472C4" w:sz="12" w:space="4"/>
-        </w:pBdr>
-        <w:shd w:fill="F2F2F2" w:color="auto" w:val="clear"/>
-        <w:spacing w:after="0" w:line="240" w:lineRule="auto"/>
-        <w:ind w:left="283"/>
-      </w:pPr>
-      <w:r>
-        <w:rPr>
-          <w:rFonts w:ascii="Courier New" w:cs="Courier New" w:eastAsia="Courier New" w:hAnsi="Courier New"/>
-          <w:sz w:val="18"/>
-          <w:szCs w:val="18"/>
-          <w:shd w:fill="F2F2F2" w:color="auto" w:val="clear"/>
-        </w:rPr>
-        <w:t xml:space="preserve">    const items: number[] = [];</w:t>
-      </w:r>
-    </w:p>
-    <w:p>
-      <w:pPr>
-        <w:keepNext w:val="false"/>
-        <w:keepLines w:val="false"/>
-        <w:pBdr>
-          <w:left w:val="single" w:color="4472C4" w:sz="12" w:space="4"/>
-        </w:pBdr>
-        <w:shd w:fill="F2F2F2" w:color="auto" w:val="clear"/>
-        <w:spacing w:after="0" w:line="240" w:lineRule="auto"/>
-        <w:ind w:left="283"/>
-      </w:pPr>
-      <w:r>
-        <w:rPr>
-          <w:rFonts w:ascii="Courier New" w:cs="Courier New" w:eastAsia="Courier New" w:hAnsi="Courier New"/>
-          <w:sz w:val="18"/>
-          <w:szCs w:val="18"/>
-          <w:shd w:fill="F2F2F2" w:color="auto" w:val="clear"/>
-        </w:rPr>
-        <w:t xml:space="preserve">    for (let i = 0; i &lt;= this.top; i++) items.push(this.data[i]);</w:t>
-      </w:r>
-    </w:p>
-    <w:p>
-      <w:pPr>
-        <w:keepNext w:val="false"/>
-        <w:keepLines w:val="false"/>
-        <w:pBdr>
-          <w:left w:val="single" w:color="4472C4" w:sz="12" w:space="4"/>
-        </w:pBdr>
-        <w:shd w:fill="F2F2F2" w:color="auto" w:val="clear"/>
-        <w:spacing w:after="0" w:line="240" w:lineRule="auto"/>
-        <w:ind w:left="283"/>
-      </w:pPr>
-      <w:r>
-        <w:rPr>
-          <w:rFonts w:ascii="Courier New" w:cs="Courier New" w:eastAsia="Courier New" w:hAnsi="Courier New"/>
-          <w:sz w:val="18"/>
-          <w:szCs w:val="18"/>
-          <w:shd w:fill="F2F2F2" w:color="auto" w:val="clear"/>
-        </w:rPr>
-        <w:t xml:space="preserve">    console.log(`Stack [bottom → top]: ${items.join(", ")}`);</w:t>
-      </w:r>
-    </w:p>
-    <w:p>
-      <w:pPr>
-        <w:keepNext w:val="false"/>
-        <w:keepLines w:val="false"/>
-        <w:pBdr>
-          <w:left w:val="single" w:color="4472C4" w:sz="12" w:space="4"/>
-        </w:pBdr>
-        <w:shd w:fill="F2F2F2" w:color="auto" w:val="clear"/>
-        <w:spacing w:after="0" w:line="240" w:lineRule="auto"/>
-        <w:ind w:left="283"/>
-      </w:pPr>
-      <w:r>
-        <w:rPr>
-          <w:rFonts w:ascii="Courier New" w:cs="Courier New" w:eastAsia="Courier New" w:hAnsi="Courier New"/>
-          <w:sz w:val="18"/>
-          <w:szCs w:val="18"/>
-          <w:shd w:fill="F2F2F2" w:color="auto" w:val="clear"/>
-        </w:rPr>
-        <w:t xml:space="preserve">  }</w:t>
-      </w:r>
-    </w:p>
-    <w:p>
-      <w:pPr>
-        <w:keepNext w:val="false"/>
-        <w:keepLines w:val="false"/>
-        <w:pBdr>
-          <w:left w:val="single" w:color="4472C4" w:sz="12" w:space="4"/>
-        </w:pBdr>
-        <w:shd w:fill="F2F2F2" w:color="auto" w:val="clear"/>
-        <w:spacing w:after="0" w:line="240" w:lineRule="auto"/>
-        <w:ind w:left="283"/>
-      </w:pPr>
-      <w:r>
-        <w:rPr>
-          <w:rFonts w:ascii="Courier New" w:cs="Courier New" w:eastAsia="Courier New" w:hAnsi="Courier New"/>
-          <w:sz w:val="18"/>
-          <w:szCs w:val="18"/>
-          <w:shd w:fill="F2F2F2" w:color="auto" w:val="clear"/>
-        </w:rPr>
-        <w:t xml:space="preserve">}</w:t>
       </w:r>
     </w:p>
     <w:p>
@@ -1414,139 +847,139 @@
           <w:sz w:val="28"/>
           <w:szCs w:val="28"/>
         </w:rPr>
-        <w:t xml:space="preserve">Лістинг 3.2 — Реалізація черги</w:t>
-      </w:r>
-    </w:p>
-    <w:p>
-      <w:pPr>
-        <w:keepNext w:val="false"/>
-        <w:keepLines w:val="false"/>
-        <w:pBdr>
-          <w:left w:val="single" w:color="4472C4" w:sz="12" w:space="4"/>
-        </w:pBdr>
-        <w:shd w:fill="F2F2F2" w:color="auto" w:val="clear"/>
-        <w:spacing w:after="0" w:line="240" w:lineRule="auto"/>
-        <w:ind w:left="283"/>
-      </w:pPr>
-      <w:r>
-        <w:rPr>
-          <w:rFonts w:ascii="Courier New" w:cs="Courier New" w:eastAsia="Courier New" w:hAnsi="Courier New"/>
-          <w:sz w:val="18"/>
-          <w:szCs w:val="18"/>
-          <w:shd w:fill="F2F2F2" w:color="auto" w:val="clear"/>
-        </w:rPr>
-        <w:t xml:space="preserve">export class ArrayQueue {</w:t>
-      </w:r>
-    </w:p>
-    <w:p>
-      <w:pPr>
-        <w:keepNext w:val="false"/>
-        <w:keepLines w:val="false"/>
-        <w:pBdr>
-          <w:left w:val="single" w:color="4472C4" w:sz="12" w:space="4"/>
-        </w:pBdr>
-        <w:shd w:fill="F2F2F2" w:color="auto" w:val="clear"/>
-        <w:spacing w:after="0" w:line="240" w:lineRule="auto"/>
-        <w:ind w:left="283"/>
-      </w:pPr>
-      <w:r>
-        <w:rPr>
-          <w:rFonts w:ascii="Courier New" w:cs="Courier New" w:eastAsia="Courier New" w:hAnsi="Courier New"/>
-          <w:sz w:val="18"/>
-          <w:szCs w:val="18"/>
-          <w:shd w:fill="F2F2F2" w:color="auto" w:val="clear"/>
-        </w:rPr>
-        <w:t xml:space="preserve">  private data: number[];</w:t>
-      </w:r>
-    </w:p>
-    <w:p>
-      <w:pPr>
-        <w:keepNext w:val="false"/>
-        <w:keepLines w:val="false"/>
-        <w:pBdr>
-          <w:left w:val="single" w:color="4472C4" w:sz="12" w:space="4"/>
-        </w:pBdr>
-        <w:shd w:fill="F2F2F2" w:color="auto" w:val="clear"/>
-        <w:spacing w:after="0" w:line="240" w:lineRule="auto"/>
-        <w:ind w:left="283"/>
-      </w:pPr>
-      <w:r>
-        <w:rPr>
-          <w:rFonts w:ascii="Courier New" w:cs="Courier New" w:eastAsia="Courier New" w:hAnsi="Courier New"/>
-          <w:sz w:val="18"/>
-          <w:szCs w:val="18"/>
-          <w:shd w:fill="F2F2F2" w:color="auto" w:val="clear"/>
-        </w:rPr>
-        <w:t xml:space="preserve">  private head: number;</w:t>
-      </w:r>
-    </w:p>
-    <w:p>
-      <w:pPr>
-        <w:keepNext w:val="false"/>
-        <w:keepLines w:val="false"/>
-        <w:pBdr>
-          <w:left w:val="single" w:color="4472C4" w:sz="12" w:space="4"/>
-        </w:pBdr>
-        <w:shd w:fill="F2F2F2" w:color="auto" w:val="clear"/>
-        <w:spacing w:after="0" w:line="240" w:lineRule="auto"/>
-        <w:ind w:left="283"/>
-      </w:pPr>
-      <w:r>
-        <w:rPr>
-          <w:rFonts w:ascii="Courier New" w:cs="Courier New" w:eastAsia="Courier New" w:hAnsi="Courier New"/>
-          <w:sz w:val="18"/>
-          <w:szCs w:val="18"/>
-          <w:shd w:fill="F2F2F2" w:color="auto" w:val="clear"/>
-        </w:rPr>
-        <w:t xml:space="preserve">  private tail: number;</w:t>
-      </w:r>
-    </w:p>
-    <w:p>
-      <w:pPr>
-        <w:keepNext w:val="false"/>
-        <w:keepLines w:val="false"/>
-        <w:pBdr>
-          <w:left w:val="single" w:color="4472C4" w:sz="12" w:space="4"/>
-        </w:pBdr>
-        <w:shd w:fill="F2F2F2" w:color="auto" w:val="clear"/>
-        <w:spacing w:after="0" w:line="240" w:lineRule="auto"/>
-        <w:ind w:left="283"/>
-      </w:pPr>
-      <w:r>
-        <w:rPr>
-          <w:rFonts w:ascii="Courier New" w:cs="Courier New" w:eastAsia="Courier New" w:hAnsi="Courier New"/>
-          <w:sz w:val="18"/>
-          <w:szCs w:val="18"/>
-          <w:shd w:fill="F2F2F2" w:color="auto" w:val="clear"/>
-        </w:rPr>
-        <w:t xml:space="preserve">  private size: number;</w:t>
-      </w:r>
-    </w:p>
-    <w:p>
-      <w:pPr>
-        <w:keepNext w:val="false"/>
-        <w:keepLines w:val="false"/>
-        <w:pBdr>
-          <w:left w:val="single" w:color="4472C4" w:sz="12" w:space="4"/>
-        </w:pBdr>
-        <w:shd w:fill="F2F2F2" w:color="auto" w:val="clear"/>
-        <w:spacing w:after="0" w:line="240" w:lineRule="auto"/>
-        <w:ind w:left="283"/>
-      </w:pPr>
-      <w:r>
-        <w:rPr>
-          <w:rFonts w:ascii="Courier New" w:cs="Courier New" w:eastAsia="Courier New" w:hAnsi="Courier New"/>
-          <w:sz w:val="18"/>
-          <w:szCs w:val="18"/>
-          <w:shd w:fill="F2F2F2" w:color="auto" w:val="clear"/>
-        </w:rPr>
-        <w:t xml:space="preserve">  private capacity: number;</w:t>
-      </w:r>
-    </w:p>
-    <w:p>
-      <w:pPr>
-        <w:keepNext w:val="false"/>
-        <w:keepLines w:val="false"/>
+        <w:t xml:space="preserve">Лістинг 3.2 — Ключові операції enqueue та dequeue</w:t>
+      </w:r>
+    </w:p>
+    <w:p>
+      <w:pPr>
+        <w:keepNext/>
+        <w:keepLines/>
+        <w:pBdr>
+          <w:left w:val="single" w:color="4472C4" w:sz="12" w:space="4"/>
+        </w:pBdr>
+        <w:shd w:fill="F2F2F2" w:color="auto" w:val="clear"/>
+        <w:spacing w:after="0" w:line="240" w:lineRule="auto"/>
+        <w:ind w:left="283"/>
+      </w:pPr>
+      <w:r>
+        <w:rPr>
+          <w:rFonts w:ascii="Courier New" w:cs="Courier New" w:eastAsia="Courier New" w:hAnsi="Courier New"/>
+          <w:sz w:val="18"/>
+          <w:szCs w:val="18"/>
+          <w:shd w:fill="F2F2F2" w:color="auto" w:val="clear"/>
+        </w:rPr>
+        <w:t xml:space="preserve">  enqueue(value: number): void {</w:t>
+      </w:r>
+    </w:p>
+    <w:p>
+      <w:pPr>
+        <w:keepNext/>
+        <w:keepLines/>
+        <w:pBdr>
+          <w:left w:val="single" w:color="4472C4" w:sz="12" w:space="4"/>
+        </w:pBdr>
+        <w:shd w:fill="F2F2F2" w:color="auto" w:val="clear"/>
+        <w:spacing w:after="0" w:line="240" w:lineRule="auto"/>
+        <w:ind w:left="283"/>
+      </w:pPr>
+      <w:r>
+        <w:rPr>
+          <w:rFonts w:ascii="Courier New" w:cs="Courier New" w:eastAsia="Courier New" w:hAnsi="Courier New"/>
+          <w:sz w:val="18"/>
+          <w:szCs w:val="18"/>
+          <w:shd w:fill="F2F2F2" w:color="auto" w:val="clear"/>
+        </w:rPr>
+        <w:t xml:space="preserve">    if (this.size &gt;= this.capacity) throw new Error("Queue overflow");</w:t>
+      </w:r>
+    </w:p>
+    <w:p>
+      <w:pPr>
+        <w:keepNext/>
+        <w:keepLines/>
+        <w:pBdr>
+          <w:left w:val="single" w:color="4472C4" w:sz="12" w:space="4"/>
+        </w:pBdr>
+        <w:shd w:fill="F2F2F2" w:color="auto" w:val="clear"/>
+        <w:spacing w:after="0" w:line="240" w:lineRule="auto"/>
+        <w:ind w:left="283"/>
+      </w:pPr>
+      <w:r>
+        <w:rPr>
+          <w:rFonts w:ascii="Courier New" w:cs="Courier New" w:eastAsia="Courier New" w:hAnsi="Courier New"/>
+          <w:sz w:val="18"/>
+          <w:szCs w:val="18"/>
+          <w:shd w:fill="F2F2F2" w:color="auto" w:val="clear"/>
+        </w:rPr>
+        <w:t xml:space="preserve">    this.data[this.tail] = value;</w:t>
+      </w:r>
+    </w:p>
+    <w:p>
+      <w:pPr>
+        <w:keepNext/>
+        <w:keepLines/>
+        <w:pBdr>
+          <w:left w:val="single" w:color="4472C4" w:sz="12" w:space="4"/>
+        </w:pBdr>
+        <w:shd w:fill="F2F2F2" w:color="auto" w:val="clear"/>
+        <w:spacing w:after="0" w:line="240" w:lineRule="auto"/>
+        <w:ind w:left="283"/>
+      </w:pPr>
+      <w:r>
+        <w:rPr>
+          <w:rFonts w:ascii="Courier New" w:cs="Courier New" w:eastAsia="Courier New" w:hAnsi="Courier New"/>
+          <w:sz w:val="18"/>
+          <w:szCs w:val="18"/>
+          <w:shd w:fill="F2F2F2" w:color="auto" w:val="clear"/>
+        </w:rPr>
+        <w:t xml:space="preserve">    this.tail = (this.tail + 1) % this.capacity;</w:t>
+      </w:r>
+    </w:p>
+    <w:p>
+      <w:pPr>
+        <w:keepNext/>
+        <w:keepLines/>
+        <w:pBdr>
+          <w:left w:val="single" w:color="4472C4" w:sz="12" w:space="4"/>
+        </w:pBdr>
+        <w:shd w:fill="F2F2F2" w:color="auto" w:val="clear"/>
+        <w:spacing w:after="0" w:line="240" w:lineRule="auto"/>
+        <w:ind w:left="283"/>
+      </w:pPr>
+      <w:r>
+        <w:rPr>
+          <w:rFonts w:ascii="Courier New" w:cs="Courier New" w:eastAsia="Courier New" w:hAnsi="Courier New"/>
+          <w:sz w:val="18"/>
+          <w:szCs w:val="18"/>
+          <w:shd w:fill="F2F2F2" w:color="auto" w:val="clear"/>
+        </w:rPr>
+        <w:t xml:space="preserve">    this.size++;</w:t>
+      </w:r>
+    </w:p>
+    <w:p>
+      <w:pPr>
+        <w:keepNext/>
+        <w:keepLines/>
+        <w:pBdr>
+          <w:left w:val="single" w:color="4472C4" w:sz="12" w:space="4"/>
+        </w:pBdr>
+        <w:shd w:fill="F2F2F2" w:color="auto" w:val="clear"/>
+        <w:spacing w:after="0" w:line="240" w:lineRule="auto"/>
+        <w:ind w:left="283"/>
+      </w:pPr>
+      <w:r>
+        <w:rPr>
+          <w:rFonts w:ascii="Courier New" w:cs="Courier New" w:eastAsia="Courier New" w:hAnsi="Courier New"/>
+          <w:sz w:val="18"/>
+          <w:szCs w:val="18"/>
+          <w:shd w:fill="F2F2F2" w:color="auto" w:val="clear"/>
+        </w:rPr>
+        <w:t xml:space="preserve">  }</w:t>
+      </w:r>
+    </w:p>
+    <w:p>
+      <w:pPr>
+        <w:keepNext/>
+        <w:keepLines/>
         <w:pBdr>
           <w:left w:val="single" w:color="4472C4" w:sz="12" w:space="4"/>
         </w:pBdr>
@@ -1566,134 +999,134 @@
     </w:p>
     <w:p>
       <w:pPr>
-        <w:keepNext w:val="false"/>
-        <w:keepLines w:val="false"/>
-        <w:pBdr>
-          <w:left w:val="single" w:color="4472C4" w:sz="12" w:space="4"/>
-        </w:pBdr>
-        <w:shd w:fill="F2F2F2" w:color="auto" w:val="clear"/>
-        <w:spacing w:after="0" w:line="240" w:lineRule="auto"/>
-        <w:ind w:left="283"/>
-      </w:pPr>
-      <w:r>
-        <w:rPr>
-          <w:rFonts w:ascii="Courier New" w:cs="Courier New" w:eastAsia="Courier New" w:hAnsi="Courier New"/>
-          <w:sz w:val="18"/>
-          <w:szCs w:val="18"/>
-          <w:shd w:fill="F2F2F2" w:color="auto" w:val="clear"/>
-        </w:rPr>
-        <w:t xml:space="preserve">  constructor(capacity: number = 100) {</w:t>
-      </w:r>
-    </w:p>
-    <w:p>
-      <w:pPr>
-        <w:keepNext w:val="false"/>
-        <w:keepLines w:val="false"/>
-        <w:pBdr>
-          <w:left w:val="single" w:color="4472C4" w:sz="12" w:space="4"/>
-        </w:pBdr>
-        <w:shd w:fill="F2F2F2" w:color="auto" w:val="clear"/>
-        <w:spacing w:after="0" w:line="240" w:lineRule="auto"/>
-        <w:ind w:left="283"/>
-      </w:pPr>
-      <w:r>
-        <w:rPr>
-          <w:rFonts w:ascii="Courier New" w:cs="Courier New" w:eastAsia="Courier New" w:hAnsi="Courier New"/>
-          <w:sz w:val="18"/>
-          <w:szCs w:val="18"/>
-          <w:shd w:fill="F2F2F2" w:color="auto" w:val="clear"/>
-        </w:rPr>
-        <w:t xml:space="preserve">    this.data = new Array(capacity);</w:t>
-      </w:r>
-    </w:p>
-    <w:p>
-      <w:pPr>
-        <w:keepNext w:val="false"/>
-        <w:keepLines w:val="false"/>
-        <w:pBdr>
-          <w:left w:val="single" w:color="4472C4" w:sz="12" w:space="4"/>
-        </w:pBdr>
-        <w:shd w:fill="F2F2F2" w:color="auto" w:val="clear"/>
-        <w:spacing w:after="0" w:line="240" w:lineRule="auto"/>
-        <w:ind w:left="283"/>
-      </w:pPr>
-      <w:r>
-        <w:rPr>
-          <w:rFonts w:ascii="Courier New" w:cs="Courier New" w:eastAsia="Courier New" w:hAnsi="Courier New"/>
-          <w:sz w:val="18"/>
-          <w:szCs w:val="18"/>
-          <w:shd w:fill="F2F2F2" w:color="auto" w:val="clear"/>
-        </w:rPr>
-        <w:t xml:space="preserve">    this.head = 0;</w:t>
-      </w:r>
-    </w:p>
-    <w:p>
-      <w:pPr>
-        <w:keepNext w:val="false"/>
-        <w:keepLines w:val="false"/>
-        <w:pBdr>
-          <w:left w:val="single" w:color="4472C4" w:sz="12" w:space="4"/>
-        </w:pBdr>
-        <w:shd w:fill="F2F2F2" w:color="auto" w:val="clear"/>
-        <w:spacing w:after="0" w:line="240" w:lineRule="auto"/>
-        <w:ind w:left="283"/>
-      </w:pPr>
-      <w:r>
-        <w:rPr>
-          <w:rFonts w:ascii="Courier New" w:cs="Courier New" w:eastAsia="Courier New" w:hAnsi="Courier New"/>
-          <w:sz w:val="18"/>
-          <w:szCs w:val="18"/>
-          <w:shd w:fill="F2F2F2" w:color="auto" w:val="clear"/>
-        </w:rPr>
-        <w:t xml:space="preserve">    this.tail = 0;</w:t>
-      </w:r>
-    </w:p>
-    <w:p>
-      <w:pPr>
-        <w:keepNext w:val="false"/>
-        <w:keepLines w:val="false"/>
-        <w:pBdr>
-          <w:left w:val="single" w:color="4472C4" w:sz="12" w:space="4"/>
-        </w:pBdr>
-        <w:shd w:fill="F2F2F2" w:color="auto" w:val="clear"/>
-        <w:spacing w:after="0" w:line="240" w:lineRule="auto"/>
-        <w:ind w:left="283"/>
-      </w:pPr>
-      <w:r>
-        <w:rPr>
-          <w:rFonts w:ascii="Courier New" w:cs="Courier New" w:eastAsia="Courier New" w:hAnsi="Courier New"/>
-          <w:sz w:val="18"/>
-          <w:szCs w:val="18"/>
-          <w:shd w:fill="F2F2F2" w:color="auto" w:val="clear"/>
-        </w:rPr>
-        <w:t xml:space="preserve">    this.size = 0;</w:t>
-      </w:r>
-    </w:p>
-    <w:p>
-      <w:pPr>
-        <w:keepNext w:val="false"/>
-        <w:keepLines w:val="false"/>
-        <w:pBdr>
-          <w:left w:val="single" w:color="4472C4" w:sz="12" w:space="4"/>
-        </w:pBdr>
-        <w:shd w:fill="F2F2F2" w:color="auto" w:val="clear"/>
-        <w:spacing w:after="0" w:line="240" w:lineRule="auto"/>
-        <w:ind w:left="283"/>
-      </w:pPr>
-      <w:r>
-        <w:rPr>
-          <w:rFonts w:ascii="Courier New" w:cs="Courier New" w:eastAsia="Courier New" w:hAnsi="Courier New"/>
-          <w:sz w:val="18"/>
-          <w:szCs w:val="18"/>
-          <w:shd w:fill="F2F2F2" w:color="auto" w:val="clear"/>
-        </w:rPr>
-        <w:t xml:space="preserve">    this.capacity = capacity;</w:t>
-      </w:r>
-    </w:p>
-    <w:p>
-      <w:pPr>
-        <w:keepNext w:val="false"/>
-        <w:keepLines w:val="false"/>
+        <w:keepNext/>
+        <w:keepLines/>
+        <w:pBdr>
+          <w:left w:val="single" w:color="4472C4" w:sz="12" w:space="4"/>
+        </w:pBdr>
+        <w:shd w:fill="F2F2F2" w:color="auto" w:val="clear"/>
+        <w:spacing w:after="0" w:line="240" w:lineRule="auto"/>
+        <w:ind w:left="283"/>
+      </w:pPr>
+      <w:r>
+        <w:rPr>
+          <w:rFonts w:ascii="Courier New" w:cs="Courier New" w:eastAsia="Courier New" w:hAnsi="Courier New"/>
+          <w:sz w:val="18"/>
+          <w:szCs w:val="18"/>
+          <w:shd w:fill="F2F2F2" w:color="auto" w:val="clear"/>
+        </w:rPr>
+        <w:t xml:space="preserve">  dequeue(): number {</w:t>
+      </w:r>
+    </w:p>
+    <w:p>
+      <w:pPr>
+        <w:keepNext/>
+        <w:keepLines/>
+        <w:pBdr>
+          <w:left w:val="single" w:color="4472C4" w:sz="12" w:space="4"/>
+        </w:pBdr>
+        <w:shd w:fill="F2F2F2" w:color="auto" w:val="clear"/>
+        <w:spacing w:after="0" w:line="240" w:lineRule="auto"/>
+        <w:ind w:left="283"/>
+      </w:pPr>
+      <w:r>
+        <w:rPr>
+          <w:rFonts w:ascii="Courier New" w:cs="Courier New" w:eastAsia="Courier New" w:hAnsi="Courier New"/>
+          <w:sz w:val="18"/>
+          <w:szCs w:val="18"/>
+          <w:shd w:fill="F2F2F2" w:color="auto" w:val="clear"/>
+        </w:rPr>
+        <w:t xml:space="preserve">    if (this.size === 0) throw new Error("Queue is empty");</w:t>
+      </w:r>
+    </w:p>
+    <w:p>
+      <w:pPr>
+        <w:keepNext/>
+        <w:keepLines/>
+        <w:pBdr>
+          <w:left w:val="single" w:color="4472C4" w:sz="12" w:space="4"/>
+        </w:pBdr>
+        <w:shd w:fill="F2F2F2" w:color="auto" w:val="clear"/>
+        <w:spacing w:after="0" w:line="240" w:lineRule="auto"/>
+        <w:ind w:left="283"/>
+      </w:pPr>
+      <w:r>
+        <w:rPr>
+          <w:rFonts w:ascii="Courier New" w:cs="Courier New" w:eastAsia="Courier New" w:hAnsi="Courier New"/>
+          <w:sz w:val="18"/>
+          <w:szCs w:val="18"/>
+          <w:shd w:fill="F2F2F2" w:color="auto" w:val="clear"/>
+        </w:rPr>
+        <w:t xml:space="preserve">    const value = this.data[this.head];</w:t>
+      </w:r>
+    </w:p>
+    <w:p>
+      <w:pPr>
+        <w:keepNext/>
+        <w:keepLines/>
+        <w:pBdr>
+          <w:left w:val="single" w:color="4472C4" w:sz="12" w:space="4"/>
+        </w:pBdr>
+        <w:shd w:fill="F2F2F2" w:color="auto" w:val="clear"/>
+        <w:spacing w:after="0" w:line="240" w:lineRule="auto"/>
+        <w:ind w:left="283"/>
+      </w:pPr>
+      <w:r>
+        <w:rPr>
+          <w:rFonts w:ascii="Courier New" w:cs="Courier New" w:eastAsia="Courier New" w:hAnsi="Courier New"/>
+          <w:sz w:val="18"/>
+          <w:szCs w:val="18"/>
+          <w:shd w:fill="F2F2F2" w:color="auto" w:val="clear"/>
+        </w:rPr>
+        <w:t xml:space="preserve">    this.head = (this.head + 1) % this.capacity;</w:t>
+      </w:r>
+    </w:p>
+    <w:p>
+      <w:pPr>
+        <w:keepNext/>
+        <w:keepLines/>
+        <w:pBdr>
+          <w:left w:val="single" w:color="4472C4" w:sz="12" w:space="4"/>
+        </w:pBdr>
+        <w:shd w:fill="F2F2F2" w:color="auto" w:val="clear"/>
+        <w:spacing w:after="0" w:line="240" w:lineRule="auto"/>
+        <w:ind w:left="283"/>
+      </w:pPr>
+      <w:r>
+        <w:rPr>
+          <w:rFonts w:ascii="Courier New" w:cs="Courier New" w:eastAsia="Courier New" w:hAnsi="Courier New"/>
+          <w:sz w:val="18"/>
+          <w:szCs w:val="18"/>
+          <w:shd w:fill="F2F2F2" w:color="auto" w:val="clear"/>
+        </w:rPr>
+        <w:t xml:space="preserve">    this.size--;</w:t>
+      </w:r>
+    </w:p>
+    <w:p>
+      <w:pPr>
+        <w:keepNext/>
+        <w:keepLines/>
+        <w:pBdr>
+          <w:left w:val="single" w:color="4472C4" w:sz="12" w:space="4"/>
+        </w:pBdr>
+        <w:shd w:fill="F2F2F2" w:color="auto" w:val="clear"/>
+        <w:spacing w:after="0" w:line="240" w:lineRule="auto"/>
+        <w:ind w:left="283"/>
+      </w:pPr>
+      <w:r>
+        <w:rPr>
+          <w:rFonts w:ascii="Courier New" w:cs="Courier New" w:eastAsia="Courier New" w:hAnsi="Courier New"/>
+          <w:sz w:val="18"/>
+          <w:szCs w:val="18"/>
+          <w:shd w:fill="F2F2F2" w:color="auto" w:val="clear"/>
+        </w:rPr>
+        <w:t xml:space="preserve">    return value;</w:t>
+      </w:r>
+    </w:p>
+    <w:p>
+      <w:pPr>
+        <w:keepNext w:val="false"/>
+        <w:keepLines/>
         <w:pBdr>
           <w:left w:val="single" w:color="4472C4" w:sz="12" w:space="4"/>
         </w:pBdr>
@@ -1709,594 +1142,6 @@
           <w:shd w:fill="F2F2F2" w:color="auto" w:val="clear"/>
         </w:rPr>
         <w:t xml:space="preserve">  }</w:t>
-      </w:r>
-    </w:p>
-    <w:p>
-      <w:pPr>
-        <w:keepNext w:val="false"/>
-        <w:keepLines w:val="false"/>
-        <w:pBdr>
-          <w:left w:val="single" w:color="4472C4" w:sz="12" w:space="4"/>
-        </w:pBdr>
-        <w:shd w:fill="F2F2F2" w:color="auto" w:val="clear"/>
-        <w:spacing w:after="0" w:line="240" w:lineRule="auto"/>
-        <w:ind w:left="283"/>
-      </w:pPr>
-      <w:r>
-        <w:rPr>
-          <w:rFonts w:ascii="Courier New" w:cs="Courier New" w:eastAsia="Courier New" w:hAnsi="Courier New"/>
-          <w:sz w:val="18"/>
-          <w:szCs w:val="18"/>
-          <w:shd w:fill="F2F2F2" w:color="auto" w:val="clear"/>
-        </w:rPr>
-        <w:t xml:space="preserve"> </w:t>
-      </w:r>
-    </w:p>
-    <w:p>
-      <w:pPr>
-        <w:keepNext w:val="false"/>
-        <w:keepLines w:val="false"/>
-        <w:pBdr>
-          <w:left w:val="single" w:color="4472C4" w:sz="12" w:space="4"/>
-        </w:pBdr>
-        <w:shd w:fill="F2F2F2" w:color="auto" w:val="clear"/>
-        <w:spacing w:after="0" w:line="240" w:lineRule="auto"/>
-        <w:ind w:left="283"/>
-      </w:pPr>
-      <w:r>
-        <w:rPr>
-          <w:rFonts w:ascii="Courier New" w:cs="Courier New" w:eastAsia="Courier New" w:hAnsi="Courier New"/>
-          <w:sz w:val="18"/>
-          <w:szCs w:val="18"/>
-          <w:shd w:fill="F2F2F2" w:color="auto" w:val="clear"/>
-        </w:rPr>
-        <w:t xml:space="preserve">  enqueue(value: number): void {</w:t>
-      </w:r>
-    </w:p>
-    <w:p>
-      <w:pPr>
-        <w:keepNext w:val="false"/>
-        <w:keepLines w:val="false"/>
-        <w:pBdr>
-          <w:left w:val="single" w:color="4472C4" w:sz="12" w:space="4"/>
-        </w:pBdr>
-        <w:shd w:fill="F2F2F2" w:color="auto" w:val="clear"/>
-        <w:spacing w:after="0" w:line="240" w:lineRule="auto"/>
-        <w:ind w:left="283"/>
-      </w:pPr>
-      <w:r>
-        <w:rPr>
-          <w:rFonts w:ascii="Courier New" w:cs="Courier New" w:eastAsia="Courier New" w:hAnsi="Courier New"/>
-          <w:sz w:val="18"/>
-          <w:szCs w:val="18"/>
-          <w:shd w:fill="F2F2F2" w:color="auto" w:val="clear"/>
-        </w:rPr>
-        <w:t xml:space="preserve">    if (this.size &gt;= this.capacity) throw new Error("Queue overflow");</w:t>
-      </w:r>
-    </w:p>
-    <w:p>
-      <w:pPr>
-        <w:keepNext w:val="false"/>
-        <w:keepLines w:val="false"/>
-        <w:pBdr>
-          <w:left w:val="single" w:color="4472C4" w:sz="12" w:space="4"/>
-        </w:pBdr>
-        <w:shd w:fill="F2F2F2" w:color="auto" w:val="clear"/>
-        <w:spacing w:after="0" w:line="240" w:lineRule="auto"/>
-        <w:ind w:left="283"/>
-      </w:pPr>
-      <w:r>
-        <w:rPr>
-          <w:rFonts w:ascii="Courier New" w:cs="Courier New" w:eastAsia="Courier New" w:hAnsi="Courier New"/>
-          <w:sz w:val="18"/>
-          <w:szCs w:val="18"/>
-          <w:shd w:fill="F2F2F2" w:color="auto" w:val="clear"/>
-        </w:rPr>
-        <w:t xml:space="preserve">    this.data[this.tail] = value;</w:t>
-      </w:r>
-    </w:p>
-    <w:p>
-      <w:pPr>
-        <w:keepNext w:val="false"/>
-        <w:keepLines w:val="false"/>
-        <w:pBdr>
-          <w:left w:val="single" w:color="4472C4" w:sz="12" w:space="4"/>
-        </w:pBdr>
-        <w:shd w:fill="F2F2F2" w:color="auto" w:val="clear"/>
-        <w:spacing w:after="0" w:line="240" w:lineRule="auto"/>
-        <w:ind w:left="283"/>
-      </w:pPr>
-      <w:r>
-        <w:rPr>
-          <w:rFonts w:ascii="Courier New" w:cs="Courier New" w:eastAsia="Courier New" w:hAnsi="Courier New"/>
-          <w:sz w:val="18"/>
-          <w:szCs w:val="18"/>
-          <w:shd w:fill="F2F2F2" w:color="auto" w:val="clear"/>
-        </w:rPr>
-        <w:t xml:space="preserve">    this.tail = (this.tail + 1) % this.capacity;</w:t>
-      </w:r>
-    </w:p>
-    <w:p>
-      <w:pPr>
-        <w:keepNext w:val="false"/>
-        <w:keepLines w:val="false"/>
-        <w:pBdr>
-          <w:left w:val="single" w:color="4472C4" w:sz="12" w:space="4"/>
-        </w:pBdr>
-        <w:shd w:fill="F2F2F2" w:color="auto" w:val="clear"/>
-        <w:spacing w:after="0" w:line="240" w:lineRule="auto"/>
-        <w:ind w:left="283"/>
-      </w:pPr>
-      <w:r>
-        <w:rPr>
-          <w:rFonts w:ascii="Courier New" w:cs="Courier New" w:eastAsia="Courier New" w:hAnsi="Courier New"/>
-          <w:sz w:val="18"/>
-          <w:szCs w:val="18"/>
-          <w:shd w:fill="F2F2F2" w:color="auto" w:val="clear"/>
-        </w:rPr>
-        <w:t xml:space="preserve">    this.size++;</w:t>
-      </w:r>
-    </w:p>
-    <w:p>
-      <w:pPr>
-        <w:keepNext w:val="false"/>
-        <w:keepLines w:val="false"/>
-        <w:pBdr>
-          <w:left w:val="single" w:color="4472C4" w:sz="12" w:space="4"/>
-        </w:pBdr>
-        <w:shd w:fill="F2F2F2" w:color="auto" w:val="clear"/>
-        <w:spacing w:after="0" w:line="240" w:lineRule="auto"/>
-        <w:ind w:left="283"/>
-      </w:pPr>
-      <w:r>
-        <w:rPr>
-          <w:rFonts w:ascii="Courier New" w:cs="Courier New" w:eastAsia="Courier New" w:hAnsi="Courier New"/>
-          <w:sz w:val="18"/>
-          <w:szCs w:val="18"/>
-          <w:shd w:fill="F2F2F2" w:color="auto" w:val="clear"/>
-        </w:rPr>
-        <w:t xml:space="preserve">  }</w:t>
-      </w:r>
-    </w:p>
-    <w:p>
-      <w:pPr>
-        <w:keepNext w:val="false"/>
-        <w:keepLines w:val="false"/>
-        <w:pBdr>
-          <w:left w:val="single" w:color="4472C4" w:sz="12" w:space="4"/>
-        </w:pBdr>
-        <w:shd w:fill="F2F2F2" w:color="auto" w:val="clear"/>
-        <w:spacing w:after="0" w:line="240" w:lineRule="auto"/>
-        <w:ind w:left="283"/>
-      </w:pPr>
-      <w:r>
-        <w:rPr>
-          <w:rFonts w:ascii="Courier New" w:cs="Courier New" w:eastAsia="Courier New" w:hAnsi="Courier New"/>
-          <w:sz w:val="18"/>
-          <w:szCs w:val="18"/>
-          <w:shd w:fill="F2F2F2" w:color="auto" w:val="clear"/>
-        </w:rPr>
-        <w:t xml:space="preserve"> </w:t>
-      </w:r>
-    </w:p>
-    <w:p>
-      <w:pPr>
-        <w:keepNext w:val="false"/>
-        <w:keepLines w:val="false"/>
-        <w:pBdr>
-          <w:left w:val="single" w:color="4472C4" w:sz="12" w:space="4"/>
-        </w:pBdr>
-        <w:shd w:fill="F2F2F2" w:color="auto" w:val="clear"/>
-        <w:spacing w:after="0" w:line="240" w:lineRule="auto"/>
-        <w:ind w:left="283"/>
-      </w:pPr>
-      <w:r>
-        <w:rPr>
-          <w:rFonts w:ascii="Courier New" w:cs="Courier New" w:eastAsia="Courier New" w:hAnsi="Courier New"/>
-          <w:sz w:val="18"/>
-          <w:szCs w:val="18"/>
-          <w:shd w:fill="F2F2F2" w:color="auto" w:val="clear"/>
-        </w:rPr>
-        <w:t xml:space="preserve">  dequeue(): number {</w:t>
-      </w:r>
-    </w:p>
-    <w:p>
-      <w:pPr>
-        <w:keepNext w:val="false"/>
-        <w:keepLines w:val="false"/>
-        <w:pBdr>
-          <w:left w:val="single" w:color="4472C4" w:sz="12" w:space="4"/>
-        </w:pBdr>
-        <w:shd w:fill="F2F2F2" w:color="auto" w:val="clear"/>
-        <w:spacing w:after="0" w:line="240" w:lineRule="auto"/>
-        <w:ind w:left="283"/>
-      </w:pPr>
-      <w:r>
-        <w:rPr>
-          <w:rFonts w:ascii="Courier New" w:cs="Courier New" w:eastAsia="Courier New" w:hAnsi="Courier New"/>
-          <w:sz w:val="18"/>
-          <w:szCs w:val="18"/>
-          <w:shd w:fill="F2F2F2" w:color="auto" w:val="clear"/>
-        </w:rPr>
-        <w:t xml:space="preserve">    if (this.size === 0) throw new Error("Queue is empty");</w:t>
-      </w:r>
-    </w:p>
-    <w:p>
-      <w:pPr>
-        <w:keepNext w:val="false"/>
-        <w:keepLines w:val="false"/>
-        <w:pBdr>
-          <w:left w:val="single" w:color="4472C4" w:sz="12" w:space="4"/>
-        </w:pBdr>
-        <w:shd w:fill="F2F2F2" w:color="auto" w:val="clear"/>
-        <w:spacing w:after="0" w:line="240" w:lineRule="auto"/>
-        <w:ind w:left="283"/>
-      </w:pPr>
-      <w:r>
-        <w:rPr>
-          <w:rFonts w:ascii="Courier New" w:cs="Courier New" w:eastAsia="Courier New" w:hAnsi="Courier New"/>
-          <w:sz w:val="18"/>
-          <w:szCs w:val="18"/>
-          <w:shd w:fill="F2F2F2" w:color="auto" w:val="clear"/>
-        </w:rPr>
-        <w:t xml:space="preserve">    const value = this.data[this.head];</w:t>
-      </w:r>
-    </w:p>
-    <w:p>
-      <w:pPr>
-        <w:keepNext w:val="false"/>
-        <w:keepLines w:val="false"/>
-        <w:pBdr>
-          <w:left w:val="single" w:color="4472C4" w:sz="12" w:space="4"/>
-        </w:pBdr>
-        <w:shd w:fill="F2F2F2" w:color="auto" w:val="clear"/>
-        <w:spacing w:after="0" w:line="240" w:lineRule="auto"/>
-        <w:ind w:left="283"/>
-      </w:pPr>
-      <w:r>
-        <w:rPr>
-          <w:rFonts w:ascii="Courier New" w:cs="Courier New" w:eastAsia="Courier New" w:hAnsi="Courier New"/>
-          <w:sz w:val="18"/>
-          <w:szCs w:val="18"/>
-          <w:shd w:fill="F2F2F2" w:color="auto" w:val="clear"/>
-        </w:rPr>
-        <w:t xml:space="preserve">    this.head = (this.head + 1) % this.capacity;</w:t>
-      </w:r>
-    </w:p>
-    <w:p>
-      <w:pPr>
-        <w:keepNext w:val="false"/>
-        <w:keepLines w:val="false"/>
-        <w:pBdr>
-          <w:left w:val="single" w:color="4472C4" w:sz="12" w:space="4"/>
-        </w:pBdr>
-        <w:shd w:fill="F2F2F2" w:color="auto" w:val="clear"/>
-        <w:spacing w:after="0" w:line="240" w:lineRule="auto"/>
-        <w:ind w:left="283"/>
-      </w:pPr>
-      <w:r>
-        <w:rPr>
-          <w:rFonts w:ascii="Courier New" w:cs="Courier New" w:eastAsia="Courier New" w:hAnsi="Courier New"/>
-          <w:sz w:val="18"/>
-          <w:szCs w:val="18"/>
-          <w:shd w:fill="F2F2F2" w:color="auto" w:val="clear"/>
-        </w:rPr>
-        <w:t xml:space="preserve">    this.size--;</w:t>
-      </w:r>
-    </w:p>
-    <w:p>
-      <w:pPr>
-        <w:keepNext w:val="false"/>
-        <w:keepLines w:val="false"/>
-        <w:pBdr>
-          <w:left w:val="single" w:color="4472C4" w:sz="12" w:space="4"/>
-        </w:pBdr>
-        <w:shd w:fill="F2F2F2" w:color="auto" w:val="clear"/>
-        <w:spacing w:after="0" w:line="240" w:lineRule="auto"/>
-        <w:ind w:left="283"/>
-      </w:pPr>
-      <w:r>
-        <w:rPr>
-          <w:rFonts w:ascii="Courier New" w:cs="Courier New" w:eastAsia="Courier New" w:hAnsi="Courier New"/>
-          <w:sz w:val="18"/>
-          <w:szCs w:val="18"/>
-          <w:shd w:fill="F2F2F2" w:color="auto" w:val="clear"/>
-        </w:rPr>
-        <w:t xml:space="preserve">    return value;</w:t>
-      </w:r>
-    </w:p>
-    <w:p>
-      <w:pPr>
-        <w:keepNext w:val="false"/>
-        <w:keepLines w:val="false"/>
-        <w:pBdr>
-          <w:left w:val="single" w:color="4472C4" w:sz="12" w:space="4"/>
-        </w:pBdr>
-        <w:shd w:fill="F2F2F2" w:color="auto" w:val="clear"/>
-        <w:spacing w:after="0" w:line="240" w:lineRule="auto"/>
-        <w:ind w:left="283"/>
-      </w:pPr>
-      <w:r>
-        <w:rPr>
-          <w:rFonts w:ascii="Courier New" w:cs="Courier New" w:eastAsia="Courier New" w:hAnsi="Courier New"/>
-          <w:sz w:val="18"/>
-          <w:szCs w:val="18"/>
-          <w:shd w:fill="F2F2F2" w:color="auto" w:val="clear"/>
-        </w:rPr>
-        <w:t xml:space="preserve">  }</w:t>
-      </w:r>
-    </w:p>
-    <w:p>
-      <w:pPr>
-        <w:keepNext w:val="false"/>
-        <w:keepLines w:val="false"/>
-        <w:pBdr>
-          <w:left w:val="single" w:color="4472C4" w:sz="12" w:space="4"/>
-        </w:pBdr>
-        <w:shd w:fill="F2F2F2" w:color="auto" w:val="clear"/>
-        <w:spacing w:after="0" w:line="240" w:lineRule="auto"/>
-        <w:ind w:left="283"/>
-      </w:pPr>
-      <w:r>
-        <w:rPr>
-          <w:rFonts w:ascii="Courier New" w:cs="Courier New" w:eastAsia="Courier New" w:hAnsi="Courier New"/>
-          <w:sz w:val="18"/>
-          <w:szCs w:val="18"/>
-          <w:shd w:fill="F2F2F2" w:color="auto" w:val="clear"/>
-        </w:rPr>
-        <w:t xml:space="preserve"> </w:t>
-      </w:r>
-    </w:p>
-    <w:p>
-      <w:pPr>
-        <w:keepNext w:val="false"/>
-        <w:keepLines w:val="false"/>
-        <w:pBdr>
-          <w:left w:val="single" w:color="4472C4" w:sz="12" w:space="4"/>
-        </w:pBdr>
-        <w:shd w:fill="F2F2F2" w:color="auto" w:val="clear"/>
-        <w:spacing w:after="0" w:line="240" w:lineRule="auto"/>
-        <w:ind w:left="283"/>
-      </w:pPr>
-      <w:r>
-        <w:rPr>
-          <w:rFonts w:ascii="Courier New" w:cs="Courier New" w:eastAsia="Courier New" w:hAnsi="Courier New"/>
-          <w:sz w:val="18"/>
-          <w:szCs w:val="18"/>
-          <w:shd w:fill="F2F2F2" w:color="auto" w:val="clear"/>
-        </w:rPr>
-        <w:t xml:space="preserve">  isEmpty(): boolean {</w:t>
-      </w:r>
-    </w:p>
-    <w:p>
-      <w:pPr>
-        <w:keepNext w:val="false"/>
-        <w:keepLines w:val="false"/>
-        <w:pBdr>
-          <w:left w:val="single" w:color="4472C4" w:sz="12" w:space="4"/>
-        </w:pBdr>
-        <w:shd w:fill="F2F2F2" w:color="auto" w:val="clear"/>
-        <w:spacing w:after="0" w:line="240" w:lineRule="auto"/>
-        <w:ind w:left="283"/>
-      </w:pPr>
-      <w:r>
-        <w:rPr>
-          <w:rFonts w:ascii="Courier New" w:cs="Courier New" w:eastAsia="Courier New" w:hAnsi="Courier New"/>
-          <w:sz w:val="18"/>
-          <w:szCs w:val="18"/>
-          <w:shd w:fill="F2F2F2" w:color="auto" w:val="clear"/>
-        </w:rPr>
-        <w:t xml:space="preserve">    return this.size === 0;</w:t>
-      </w:r>
-    </w:p>
-    <w:p>
-      <w:pPr>
-        <w:keepNext w:val="false"/>
-        <w:keepLines w:val="false"/>
-        <w:pBdr>
-          <w:left w:val="single" w:color="4472C4" w:sz="12" w:space="4"/>
-        </w:pBdr>
-        <w:shd w:fill="F2F2F2" w:color="auto" w:val="clear"/>
-        <w:spacing w:after="0" w:line="240" w:lineRule="auto"/>
-        <w:ind w:left="283"/>
-      </w:pPr>
-      <w:r>
-        <w:rPr>
-          <w:rFonts w:ascii="Courier New" w:cs="Courier New" w:eastAsia="Courier New" w:hAnsi="Courier New"/>
-          <w:sz w:val="18"/>
-          <w:szCs w:val="18"/>
-          <w:shd w:fill="F2F2F2" w:color="auto" w:val="clear"/>
-        </w:rPr>
-        <w:t xml:space="preserve">  }</w:t>
-      </w:r>
-    </w:p>
-    <w:p>
-      <w:pPr>
-        <w:keepNext w:val="false"/>
-        <w:keepLines w:val="false"/>
-        <w:pBdr>
-          <w:left w:val="single" w:color="4472C4" w:sz="12" w:space="4"/>
-        </w:pBdr>
-        <w:shd w:fill="F2F2F2" w:color="auto" w:val="clear"/>
-        <w:spacing w:after="0" w:line="240" w:lineRule="auto"/>
-        <w:ind w:left="283"/>
-      </w:pPr>
-      <w:r>
-        <w:rPr>
-          <w:rFonts w:ascii="Courier New" w:cs="Courier New" w:eastAsia="Courier New" w:hAnsi="Courier New"/>
-          <w:sz w:val="18"/>
-          <w:szCs w:val="18"/>
-          <w:shd w:fill="F2F2F2" w:color="auto" w:val="clear"/>
-        </w:rPr>
-        <w:t xml:space="preserve"> </w:t>
-      </w:r>
-    </w:p>
-    <w:p>
-      <w:pPr>
-        <w:keepNext w:val="false"/>
-        <w:keepLines w:val="false"/>
-        <w:pBdr>
-          <w:left w:val="single" w:color="4472C4" w:sz="12" w:space="4"/>
-        </w:pBdr>
-        <w:shd w:fill="F2F2F2" w:color="auto" w:val="clear"/>
-        <w:spacing w:after="0" w:line="240" w:lineRule="auto"/>
-        <w:ind w:left="283"/>
-      </w:pPr>
-      <w:r>
-        <w:rPr>
-          <w:rFonts w:ascii="Courier New" w:cs="Courier New" w:eastAsia="Courier New" w:hAnsi="Courier New"/>
-          <w:sz w:val="18"/>
-          <w:szCs w:val="18"/>
-          <w:shd w:fill="F2F2F2" w:color="auto" w:val="clear"/>
-        </w:rPr>
-        <w:t xml:space="preserve">  print(): void {</w:t>
-      </w:r>
-    </w:p>
-    <w:p>
-      <w:pPr>
-        <w:keepNext w:val="false"/>
-        <w:keepLines w:val="false"/>
-        <w:pBdr>
-          <w:left w:val="single" w:color="4472C4" w:sz="12" w:space="4"/>
-        </w:pBdr>
-        <w:shd w:fill="F2F2F2" w:color="auto" w:val="clear"/>
-        <w:spacing w:after="0" w:line="240" w:lineRule="auto"/>
-        <w:ind w:left="283"/>
-      </w:pPr>
-      <w:r>
-        <w:rPr>
-          <w:rFonts w:ascii="Courier New" w:cs="Courier New" w:eastAsia="Courier New" w:hAnsi="Courier New"/>
-          <w:sz w:val="18"/>
-          <w:szCs w:val="18"/>
-          <w:shd w:fill="F2F2F2" w:color="auto" w:val="clear"/>
-        </w:rPr>
-        <w:t xml:space="preserve">    const items: number[] = [];</w:t>
-      </w:r>
-    </w:p>
-    <w:p>
-      <w:pPr>
-        <w:keepNext w:val="false"/>
-        <w:keepLines w:val="false"/>
-        <w:pBdr>
-          <w:left w:val="single" w:color="4472C4" w:sz="12" w:space="4"/>
-        </w:pBdr>
-        <w:shd w:fill="F2F2F2" w:color="auto" w:val="clear"/>
-        <w:spacing w:after="0" w:line="240" w:lineRule="auto"/>
-        <w:ind w:left="283"/>
-      </w:pPr>
-      <w:r>
-        <w:rPr>
-          <w:rFonts w:ascii="Courier New" w:cs="Courier New" w:eastAsia="Courier New" w:hAnsi="Courier New"/>
-          <w:sz w:val="18"/>
-          <w:szCs w:val="18"/>
-          <w:shd w:fill="F2F2F2" w:color="auto" w:val="clear"/>
-        </w:rPr>
-        <w:t xml:space="preserve">    for (let i = 0; i &lt; this.size; i++) {</w:t>
-      </w:r>
-    </w:p>
-    <w:p>
-      <w:pPr>
-        <w:keepNext w:val="false"/>
-        <w:keepLines w:val="false"/>
-        <w:pBdr>
-          <w:left w:val="single" w:color="4472C4" w:sz="12" w:space="4"/>
-        </w:pBdr>
-        <w:shd w:fill="F2F2F2" w:color="auto" w:val="clear"/>
-        <w:spacing w:after="0" w:line="240" w:lineRule="auto"/>
-        <w:ind w:left="283"/>
-      </w:pPr>
-      <w:r>
-        <w:rPr>
-          <w:rFonts w:ascii="Courier New" w:cs="Courier New" w:eastAsia="Courier New" w:hAnsi="Courier New"/>
-          <w:sz w:val="18"/>
-          <w:szCs w:val="18"/>
-          <w:shd w:fill="F2F2F2" w:color="auto" w:val="clear"/>
-        </w:rPr>
-        <w:t xml:space="preserve">      items.push(this.data[(this.head + i) % this.capacity]);</w:t>
-      </w:r>
-    </w:p>
-    <w:p>
-      <w:pPr>
-        <w:keepNext w:val="false"/>
-        <w:keepLines w:val="false"/>
-        <w:pBdr>
-          <w:left w:val="single" w:color="4472C4" w:sz="12" w:space="4"/>
-        </w:pBdr>
-        <w:shd w:fill="F2F2F2" w:color="auto" w:val="clear"/>
-        <w:spacing w:after="0" w:line="240" w:lineRule="auto"/>
-        <w:ind w:left="283"/>
-      </w:pPr>
-      <w:r>
-        <w:rPr>
-          <w:rFonts w:ascii="Courier New" w:cs="Courier New" w:eastAsia="Courier New" w:hAnsi="Courier New"/>
-          <w:sz w:val="18"/>
-          <w:szCs w:val="18"/>
-          <w:shd w:fill="F2F2F2" w:color="auto" w:val="clear"/>
-        </w:rPr>
-        <w:t xml:space="preserve">    }</w:t>
-      </w:r>
-    </w:p>
-    <w:p>
-      <w:pPr>
-        <w:keepNext w:val="false"/>
-        <w:keepLines w:val="false"/>
-        <w:pBdr>
-          <w:left w:val="single" w:color="4472C4" w:sz="12" w:space="4"/>
-        </w:pBdr>
-        <w:shd w:fill="F2F2F2" w:color="auto" w:val="clear"/>
-        <w:spacing w:after="0" w:line="240" w:lineRule="auto"/>
-        <w:ind w:left="283"/>
-      </w:pPr>
-      <w:r>
-        <w:rPr>
-          <w:rFonts w:ascii="Courier New" w:cs="Courier New" w:eastAsia="Courier New" w:hAnsi="Courier New"/>
-          <w:sz w:val="18"/>
-          <w:szCs w:val="18"/>
-          <w:shd w:fill="F2F2F2" w:color="auto" w:val="clear"/>
-        </w:rPr>
-        <w:t xml:space="preserve">    console.log(`Queue [head → tail]: ${items.join(", ")}`);</w:t>
-      </w:r>
-    </w:p>
-    <w:p>
-      <w:pPr>
-        <w:keepNext w:val="false"/>
-        <w:keepLines w:val="false"/>
-        <w:pBdr>
-          <w:left w:val="single" w:color="4472C4" w:sz="12" w:space="4"/>
-        </w:pBdr>
-        <w:shd w:fill="F2F2F2" w:color="auto" w:val="clear"/>
-        <w:spacing w:after="0" w:line="240" w:lineRule="auto"/>
-        <w:ind w:left="283"/>
-      </w:pPr>
-      <w:r>
-        <w:rPr>
-          <w:rFonts w:ascii="Courier New" w:cs="Courier New" w:eastAsia="Courier New" w:hAnsi="Courier New"/>
-          <w:sz w:val="18"/>
-          <w:szCs w:val="18"/>
-          <w:shd w:fill="F2F2F2" w:color="auto" w:val="clear"/>
-        </w:rPr>
-        <w:t xml:space="preserve">  }</w:t>
-      </w:r>
-    </w:p>
-    <w:p>
-      <w:pPr>
-        <w:keepNext w:val="false"/>
-        <w:keepLines w:val="false"/>
-        <w:pBdr>
-          <w:left w:val="single" w:color="4472C4" w:sz="12" w:space="4"/>
-        </w:pBdr>
-        <w:shd w:fill="F2F2F2" w:color="auto" w:val="clear"/>
-        <w:spacing w:after="0" w:line="240" w:lineRule="auto"/>
-        <w:ind w:left="283"/>
-      </w:pPr>
-      <w:r>
-        <w:rPr>
-          <w:rFonts w:ascii="Courier New" w:cs="Courier New" w:eastAsia="Courier New" w:hAnsi="Courier New"/>
-          <w:sz w:val="18"/>
-          <w:szCs w:val="18"/>
-          <w:shd w:fill="F2F2F2" w:color="auto" w:val="clear"/>
-        </w:rPr>
-        <w:t xml:space="preserve">}</w:t>
       </w:r>
     </w:p>
     <w:p>
@@ -2329,7 +1174,7 @@
           <w:sz w:val="28"/>
           <w:szCs w:val="28"/>
         </w:rPr>
-        <w:t xml:space="preserve">Однозв'язковий список — це динамічна структура даних, де кожен вузол зберігає значення та посилання на наступний вузол. Операція append проходить список до останнього вузла та додає новий елемент. Операція print обходить список від head до null, збираючи значення для виведення.</w:t>
+        <w:t xml:space="preserve">Однозв'язковий список — це динамічна структура даних, де кожен вузол зберігає значення та посилання на наступний вузол. Операція append проходить список до останнього вузна та додає новий елемент. Операція print обходить список від head до null, збираючи значення для виведення.</w:t>
       </w:r>
     </w:p>
     <w:p>
@@ -2344,139 +1189,202 @@
           <w:sz w:val="28"/>
           <w:szCs w:val="28"/>
         </w:rPr>
-        <w:t xml:space="preserve">Лістинг 3.3 — Реалізація зв'язкового списку</w:t>
-      </w:r>
-    </w:p>
-    <w:p>
-      <w:pPr>
-        <w:keepNext w:val="false"/>
-        <w:keepLines w:val="false"/>
-        <w:pBdr>
-          <w:left w:val="single" w:color="4472C4" w:sz="12" w:space="4"/>
-        </w:pBdr>
-        <w:shd w:fill="F2F2F2" w:color="auto" w:val="clear"/>
-        <w:spacing w:after="0" w:line="240" w:lineRule="auto"/>
-        <w:ind w:left="283"/>
-      </w:pPr>
-      <w:r>
-        <w:rPr>
-          <w:rFonts w:ascii="Courier New" w:cs="Courier New" w:eastAsia="Courier New" w:hAnsi="Courier New"/>
-          <w:sz w:val="18"/>
-          <w:szCs w:val="18"/>
-          <w:shd w:fill="F2F2F2" w:color="auto" w:val="clear"/>
-        </w:rPr>
-        <w:t xml:space="preserve">class ListNode {</w:t>
-      </w:r>
-    </w:p>
-    <w:p>
-      <w:pPr>
-        <w:keepNext w:val="false"/>
-        <w:keepLines w:val="false"/>
-        <w:pBdr>
-          <w:left w:val="single" w:color="4472C4" w:sz="12" w:space="4"/>
-        </w:pBdr>
-        <w:shd w:fill="F2F2F2" w:color="auto" w:val="clear"/>
-        <w:spacing w:after="0" w:line="240" w:lineRule="auto"/>
-        <w:ind w:left="283"/>
-      </w:pPr>
-      <w:r>
-        <w:rPr>
-          <w:rFonts w:ascii="Courier New" w:cs="Courier New" w:eastAsia="Courier New" w:hAnsi="Courier New"/>
-          <w:sz w:val="18"/>
-          <w:szCs w:val="18"/>
-          <w:shd w:fill="F2F2F2" w:color="auto" w:val="clear"/>
-        </w:rPr>
-        <w:t xml:space="preserve">  value: number;</w:t>
-      </w:r>
-    </w:p>
-    <w:p>
-      <w:pPr>
-        <w:keepNext w:val="false"/>
-        <w:keepLines w:val="false"/>
-        <w:pBdr>
-          <w:left w:val="single" w:color="4472C4" w:sz="12" w:space="4"/>
-        </w:pBdr>
-        <w:shd w:fill="F2F2F2" w:color="auto" w:val="clear"/>
-        <w:spacing w:after="0" w:line="240" w:lineRule="auto"/>
-        <w:ind w:left="283"/>
-      </w:pPr>
-      <w:r>
-        <w:rPr>
-          <w:rFonts w:ascii="Courier New" w:cs="Courier New" w:eastAsia="Courier New" w:hAnsi="Courier New"/>
-          <w:sz w:val="18"/>
-          <w:szCs w:val="18"/>
-          <w:shd w:fill="F2F2F2" w:color="auto" w:val="clear"/>
-        </w:rPr>
-        <w:t xml:space="preserve">  next: ListNode | null;</w:t>
-      </w:r>
-    </w:p>
-    <w:p>
-      <w:pPr>
-        <w:keepNext w:val="false"/>
-        <w:keepLines w:val="false"/>
-        <w:pBdr>
-          <w:left w:val="single" w:color="4472C4" w:sz="12" w:space="4"/>
-        </w:pBdr>
-        <w:shd w:fill="F2F2F2" w:color="auto" w:val="clear"/>
-        <w:spacing w:after="0" w:line="240" w:lineRule="auto"/>
-        <w:ind w:left="283"/>
-      </w:pPr>
-      <w:r>
-        <w:rPr>
-          <w:rFonts w:ascii="Courier New" w:cs="Courier New" w:eastAsia="Courier New" w:hAnsi="Courier New"/>
-          <w:sz w:val="18"/>
-          <w:szCs w:val="18"/>
-          <w:shd w:fill="F2F2F2" w:color="auto" w:val="clear"/>
-        </w:rPr>
-        <w:t xml:space="preserve">  constructor(value: number) {</w:t>
-      </w:r>
-    </w:p>
-    <w:p>
-      <w:pPr>
-        <w:keepNext w:val="false"/>
-        <w:keepLines w:val="false"/>
-        <w:pBdr>
-          <w:left w:val="single" w:color="4472C4" w:sz="12" w:space="4"/>
-        </w:pBdr>
-        <w:shd w:fill="F2F2F2" w:color="auto" w:val="clear"/>
-        <w:spacing w:after="0" w:line="240" w:lineRule="auto"/>
-        <w:ind w:left="283"/>
-      </w:pPr>
-      <w:r>
-        <w:rPr>
-          <w:rFonts w:ascii="Courier New" w:cs="Courier New" w:eastAsia="Courier New" w:hAnsi="Courier New"/>
-          <w:sz w:val="18"/>
-          <w:szCs w:val="18"/>
-          <w:shd w:fill="F2F2F2" w:color="auto" w:val="clear"/>
-        </w:rPr>
-        <w:t xml:space="preserve">    this.value = value;</w:t>
-      </w:r>
-    </w:p>
-    <w:p>
-      <w:pPr>
-        <w:keepNext w:val="false"/>
-        <w:keepLines w:val="false"/>
-        <w:pBdr>
-          <w:left w:val="single" w:color="4472C4" w:sz="12" w:space="4"/>
-        </w:pBdr>
-        <w:shd w:fill="F2F2F2" w:color="auto" w:val="clear"/>
-        <w:spacing w:after="0" w:line="240" w:lineRule="auto"/>
-        <w:ind w:left="283"/>
-      </w:pPr>
-      <w:r>
-        <w:rPr>
-          <w:rFonts w:ascii="Courier New" w:cs="Courier New" w:eastAsia="Courier New" w:hAnsi="Courier New"/>
-          <w:sz w:val="18"/>
-          <w:szCs w:val="18"/>
-          <w:shd w:fill="F2F2F2" w:color="auto" w:val="clear"/>
-        </w:rPr>
-        <w:t xml:space="preserve">    this.next = null;</w:t>
-      </w:r>
-    </w:p>
-    <w:p>
-      <w:pPr>
-        <w:keepNext w:val="false"/>
-        <w:keepLines w:val="false"/>
+        <w:t xml:space="preserve">Лістинг 3.3 — Ключова операція append</w:t>
+      </w:r>
+    </w:p>
+    <w:p>
+      <w:pPr>
+        <w:keepNext/>
+        <w:keepLines/>
+        <w:pBdr>
+          <w:left w:val="single" w:color="4472C4" w:sz="12" w:space="4"/>
+        </w:pBdr>
+        <w:shd w:fill="F2F2F2" w:color="auto" w:val="clear"/>
+        <w:spacing w:after="0" w:line="240" w:lineRule="auto"/>
+        <w:ind w:left="283"/>
+      </w:pPr>
+      <w:r>
+        <w:rPr>
+          <w:rFonts w:ascii="Courier New" w:cs="Courier New" w:eastAsia="Courier New" w:hAnsi="Courier New"/>
+          <w:sz w:val="18"/>
+          <w:szCs w:val="18"/>
+          <w:shd w:fill="F2F2F2" w:color="auto" w:val="clear"/>
+        </w:rPr>
+        <w:t xml:space="preserve">  append(value: number): void {</w:t>
+      </w:r>
+    </w:p>
+    <w:p>
+      <w:pPr>
+        <w:keepNext/>
+        <w:keepLines/>
+        <w:pBdr>
+          <w:left w:val="single" w:color="4472C4" w:sz="12" w:space="4"/>
+        </w:pBdr>
+        <w:shd w:fill="F2F2F2" w:color="auto" w:val="clear"/>
+        <w:spacing w:after="0" w:line="240" w:lineRule="auto"/>
+        <w:ind w:left="283"/>
+      </w:pPr>
+      <w:r>
+        <w:rPr>
+          <w:rFonts w:ascii="Courier New" w:cs="Courier New" w:eastAsia="Courier New" w:hAnsi="Courier New"/>
+          <w:sz w:val="18"/>
+          <w:szCs w:val="18"/>
+          <w:shd w:fill="F2F2F2" w:color="auto" w:val="clear"/>
+        </w:rPr>
+        <w:t xml:space="preserve">    const node = new ListNode(value);</w:t>
+      </w:r>
+    </w:p>
+    <w:p>
+      <w:pPr>
+        <w:keepNext/>
+        <w:keepLines/>
+        <w:pBdr>
+          <w:left w:val="single" w:color="4472C4" w:sz="12" w:space="4"/>
+        </w:pBdr>
+        <w:shd w:fill="F2F2F2" w:color="auto" w:val="clear"/>
+        <w:spacing w:after="0" w:line="240" w:lineRule="auto"/>
+        <w:ind w:left="283"/>
+      </w:pPr>
+      <w:r>
+        <w:rPr>
+          <w:rFonts w:ascii="Courier New" w:cs="Courier New" w:eastAsia="Courier New" w:hAnsi="Courier New"/>
+          <w:sz w:val="18"/>
+          <w:szCs w:val="18"/>
+          <w:shd w:fill="F2F2F2" w:color="auto" w:val="clear"/>
+        </w:rPr>
+        <w:t xml:space="preserve">    if (!this.head) {</w:t>
+      </w:r>
+    </w:p>
+    <w:p>
+      <w:pPr>
+        <w:keepNext/>
+        <w:keepLines/>
+        <w:pBdr>
+          <w:left w:val="single" w:color="4472C4" w:sz="12" w:space="4"/>
+        </w:pBdr>
+        <w:shd w:fill="F2F2F2" w:color="auto" w:val="clear"/>
+        <w:spacing w:after="0" w:line="240" w:lineRule="auto"/>
+        <w:ind w:left="283"/>
+      </w:pPr>
+      <w:r>
+        <w:rPr>
+          <w:rFonts w:ascii="Courier New" w:cs="Courier New" w:eastAsia="Courier New" w:hAnsi="Courier New"/>
+          <w:sz w:val="18"/>
+          <w:szCs w:val="18"/>
+          <w:shd w:fill="F2F2F2" w:color="auto" w:val="clear"/>
+        </w:rPr>
+        <w:t xml:space="preserve">      this.head = node;</w:t>
+      </w:r>
+    </w:p>
+    <w:p>
+      <w:pPr>
+        <w:keepNext/>
+        <w:keepLines/>
+        <w:pBdr>
+          <w:left w:val="single" w:color="4472C4" w:sz="12" w:space="4"/>
+        </w:pBdr>
+        <w:shd w:fill="F2F2F2" w:color="auto" w:val="clear"/>
+        <w:spacing w:after="0" w:line="240" w:lineRule="auto"/>
+        <w:ind w:left="283"/>
+      </w:pPr>
+      <w:r>
+        <w:rPr>
+          <w:rFonts w:ascii="Courier New" w:cs="Courier New" w:eastAsia="Courier New" w:hAnsi="Courier New"/>
+          <w:sz w:val="18"/>
+          <w:szCs w:val="18"/>
+          <w:shd w:fill="F2F2F2" w:color="auto" w:val="clear"/>
+        </w:rPr>
+        <w:t xml:space="preserve">      return;</w:t>
+      </w:r>
+    </w:p>
+    <w:p>
+      <w:pPr>
+        <w:keepNext/>
+        <w:keepLines/>
+        <w:pBdr>
+          <w:left w:val="single" w:color="4472C4" w:sz="12" w:space="4"/>
+        </w:pBdr>
+        <w:shd w:fill="F2F2F2" w:color="auto" w:val="clear"/>
+        <w:spacing w:after="0" w:line="240" w:lineRule="auto"/>
+        <w:ind w:left="283"/>
+      </w:pPr>
+      <w:r>
+        <w:rPr>
+          <w:rFonts w:ascii="Courier New" w:cs="Courier New" w:eastAsia="Courier New" w:hAnsi="Courier New"/>
+          <w:sz w:val="18"/>
+          <w:szCs w:val="18"/>
+          <w:shd w:fill="F2F2F2" w:color="auto" w:val="clear"/>
+        </w:rPr>
+        <w:t xml:space="preserve">    }</w:t>
+      </w:r>
+    </w:p>
+    <w:p>
+      <w:pPr>
+        <w:keepNext/>
+        <w:keepLines/>
+        <w:pBdr>
+          <w:left w:val="single" w:color="4472C4" w:sz="12" w:space="4"/>
+        </w:pBdr>
+        <w:shd w:fill="F2F2F2" w:color="auto" w:val="clear"/>
+        <w:spacing w:after="0" w:line="240" w:lineRule="auto"/>
+        <w:ind w:left="283"/>
+      </w:pPr>
+      <w:r>
+        <w:rPr>
+          <w:rFonts w:ascii="Courier New" w:cs="Courier New" w:eastAsia="Courier New" w:hAnsi="Courier New"/>
+          <w:sz w:val="18"/>
+          <w:szCs w:val="18"/>
+          <w:shd w:fill="F2F2F2" w:color="auto" w:val="clear"/>
+        </w:rPr>
+        <w:t xml:space="preserve">    let current = this.head;</w:t>
+      </w:r>
+    </w:p>
+    <w:p>
+      <w:pPr>
+        <w:keepNext/>
+        <w:keepLines/>
+        <w:pBdr>
+          <w:left w:val="single" w:color="4472C4" w:sz="12" w:space="4"/>
+        </w:pBdr>
+        <w:shd w:fill="F2F2F2" w:color="auto" w:val="clear"/>
+        <w:spacing w:after="0" w:line="240" w:lineRule="auto"/>
+        <w:ind w:left="283"/>
+      </w:pPr>
+      <w:r>
+        <w:rPr>
+          <w:rFonts w:ascii="Courier New" w:cs="Courier New" w:eastAsia="Courier New" w:hAnsi="Courier New"/>
+          <w:sz w:val="18"/>
+          <w:szCs w:val="18"/>
+          <w:shd w:fill="F2F2F2" w:color="auto" w:val="clear"/>
+        </w:rPr>
+        <w:t xml:space="preserve">    while (current.next) current = current.next;</w:t>
+      </w:r>
+    </w:p>
+    <w:p>
+      <w:pPr>
+        <w:keepNext/>
+        <w:keepLines/>
+        <w:pBdr>
+          <w:left w:val="single" w:color="4472C4" w:sz="12" w:space="4"/>
+        </w:pBdr>
+        <w:shd w:fill="F2F2F2" w:color="auto" w:val="clear"/>
+        <w:spacing w:after="0" w:line="240" w:lineRule="auto"/>
+        <w:ind w:left="283"/>
+      </w:pPr>
+      <w:r>
+        <w:rPr>
+          <w:rFonts w:ascii="Courier New" w:cs="Courier New" w:eastAsia="Courier New" w:hAnsi="Courier New"/>
+          <w:sz w:val="18"/>
+          <w:szCs w:val="18"/>
+          <w:shd w:fill="F2F2F2" w:color="auto" w:val="clear"/>
+        </w:rPr>
+        <w:t xml:space="preserve">    current.next = node;</w:t>
+      </w:r>
+    </w:p>
+    <w:p>
+      <w:pPr>
+        <w:keepNext w:val="false"/>
+        <w:keepLines/>
         <w:pBdr>
           <w:left w:val="single" w:color="4472C4" w:sz="12" w:space="4"/>
         </w:pBdr>
@@ -2492,552 +1400,6 @@
           <w:shd w:fill="F2F2F2" w:color="auto" w:val="clear"/>
         </w:rPr>
         <w:t xml:space="preserve">  }</w:t>
-      </w:r>
-    </w:p>
-    <w:p>
-      <w:pPr>
-        <w:keepNext w:val="false"/>
-        <w:keepLines w:val="false"/>
-        <w:pBdr>
-          <w:left w:val="single" w:color="4472C4" w:sz="12" w:space="4"/>
-        </w:pBdr>
-        <w:shd w:fill="F2F2F2" w:color="auto" w:val="clear"/>
-        <w:spacing w:after="0" w:line="240" w:lineRule="auto"/>
-        <w:ind w:left="283"/>
-      </w:pPr>
-      <w:r>
-        <w:rPr>
-          <w:rFonts w:ascii="Courier New" w:cs="Courier New" w:eastAsia="Courier New" w:hAnsi="Courier New"/>
-          <w:sz w:val="18"/>
-          <w:szCs w:val="18"/>
-          <w:shd w:fill="F2F2F2" w:color="auto" w:val="clear"/>
-        </w:rPr>
-        <w:t xml:space="preserve">}</w:t>
-      </w:r>
-    </w:p>
-    <w:p>
-      <w:pPr>
-        <w:keepNext w:val="false"/>
-        <w:keepLines w:val="false"/>
-        <w:pBdr>
-          <w:left w:val="single" w:color="4472C4" w:sz="12" w:space="4"/>
-        </w:pBdr>
-        <w:shd w:fill="F2F2F2" w:color="auto" w:val="clear"/>
-        <w:spacing w:after="0" w:line="240" w:lineRule="auto"/>
-        <w:ind w:left="283"/>
-      </w:pPr>
-      <w:r>
-        <w:rPr>
-          <w:rFonts w:ascii="Courier New" w:cs="Courier New" w:eastAsia="Courier New" w:hAnsi="Courier New"/>
-          <w:sz w:val="18"/>
-          <w:szCs w:val="18"/>
-          <w:shd w:fill="F2F2F2" w:color="auto" w:val="clear"/>
-        </w:rPr>
-        <w:t xml:space="preserve"> </w:t>
-      </w:r>
-    </w:p>
-    <w:p>
-      <w:pPr>
-        <w:keepNext w:val="false"/>
-        <w:keepLines w:val="false"/>
-        <w:pBdr>
-          <w:left w:val="single" w:color="4472C4" w:sz="12" w:space="4"/>
-        </w:pBdr>
-        <w:shd w:fill="F2F2F2" w:color="auto" w:val="clear"/>
-        <w:spacing w:after="0" w:line="240" w:lineRule="auto"/>
-        <w:ind w:left="283"/>
-      </w:pPr>
-      <w:r>
-        <w:rPr>
-          <w:rFonts w:ascii="Courier New" w:cs="Courier New" w:eastAsia="Courier New" w:hAnsi="Courier New"/>
-          <w:sz w:val="18"/>
-          <w:szCs w:val="18"/>
-          <w:shd w:fill="F2F2F2" w:color="auto" w:val="clear"/>
-        </w:rPr>
-        <w:t xml:space="preserve">export class SinglyLinkedList {</w:t>
-      </w:r>
-    </w:p>
-    <w:p>
-      <w:pPr>
-        <w:keepNext w:val="false"/>
-        <w:keepLines w:val="false"/>
-        <w:pBdr>
-          <w:left w:val="single" w:color="4472C4" w:sz="12" w:space="4"/>
-        </w:pBdr>
-        <w:shd w:fill="F2F2F2" w:color="auto" w:val="clear"/>
-        <w:spacing w:after="0" w:line="240" w:lineRule="auto"/>
-        <w:ind w:left="283"/>
-      </w:pPr>
-      <w:r>
-        <w:rPr>
-          <w:rFonts w:ascii="Courier New" w:cs="Courier New" w:eastAsia="Courier New" w:hAnsi="Courier New"/>
-          <w:sz w:val="18"/>
-          <w:szCs w:val="18"/>
-          <w:shd w:fill="F2F2F2" w:color="auto" w:val="clear"/>
-        </w:rPr>
-        <w:t xml:space="preserve">  private head: ListNode | null = null;</w:t>
-      </w:r>
-    </w:p>
-    <w:p>
-      <w:pPr>
-        <w:keepNext w:val="false"/>
-        <w:keepLines w:val="false"/>
-        <w:pBdr>
-          <w:left w:val="single" w:color="4472C4" w:sz="12" w:space="4"/>
-        </w:pBdr>
-        <w:shd w:fill="F2F2F2" w:color="auto" w:val="clear"/>
-        <w:spacing w:after="0" w:line="240" w:lineRule="auto"/>
-        <w:ind w:left="283"/>
-      </w:pPr>
-      <w:r>
-        <w:rPr>
-          <w:rFonts w:ascii="Courier New" w:cs="Courier New" w:eastAsia="Courier New" w:hAnsi="Courier New"/>
-          <w:sz w:val="18"/>
-          <w:szCs w:val="18"/>
-          <w:shd w:fill="F2F2F2" w:color="auto" w:val="clear"/>
-        </w:rPr>
-        <w:t xml:space="preserve"> </w:t>
-      </w:r>
-    </w:p>
-    <w:p>
-      <w:pPr>
-        <w:keepNext w:val="false"/>
-        <w:keepLines w:val="false"/>
-        <w:pBdr>
-          <w:left w:val="single" w:color="4472C4" w:sz="12" w:space="4"/>
-        </w:pBdr>
-        <w:shd w:fill="F2F2F2" w:color="auto" w:val="clear"/>
-        <w:spacing w:after="0" w:line="240" w:lineRule="auto"/>
-        <w:ind w:left="283"/>
-      </w:pPr>
-      <w:r>
-        <w:rPr>
-          <w:rFonts w:ascii="Courier New" w:cs="Courier New" w:eastAsia="Courier New" w:hAnsi="Courier New"/>
-          <w:sz w:val="18"/>
-          <w:szCs w:val="18"/>
-          <w:shd w:fill="F2F2F2" w:color="auto" w:val="clear"/>
-        </w:rPr>
-        <w:t xml:space="preserve">  append(value: number): void {</w:t>
-      </w:r>
-    </w:p>
-    <w:p>
-      <w:pPr>
-        <w:keepNext w:val="false"/>
-        <w:keepLines w:val="false"/>
-        <w:pBdr>
-          <w:left w:val="single" w:color="4472C4" w:sz="12" w:space="4"/>
-        </w:pBdr>
-        <w:shd w:fill="F2F2F2" w:color="auto" w:val="clear"/>
-        <w:spacing w:after="0" w:line="240" w:lineRule="auto"/>
-        <w:ind w:left="283"/>
-      </w:pPr>
-      <w:r>
-        <w:rPr>
-          <w:rFonts w:ascii="Courier New" w:cs="Courier New" w:eastAsia="Courier New" w:hAnsi="Courier New"/>
-          <w:sz w:val="18"/>
-          <w:szCs w:val="18"/>
-          <w:shd w:fill="F2F2F2" w:color="auto" w:val="clear"/>
-        </w:rPr>
-        <w:t xml:space="preserve">    const node = new ListNode(value);</w:t>
-      </w:r>
-    </w:p>
-    <w:p>
-      <w:pPr>
-        <w:keepNext w:val="false"/>
-        <w:keepLines w:val="false"/>
-        <w:pBdr>
-          <w:left w:val="single" w:color="4472C4" w:sz="12" w:space="4"/>
-        </w:pBdr>
-        <w:shd w:fill="F2F2F2" w:color="auto" w:val="clear"/>
-        <w:spacing w:after="0" w:line="240" w:lineRule="auto"/>
-        <w:ind w:left="283"/>
-      </w:pPr>
-      <w:r>
-        <w:rPr>
-          <w:rFonts w:ascii="Courier New" w:cs="Courier New" w:eastAsia="Courier New" w:hAnsi="Courier New"/>
-          <w:sz w:val="18"/>
-          <w:szCs w:val="18"/>
-          <w:shd w:fill="F2F2F2" w:color="auto" w:val="clear"/>
-        </w:rPr>
-        <w:t xml:space="preserve">    if (!this.head) {</w:t>
-      </w:r>
-    </w:p>
-    <w:p>
-      <w:pPr>
-        <w:keepNext w:val="false"/>
-        <w:keepLines w:val="false"/>
-        <w:pBdr>
-          <w:left w:val="single" w:color="4472C4" w:sz="12" w:space="4"/>
-        </w:pBdr>
-        <w:shd w:fill="F2F2F2" w:color="auto" w:val="clear"/>
-        <w:spacing w:after="0" w:line="240" w:lineRule="auto"/>
-        <w:ind w:left="283"/>
-      </w:pPr>
-      <w:r>
-        <w:rPr>
-          <w:rFonts w:ascii="Courier New" w:cs="Courier New" w:eastAsia="Courier New" w:hAnsi="Courier New"/>
-          <w:sz w:val="18"/>
-          <w:szCs w:val="18"/>
-          <w:shd w:fill="F2F2F2" w:color="auto" w:val="clear"/>
-        </w:rPr>
-        <w:t xml:space="preserve">      this.head = node;</w:t>
-      </w:r>
-    </w:p>
-    <w:p>
-      <w:pPr>
-        <w:keepNext w:val="false"/>
-        <w:keepLines w:val="false"/>
-        <w:pBdr>
-          <w:left w:val="single" w:color="4472C4" w:sz="12" w:space="4"/>
-        </w:pBdr>
-        <w:shd w:fill="F2F2F2" w:color="auto" w:val="clear"/>
-        <w:spacing w:after="0" w:line="240" w:lineRule="auto"/>
-        <w:ind w:left="283"/>
-      </w:pPr>
-      <w:r>
-        <w:rPr>
-          <w:rFonts w:ascii="Courier New" w:cs="Courier New" w:eastAsia="Courier New" w:hAnsi="Courier New"/>
-          <w:sz w:val="18"/>
-          <w:szCs w:val="18"/>
-          <w:shd w:fill="F2F2F2" w:color="auto" w:val="clear"/>
-        </w:rPr>
-        <w:t xml:space="preserve">      return;</w:t>
-      </w:r>
-    </w:p>
-    <w:p>
-      <w:pPr>
-        <w:keepNext w:val="false"/>
-        <w:keepLines w:val="false"/>
-        <w:pBdr>
-          <w:left w:val="single" w:color="4472C4" w:sz="12" w:space="4"/>
-        </w:pBdr>
-        <w:shd w:fill="F2F2F2" w:color="auto" w:val="clear"/>
-        <w:spacing w:after="0" w:line="240" w:lineRule="auto"/>
-        <w:ind w:left="283"/>
-      </w:pPr>
-      <w:r>
-        <w:rPr>
-          <w:rFonts w:ascii="Courier New" w:cs="Courier New" w:eastAsia="Courier New" w:hAnsi="Courier New"/>
-          <w:sz w:val="18"/>
-          <w:szCs w:val="18"/>
-          <w:shd w:fill="F2F2F2" w:color="auto" w:val="clear"/>
-        </w:rPr>
-        <w:t xml:space="preserve">    }</w:t>
-      </w:r>
-    </w:p>
-    <w:p>
-      <w:pPr>
-        <w:keepNext w:val="false"/>
-        <w:keepLines w:val="false"/>
-        <w:pBdr>
-          <w:left w:val="single" w:color="4472C4" w:sz="12" w:space="4"/>
-        </w:pBdr>
-        <w:shd w:fill="F2F2F2" w:color="auto" w:val="clear"/>
-        <w:spacing w:after="0" w:line="240" w:lineRule="auto"/>
-        <w:ind w:left="283"/>
-      </w:pPr>
-      <w:r>
-        <w:rPr>
-          <w:rFonts w:ascii="Courier New" w:cs="Courier New" w:eastAsia="Courier New" w:hAnsi="Courier New"/>
-          <w:sz w:val="18"/>
-          <w:szCs w:val="18"/>
-          <w:shd w:fill="F2F2F2" w:color="auto" w:val="clear"/>
-        </w:rPr>
-        <w:t xml:space="preserve">    let current = this.head;</w:t>
-      </w:r>
-    </w:p>
-    <w:p>
-      <w:pPr>
-        <w:keepNext w:val="false"/>
-        <w:keepLines w:val="false"/>
-        <w:pBdr>
-          <w:left w:val="single" w:color="4472C4" w:sz="12" w:space="4"/>
-        </w:pBdr>
-        <w:shd w:fill="F2F2F2" w:color="auto" w:val="clear"/>
-        <w:spacing w:after="0" w:line="240" w:lineRule="auto"/>
-        <w:ind w:left="283"/>
-      </w:pPr>
-      <w:r>
-        <w:rPr>
-          <w:rFonts w:ascii="Courier New" w:cs="Courier New" w:eastAsia="Courier New" w:hAnsi="Courier New"/>
-          <w:sz w:val="18"/>
-          <w:szCs w:val="18"/>
-          <w:shd w:fill="F2F2F2" w:color="auto" w:val="clear"/>
-        </w:rPr>
-        <w:t xml:space="preserve">    while (current.next) current = current.next;</w:t>
-      </w:r>
-    </w:p>
-    <w:p>
-      <w:pPr>
-        <w:keepNext w:val="false"/>
-        <w:keepLines w:val="false"/>
-        <w:pBdr>
-          <w:left w:val="single" w:color="4472C4" w:sz="12" w:space="4"/>
-        </w:pBdr>
-        <w:shd w:fill="F2F2F2" w:color="auto" w:val="clear"/>
-        <w:spacing w:after="0" w:line="240" w:lineRule="auto"/>
-        <w:ind w:left="283"/>
-      </w:pPr>
-      <w:r>
-        <w:rPr>
-          <w:rFonts w:ascii="Courier New" w:cs="Courier New" w:eastAsia="Courier New" w:hAnsi="Courier New"/>
-          <w:sz w:val="18"/>
-          <w:szCs w:val="18"/>
-          <w:shd w:fill="F2F2F2" w:color="auto" w:val="clear"/>
-        </w:rPr>
-        <w:t xml:space="preserve">    current.next = node;</w:t>
-      </w:r>
-    </w:p>
-    <w:p>
-      <w:pPr>
-        <w:keepNext w:val="false"/>
-        <w:keepLines w:val="false"/>
-        <w:pBdr>
-          <w:left w:val="single" w:color="4472C4" w:sz="12" w:space="4"/>
-        </w:pBdr>
-        <w:shd w:fill="F2F2F2" w:color="auto" w:val="clear"/>
-        <w:spacing w:after="0" w:line="240" w:lineRule="auto"/>
-        <w:ind w:left="283"/>
-      </w:pPr>
-      <w:r>
-        <w:rPr>
-          <w:rFonts w:ascii="Courier New" w:cs="Courier New" w:eastAsia="Courier New" w:hAnsi="Courier New"/>
-          <w:sz w:val="18"/>
-          <w:szCs w:val="18"/>
-          <w:shd w:fill="F2F2F2" w:color="auto" w:val="clear"/>
-        </w:rPr>
-        <w:t xml:space="preserve">  }</w:t>
-      </w:r>
-    </w:p>
-    <w:p>
-      <w:pPr>
-        <w:keepNext w:val="false"/>
-        <w:keepLines w:val="false"/>
-        <w:pBdr>
-          <w:left w:val="single" w:color="4472C4" w:sz="12" w:space="4"/>
-        </w:pBdr>
-        <w:shd w:fill="F2F2F2" w:color="auto" w:val="clear"/>
-        <w:spacing w:after="0" w:line="240" w:lineRule="auto"/>
-        <w:ind w:left="283"/>
-      </w:pPr>
-      <w:r>
-        <w:rPr>
-          <w:rFonts w:ascii="Courier New" w:cs="Courier New" w:eastAsia="Courier New" w:hAnsi="Courier New"/>
-          <w:sz w:val="18"/>
-          <w:szCs w:val="18"/>
-          <w:shd w:fill="F2F2F2" w:color="auto" w:val="clear"/>
-        </w:rPr>
-        <w:t xml:space="preserve"> </w:t>
-      </w:r>
-    </w:p>
-    <w:p>
-      <w:pPr>
-        <w:keepNext w:val="false"/>
-        <w:keepLines w:val="false"/>
-        <w:pBdr>
-          <w:left w:val="single" w:color="4472C4" w:sz="12" w:space="4"/>
-        </w:pBdr>
-        <w:shd w:fill="F2F2F2" w:color="auto" w:val="clear"/>
-        <w:spacing w:after="0" w:line="240" w:lineRule="auto"/>
-        <w:ind w:left="283"/>
-      </w:pPr>
-      <w:r>
-        <w:rPr>
-          <w:rFonts w:ascii="Courier New" w:cs="Courier New" w:eastAsia="Courier New" w:hAnsi="Courier New"/>
-          <w:sz w:val="18"/>
-          <w:szCs w:val="18"/>
-          <w:shd w:fill="F2F2F2" w:color="auto" w:val="clear"/>
-        </w:rPr>
-        <w:t xml:space="preserve">  print(): void {</w:t>
-      </w:r>
-    </w:p>
-    <w:p>
-      <w:pPr>
-        <w:keepNext w:val="false"/>
-        <w:keepLines w:val="false"/>
-        <w:pBdr>
-          <w:left w:val="single" w:color="4472C4" w:sz="12" w:space="4"/>
-        </w:pBdr>
-        <w:shd w:fill="F2F2F2" w:color="auto" w:val="clear"/>
-        <w:spacing w:after="0" w:line="240" w:lineRule="auto"/>
-        <w:ind w:left="283"/>
-      </w:pPr>
-      <w:r>
-        <w:rPr>
-          <w:rFonts w:ascii="Courier New" w:cs="Courier New" w:eastAsia="Courier New" w:hAnsi="Courier New"/>
-          <w:sz w:val="18"/>
-          <w:szCs w:val="18"/>
-          <w:shd w:fill="F2F2F2" w:color="auto" w:val="clear"/>
-        </w:rPr>
-        <w:t xml:space="preserve">    const items: number[] = [];</w:t>
-      </w:r>
-    </w:p>
-    <w:p>
-      <w:pPr>
-        <w:keepNext w:val="false"/>
-        <w:keepLines w:val="false"/>
-        <w:pBdr>
-          <w:left w:val="single" w:color="4472C4" w:sz="12" w:space="4"/>
-        </w:pBdr>
-        <w:shd w:fill="F2F2F2" w:color="auto" w:val="clear"/>
-        <w:spacing w:after="0" w:line="240" w:lineRule="auto"/>
-        <w:ind w:left="283"/>
-      </w:pPr>
-      <w:r>
-        <w:rPr>
-          <w:rFonts w:ascii="Courier New" w:cs="Courier New" w:eastAsia="Courier New" w:hAnsi="Courier New"/>
-          <w:sz w:val="18"/>
-          <w:szCs w:val="18"/>
-          <w:shd w:fill="F2F2F2" w:color="auto" w:val="clear"/>
-        </w:rPr>
-        <w:t xml:space="preserve">    let current = this.head;</w:t>
-      </w:r>
-    </w:p>
-    <w:p>
-      <w:pPr>
-        <w:keepNext w:val="false"/>
-        <w:keepLines w:val="false"/>
-        <w:pBdr>
-          <w:left w:val="single" w:color="4472C4" w:sz="12" w:space="4"/>
-        </w:pBdr>
-        <w:shd w:fill="F2F2F2" w:color="auto" w:val="clear"/>
-        <w:spacing w:after="0" w:line="240" w:lineRule="auto"/>
-        <w:ind w:left="283"/>
-      </w:pPr>
-      <w:r>
-        <w:rPr>
-          <w:rFonts w:ascii="Courier New" w:cs="Courier New" w:eastAsia="Courier New" w:hAnsi="Courier New"/>
-          <w:sz w:val="18"/>
-          <w:szCs w:val="18"/>
-          <w:shd w:fill="F2F2F2" w:color="auto" w:val="clear"/>
-        </w:rPr>
-        <w:t xml:space="preserve">    while (current) {</w:t>
-      </w:r>
-    </w:p>
-    <w:p>
-      <w:pPr>
-        <w:keepNext w:val="false"/>
-        <w:keepLines w:val="false"/>
-        <w:pBdr>
-          <w:left w:val="single" w:color="4472C4" w:sz="12" w:space="4"/>
-        </w:pBdr>
-        <w:shd w:fill="F2F2F2" w:color="auto" w:val="clear"/>
-        <w:spacing w:after="0" w:line="240" w:lineRule="auto"/>
-        <w:ind w:left="283"/>
-      </w:pPr>
-      <w:r>
-        <w:rPr>
-          <w:rFonts w:ascii="Courier New" w:cs="Courier New" w:eastAsia="Courier New" w:hAnsi="Courier New"/>
-          <w:sz w:val="18"/>
-          <w:szCs w:val="18"/>
-          <w:shd w:fill="F2F2F2" w:color="auto" w:val="clear"/>
-        </w:rPr>
-        <w:t xml:space="preserve">      items.push(current.value);</w:t>
-      </w:r>
-    </w:p>
-    <w:p>
-      <w:pPr>
-        <w:keepNext w:val="false"/>
-        <w:keepLines w:val="false"/>
-        <w:pBdr>
-          <w:left w:val="single" w:color="4472C4" w:sz="12" w:space="4"/>
-        </w:pBdr>
-        <w:shd w:fill="F2F2F2" w:color="auto" w:val="clear"/>
-        <w:spacing w:after="0" w:line="240" w:lineRule="auto"/>
-        <w:ind w:left="283"/>
-      </w:pPr>
-      <w:r>
-        <w:rPr>
-          <w:rFonts w:ascii="Courier New" w:cs="Courier New" w:eastAsia="Courier New" w:hAnsi="Courier New"/>
-          <w:sz w:val="18"/>
-          <w:szCs w:val="18"/>
-          <w:shd w:fill="F2F2F2" w:color="auto" w:val="clear"/>
-        </w:rPr>
-        <w:t xml:space="preserve">      current = current.next;</w:t>
-      </w:r>
-    </w:p>
-    <w:p>
-      <w:pPr>
-        <w:keepNext w:val="false"/>
-        <w:keepLines w:val="false"/>
-        <w:pBdr>
-          <w:left w:val="single" w:color="4472C4" w:sz="12" w:space="4"/>
-        </w:pBdr>
-        <w:shd w:fill="F2F2F2" w:color="auto" w:val="clear"/>
-        <w:spacing w:after="0" w:line="240" w:lineRule="auto"/>
-        <w:ind w:left="283"/>
-      </w:pPr>
-      <w:r>
-        <w:rPr>
-          <w:rFonts w:ascii="Courier New" w:cs="Courier New" w:eastAsia="Courier New" w:hAnsi="Courier New"/>
-          <w:sz w:val="18"/>
-          <w:szCs w:val="18"/>
-          <w:shd w:fill="F2F2F2" w:color="auto" w:val="clear"/>
-        </w:rPr>
-        <w:t xml:space="preserve">    }</w:t>
-      </w:r>
-    </w:p>
-    <w:p>
-      <w:pPr>
-        <w:keepNext w:val="false"/>
-        <w:keepLines w:val="false"/>
-        <w:pBdr>
-          <w:left w:val="single" w:color="4472C4" w:sz="12" w:space="4"/>
-        </w:pBdr>
-        <w:shd w:fill="F2F2F2" w:color="auto" w:val="clear"/>
-        <w:spacing w:after="0" w:line="240" w:lineRule="auto"/>
-        <w:ind w:left="283"/>
-      </w:pPr>
-      <w:r>
-        <w:rPr>
-          <w:rFonts w:ascii="Courier New" w:cs="Courier New" w:eastAsia="Courier New" w:hAnsi="Courier New"/>
-          <w:sz w:val="18"/>
-          <w:szCs w:val="18"/>
-          <w:shd w:fill="F2F2F2" w:color="auto" w:val="clear"/>
-        </w:rPr>
-        <w:t xml:space="preserve">    console.log(`List: ${items.join(" → ")} → null`);</w:t>
-      </w:r>
-    </w:p>
-    <w:p>
-      <w:pPr>
-        <w:keepNext w:val="false"/>
-        <w:keepLines w:val="false"/>
-        <w:pBdr>
-          <w:left w:val="single" w:color="4472C4" w:sz="12" w:space="4"/>
-        </w:pBdr>
-        <w:shd w:fill="F2F2F2" w:color="auto" w:val="clear"/>
-        <w:spacing w:after="0" w:line="240" w:lineRule="auto"/>
-        <w:ind w:left="283"/>
-      </w:pPr>
-      <w:r>
-        <w:rPr>
-          <w:rFonts w:ascii="Courier New" w:cs="Courier New" w:eastAsia="Courier New" w:hAnsi="Courier New"/>
-          <w:sz w:val="18"/>
-          <w:szCs w:val="18"/>
-          <w:shd w:fill="F2F2F2" w:color="auto" w:val="clear"/>
-        </w:rPr>
-        <w:t xml:space="preserve">  }</w:t>
-      </w:r>
-    </w:p>
-    <w:p>
-      <w:pPr>
-        <w:keepNext w:val="false"/>
-        <w:keepLines w:val="false"/>
-        <w:pBdr>
-          <w:left w:val="single" w:color="4472C4" w:sz="12" w:space="4"/>
-        </w:pBdr>
-        <w:shd w:fill="F2F2F2" w:color="auto" w:val="clear"/>
-        <w:spacing w:after="0" w:line="240" w:lineRule="auto"/>
-        <w:ind w:left="283"/>
-      </w:pPr>
-      <w:r>
-        <w:rPr>
-          <w:rFonts w:ascii="Courier New" w:cs="Courier New" w:eastAsia="Courier New" w:hAnsi="Courier New"/>
-          <w:sz w:val="18"/>
-          <w:szCs w:val="18"/>
-          <w:shd w:fill="F2F2F2" w:color="auto" w:val="clear"/>
-        </w:rPr>
-        <w:t xml:space="preserve">}</w:t>
       </w:r>
     </w:p>
     <w:p>
@@ -4126,7 +2488,7 @@
           <w:sz w:val="28"/>
           <w:szCs w:val="28"/>
         </w:rPr>
-        <w:t xml:space="preserve">У ході лабораторної роботи було реалізовано три базові структури даних — стек, чергу та зв'язковий список — без використання стандартних бібліотечних класів. Стек реалізовано на основі масиву з принципом LIFO, чергу — як циклічний буфер з принципом FIFO, список — як однозв'язкову динамічну структуру. Результати демонструють коректну роботу всіх операцій.</w:t>
+        <w:t xml:space="preserve">У ході лабораторної роботи було реалізовано три базові структури даних без використання стандартних бібліотечних класів. Стек реалізовано на основі масиву з принципом LIFO, чергу — як циклічний буфер з принципом FIFO, однозв'язковий список — як динамічну структуру з покажчиками. Усі операції працюють коректно, що підтверджено результатами виконання програми.</w:t>
       </w:r>
     </w:p>
     <w:p>

</xml_diff>